<commit_message>
Replace section break dashes with * * * in full draft, regenerate formatted docx
</commit_message>
<xml_diff>
--- a/Manuscript/Plausibly_Deniable_FORMATTED.docx
+++ b/Manuscript/Plausibly_Deniable_FORMATTED.docx
@@ -18,32 +18,6 @@
         <w:t xml:space="preserve">Ryan Charles Lingo</w:t>
       </w:r>
     </w:p>
-    <w:sdt>
-      <w:sdtPr>
-        <w:docPartObj>
-          <w:docPartGallery w:val="Table of Contents"/>
-          <w:docPartUnique/>
-        </w:docPartObj>
-      </w:sdtPr>
-      <w:sdtContent>
-        <w:p>
-          <w:pPr>
-            <w:pStyle w:val="TOCHeading"/>
-          </w:pPr>
-          <w:r>
-            <w:t xml:space="preserve">Table of Contents</w:t>
-          </w:r>
-        </w:p>
-        <w:p>
-          <w:r>
-            <w:fldChar w:fldCharType="begin" w:dirty="true"/>
-            <w:instrText xml:space="preserve">TOC \o "1-1" \h \z \u</w:instrText>
-            <w:fldChar w:fldCharType="separate"/>
-            <w:fldChar w:fldCharType="end"/>
-          </w:r>
-        </w:p>
-      </w:sdtContent>
-    </w:sdt>
     <w:bookmarkStart w:id="9" w:name="authors-note"/>
     <w:p>
       <w:pPr>

</xml_diff>

<commit_message>
Fix section breaks and restore TOC in formatted docx
</commit_message>
<xml_diff>
--- a/Manuscript/Plausibly_Deniable_FORMATTED.docx
+++ b/Manuscript/Plausibly_Deniable_FORMATTED.docx
@@ -18,6 +18,32 @@
         <w:t xml:space="preserve">Ryan Charles Lingo</w:t>
       </w:r>
     </w:p>
+    <w:sdt>
+      <w:sdtPr>
+        <w:docPartObj>
+          <w:docPartGallery w:val="Table of Contents"/>
+          <w:docPartUnique/>
+        </w:docPartObj>
+      </w:sdtPr>
+      <w:sdtContent>
+        <w:p>
+          <w:pPr>
+            <w:pStyle w:val="TOCHeading"/>
+          </w:pPr>
+          <w:r>
+            <w:t xml:space="preserve">Table of Contents</w:t>
+          </w:r>
+        </w:p>
+        <w:p>
+          <w:r>
+            <w:fldChar w:fldCharType="begin" w:dirty="true"/>
+            <w:instrText xml:space="preserve">TOC \o "1-1" \h \z \u</w:instrText>
+            <w:fldChar w:fldCharType="separate"/>
+            <w:fldChar w:fldCharType="end"/>
+          </w:r>
+        </w:p>
+      </w:sdtContent>
+    </w:sdt>
     <w:bookmarkStart w:id="9" w:name="authors-note"/>
     <w:p>
       <w:pPr>
@@ -76,15 +102,16 @@
       </w:r>
     </w:p>
     <w:p>
-      <w:r>
-        <w:pict>
-          <v:rect style="width:0;height:1.5pt" o:hralign="center" o:hrstd="t" o:hr="t"/>
-        </w:pict>
-      </w:r>
-    </w:p>
-    <w:p>
-      <w:pPr>
-        <w:pStyle w:val="FirstParagraph"/>
+      <w:pPr>
+        <w:pStyle w:val="BodyText"/>
+      </w:pPr>
+      <w:r>
+        <w:t xml:space="preserve">✦ ✦ ✦</w:t>
+      </w:r>
+    </w:p>
+    <w:p>
+      <w:pPr>
+        <w:pStyle w:val="BodyText"/>
       </w:pPr>
       <w:r>
         <w:t xml:space="preserve">To everyone who reads this — I want to say something before you turn the page.</w:t>
@@ -153,10 +180,11 @@
       </w:r>
     </w:p>
     <w:p>
-      <w:r>
-        <w:pict>
-          <v:rect style="width:0;height:1.5pt" o:hralign="center" o:hrstd="t" o:hr="t"/>
-        </w:pict>
+      <w:pPr>
+        <w:pStyle w:val="BodyText"/>
+      </w:pPr>
+      <w:r>
+        <w:t xml:space="preserve">✦ ✦ ✦</w:t>
       </w:r>
     </w:p>
     <w:bookmarkEnd w:id="9"/>
@@ -210,15 +238,16 @@
       </w:r>
     </w:p>
     <w:p>
-      <w:r>
-        <w:pict>
-          <v:rect style="width:0;height:1.5pt" o:hralign="center" o:hrstd="t" o:hr="t"/>
-        </w:pict>
-      </w:r>
-    </w:p>
-    <w:p>
-      <w:pPr>
-        <w:pStyle w:val="FirstParagraph"/>
+      <w:pPr>
+        <w:pStyle w:val="BodyText"/>
+      </w:pPr>
+      <w:r>
+        <w:t xml:space="preserve">✦ ✦ ✦</w:t>
+      </w:r>
+    </w:p>
+    <w:p>
+      <w:pPr>
+        <w:pStyle w:val="BodyText"/>
       </w:pPr>
       <w:r>
         <w:t xml:space="preserve">I want to say something about the phrase</w:t>
@@ -334,15 +363,16 @@
       </w:r>
     </w:p>
     <w:p>
-      <w:r>
-        <w:pict>
-          <v:rect style="width:0;height:1.5pt" o:hralign="center" o:hrstd="t" o:hr="t"/>
-        </w:pict>
-      </w:r>
-    </w:p>
-    <w:p>
-      <w:pPr>
-        <w:pStyle w:val="FirstParagraph"/>
+      <w:pPr>
+        <w:pStyle w:val="BodyText"/>
+      </w:pPr>
+      <w:r>
+        <w:t xml:space="preserve">✦ ✦ ✦</w:t>
+      </w:r>
+    </w:p>
+    <w:p>
+      <w:pPr>
+        <w:pStyle w:val="BodyText"/>
       </w:pPr>
       <w:r>
         <w:t xml:space="preserve">A note on how to read this book.</w:t>
@@ -373,15 +403,16 @@
       </w:r>
     </w:p>
     <w:p>
-      <w:r>
-        <w:pict>
-          <v:rect style="width:0;height:1.5pt" o:hralign="center" o:hrstd="t" o:hr="t"/>
-        </w:pict>
-      </w:r>
-    </w:p>
-    <w:p>
-      <w:pPr>
-        <w:pStyle w:val="FirstParagraph"/>
+      <w:pPr>
+        <w:pStyle w:val="BodyText"/>
+      </w:pPr>
+      <w:r>
+        <w:t xml:space="preserve">✦ ✦ ✦</w:t>
+      </w:r>
+    </w:p>
+    <w:p>
+      <w:pPr>
+        <w:pStyle w:val="BodyText"/>
       </w:pPr>
       <w:r>
         <w:t xml:space="preserve">A note on names: everyone named in this book is named because the record requires it. I have not changed names to protect anyone who made decisions that harmed me and then ensured there was no paper trail connecting them to those decisions. The paper trail exists anyway. I kept it.</w:t>
@@ -404,15 +435,16 @@
       </w:r>
     </w:p>
     <w:p>
-      <w:r>
-        <w:pict>
-          <v:rect style="width:0;height:1.5pt" o:hralign="center" o:hrstd="t" o:hr="t"/>
-        </w:pict>
-      </w:r>
-    </w:p>
-    <w:p>
-      <w:pPr>
-        <w:pStyle w:val="FirstParagraph"/>
+      <w:pPr>
+        <w:pStyle w:val="BodyText"/>
+      </w:pPr>
+      <w:r>
+        <w:t xml:space="preserve">✦ ✦ ✦</w:t>
+      </w:r>
+    </w:p>
+    <w:p>
+      <w:pPr>
+        <w:pStyle w:val="BodyText"/>
       </w:pPr>
       <w:r>
         <w:rPr>
@@ -433,10 +465,11 @@
       </w:r>
     </w:p>
     <w:p>
-      <w:r>
-        <w:pict>
-          <v:rect style="width:0;height:1.5pt" o:hralign="center" o:hrstd="t" o:hr="t"/>
-        </w:pict>
+      <w:pPr>
+        <w:pStyle w:val="BodyText"/>
+      </w:pPr>
+      <w:r>
+        <w:t xml:space="preserve">✦ ✦ ✦</w:t>
       </w:r>
     </w:p>
     <w:bookmarkEnd w:id="10"/>
@@ -880,15 +913,16 @@
       </w:r>
     </w:p>
     <w:p>
-      <w:r>
-        <w:pict>
-          <v:rect style="width:0;height:1.5pt" o:hralign="center" o:hrstd="t" o:hr="t"/>
-        </w:pict>
-      </w:r>
-    </w:p>
-    <w:p>
-      <w:pPr>
-        <w:pStyle w:val="FirstParagraph"/>
+      <w:pPr>
+        <w:pStyle w:val="BodyText"/>
+      </w:pPr>
+      <w:r>
+        <w:t xml:space="preserve">✦ ✦ ✦</w:t>
+      </w:r>
+    </w:p>
+    <w:p>
+      <w:pPr>
+        <w:pStyle w:val="BodyText"/>
       </w:pPr>
       <w:r>
         <w:t xml:space="preserve">But this story doesn’t start on March 2nd, 2023. It starts earlier, with a job offer, a security clearance, and a genuine belief that the work I was doing mattered.</w:t>
@@ -1087,10 +1121,11 @@
       </w:r>
     </w:p>
     <w:p>
-      <w:r>
-        <w:pict>
-          <v:rect style="width:0;height:1.5pt" o:hralign="center" o:hrstd="t" o:hr="t"/>
-        </w:pict>
+      <w:pPr>
+        <w:pStyle w:val="BodyText"/>
+      </w:pPr>
+      <w:r>
+        <w:t xml:space="preserve">✦ ✦ ✦</w:t>
       </w:r>
     </w:p>
     <w:bookmarkEnd w:id="11"/>
@@ -1444,10 +1479,11 @@
       </w:r>
     </w:p>
     <w:p>
-      <w:r>
-        <w:pict>
-          <v:rect style="width:0;height:1.5pt" o:hralign="center" o:hrstd="t" o:hr="t"/>
-        </w:pict>
+      <w:pPr>
+        <w:pStyle w:val="BodyText"/>
+      </w:pPr>
+      <w:r>
+        <w:t xml:space="preserve">✦ ✦ ✦</w:t>
       </w:r>
     </w:p>
     <w:bookmarkEnd w:id="12"/>
@@ -1737,10 +1773,11 @@
       </w:r>
     </w:p>
     <w:p>
-      <w:r>
-        <w:pict>
-          <v:rect style="width:0;height:1.5pt" o:hralign="center" o:hrstd="t" o:hr="t"/>
-        </w:pict>
+      <w:pPr>
+        <w:pStyle w:val="BodyText"/>
+      </w:pPr>
+      <w:r>
+        <w:t xml:space="preserve">✦ ✦ ✦</w:t>
       </w:r>
     </w:p>
     <w:bookmarkEnd w:id="13"/>
@@ -1930,15 +1967,16 @@
       </w:r>
     </w:p>
     <w:p>
-      <w:r>
-        <w:pict>
-          <v:rect style="width:0;height:1.5pt" o:hralign="center" o:hrstd="t" o:hr="t"/>
-        </w:pict>
-      </w:r>
-    </w:p>
-    <w:p>
-      <w:pPr>
-        <w:pStyle w:val="FirstParagraph"/>
+      <w:pPr>
+        <w:pStyle w:val="BodyText"/>
+      </w:pPr>
+      <w:r>
+        <w:t xml:space="preserve">✦ ✦ ✦</w:t>
+      </w:r>
+    </w:p>
+    <w:p>
+      <w:pPr>
+        <w:pStyle w:val="BodyText"/>
       </w:pPr>
       <w:r>
         <w:t xml:space="preserve">We took breaks outside. That was the rhythm of the unit — structured time outdoors, back inside, structured time indoors, repeat. It gave the day a shape that didn’t require you to think about what the day actually was.</w:t>
@@ -2025,15 +2063,16 @@
       </w:r>
     </w:p>
     <w:p>
-      <w:r>
-        <w:pict>
-          <v:rect style="width:0;height:1.5pt" o:hralign="center" o:hrstd="t" o:hr="t"/>
-        </w:pict>
-      </w:r>
-    </w:p>
-    <w:p>
-      <w:pPr>
-        <w:pStyle w:val="FirstParagraph"/>
+      <w:pPr>
+        <w:pStyle w:val="BodyText"/>
+      </w:pPr>
+      <w:r>
+        <w:t xml:space="preserve">✦ ✦ ✦</w:t>
+      </w:r>
+    </w:p>
+    <w:p>
+      <w:pPr>
+        <w:pStyle w:val="BodyText"/>
       </w:pPr>
       <w:r>
         <w:t xml:space="preserve">I had already started driving back to DC when I stopped.</w:t>
@@ -2176,15 +2215,16 @@
       </w:r>
     </w:p>
     <w:p>
-      <w:r>
-        <w:pict>
-          <v:rect style="width:0;height:1.5pt" o:hralign="center" o:hrstd="t" o:hr="t"/>
-        </w:pict>
-      </w:r>
-    </w:p>
-    <w:p>
-      <w:pPr>
-        <w:pStyle w:val="FirstParagraph"/>
+      <w:pPr>
+        <w:pStyle w:val="BodyText"/>
+      </w:pPr>
+      <w:r>
+        <w:t xml:space="preserve">✦ ✦ ✦</w:t>
+      </w:r>
+    </w:p>
+    <w:p>
+      <w:pPr>
+        <w:pStyle w:val="BodyText"/>
       </w:pPr>
       <w:r>
         <w:t xml:space="preserve">Horsham was cleaner than Brooke Glen. That’s the most I’ll say in its favor.</w:t>
@@ -2419,15 +2459,16 @@
       </w:r>
     </w:p>
     <w:p>
-      <w:r>
-        <w:pict>
-          <v:rect style="width:0;height:1.5pt" o:hralign="center" o:hrstd="t" o:hr="t"/>
-        </w:pict>
-      </w:r>
-    </w:p>
-    <w:p>
-      <w:pPr>
-        <w:pStyle w:val="FirstParagraph"/>
+      <w:pPr>
+        <w:pStyle w:val="BodyText"/>
+      </w:pPr>
+      <w:r>
+        <w:t xml:space="preserve">✦ ✦ ✦</w:t>
+      </w:r>
+    </w:p>
+    <w:p>
+      <w:pPr>
+        <w:pStyle w:val="BodyText"/>
       </w:pPr>
       <w:r>
         <w:t xml:space="preserve">At some point they decided I could leave.</w:t>
@@ -2466,10 +2507,11 @@
       </w:r>
     </w:p>
     <w:p>
-      <w:r>
-        <w:pict>
-          <v:rect style="width:0;height:1.5pt" o:hralign="center" o:hrstd="t" o:hr="t"/>
-        </w:pict>
+      <w:pPr>
+        <w:pStyle w:val="BodyText"/>
+      </w:pPr>
+      <w:r>
+        <w:t xml:space="preserve">✦ ✦ ✦</w:t>
       </w:r>
     </w:p>
     <w:bookmarkEnd w:id="14"/>
@@ -2571,15 +2613,16 @@
       </w:r>
     </w:p>
     <w:p>
-      <w:r>
-        <w:pict>
-          <v:rect style="width:0;height:1.5pt" o:hralign="center" o:hrstd="t" o:hr="t"/>
-        </w:pict>
-      </w:r>
-    </w:p>
-    <w:p>
-      <w:pPr>
-        <w:pStyle w:val="FirstParagraph"/>
+      <w:pPr>
+        <w:pStyle w:val="BodyText"/>
+      </w:pPr>
+      <w:r>
+        <w:t xml:space="preserve">✦ ✦ ✦</w:t>
+      </w:r>
+    </w:p>
+    <w:p>
+      <w:pPr>
+        <w:pStyle w:val="BodyText"/>
       </w:pPr>
       <w:r>
         <w:t xml:space="preserve">The phone was still mine. That was one thing they hadn’t taken.</w:t>
@@ -2682,15 +2725,16 @@
       </w:r>
     </w:p>
     <w:p>
-      <w:r>
-        <w:pict>
-          <v:rect style="width:0;height:1.5pt" o:hralign="center" o:hrstd="t" o:hr="t"/>
-        </w:pict>
-      </w:r>
-    </w:p>
-    <w:p>
-      <w:pPr>
-        <w:pStyle w:val="FirstParagraph"/>
+      <w:pPr>
+        <w:pStyle w:val="BodyText"/>
+      </w:pPr>
+      <w:r>
+        <w:t xml:space="preserve">✦ ✦ ✦</w:t>
+      </w:r>
+    </w:p>
+    <w:p>
+      <w:pPr>
+        <w:pStyle w:val="BodyText"/>
       </w:pPr>
       <w:r>
         <w:t xml:space="preserve">The content escalated. That’s the honest way to describe it, not a dramatic shift, not a single moment, but a gradual pressure applied with precision over days and weeks until the accumulation became undeniable.</w:t>
@@ -2905,15 +2949,16 @@
       </w:r>
     </w:p>
     <w:p>
-      <w:r>
-        <w:pict>
-          <v:rect style="width:0;height:1.5pt" o:hralign="center" o:hrstd="t" o:hr="t"/>
-        </w:pict>
-      </w:r>
-    </w:p>
-    <w:p>
-      <w:pPr>
-        <w:pStyle w:val="FirstParagraph"/>
+      <w:pPr>
+        <w:pStyle w:val="BodyText"/>
+      </w:pPr>
+      <w:r>
+        <w:t xml:space="preserve">✦ ✦ ✦</w:t>
+      </w:r>
+    </w:p>
+    <w:p>
+      <w:pPr>
+        <w:pStyle w:val="BodyText"/>
       </w:pPr>
       <w:r>
         <w:t xml:space="preserve">I was not only documenting. I was still fighting.</w:t>
@@ -3040,15 +3085,16 @@
       </w:r>
     </w:p>
     <w:p>
-      <w:r>
-        <w:pict>
-          <v:rect style="width:0;height:1.5pt" o:hralign="center" o:hrstd="t" o:hr="t"/>
-        </w:pict>
-      </w:r>
-    </w:p>
-    <w:p>
-      <w:pPr>
-        <w:pStyle w:val="FirstParagraph"/>
+      <w:pPr>
+        <w:pStyle w:val="BodyText"/>
+      </w:pPr>
+      <w:r>
+        <w:t xml:space="preserve">✦ ✦ ✦</w:t>
+      </w:r>
+    </w:p>
+    <w:p>
+      <w:pPr>
+        <w:pStyle w:val="BodyText"/>
       </w:pPr>
       <w:r>
         <w:t xml:space="preserve">At some point I stopped waiting for the wall to move.</w:t>
@@ -3103,10 +3149,11 @@
       </w:r>
     </w:p>
     <w:p>
-      <w:r>
-        <w:pict>
-          <v:rect style="width:0;height:1.5pt" o:hralign="center" o:hrstd="t" o:hr="t"/>
-        </w:pict>
+      <w:pPr>
+        <w:pStyle w:val="BodyText"/>
+      </w:pPr>
+      <w:r>
+        <w:t xml:space="preserve">✦ ✦ ✦</w:t>
       </w:r>
     </w:p>
     <w:bookmarkEnd w:id="15"/>
@@ -3170,10 +3217,11 @@
       </w:r>
     </w:p>
     <w:p>
-      <w:r>
-        <w:pict>
-          <v:rect style="width:0;height:1.5pt" o:hralign="center" o:hrstd="t" o:hr="t"/>
-        </w:pict>
+      <w:pPr>
+        <w:pStyle w:val="BodyText"/>
+      </w:pPr>
+      <w:r>
+        <w:t xml:space="preserve">✦ ✦ ✦</w:t>
       </w:r>
     </w:p>
     <w:bookmarkStart w:id="16" w:name="part-one-federal-agencies-and-officials"/>
@@ -3556,10 +3604,11 @@
       </w:r>
     </w:p>
     <w:p>
-      <w:r>
-        <w:pict>
-          <v:rect style="width:0;height:1.5pt" o:hralign="center" o:hrstd="t" o:hr="t"/>
-        </w:pict>
+      <w:pPr>
+        <w:pStyle w:val="BodyText"/>
+      </w:pPr>
+      <w:r>
+        <w:t xml:space="preserve">✦ ✦ ✦</w:t>
       </w:r>
     </w:p>
     <w:bookmarkEnd w:id="16"/>
@@ -4027,10 +4076,11 @@
       </w:r>
     </w:p>
     <w:p>
-      <w:r>
-        <w:pict>
-          <v:rect style="width:0;height:1.5pt" o:hralign="center" o:hrstd="t" o:hr="t"/>
-        </w:pict>
+      <w:pPr>
+        <w:pStyle w:val="BodyText"/>
+      </w:pPr>
+      <w:r>
+        <w:t xml:space="preserve">✦ ✦ ✦</w:t>
       </w:r>
     </w:p>
     <w:bookmarkEnd w:id="17"/>
@@ -4466,10 +4516,11 @@
       </w:r>
     </w:p>
     <w:p>
-      <w:r>
-        <w:pict>
-          <v:rect style="width:0;height:1.5pt" o:hralign="center" o:hrstd="t" o:hr="t"/>
-        </w:pict>
+      <w:pPr>
+        <w:pStyle w:val="BodyText"/>
+      </w:pPr>
+      <w:r>
+        <w:t xml:space="preserve">✦ ✦ ✦</w:t>
       </w:r>
     </w:p>
     <w:bookmarkEnd w:id="18"/>
@@ -4747,15 +4798,16 @@
       </w:r>
     </w:p>
     <w:p>
-      <w:r>
-        <w:pict>
-          <v:rect style="width:0;height:1.5pt" o:hralign="center" o:hrstd="t" o:hr="t"/>
-        </w:pict>
-      </w:r>
-    </w:p>
-    <w:p>
-      <w:pPr>
-        <w:pStyle w:val="FirstParagraph"/>
+      <w:pPr>
+        <w:pStyle w:val="BodyText"/>
+      </w:pPr>
+      <w:r>
+        <w:t xml:space="preserve">✦ ✦ ✦</w:t>
+      </w:r>
+    </w:p>
+    <w:p>
+      <w:pPr>
+        <w:pStyle w:val="BodyText"/>
       </w:pPr>
       <w:r>
         <w:t xml:space="preserve">That is the list.</w:t>
@@ -4806,10 +4858,11 @@
       </w:r>
     </w:p>
     <w:p>
-      <w:r>
-        <w:pict>
-          <v:rect style="width:0;height:1.5pt" o:hralign="center" o:hrstd="t" o:hr="t"/>
-        </w:pict>
+      <w:pPr>
+        <w:pStyle w:val="BodyText"/>
+      </w:pPr>
+      <w:r>
+        <w:t xml:space="preserve">✦ ✦ ✦</w:t>
       </w:r>
     </w:p>
     <w:bookmarkEnd w:id="19"/>
@@ -4929,15 +4982,16 @@
       </w:r>
     </w:p>
     <w:p>
-      <w:r>
-        <w:pict>
-          <v:rect style="width:0;height:1.5pt" o:hralign="center" o:hrstd="t" o:hr="t"/>
-        </w:pict>
-      </w:r>
-    </w:p>
-    <w:p>
-      <w:pPr>
-        <w:pStyle w:val="FirstParagraph"/>
+      <w:pPr>
+        <w:pStyle w:val="BodyText"/>
+      </w:pPr>
+      <w:r>
+        <w:t xml:space="preserve">✦ ✦ ✦</w:t>
+      </w:r>
+    </w:p>
+    <w:p>
+      <w:pPr>
+        <w:pStyle w:val="BodyText"/>
       </w:pPr>
       <w:r>
         <w:t xml:space="preserve">The interview went well. I told them what I was good at. I described my aspirations — the tools I wanted to build, the problems I wanted to solve, the kind of work I had always believed I was meant to do. I expressed genuine thanks for their time. I meant it.</w:t>
@@ -5052,15 +5106,16 @@
       </w:r>
     </w:p>
     <w:p>
-      <w:r>
-        <w:pict>
-          <v:rect style="width:0;height:1.5pt" o:hralign="center" o:hrstd="t" o:hr="t"/>
-        </w:pict>
-      </w:r>
-    </w:p>
-    <w:p>
-      <w:pPr>
-        <w:pStyle w:val="FirstParagraph"/>
+      <w:pPr>
+        <w:pStyle w:val="BodyText"/>
+      </w:pPr>
+      <w:r>
+        <w:t xml:space="preserve">✦ ✦ ✦</w:t>
+      </w:r>
+    </w:p>
+    <w:p>
+      <w:pPr>
+        <w:pStyle w:val="BodyText"/>
       </w:pPr>
       <w:r>
         <w:t xml:space="preserve">On the morning of March 1st I emailed Dr. Benson and Captain Pearson.</w:t>
@@ -5179,15 +5234,16 @@
       </w:r>
     </w:p>
     <w:p>
-      <w:r>
-        <w:pict>
-          <v:rect style="width:0;height:1.5pt" o:hralign="center" o:hrstd="t" o:hr="t"/>
-        </w:pict>
-      </w:r>
-    </w:p>
-    <w:p>
-      <w:pPr>
-        <w:pStyle w:val="FirstParagraph"/>
+      <w:pPr>
+        <w:pStyle w:val="BodyText"/>
+      </w:pPr>
+      <w:r>
+        <w:t xml:space="preserve">✦ ✦ ✦</w:t>
+      </w:r>
+    </w:p>
+    <w:p>
+      <w:pPr>
+        <w:pStyle w:val="BodyText"/>
       </w:pPr>
       <w:r>
         <w:t xml:space="preserve">I filed the SAF/IG complaint on June 1, 2024.</w:t>
@@ -5318,15 +5374,16 @@
       </w:r>
     </w:p>
     <w:p>
-      <w:r>
-        <w:pict>
-          <v:rect style="width:0;height:1.5pt" o:hralign="center" o:hrstd="t" o:hr="t"/>
-        </w:pict>
-      </w:r>
-    </w:p>
-    <w:p>
-      <w:pPr>
-        <w:pStyle w:val="FirstParagraph"/>
+      <w:pPr>
+        <w:pStyle w:val="BodyText"/>
+      </w:pPr>
+      <w:r>
+        <w:t xml:space="preserve">✦ ✦ ✦</w:t>
+      </w:r>
+    </w:p>
+    <w:p>
+      <w:pPr>
+        <w:pStyle w:val="BodyText"/>
       </w:pPr>
       <w:r>
         <w:t xml:space="preserve">Senator Casey’s office had done everything correctly.</w:t>
@@ -5573,10 +5630,11 @@
       </w:r>
     </w:p>
     <w:p>
-      <w:r>
-        <w:pict>
-          <v:rect style="width:0;height:1.5pt" o:hralign="center" o:hrstd="t" o:hr="t"/>
-        </w:pict>
+      <w:pPr>
+        <w:pStyle w:val="BodyText"/>
+      </w:pPr>
+      <w:r>
+        <w:t xml:space="preserve">✦ ✦ ✦</w:t>
       </w:r>
     </w:p>
     <w:bookmarkEnd w:id="21"/>
@@ -5770,15 +5828,16 @@
       </w:r>
     </w:p>
     <w:p>
-      <w:r>
-        <w:pict>
-          <v:rect style="width:0;height:1.5pt" o:hralign="center" o:hrstd="t" o:hr="t"/>
-        </w:pict>
-      </w:r>
-    </w:p>
-    <w:p>
-      <w:pPr>
-        <w:pStyle w:val="FirstParagraph"/>
+      <w:pPr>
+        <w:pStyle w:val="BodyText"/>
+      </w:pPr>
+      <w:r>
+        <w:t xml:space="preserve">✦ ✦ ✦</w:t>
+      </w:r>
+    </w:p>
+    <w:p>
+      <w:pPr>
+        <w:pStyle w:val="BodyText"/>
       </w:pPr>
       <w:r>
         <w:t xml:space="preserve">I remember lying in bed at 1pm when my brother called.</w:t>
@@ -5849,15 +5908,16 @@
       </w:r>
     </w:p>
     <w:p>
-      <w:r>
-        <w:pict>
-          <v:rect style="width:0;height:1.5pt" o:hralign="center" o:hrstd="t" o:hr="t"/>
-        </w:pict>
-      </w:r>
-    </w:p>
-    <w:p>
-      <w:pPr>
-        <w:pStyle w:val="FirstParagraph"/>
+      <w:pPr>
+        <w:pStyle w:val="BodyText"/>
+      </w:pPr>
+      <w:r>
+        <w:t xml:space="preserve">✦ ✦ ✦</w:t>
+      </w:r>
+    </w:p>
+    <w:p>
+      <w:pPr>
+        <w:pStyle w:val="BodyText"/>
       </w:pPr>
       <w:r>
         <w:t xml:space="preserve">The NGA sent me a HireVue invitation in June 2024.</w:t>
@@ -5980,15 +6040,16 @@
       </w:r>
     </w:p>
     <w:p>
-      <w:r>
-        <w:pict>
-          <v:rect style="width:0;height:1.5pt" o:hralign="center" o:hrstd="t" o:hr="t"/>
-        </w:pict>
-      </w:r>
-    </w:p>
-    <w:p>
-      <w:pPr>
-        <w:pStyle w:val="FirstParagraph"/>
+      <w:pPr>
+        <w:pStyle w:val="BodyText"/>
+      </w:pPr>
+      <w:r>
+        <w:t xml:space="preserve">✦ ✦ ✦</w:t>
+      </w:r>
+    </w:p>
+    <w:p>
+      <w:pPr>
+        <w:pStyle w:val="BodyText"/>
       </w:pPr>
       <w:r>
         <w:t xml:space="preserve">Leidos ended in August 2023. The same month I started an intensive outpatient program: structured daily therapy for people whose depression has made ordinary functioning impossible. That’s what they left me with.</w:t>
@@ -6115,15 +6176,16 @@
       </w:r>
     </w:p>
     <w:p>
-      <w:r>
-        <w:pict>
-          <v:rect style="width:0;height:1.5pt" o:hralign="center" o:hrstd="t" o:hr="t"/>
-        </w:pict>
-      </w:r>
-    </w:p>
-    <w:p>
-      <w:pPr>
-        <w:pStyle w:val="FirstParagraph"/>
+      <w:pPr>
+        <w:pStyle w:val="BodyText"/>
+      </w:pPr>
+      <w:r>
+        <w:t xml:space="preserve">✦ ✦ ✦</w:t>
+      </w:r>
+    </w:p>
+    <w:p>
+      <w:pPr>
+        <w:pStyle w:val="BodyText"/>
       </w:pPr>
       <w:r>
         <w:t xml:space="preserve">At some point staying stopped being a question.</w:t>
@@ -6314,10 +6376,11 @@
       </w:r>
     </w:p>
     <w:p>
-      <w:r>
-        <w:pict>
-          <v:rect style="width:0;height:1.5pt" o:hralign="center" o:hrstd="t" o:hr="t"/>
-        </w:pict>
+      <w:pPr>
+        <w:pStyle w:val="BodyText"/>
+      </w:pPr>
+      <w:r>
+        <w:t xml:space="preserve">✦ ✦ ✦</w:t>
       </w:r>
     </w:p>
     <w:bookmarkEnd w:id="22"/>
@@ -6411,15 +6474,16 @@
       </w:r>
     </w:p>
     <w:p>
-      <w:r>
-        <w:pict>
-          <v:rect style="width:0;height:1.5pt" o:hralign="center" o:hrstd="t" o:hr="t"/>
-        </w:pict>
-      </w:r>
-    </w:p>
-    <w:p>
-      <w:pPr>
-        <w:pStyle w:val="FirstParagraph"/>
+      <w:pPr>
+        <w:pStyle w:val="BodyText"/>
+      </w:pPr>
+      <w:r>
+        <w:t xml:space="preserve">✦ ✦ ✦</w:t>
+      </w:r>
+    </w:p>
+    <w:p>
+      <w:pPr>
+        <w:pStyle w:val="BodyText"/>
       </w:pPr>
       <w:r>
         <w:t xml:space="preserve">By the time I found stable ground again I had a job and a life that had some shape to it. Not what I had before March 2023, not Navy Yard and a SECRET clearance and a presentation slot at the largest GIS conference in the world. But a real apartment, split with my boyfriend, in a place I actually liked. That mattered more than I expected it to.</w:t>
@@ -6518,15 +6582,16 @@
       </w:r>
     </w:p>
     <w:p>
-      <w:r>
-        <w:pict>
-          <v:rect style="width:0;height:1.5pt" o:hralign="center" o:hrstd="t" o:hr="t"/>
-        </w:pict>
-      </w:r>
-    </w:p>
-    <w:p>
-      <w:pPr>
-        <w:pStyle w:val="FirstParagraph"/>
+      <w:pPr>
+        <w:pStyle w:val="BodyText"/>
+      </w:pPr>
+      <w:r>
+        <w:t xml:space="preserve">✦ ✦ ✦</w:t>
+      </w:r>
+    </w:p>
+    <w:p>
+      <w:pPr>
+        <w:pStyle w:val="BodyText"/>
       </w:pPr>
       <w:r>
         <w:t xml:space="preserve">I called Representative Luna’s office in March 2026.</w:t>
@@ -6597,15 +6662,16 @@
       </w:r>
     </w:p>
     <w:p>
-      <w:r>
-        <w:pict>
-          <v:rect style="width:0;height:1.5pt" o:hralign="center" o:hrstd="t" o:hr="t"/>
-        </w:pict>
-      </w:r>
-    </w:p>
-    <w:p>
-      <w:pPr>
-        <w:pStyle w:val="FirstParagraph"/>
+      <w:pPr>
+        <w:pStyle w:val="BodyText"/>
+      </w:pPr>
+      <w:r>
+        <w:t xml:space="preserve">✦ ✦ ✦</w:t>
+      </w:r>
+    </w:p>
+    <w:p>
+      <w:pPr>
+        <w:pStyle w:val="BodyText"/>
       </w:pPr>
       <w:r>
         <w:t xml:space="preserve">Nothing has happened.</w:t>
@@ -6652,15 +6718,16 @@
       </w:r>
     </w:p>
     <w:p>
-      <w:r>
-        <w:pict>
-          <v:rect style="width:0;height:1.5pt" o:hralign="center" o:hrstd="t" o:hr="t"/>
-        </w:pict>
-      </w:r>
-    </w:p>
-    <w:p>
-      <w:pPr>
-        <w:pStyle w:val="FirstParagraph"/>
+      <w:pPr>
+        <w:pStyle w:val="BodyText"/>
+      </w:pPr>
+      <w:r>
+        <w:t xml:space="preserve">✦ ✦ ✦</w:t>
+      </w:r>
+    </w:p>
+    <w:p>
+      <w:pPr>
+        <w:pStyle w:val="BodyText"/>
       </w:pPr>
       <w:r>
         <w:t xml:space="preserve">If you are reading this, you are part of the record now.</w:t>

</xml_diff>

<commit_message>
Add KDP formatted book cover JPG
</commit_message>
<xml_diff>
--- a/Manuscript/Plausibly_Deniable_FORMATTED.docx
+++ b/Manuscript/Plausibly_Deniable_FORMATTED.docx
@@ -6,66 +6,6 @@
       <w:pPr>
         <w:pStyle w:val="Title"/>
       </w:pPr>
-      <w:r>
-        <w:rPr>
-          <w:noProof/>
-        </w:rPr>
-        <w:drawing>
-          <wp:anchor distT="0" distB="0" distL="114300" distR="114300" simplePos="0" relativeHeight="251658240" behindDoc="0" locked="0" layoutInCell="1" allowOverlap="1" wp14:anchorId="3B97A4AD" wp14:editId="15A53BE3">
-            <wp:simplePos x="0" y="0"/>
-            <wp:positionH relativeFrom="column">
-              <wp:posOffset>168275</wp:posOffset>
-            </wp:positionH>
-            <wp:positionV relativeFrom="paragraph">
-              <wp:posOffset>-240665</wp:posOffset>
-            </wp:positionV>
-            <wp:extent cx="5614035" cy="8565515"/>
-            <wp:effectExtent l="0" t="0" r="0" b="0"/>
-            <wp:wrapSquare wrapText="bothSides"/>
-            <wp:docPr id="142378858" name="Picture 1"/>
-            <wp:cNvGraphicFramePr>
-              <a:graphicFrameLocks xmlns:a="http://schemas.openxmlformats.org/drawingml/2006/main" noChangeAspect="1"/>
-            </wp:cNvGraphicFramePr>
-            <a:graphic xmlns:a="http://schemas.openxmlformats.org/drawingml/2006/main">
-              <a:graphicData uri="http://schemas.openxmlformats.org/drawingml/2006/picture">
-                <pic:pic xmlns:pic="http://schemas.openxmlformats.org/drawingml/2006/picture">
-                  <pic:nvPicPr>
-                    <pic:cNvPr id="142378858" name="Picture 142378858"/>
-                    <pic:cNvPicPr/>
-                  </pic:nvPicPr>
-                  <pic:blipFill>
-                    <a:blip r:embed="rId7">
-                      <a:extLst>
-                        <a:ext uri="{28A0092B-C50C-407E-A947-70E740481C1C}">
-                          <a14:useLocalDpi xmlns:a14="http://schemas.microsoft.com/office/drawing/2010/main" val="0"/>
-                        </a:ext>
-                      </a:extLst>
-                    </a:blip>
-                    <a:stretch>
-                      <a:fillRect/>
-                    </a:stretch>
-                  </pic:blipFill>
-                  <pic:spPr>
-                    <a:xfrm>
-                      <a:off x="0" y="0"/>
-                      <a:ext cx="5614035" cy="8565515"/>
-                    </a:xfrm>
-                    <a:prstGeom prst="rect">
-                      <a:avLst/>
-                    </a:prstGeom>
-                  </pic:spPr>
-                </pic:pic>
-              </a:graphicData>
-            </a:graphic>
-            <wp14:sizeRelH relativeFrom="page">
-              <wp14:pctWidth>0</wp14:pctWidth>
-            </wp14:sizeRelH>
-            <wp14:sizeRelV relativeFrom="page">
-              <wp14:pctHeight>0</wp14:pctHeight>
-            </wp14:sizeRelV>
-          </wp:anchor>
-        </w:drawing>
-      </w:r>
     </w:p>
     <w:p>
       <w:pPr>
@@ -110,11 +50,6 @@
       <w:pPr>
         <w:pStyle w:val="Title"/>
       </w:pPr>
-    </w:p>
-    <w:p>
-      <w:pPr>
-        <w:pStyle w:val="Title"/>
-      </w:pPr>
       <w:r>
         <w:t>“Plausibly Deniable”</w:t>
       </w:r>
@@ -143,7 +78,7 @@
         <w:pStyle w:val="Heading1"/>
         <w:spacing w:line="276" w:lineRule="auto"/>
       </w:pPr>
-      <w:bookmarkStart w:id="1" w:name="_Toc228105070"/>
+      <w:bookmarkStart w:id="1" w:name="_Toc228108884"/>
       <w:r>
         <w:lastRenderedPageBreak/>
         <w:t>Author’s Note</w:t>
@@ -310,7 +245,7 @@
         <w:pStyle w:val="Heading1"/>
         <w:spacing w:line="276" w:lineRule="auto"/>
       </w:pPr>
-      <w:bookmarkStart w:id="3" w:name="_Toc228105071"/>
+      <w:bookmarkStart w:id="3" w:name="_Toc228108885"/>
       <w:r>
         <w:lastRenderedPageBreak/>
         <w:t>Foreword</w:t>
@@ -663,7 +598,7 @@
           <w:r>
             <w:fldChar w:fldCharType="separate"/>
           </w:r>
-          <w:hyperlink w:anchor="_Toc228105070" w:history="1">
+          <w:hyperlink w:anchor="_Toc228108884" w:history="1">
             <w:r>
               <w:rPr>
                 <w:rStyle w:val="Hyperlink"/>
@@ -690,7 +625,7 @@
                 <w:noProof/>
                 <w:webHidden/>
               </w:rPr>
-              <w:instrText xml:space="preserve"> PAGEREF _Toc228105070 \h </w:instrText>
+              <w:instrText xml:space="preserve"> PAGEREF _Toc228108884 \h </w:instrText>
             </w:r>
             <w:r>
               <w:rPr>
@@ -710,7 +645,7 @@
                 <w:noProof/>
                 <w:webHidden/>
               </w:rPr>
-              <w:t>2</w:t>
+              <w:t>1</w:t>
             </w:r>
             <w:r>
               <w:rPr>
@@ -734,7 +669,7 @@
               <w14:ligatures w14:val="standardContextual"/>
             </w:rPr>
           </w:pPr>
-          <w:hyperlink w:anchor="_Toc228105071" w:history="1">
+          <w:hyperlink w:anchor="_Toc228108885" w:history="1">
             <w:r>
               <w:rPr>
                 <w:rStyle w:val="Hyperlink"/>
@@ -761,7 +696,7 @@
                 <w:noProof/>
                 <w:webHidden/>
               </w:rPr>
-              <w:instrText xml:space="preserve"> PAGEREF _Toc228105071 \h </w:instrText>
+              <w:instrText xml:space="preserve"> PAGEREF _Toc228108885 \h </w:instrText>
             </w:r>
             <w:r>
               <w:rPr>
@@ -781,7 +716,7 @@
                 <w:noProof/>
                 <w:webHidden/>
               </w:rPr>
-              <w:t>4</w:t>
+              <w:t>3</w:t>
             </w:r>
             <w:r>
               <w:rPr>
@@ -805,7 +740,7 @@
               <w14:ligatures w14:val="standardContextual"/>
             </w:rPr>
           </w:pPr>
-          <w:hyperlink w:anchor="_Toc228105072" w:history="1">
+          <w:hyperlink w:anchor="_Toc228108886" w:history="1">
             <w:r>
               <w:rPr>
                 <w:rStyle w:val="Hyperlink"/>
@@ -832,7 +767,7 @@
                 <w:noProof/>
                 <w:webHidden/>
               </w:rPr>
-              <w:instrText xml:space="preserve"> PAGEREF _Toc228105072 \h </w:instrText>
+              <w:instrText xml:space="preserve"> PAGEREF _Toc228108886 \h </w:instrText>
             </w:r>
             <w:r>
               <w:rPr>
@@ -852,7 +787,7 @@
                 <w:noProof/>
                 <w:webHidden/>
               </w:rPr>
-              <w:t>8</w:t>
+              <w:t>7</w:t>
             </w:r>
             <w:r>
               <w:rPr>
@@ -876,7 +811,7 @@
               <w14:ligatures w14:val="standardContextual"/>
             </w:rPr>
           </w:pPr>
-          <w:hyperlink w:anchor="_Toc228105073" w:history="1">
+          <w:hyperlink w:anchor="_Toc228108887" w:history="1">
             <w:r>
               <w:rPr>
                 <w:rStyle w:val="Hyperlink"/>
@@ -903,7 +838,7 @@
                 <w:noProof/>
                 <w:webHidden/>
               </w:rPr>
-              <w:instrText xml:space="preserve"> PAGEREF _Toc228105073 \h </w:instrText>
+              <w:instrText xml:space="preserve"> PAGEREF _Toc228108887 \h </w:instrText>
             </w:r>
             <w:r>
               <w:rPr>
@@ -923,7 +858,7 @@
                 <w:noProof/>
                 <w:webHidden/>
               </w:rPr>
-              <w:t>16</w:t>
+              <w:t>15</w:t>
             </w:r>
             <w:r>
               <w:rPr>
@@ -947,7 +882,7 @@
               <w14:ligatures w14:val="standardContextual"/>
             </w:rPr>
           </w:pPr>
-          <w:hyperlink w:anchor="_Toc228105074" w:history="1">
+          <w:hyperlink w:anchor="_Toc228108888" w:history="1">
             <w:r>
               <w:rPr>
                 <w:rStyle w:val="Hyperlink"/>
@@ -974,7 +909,7 @@
                 <w:noProof/>
                 <w:webHidden/>
               </w:rPr>
-              <w:instrText xml:space="preserve"> PAGEREF _Toc228105074 \h </w:instrText>
+              <w:instrText xml:space="preserve"> PAGEREF _Toc228108888 \h </w:instrText>
             </w:r>
             <w:r>
               <w:rPr>
@@ -994,7 +929,7 @@
                 <w:noProof/>
                 <w:webHidden/>
               </w:rPr>
-              <w:t>21</w:t>
+              <w:t>20</w:t>
             </w:r>
             <w:r>
               <w:rPr>
@@ -1018,7 +953,7 @@
               <w14:ligatures w14:val="standardContextual"/>
             </w:rPr>
           </w:pPr>
-          <w:hyperlink w:anchor="_Toc228105075" w:history="1">
+          <w:hyperlink w:anchor="_Toc228108889" w:history="1">
             <w:r>
               <w:rPr>
                 <w:rStyle w:val="Hyperlink"/>
@@ -1045,7 +980,7 @@
                 <w:noProof/>
                 <w:webHidden/>
               </w:rPr>
-              <w:instrText xml:space="preserve"> PAGEREF _Toc228105075 \h </w:instrText>
+              <w:instrText xml:space="preserve"> PAGEREF _Toc228108889 \h </w:instrText>
             </w:r>
             <w:r>
               <w:rPr>
@@ -1065,7 +1000,7 @@
                 <w:noProof/>
                 <w:webHidden/>
               </w:rPr>
-              <w:t>25</w:t>
+              <w:t>24</w:t>
             </w:r>
             <w:r>
               <w:rPr>
@@ -1089,7 +1024,7 @@
               <w14:ligatures w14:val="standardContextual"/>
             </w:rPr>
           </w:pPr>
-          <w:hyperlink w:anchor="_Toc228105076" w:history="1">
+          <w:hyperlink w:anchor="_Toc228108890" w:history="1">
             <w:r>
               <w:rPr>
                 <w:rStyle w:val="Hyperlink"/>
@@ -1116,7 +1051,7 @@
                 <w:noProof/>
                 <w:webHidden/>
               </w:rPr>
-              <w:instrText xml:space="preserve"> PAGEREF _Toc228105076 \h </w:instrText>
+              <w:instrText xml:space="preserve"> PAGEREF _Toc228108890 \h </w:instrText>
             </w:r>
             <w:r>
               <w:rPr>
@@ -1136,7 +1071,7 @@
                 <w:noProof/>
                 <w:webHidden/>
               </w:rPr>
-              <w:t>32</w:t>
+              <w:t>31</w:t>
             </w:r>
             <w:r>
               <w:rPr>
@@ -1160,7 +1095,7 @@
               <w14:ligatures w14:val="standardContextual"/>
             </w:rPr>
           </w:pPr>
-          <w:hyperlink w:anchor="_Toc228105077" w:history="1">
+          <w:hyperlink w:anchor="_Toc228108891" w:history="1">
             <w:r>
               <w:rPr>
                 <w:rStyle w:val="Hyperlink"/>
@@ -1187,7 +1122,7 @@
                 <w:noProof/>
                 <w:webHidden/>
               </w:rPr>
-              <w:instrText xml:space="preserve"> PAGEREF _Toc228105077 \h </w:instrText>
+              <w:instrText xml:space="preserve"> PAGEREF _Toc228108891 \h </w:instrText>
             </w:r>
             <w:r>
               <w:rPr>
@@ -1207,7 +1142,7 @@
                 <w:noProof/>
                 <w:webHidden/>
               </w:rPr>
-              <w:t>38</w:t>
+              <w:t>37</w:t>
             </w:r>
             <w:r>
               <w:rPr>
@@ -1231,7 +1166,7 @@
               <w14:ligatures w14:val="standardContextual"/>
             </w:rPr>
           </w:pPr>
-          <w:hyperlink w:anchor="_Toc228105078" w:history="1">
+          <w:hyperlink w:anchor="_Toc228108892" w:history="1">
             <w:r>
               <w:rPr>
                 <w:rStyle w:val="Hyperlink"/>
@@ -1258,7 +1193,7 @@
                 <w:noProof/>
                 <w:webHidden/>
               </w:rPr>
-              <w:instrText xml:space="preserve"> PAGEREF _Toc228105078 \h </w:instrText>
+              <w:instrText xml:space="preserve"> PAGEREF _Toc228108892 \h </w:instrText>
             </w:r>
             <w:r>
               <w:rPr>
@@ -1278,7 +1213,7 @@
                 <w:noProof/>
                 <w:webHidden/>
               </w:rPr>
-              <w:t>46</w:t>
+              <w:t>45</w:t>
             </w:r>
             <w:r>
               <w:rPr>
@@ -1302,7 +1237,7 @@
               <w14:ligatures w14:val="standardContextual"/>
             </w:rPr>
           </w:pPr>
-          <w:hyperlink w:anchor="_Toc228105079" w:history="1">
+          <w:hyperlink w:anchor="_Toc228108893" w:history="1">
             <w:r>
               <w:rPr>
                 <w:rStyle w:val="Hyperlink"/>
@@ -1329,7 +1264,7 @@
                 <w:noProof/>
                 <w:webHidden/>
               </w:rPr>
-              <w:instrText xml:space="preserve"> PAGEREF _Toc228105079 \h </w:instrText>
+              <w:instrText xml:space="preserve"> PAGEREF _Toc228108893 \h </w:instrText>
             </w:r>
             <w:r>
               <w:rPr>
@@ -1349,7 +1284,7 @@
                 <w:noProof/>
                 <w:webHidden/>
               </w:rPr>
-              <w:t>53</w:t>
+              <w:t>52</w:t>
             </w:r>
             <w:r>
               <w:rPr>
@@ -1373,7 +1308,7 @@
               <w14:ligatures w14:val="standardContextual"/>
             </w:rPr>
           </w:pPr>
-          <w:hyperlink w:anchor="_Toc228105080" w:history="1">
+          <w:hyperlink w:anchor="_Toc228108894" w:history="1">
             <w:r>
               <w:rPr>
                 <w:rStyle w:val="Hyperlink"/>
@@ -1400,7 +1335,7 @@
                 <w:noProof/>
                 <w:webHidden/>
               </w:rPr>
-              <w:instrText xml:space="preserve"> PAGEREF _Toc228105080 \h </w:instrText>
+              <w:instrText xml:space="preserve"> PAGEREF _Toc228108894 \h </w:instrText>
             </w:r>
             <w:r>
               <w:rPr>
@@ -1420,7 +1355,7 @@
                 <w:noProof/>
                 <w:webHidden/>
               </w:rPr>
-              <w:t>62</w:t>
+              <w:t>61</w:t>
             </w:r>
             <w:r>
               <w:rPr>
@@ -1444,7 +1379,7 @@
               <w14:ligatures w14:val="standardContextual"/>
             </w:rPr>
           </w:pPr>
-          <w:hyperlink w:anchor="_Toc228105081" w:history="1">
+          <w:hyperlink w:anchor="_Toc228108895" w:history="1">
             <w:r>
               <w:rPr>
                 <w:rStyle w:val="Hyperlink"/>
@@ -1471,7 +1406,7 @@
                 <w:noProof/>
                 <w:webHidden/>
               </w:rPr>
-              <w:instrText xml:space="preserve"> PAGEREF _Toc228105081 \h </w:instrText>
+              <w:instrText xml:space="preserve"> PAGEREF _Toc228108895 \h </w:instrText>
             </w:r>
             <w:r>
               <w:rPr>
@@ -1491,7 +1426,7 @@
                 <w:noProof/>
                 <w:webHidden/>
               </w:rPr>
-              <w:t>67</w:t>
+              <w:t>66</w:t>
             </w:r>
             <w:r>
               <w:rPr>
@@ -1523,7 +1458,7 @@
         <w:pStyle w:val="Heading1"/>
         <w:spacing w:line="276" w:lineRule="auto"/>
       </w:pPr>
-      <w:bookmarkStart w:id="5" w:name="_Toc228105072"/>
+      <w:bookmarkStart w:id="5" w:name="_Toc228108886"/>
       <w:r>
         <w:lastRenderedPageBreak/>
         <w:t>Chapter 1: The Offer</w:t>
@@ -2265,7 +2200,7 @@
         <w:pStyle w:val="Heading1"/>
         <w:spacing w:line="276" w:lineRule="auto"/>
       </w:pPr>
-      <w:bookmarkStart w:id="7" w:name="_Toc228105073"/>
+      <w:bookmarkStart w:id="7" w:name="_Toc228108887"/>
       <w:r>
         <w:lastRenderedPageBreak/>
         <w:t>Chapter 2: What I Saw</w:t>
@@ -2667,7 +2602,7 @@
         <w:pStyle w:val="Heading1"/>
         <w:spacing w:line="276" w:lineRule="auto"/>
       </w:pPr>
-      <w:bookmarkStart w:id="9" w:name="_Toc228105074"/>
+      <w:bookmarkStart w:id="9" w:name="_Toc228108888"/>
       <w:r>
         <w:lastRenderedPageBreak/>
         <w:t>Chapter 3: The Second Project</w:t>
@@ -2999,7 +2934,7 @@
         <w:spacing w:line="276" w:lineRule="auto"/>
       </w:pPr>
       <w:bookmarkStart w:id="10" w:name="chapter-4-inside"/>
-      <w:bookmarkStart w:id="11" w:name="_Toc228105075"/>
+      <w:bookmarkStart w:id="11" w:name="_Toc228108889"/>
       <w:bookmarkEnd w:id="8"/>
       <w:r>
         <w:lastRenderedPageBreak/>
@@ -3795,7 +3730,7 @@
         <w:pStyle w:val="Heading1"/>
         <w:spacing w:line="276" w:lineRule="auto"/>
       </w:pPr>
-      <w:bookmarkStart w:id="13" w:name="_Toc228105076"/>
+      <w:bookmarkStart w:id="13" w:name="_Toc228108890"/>
       <w:r>
         <w:lastRenderedPageBreak/>
         <w:t>Chapter 5: The Noise</w:t>
@@ -4478,7 +4413,7 @@
         <w:spacing w:line="276" w:lineRule="auto"/>
       </w:pPr>
       <w:bookmarkStart w:id="14" w:name="chapter-6-the-external-fight"/>
-      <w:bookmarkStart w:id="15" w:name="_Toc228105077"/>
+      <w:bookmarkStart w:id="15" w:name="_Toc228108891"/>
       <w:bookmarkEnd w:id="12"/>
       <w:r>
         <w:lastRenderedPageBreak/>
@@ -6102,7 +6037,7 @@
         <w:pStyle w:val="Heading1"/>
         <w:spacing w:line="276" w:lineRule="auto"/>
       </w:pPr>
-      <w:bookmarkStart w:id="21" w:name="_Toc228105078"/>
+      <w:bookmarkStart w:id="21" w:name="_Toc228108892"/>
       <w:r>
         <w:lastRenderedPageBreak/>
         <w:t>Chapter 7: Benson and Bartlett</w:t>
@@ -6920,7 +6855,7 @@
         <w:spacing w:line="276" w:lineRule="auto"/>
       </w:pPr>
       <w:bookmarkStart w:id="22" w:name="chapter-8-the-cost"/>
-      <w:bookmarkStart w:id="23" w:name="_Toc228105079"/>
+      <w:bookmarkStart w:id="23" w:name="_Toc228108893"/>
       <w:bookmarkEnd w:id="20"/>
       <w:r>
         <w:lastRenderedPageBreak/>
@@ -7734,7 +7669,7 @@
         <w:pStyle w:val="Heading1"/>
         <w:spacing w:line="276" w:lineRule="auto"/>
       </w:pPr>
-      <w:bookmarkStart w:id="25" w:name="_Toc228105080"/>
+      <w:bookmarkStart w:id="25" w:name="_Toc228108894"/>
       <w:r>
         <w:lastRenderedPageBreak/>
         <w:t>Epilogue: Still Fighting</w:t>
@@ -8205,7 +8140,7 @@
         <w:pStyle w:val="Heading1"/>
         <w:spacing w:line="276" w:lineRule="auto"/>
       </w:pPr>
-      <w:bookmarkStart w:id="27" w:name="_Toc228105081"/>
+      <w:bookmarkStart w:id="27" w:name="_Toc228108895"/>
       <w:r>
         <w:lastRenderedPageBreak/>
         <w:t>About the Author</w:t>
@@ -8267,8 +8202,8 @@
       <w:bookmarkEnd w:id="26"/>
     </w:p>
     <w:sectPr>
-      <w:footerReference w:type="even" r:id="rId8"/>
-      <w:footerReference w:type="default" r:id="rId9"/>
+      <w:footerReference w:type="even" r:id="rId7"/>
+      <w:footerReference w:type="default" r:id="rId8"/>
       <w:footnotePr>
         <w:numRestart w:val="eachSect"/>
       </w:footnotePr>

</xml_diff>

<commit_message>
Update Author's Note, Chapter 3 and 4, formatted docx manual edits
</commit_message>
<xml_diff>
--- a/Manuscript/Plausibly_Deniable_FORMATTED.docx
+++ b/Manuscript/Plausibly_Deniable_FORMATTED.docx
@@ -149,21 +149,39 @@
         <w:rPr>
           <w:rFonts w:ascii="Georgia" w:hAnsi="Georgia" w:cs="Times New Roman"/>
         </w:rPr>
-        <w:t>To Kyle, you are a scientist and a rational one. You never reached for the easy explanation. You heard everything and you stayed. You made me feel heard without question, without hesitation. You were my anchor through all of it and you are the reason I came home.</w:t>
-      </w:r>
-    </w:p>
-    <w:p>
-      <w:pPr>
-        <w:pStyle w:val="BodyText"/>
-        <w:spacing w:line="276" w:lineRule="auto"/>
+        <w:t>To Kyle, you are a scientist and a rational one. You never reached for the easy explanation. You heard everything and you stayed. You made me feel heard without question, without hesitation. You were my anchor through all of it</w:t>
+      </w:r>
+      <w:r>
         <w:rPr>
           <w:rFonts w:ascii="Georgia" w:hAnsi="Georgia" w:cs="Times New Roman"/>
         </w:rPr>
-      </w:pPr>
+        <w:t>.</w:t>
+      </w:r>
       <w:r>
         <w:rPr>
           <w:rFonts w:ascii="Georgia" w:hAnsi="Georgia" w:cs="Times New Roman"/>
         </w:rPr>
+        <w:t xml:space="preserve"> </w:t>
+      </w:r>
+      <w:r>
+        <w:rPr>
+          <w:rFonts w:ascii="Georgia" w:hAnsi="Georgia" w:cs="Times New Roman"/>
+        </w:rPr>
+        <w:t>You and my family are the reason I came home.</w:t>
+      </w:r>
+    </w:p>
+    <w:p>
+      <w:pPr>
+        <w:pStyle w:val="BodyText"/>
+        <w:spacing w:line="276" w:lineRule="auto"/>
+        <w:rPr>
+          <w:rFonts w:ascii="Georgia" w:hAnsi="Georgia" w:cs="Times New Roman"/>
+        </w:rPr>
+      </w:pPr>
+      <w:r>
+        <w:rPr>
+          <w:rFonts w:ascii="Georgia" w:hAnsi="Georgia" w:cs="Times New Roman"/>
+        </w:rPr>
         <w:t>To my family, I love you. What you went through during that period was not okay, and I want you to know I have never forgotten that. You were asked to make sense of something that was designed not to make sense. You did the best you could with what you were given.</w:t>
       </w:r>
     </w:p>
@@ -199,6 +217,21 @@
     </w:p>
     <w:p>
       <w:pPr>
+        <w:pStyle w:val="BodyText"/>
+        <w:spacing w:line="276" w:lineRule="auto"/>
+        <w:rPr>
+          <w:rFonts w:ascii="Georgia" w:hAnsi="Georgia" w:cs="Times New Roman"/>
+        </w:rPr>
+      </w:pPr>
+      <w:r>
+        <w:rPr>
+          <w:rFonts w:ascii="Georgia" w:hAnsi="Georgia" w:cs="Times New Roman"/>
+        </w:rPr>
+        <w:t>To my nieces and nephews — you are why I wrote this. Every page of it.</w:t>
+      </w:r>
+    </w:p>
+    <w:p>
+      <w:pPr>
         <w:spacing w:line="276" w:lineRule="auto"/>
         <w:jc w:val="center"/>
         <w:rPr>
@@ -284,14 +317,8 @@
         <w:rPr>
           <w:rFonts w:ascii="Georgia" w:hAnsi="Georgia" w:cs="Times New Roman"/>
         </w:rPr>
-        <w:t xml:space="preserve">The documents in this book are real. The dates are real. The names are real. The contradiction at the center of this account — an eleven-message Air Force email chain </w:t>
-      </w:r>
-      <w:r>
-        <w:rPr>
-          <w:rFonts w:ascii="Georgia" w:hAnsi="Georgia" w:cs="Times New Roman"/>
-        </w:rPr>
         <w:lastRenderedPageBreak/>
-        <w:t>on one side, a Pentagon official’s denial to a United States Senator on the other — is not a matter of interpretation. It is a matter of record.</w:t>
+        <w:t>The documents in this book are real. The dates are real. The names are real. The contradiction at the center of this account — an eleven-message Air Force email chain on one side, a Pentagon official’s denial to a United States Senator on the other — is not a matter of interpretation. It is a matter of record.</w:t>
       </w:r>
     </w:p>
     <w:p>
@@ -3953,6 +3980,21 @@
         <w:rPr>
           <w:rFonts w:ascii="Georgia" w:hAnsi="Georgia"/>
         </w:rPr>
+        <w:t>Leidos had provided a compromised machine to a contractor they were positioning for a covert operation. That was not a coincidence.</w:t>
+      </w:r>
+    </w:p>
+    <w:p>
+      <w:pPr>
+        <w:pStyle w:val="BodyText"/>
+        <w:spacing w:line="276" w:lineRule="auto"/>
+        <w:rPr>
+          <w:rFonts w:ascii="Georgia" w:hAnsi="Georgia"/>
+        </w:rPr>
+      </w:pPr>
+      <w:r>
+        <w:rPr>
+          <w:rFonts w:ascii="Georgia" w:hAnsi="Georgia"/>
+        </w:rPr>
         <w:t>I came in more than once during that period. Getting the laptop sorted. Getting set up. New chargers. A YubiKey — a physical hardware security token used for two-factor authentication on sensitive systems. I noted that too, the way I had noted the uncleared laptop. Financial dashboards don’t typically require that level of access infrastructure. I didn’t say anything. I was new. I told myself there were things about government contracting I didn’t fully understand yet.</w:t>
       </w:r>
     </w:p>
@@ -4028,22 +4070,28 @@
         <w:rPr>
           <w:rFonts w:ascii="Georgia" w:hAnsi="Georgia"/>
         </w:rPr>
-        <w:t>Looking back, it felt like a warning. I still can’t tell you exactly what she was warning me about. I don’t know if she knew what was coming or whether she was simply a person who had seen enough of this world to understand that some situations have predictable endings. What I know is that it never sat right with me. And I know that after everything happened — after March 2nd, after all of it — she never reached out.</w:t>
-      </w:r>
-    </w:p>
-    <w:p>
-      <w:pPr>
-        <w:pStyle w:val="BodyText"/>
-        <w:spacing w:line="276" w:lineRule="auto"/>
-        <w:rPr>
-          <w:rFonts w:ascii="Georgia" w:hAnsi="Georgia"/>
-        </w:rPr>
-      </w:pPr>
+        <w:t xml:space="preserve">Looking back, it felt like a warning. I still can’t tell you exactly what she was warning me about. I don’t know if she knew what was coming or whether she was simply a person </w:t>
+      </w:r>
       <w:r>
         <w:rPr>
           <w:rFonts w:ascii="Georgia" w:hAnsi="Georgia"/>
         </w:rPr>
         <w:lastRenderedPageBreak/>
+        <w:t>who had seen enough of this world to understand that some situations have predictable endings. What I know is that it never sat right with me. And I know that after everything happened — after March 2nd, after all of it — she never reached out.</w:t>
+      </w:r>
+    </w:p>
+    <w:p>
+      <w:pPr>
+        <w:pStyle w:val="BodyText"/>
+        <w:spacing w:line="276" w:lineRule="auto"/>
+        <w:rPr>
+          <w:rFonts w:ascii="Georgia" w:hAnsi="Georgia"/>
+        </w:rPr>
+      </w:pPr>
+      <w:r>
+        <w:rPr>
+          <w:rFonts w:ascii="Georgia" w:hAnsi="Georgia"/>
+        </w:rPr>
         <w:t>The last email I received from her read:</w:t>
       </w:r>
     </w:p>
@@ -4166,7 +4214,14 @@
         <w:rPr>
           <w:rFonts w:ascii="Georgia" w:hAnsi="Georgia"/>
         </w:rPr>
-        <w:t>I was happy to be there. I want to say that clearly because it matters for everything that follows. I wasn’t suspicious. I wasn’t looking for exits. I was a contractor who had built something real, whose abstract had been accepted at the largest GIS conference in the world, who was now sitting in a dim room in a Capitol Hill office getting set up for a new project with senior people who knew his name.</w:t>
+        <w:t xml:space="preserve">I was happy to be there. I want to say that clearly because it matters for everything that follows. I wasn’t suspicious. I wasn’t looking for exits. I was a contractor who had built something real, whose abstract had been accepted at the largest GIS conference in the </w:t>
+      </w:r>
+      <w:r>
+        <w:rPr>
+          <w:rFonts w:ascii="Georgia" w:hAnsi="Georgia"/>
+        </w:rPr>
+        <w:lastRenderedPageBreak/>
+        <w:t>world, who was now sitting in a dim room in a Capitol Hill office getting set up for a new project with senior people who knew his name.</w:t>
       </w:r>
     </w:p>
     <w:p>
@@ -4196,7 +4251,6 @@
         <w:rPr>
           <w:rFonts w:ascii="Georgia" w:hAnsi="Georgia"/>
         </w:rPr>
-        <w:lastRenderedPageBreak/>
         <w:t>I never built the dashboards.</w:t>
       </w:r>
     </w:p>
@@ -4377,6 +4431,36 @@
         <w:rPr>
           <w:rFonts w:ascii="Georgia" w:hAnsi="Georgia"/>
         </w:rPr>
+        <w:t>The first thing I did when I got home was ask my parents to help me find a lawyer. I don't remember which one they found. What I remember is telling my mother repeatedly that day. I need a lawyer. Not because I didn't know what had happened. Because I did.</w:t>
+      </w:r>
+    </w:p>
+    <w:p>
+      <w:pPr>
+        <w:pStyle w:val="FirstParagraph"/>
+        <w:spacing w:line="276" w:lineRule="auto"/>
+        <w:rPr>
+          <w:rFonts w:ascii="Georgia" w:hAnsi="Georgia"/>
+        </w:rPr>
+      </w:pPr>
+      <w:r>
+        <w:rPr>
+          <w:rFonts w:ascii="Georgia" w:hAnsi="Georgia"/>
+        </w:rPr>
+        <w:t>On March 5th, two days after I got home and two days before Brooke Glen, I sent a fax to the DHS Office of Inspector General. I described what had happened. I signed my name to it. I was functioning on almost no sleep and the most destabilizing week of my life, and I filed a federal complaint anyway. That document exists. It is dated March 5, 2023.</w:t>
+      </w:r>
+    </w:p>
+    <w:p>
+      <w:pPr>
+        <w:pStyle w:val="FirstParagraph"/>
+        <w:spacing w:line="276" w:lineRule="auto"/>
+        <w:rPr>
+          <w:rFonts w:ascii="Georgia" w:hAnsi="Georgia"/>
+        </w:rPr>
+      </w:pPr>
+      <w:r>
+        <w:rPr>
+          <w:rFonts w:ascii="Georgia" w:hAnsi="Georgia"/>
+        </w:rPr>
         <w:t>I was admitted to Brooke Glen Behavioral Health on March 7th, 2023. By that point the sequence of events since March 2nd had made that outcome feel inevitable to everyone around me.</w:t>
       </w:r>
     </w:p>
@@ -4510,6 +4594,7 @@
         <w:rPr>
           <w:rFonts w:ascii="Georgia" w:hAnsi="Georgia"/>
         </w:rPr>
+        <w:lastRenderedPageBreak/>
         <w:t>Two of the men there were military. I registered that the way you register certain things when your pattern recognition has been running hot for weeks. You notice. You file it. You don’t say anything because there is no one to say it to.</w:t>
       </w:r>
     </w:p>
@@ -4554,14 +4639,7 @@
         <w:rPr>
           <w:rFonts w:ascii="Georgia" w:hAnsi="Georgia"/>
         </w:rPr>
-        <w:t xml:space="preserve"> is not a statement that plays well in a psychiatric facility. I had already learned </w:t>
-      </w:r>
-      <w:r>
-        <w:rPr>
-          <w:rFonts w:ascii="Georgia" w:hAnsi="Georgia"/>
-        </w:rPr>
-        <w:lastRenderedPageBreak/>
-        <w:t>that. I was in the facility because of what happened when people decided what my perceptions meant.</w:t>
+        <w:t xml:space="preserve"> is not a statement that plays well in a psychiatric facility. I had already learned that. I was in the facility because of what happened when people decided what my perceptions meant.</w:t>
       </w:r>
     </w:p>
     <w:p>
@@ -4725,7 +4803,14 @@
         <w:rPr>
           <w:rFonts w:ascii="Georgia" w:hAnsi="Georgia"/>
         </w:rPr>
-        <w:t>He was on the floor. The paramedics were already there or arrived very quickly — that part is compressed in the way emergency moments compress. What I remember clearly is the stretcher. The body on it. The particular stillness of someone who has gone somewhere else and may not come back.</w:t>
+        <w:t xml:space="preserve">He was on the floor. The paramedics were already there or arrived very quickly — that part is compressed in the way emergency moments compress. What I remember clearly </w:t>
+      </w:r>
+      <w:r>
+        <w:rPr>
+          <w:rFonts w:ascii="Georgia" w:hAnsi="Georgia"/>
+        </w:rPr>
+        <w:lastRenderedPageBreak/>
+        <w:t>is the stretcher. The body on it. The particular stillness of someone who has gone somewhere else and may not come back.</w:t>
       </w:r>
     </w:p>
     <w:p>
@@ -4755,68 +4840,354 @@
         <w:rPr>
           <w:rFonts w:ascii="Georgia" w:hAnsi="Georgia"/>
         </w:rPr>
+        <w:t>I stood there and understood something I could not say to anyone in that building.</w:t>
+      </w:r>
+    </w:p>
+    <w:p>
+      <w:pPr>
+        <w:pStyle w:val="BodyText"/>
+        <w:spacing w:line="276" w:lineRule="auto"/>
+        <w:rPr>
+          <w:rFonts w:ascii="Georgia" w:hAnsi="Georgia"/>
+        </w:rPr>
+      </w:pPr>
+      <w:r>
+        <w:rPr>
+          <w:rFonts w:ascii="Georgia" w:hAnsi="Georgia"/>
+        </w:rPr>
+        <w:t>That was supposed to be me.</w:t>
+      </w:r>
+    </w:p>
+    <w:p>
+      <w:pPr>
+        <w:pStyle w:val="BodyText"/>
+        <w:spacing w:line="276" w:lineRule="auto"/>
+        <w:rPr>
+          <w:rFonts w:ascii="Georgia" w:hAnsi="Georgia"/>
+        </w:rPr>
+      </w:pPr>
+      <w:r>
+        <w:rPr>
+          <w:rFonts w:ascii="Georgia" w:hAnsi="Georgia"/>
+        </w:rPr>
+        <w:t>Not him specifically — I didn’t know him, not really. But the shape of it. The pills. The timing. The system that was supposed to be keeping you safe being the same system that handed you the means. I had poured my pills down the drain at midnight. I had read the sentence. And now I was watching the sentence play out on someone else’s body and I was supposed to have no context for it.</w:t>
+      </w:r>
+    </w:p>
+    <w:p>
+      <w:pPr>
+        <w:pStyle w:val="BodyText"/>
+        <w:spacing w:line="276" w:lineRule="auto"/>
+        <w:rPr>
+          <w:rFonts w:ascii="Georgia" w:hAnsi="Georgia"/>
+        </w:rPr>
+      </w:pPr>
+      <w:r>
+        <w:rPr>
+          <w:rFonts w:ascii="Georgia" w:hAnsi="Georgia"/>
+        </w:rPr>
+        <w:t>I had context. I didn’t sleep that night either.</w:t>
+      </w:r>
+    </w:p>
+    <w:p>
+      <w:pPr>
+        <w:pStyle w:val="BodyText"/>
+        <w:spacing w:line="276" w:lineRule="auto"/>
+        <w:rPr>
+          <w:rFonts w:ascii="Georgia" w:hAnsi="Georgia"/>
+        </w:rPr>
+      </w:pPr>
+      <w:r>
+        <w:rPr>
+          <w:rFonts w:ascii="Georgia" w:hAnsi="Georgia"/>
+        </w:rPr>
+        <w:t>They discharged me from Brooke Glen after seven days.</w:t>
+      </w:r>
+    </w:p>
+    <w:p>
+      <w:pPr>
+        <w:spacing w:line="276" w:lineRule="auto"/>
+        <w:jc w:val="center"/>
+        <w:rPr>
+          <w:rFonts w:ascii="Georgia" w:hAnsi="Georgia"/>
+        </w:rPr>
+      </w:pPr>
+      <w:r>
+        <w:rPr>
+          <w:rFonts w:ascii="Georgia" w:hAnsi="Georgia"/>
+        </w:rPr>
+        <w:t>***</w:t>
+      </w:r>
+    </w:p>
+    <w:p>
+      <w:pPr>
+        <w:pStyle w:val="FirstParagraph"/>
+        <w:spacing w:line="276" w:lineRule="auto"/>
+        <w:rPr>
+          <w:rFonts w:ascii="Georgia" w:hAnsi="Georgia"/>
+        </w:rPr>
+      </w:pPr>
+      <w:r>
+        <w:rPr>
+          <w:rFonts w:ascii="Georgia" w:hAnsi="Georgia"/>
+        </w:rPr>
+        <w:t>I had already started driving back to DC when I stopped.</w:t>
+      </w:r>
+    </w:p>
+    <w:p>
+      <w:pPr>
+        <w:pStyle w:val="BodyText"/>
+        <w:spacing w:line="276" w:lineRule="auto"/>
+        <w:rPr>
+          <w:rFonts w:ascii="Georgia" w:hAnsi="Georgia"/>
+        </w:rPr>
+      </w:pPr>
+      <w:r>
+        <w:rPr>
+          <w:rFonts w:ascii="Georgia" w:hAnsi="Georgia"/>
+        </w:rPr>
+        <w:t>Somewhere in Pennsylvania, maybe 45 minutes from home, close enough that turning around was still a real option. I pulled over and called my mother. I told her I couldn’t go back.</w:t>
+      </w:r>
+    </w:p>
+    <w:p>
+      <w:pPr>
+        <w:pStyle w:val="BodyText"/>
+        <w:spacing w:line="276" w:lineRule="auto"/>
+        <w:rPr>
+          <w:rFonts w:ascii="Georgia" w:hAnsi="Georgia"/>
+        </w:rPr>
+      </w:pPr>
+      <w:r>
+        <w:rPr>
+          <w:rFonts w:ascii="Georgia" w:hAnsi="Georgia"/>
+        </w:rPr>
+        <w:t>She was trying. I believe that. The specifics of what she said are gone but the shape of it remains — she was offering home, the possibility that this was over, that the simple thing was the right thing. The sound of a person who loved me trying to find the version of this that made sense.</w:t>
+      </w:r>
+    </w:p>
+    <w:p>
+      <w:pPr>
+        <w:pStyle w:val="BodyText"/>
+        <w:spacing w:line="276" w:lineRule="auto"/>
+        <w:rPr>
+          <w:rFonts w:ascii="Georgia" w:hAnsi="Georgia"/>
+        </w:rPr>
+      </w:pPr>
+      <w:r>
+        <w:rPr>
+          <w:rFonts w:ascii="Georgia" w:hAnsi="Georgia"/>
+        </w:rPr>
+        <w:t>I looked at the navigation while she talked.</w:t>
+      </w:r>
+    </w:p>
+    <w:p>
+      <w:pPr>
+        <w:pStyle w:val="BodyText"/>
+        <w:spacing w:line="276" w:lineRule="auto"/>
+        <w:rPr>
+          <w:rFonts w:ascii="Georgia" w:hAnsi="Georgia"/>
+        </w:rPr>
+      </w:pPr>
+      <w:r>
+        <w:rPr>
+          <w:rFonts w:ascii="Georgia" w:hAnsi="Georgia"/>
+        </w:rPr>
+        <w:t>My Polestar had filled in a destination. I hadn’t touched it. I hadn’t entered anything. The screen showed Riverside, California — 2,700 miles, turn left, here is your route, here is where you are going next.</w:t>
+      </w:r>
+    </w:p>
+    <w:p>
+      <w:pPr>
+        <w:pStyle w:val="BodyText"/>
+        <w:spacing w:line="276" w:lineRule="auto"/>
+        <w:rPr>
+          <w:rFonts w:ascii="Georgia" w:hAnsi="Georgia"/>
+        </w:rPr>
+      </w:pPr>
+      <w:r>
+        <w:rPr>
+          <w:rFonts w:ascii="Georgia" w:hAnsi="Georgia"/>
+        </w:rPr>
         <w:lastRenderedPageBreak/>
-        <w:t>I stood there and understood something I could not say to anyone in that building.</w:t>
-      </w:r>
-    </w:p>
-    <w:p>
-      <w:pPr>
-        <w:pStyle w:val="BodyText"/>
-        <w:spacing w:line="276" w:lineRule="auto"/>
-        <w:rPr>
-          <w:rFonts w:ascii="Georgia" w:hAnsi="Georgia"/>
-        </w:rPr>
-      </w:pPr>
-      <w:r>
-        <w:rPr>
-          <w:rFonts w:ascii="Georgia" w:hAnsi="Georgia"/>
-        </w:rPr>
-        <w:t>That was supposed to be me.</w:t>
-      </w:r>
-    </w:p>
-    <w:p>
-      <w:pPr>
-        <w:pStyle w:val="BodyText"/>
-        <w:spacing w:line="276" w:lineRule="auto"/>
-        <w:rPr>
-          <w:rFonts w:ascii="Georgia" w:hAnsi="Georgia"/>
-        </w:rPr>
-      </w:pPr>
-      <w:r>
-        <w:rPr>
-          <w:rFonts w:ascii="Georgia" w:hAnsi="Georgia"/>
-        </w:rPr>
-        <w:t>Not him specifically — I didn’t know him, not really. But the shape of it. The pills. The timing. The system that was supposed to be keeping you safe being the same system that handed you the means. I had poured my pills down the drain at midnight. I had read the sentence. And now I was watching the sentence play out on someone else’s body and I was supposed to have no context for it.</w:t>
-      </w:r>
-    </w:p>
-    <w:p>
-      <w:pPr>
-        <w:pStyle w:val="BodyText"/>
-        <w:spacing w:line="276" w:lineRule="auto"/>
-        <w:rPr>
-          <w:rFonts w:ascii="Georgia" w:hAnsi="Georgia"/>
-        </w:rPr>
-      </w:pPr>
-      <w:r>
-        <w:rPr>
-          <w:rFonts w:ascii="Georgia" w:hAnsi="Georgia"/>
-        </w:rPr>
-        <w:t>I had context. I didn’t sleep that night either.</w:t>
-      </w:r>
-    </w:p>
-    <w:p>
-      <w:pPr>
-        <w:pStyle w:val="BodyText"/>
-        <w:spacing w:line="276" w:lineRule="auto"/>
-        <w:rPr>
-          <w:rFonts w:ascii="Georgia" w:hAnsi="Georgia"/>
-        </w:rPr>
-      </w:pPr>
-      <w:r>
-        <w:rPr>
-          <w:rFonts w:ascii="Georgia" w:hAnsi="Georgia"/>
-        </w:rPr>
-        <w:t>They discharged me from Brooke Glen after seven days.</w:t>
+        <w:t>Riverside was where the CBP job was. The one I had applied for on February 23rd, one week before March 2nd. The announcement had closed on March 7th — the same day I was admitted to Brooke Glen.</w:t>
+      </w:r>
+    </w:p>
+    <w:p>
+      <w:pPr>
+        <w:pStyle w:val="BodyText"/>
+        <w:spacing w:line="276" w:lineRule="auto"/>
+        <w:rPr>
+          <w:rFonts w:ascii="Georgia" w:hAnsi="Georgia"/>
+        </w:rPr>
+      </w:pPr>
+      <w:r>
+        <w:rPr>
+          <w:rFonts w:ascii="Georgia" w:hAnsi="Georgia"/>
+        </w:rPr>
+        <w:t>I didn’t tell my mother about the screen. There was no version of that sentence that helped anything. She was offering home and the car was offering Riverside and I was somewhere between the two of them, 45 minutes from a place I had grown up in, unable to go forward and not yet able to go back.</w:t>
+      </w:r>
+    </w:p>
+    <w:p>
+      <w:pPr>
+        <w:pStyle w:val="BodyText"/>
+        <w:spacing w:line="276" w:lineRule="auto"/>
+        <w:rPr>
+          <w:rFonts w:ascii="Georgia" w:hAnsi="Georgia"/>
+        </w:rPr>
+      </w:pPr>
+      <w:r>
+        <w:rPr>
+          <w:rFonts w:ascii="Georgia" w:hAnsi="Georgia"/>
+        </w:rPr>
+        <w:t>I went back.</w:t>
+      </w:r>
+    </w:p>
+    <w:p>
+      <w:pPr>
+        <w:pStyle w:val="BodyText"/>
+        <w:spacing w:line="276" w:lineRule="auto"/>
+        <w:rPr>
+          <w:rFonts w:ascii="Georgia" w:hAnsi="Georgia"/>
+        </w:rPr>
+      </w:pPr>
+      <w:r>
+        <w:rPr>
+          <w:rFonts w:ascii="Georgia" w:hAnsi="Georgia"/>
+        </w:rPr>
+        <w:t>During that period I called Leidos. More than once. I have a text from Zoey confirming she received one of my voicemails. I was not calling to ask for help. I was calling to put them on notice — that I intended to pursue arbitration, that I was not going to let this go quietly.</w:t>
+      </w:r>
+    </w:p>
+    <w:p>
+      <w:pPr>
+        <w:pStyle w:val="BodyText"/>
+        <w:spacing w:line="276" w:lineRule="auto"/>
+        <w:rPr>
+          <w:rFonts w:ascii="Georgia" w:hAnsi="Georgia"/>
+        </w:rPr>
+      </w:pPr>
+      <w:r>
+        <w:rPr>
+          <w:rFonts w:ascii="Georgia" w:hAnsi="Georgia"/>
+        </w:rPr>
+        <w:t>At some point during those communications she said it.</w:t>
+      </w:r>
+    </w:p>
+    <w:p>
+      <w:pPr>
+        <w:pStyle w:val="BodyText"/>
+        <w:spacing w:line="276" w:lineRule="auto"/>
+        <w:rPr>
+          <w:rFonts w:ascii="Georgia" w:hAnsi="Georgia"/>
+        </w:rPr>
+      </w:pPr>
+      <w:r>
+        <w:rPr>
+          <w:rFonts w:ascii="Georgia" w:hAnsi="Georgia"/>
+        </w:rPr>
+        <w:t>“We don’t want things to get messy.”</w:t>
+      </w:r>
+    </w:p>
+    <w:p>
+      <w:pPr>
+        <w:pStyle w:val="BodyText"/>
+        <w:spacing w:line="276" w:lineRule="auto"/>
+        <w:rPr>
+          <w:rFonts w:ascii="Georgia" w:hAnsi="Georgia"/>
+        </w:rPr>
+      </w:pPr>
+      <w:r>
+        <w:rPr>
+          <w:rFonts w:ascii="Georgia" w:hAnsi="Georgia"/>
+        </w:rPr>
+        <w:t>I know what that meant. An institution that had just watched one of its contractors get hospitalized, lose his access and lose his evidence was telling him that pursuing accountability would be inconvenient for them. Dressed up as HR language. Delivered to a person who had just gotten out of a psychiatric facility.</w:t>
+      </w:r>
+    </w:p>
+    <w:p>
+      <w:pPr>
+        <w:pStyle w:val="BodyText"/>
+        <w:spacing w:line="276" w:lineRule="auto"/>
+        <w:rPr>
+          <w:rFonts w:ascii="Georgia" w:hAnsi="Georgia"/>
+        </w:rPr>
+      </w:pPr>
+      <w:r>
+        <w:rPr>
+          <w:rFonts w:ascii="Georgia" w:hAnsi="Georgia"/>
+        </w:rPr>
+        <w:t>The calls from that period are mostly gone. I got a new phone number afterward. The text from Zoey is what remains.</w:t>
+      </w:r>
+    </w:p>
+    <w:p>
+      <w:pPr>
+        <w:pStyle w:val="BodyText"/>
+        <w:spacing w:line="276" w:lineRule="auto"/>
+        <w:rPr>
+          <w:rFonts w:ascii="Georgia" w:hAnsi="Georgia"/>
+        </w:rPr>
+      </w:pPr>
+      <w:r>
+        <w:rPr>
+          <w:rFonts w:ascii="Georgia" w:hAnsi="Georgia"/>
+        </w:rPr>
+        <w:t>The following day the accident happened.</w:t>
+      </w:r>
+    </w:p>
+    <w:p>
+      <w:pPr>
+        <w:pStyle w:val="BodyText"/>
+        <w:spacing w:line="276" w:lineRule="auto"/>
+        <w:rPr>
+          <w:rFonts w:ascii="Georgia" w:hAnsi="Georgia"/>
+        </w:rPr>
+      </w:pPr>
+      <w:r>
+        <w:rPr>
+          <w:rFonts w:ascii="Georgia" w:hAnsi="Georgia"/>
+        </w:rPr>
+        <w:t>I will not put the details on this page. What I’ll tell you is that by that point I had not slept properly in nearly two weeks — five days from March 2nd through admission, seven more days at Brooke Glen where the medication was supposed to help and didn’t, not really, not in any way that felt like actual rest. They had taken me off the medications I knew and put me on ones I didn’t. The ground under every thought had been shifting for two weeks straight. I was not the same person who had driven to Dunkin’ Donuts on the morning of March 2nd and ordered a medium coffee, half-decaf, half-regular, and thought the day was going to be ordinary.</w:t>
+      </w:r>
+    </w:p>
+    <w:p>
+      <w:pPr>
+        <w:pStyle w:val="BodyText"/>
+        <w:spacing w:line="276" w:lineRule="auto"/>
+        <w:rPr>
+          <w:rFonts w:ascii="Georgia" w:hAnsi="Georgia"/>
+        </w:rPr>
+      </w:pPr>
+      <w:r>
+        <w:rPr>
+          <w:rFonts w:ascii="Georgia" w:hAnsi="Georgia"/>
+        </w:rPr>
+        <w:t>What I’ll tell you is that my family initiated the 302 that followed.</w:t>
+      </w:r>
+    </w:p>
+    <w:p>
+      <w:pPr>
+        <w:pStyle w:val="BodyText"/>
+        <w:spacing w:line="276" w:lineRule="auto"/>
+        <w:rPr>
+          <w:rFonts w:ascii="Georgia" w:hAnsi="Georgia"/>
+        </w:rPr>
+      </w:pPr>
+      <w:r>
+        <w:rPr>
+          <w:rFonts w:ascii="Georgia" w:hAnsi="Georgia"/>
+        </w:rPr>
+        <w:t>A 302 is an involuntary psychiatric commitment under Pennsylvania law. Someone signs their name to a document stating that you cannot make certain determinations for yourself and that keeping you safe requires removing your ability to choose. It means the next facility doesn’t ask if you want to come in.</w:t>
+      </w:r>
+    </w:p>
+    <w:p>
+      <w:pPr>
+        <w:pStyle w:val="BodyText"/>
+        <w:spacing w:line="276" w:lineRule="auto"/>
+        <w:rPr>
+          <w:rFonts w:ascii="Georgia" w:hAnsi="Georgia"/>
+        </w:rPr>
+      </w:pPr>
+      <w:r>
+        <w:rPr>
+          <w:rFonts w:ascii="Georgia" w:hAnsi="Georgia"/>
+        </w:rPr>
+        <w:lastRenderedPageBreak/>
+        <w:t>I didn’t get to say no.</w:t>
       </w:r>
     </w:p>
     <w:p>
@@ -4846,329 +5217,338 @@
         <w:rPr>
           <w:rFonts w:ascii="Georgia" w:hAnsi="Georgia"/>
         </w:rPr>
-        <w:t>I had already started driving back to DC when I stopped.</w:t>
-      </w:r>
-    </w:p>
-    <w:p>
-      <w:pPr>
-        <w:pStyle w:val="BodyText"/>
-        <w:spacing w:line="276" w:lineRule="auto"/>
-        <w:rPr>
-          <w:rFonts w:ascii="Georgia" w:hAnsi="Georgia"/>
-        </w:rPr>
-      </w:pPr>
-      <w:r>
-        <w:rPr>
-          <w:rFonts w:ascii="Georgia" w:hAnsi="Georgia"/>
-        </w:rPr>
-        <w:t>Somewhere in Pennsylvania, maybe 45 minutes from home, close enough that turning around was still a real option. I pulled over and called my mother. I told her I couldn’t go back.</w:t>
-      </w:r>
-    </w:p>
-    <w:p>
-      <w:pPr>
-        <w:pStyle w:val="BodyText"/>
-        <w:spacing w:line="276" w:lineRule="auto"/>
-        <w:rPr>
-          <w:rFonts w:ascii="Georgia" w:hAnsi="Georgia"/>
-        </w:rPr>
-      </w:pPr>
-      <w:r>
-        <w:rPr>
-          <w:rFonts w:ascii="Georgia" w:hAnsi="Georgia"/>
-        </w:rPr>
-        <w:t>She was trying. I believe that. The specifics of what she said are gone but the shape of it remains — she was offering home, the possibility that this was over, that the simple thing was the right thing. The sound of a person who loved me trying to find the version of this that made sense.</w:t>
-      </w:r>
-    </w:p>
-    <w:p>
-      <w:pPr>
-        <w:pStyle w:val="BodyText"/>
-        <w:spacing w:line="276" w:lineRule="auto"/>
-        <w:rPr>
-          <w:rFonts w:ascii="Georgia" w:hAnsi="Georgia"/>
-        </w:rPr>
-      </w:pPr>
-      <w:r>
-        <w:rPr>
-          <w:rFonts w:ascii="Georgia" w:hAnsi="Georgia"/>
-        </w:rPr>
-        <w:t>I looked at the navigation while she talked.</w:t>
-      </w:r>
-    </w:p>
-    <w:p>
-      <w:pPr>
-        <w:pStyle w:val="BodyText"/>
-        <w:spacing w:line="276" w:lineRule="auto"/>
-        <w:rPr>
-          <w:rFonts w:ascii="Georgia" w:hAnsi="Georgia"/>
-        </w:rPr>
-      </w:pPr>
-      <w:r>
-        <w:rPr>
-          <w:rFonts w:ascii="Georgia" w:hAnsi="Georgia"/>
-        </w:rPr>
-        <w:t>My Polestar had filled in a destination. I hadn’t touched it. I hadn’t entered anything. The screen showed Riverside, California — 2,700 miles, turn left, here is your route, here is where you are going next.</w:t>
-      </w:r>
-    </w:p>
-    <w:p>
-      <w:pPr>
-        <w:pStyle w:val="BodyText"/>
-        <w:spacing w:line="276" w:lineRule="auto"/>
-        <w:rPr>
-          <w:rFonts w:ascii="Georgia" w:hAnsi="Georgia"/>
-        </w:rPr>
-      </w:pPr>
-      <w:r>
-        <w:rPr>
-          <w:rFonts w:ascii="Georgia" w:hAnsi="Georgia"/>
-        </w:rPr>
-        <w:t>Riverside was where the CBP job was. The one I had applied for on February 23rd, one week before March 2nd. The announcement had closed on March 7th — the same day I was admitted to Brooke Glen.</w:t>
-      </w:r>
-    </w:p>
-    <w:p>
-      <w:pPr>
-        <w:pStyle w:val="BodyText"/>
-        <w:spacing w:line="276" w:lineRule="auto"/>
-        <w:rPr>
-          <w:rFonts w:ascii="Georgia" w:hAnsi="Georgia"/>
-        </w:rPr>
-      </w:pPr>
-      <w:r>
-        <w:rPr>
-          <w:rFonts w:ascii="Georgia" w:hAnsi="Georgia"/>
-        </w:rPr>
-        <w:t>I didn’t tell my mother about the screen. There was no version of that sentence that helped anything. She was offering home and the car was offering Riverside and I was somewhere between the two of them, 45 minutes from a place I had grown up in, unable to go forward and not yet able to go back.</w:t>
-      </w:r>
-    </w:p>
-    <w:p>
-      <w:pPr>
-        <w:pStyle w:val="BodyText"/>
-        <w:spacing w:line="276" w:lineRule="auto"/>
-        <w:rPr>
-          <w:rFonts w:ascii="Georgia" w:hAnsi="Georgia"/>
-        </w:rPr>
-      </w:pPr>
-      <w:r>
-        <w:rPr>
-          <w:rFonts w:ascii="Georgia" w:hAnsi="Georgia"/>
-        </w:rPr>
-        <w:t>I went back.</w:t>
-      </w:r>
-    </w:p>
-    <w:p>
-      <w:pPr>
-        <w:pStyle w:val="BodyText"/>
-        <w:spacing w:line="276" w:lineRule="auto"/>
-        <w:rPr>
-          <w:rFonts w:ascii="Georgia" w:hAnsi="Georgia"/>
-        </w:rPr>
-      </w:pPr>
-      <w:r>
-        <w:rPr>
-          <w:rFonts w:ascii="Georgia" w:hAnsi="Georgia"/>
-        </w:rPr>
-        <w:t xml:space="preserve">During that period I called Leidos. More than once. I have a text from Zoey confirming she received one of my voicemails. I was not calling to ask for help. I was calling to put </w:t>
-      </w:r>
+        <w:t>Horsham was cleaner than Brooke Glen. That’s the most I’ll say in its favor.</w:t>
+      </w:r>
+    </w:p>
+    <w:p>
+      <w:pPr>
+        <w:pStyle w:val="BodyText"/>
+        <w:spacing w:line="276" w:lineRule="auto"/>
+        <w:rPr>
+          <w:rFonts w:ascii="Georgia" w:hAnsi="Georgia"/>
+        </w:rPr>
+      </w:pPr>
+      <w:r>
+        <w:rPr>
+          <w:rFonts w:ascii="Georgia" w:hAnsi="Georgia"/>
+        </w:rPr>
+        <w:t>By the time I arrived I had been awake in any meaningful sense for close to two and a half weeks. The medications they gave me were heavy. Not restoring — just weighted. There is a difference between being sedated and being restored and I learned it there.</w:t>
+      </w:r>
+    </w:p>
+    <w:p>
+      <w:pPr>
+        <w:pStyle w:val="BodyText"/>
+        <w:spacing w:line="276" w:lineRule="auto"/>
+        <w:rPr>
+          <w:rFonts w:ascii="Georgia" w:hAnsi="Georgia"/>
+        </w:rPr>
+      </w:pPr>
+      <w:r>
+        <w:rPr>
+          <w:rFonts w:ascii="Georgia" w:hAnsi="Georgia"/>
+        </w:rPr>
+        <w:t>The question I had been running at Brooke Glen was gone by Horsham. Not answered. Gone. There was nothing left to run it on.</w:t>
+      </w:r>
+    </w:p>
+    <w:p>
+      <w:pPr>
+        <w:pStyle w:val="BodyText"/>
+        <w:spacing w:line="276" w:lineRule="auto"/>
+        <w:rPr>
+          <w:rFonts w:ascii="Georgia" w:hAnsi="Georgia"/>
+        </w:rPr>
+      </w:pPr>
+      <w:r>
+        <w:rPr>
+          <w:rFonts w:ascii="Georgia" w:hAnsi="Georgia"/>
+        </w:rPr>
+        <w:t>I met a woman who told me she worked for the federal government. She told me there were angels standing behind me. I did not tell her what I knew about the federal government. I did not tell her what had put me in that room.</w:t>
+      </w:r>
+    </w:p>
+    <w:p>
+      <w:pPr>
+        <w:pStyle w:val="BodyText"/>
+        <w:spacing w:line="276" w:lineRule="auto"/>
+        <w:rPr>
+          <w:rFonts w:ascii="Georgia" w:hAnsi="Georgia"/>
+        </w:rPr>
+      </w:pPr>
+      <w:r>
+        <w:rPr>
+          <w:rFonts w:ascii="Georgia" w:hAnsi="Georgia"/>
+        </w:rPr>
+        <w:t>I met a man who said he worked for the federal government and had seen real live aliens. He told me his family members were in the government and held high ranking positions. He told me he had a clearance. He wore something over his face and hair — covering himself, hiding his identity from whoever he believed was watching. He believed it completely.</w:t>
+      </w:r>
+    </w:p>
+    <w:p>
+      <w:pPr>
+        <w:pStyle w:val="BodyText"/>
+        <w:spacing w:line="276" w:lineRule="auto"/>
+        <w:rPr>
+          <w:rFonts w:ascii="Georgia" w:hAnsi="Georgia"/>
+        </w:rPr>
+      </w:pPr>
+      <w:r>
+        <w:rPr>
+          <w:rFonts w:ascii="Georgia" w:hAnsi="Georgia"/>
+        </w:rPr>
+        <w:t>I didn’t talk to him much.</w:t>
+      </w:r>
+    </w:p>
+    <w:p>
+      <w:pPr>
+        <w:pStyle w:val="BodyText"/>
+        <w:spacing w:line="276" w:lineRule="auto"/>
+        <w:rPr>
+          <w:rFonts w:ascii="Georgia" w:hAnsi="Georgia"/>
+        </w:rPr>
+      </w:pPr>
+      <w:r>
+        <w:rPr>
+          <w:rFonts w:ascii="Georgia" w:hAnsi="Georgia"/>
+        </w:rPr>
+        <w:t>I want to be careful about why. It wasn’t that I thought he was wrong about everything. It was that I had stopped. I had been mutilated and exhausted into silence by that point. I was not going to sit in a psychiatric facility and tell a man with his face covered that I understood something about what it meant to know a thing you couldn’t prove to anyone’s satisfaction. I was not going to give anyone in that building one more data point.</w:t>
+      </w:r>
+    </w:p>
+    <w:p>
+      <w:pPr>
+        <w:pStyle w:val="BodyText"/>
+        <w:spacing w:line="276" w:lineRule="auto"/>
+        <w:rPr>
+          <w:rFonts w:ascii="Georgia" w:hAnsi="Georgia"/>
+        </w:rPr>
+      </w:pPr>
+      <w:r>
+        <w:rPr>
+          <w:rFonts w:ascii="Georgia" w:hAnsi="Georgia"/>
+        </w:rPr>
+        <w:t>So I watched the ceiling instead.</w:t>
+      </w:r>
+    </w:p>
+    <w:p>
+      <w:pPr>
+        <w:pStyle w:val="BodyText"/>
+        <w:spacing w:line="276" w:lineRule="auto"/>
+        <w:rPr>
+          <w:rFonts w:ascii="Georgia" w:hAnsi="Georgia"/>
+        </w:rPr>
+      </w:pPr>
+      <w:r>
+        <w:rPr>
+          <w:rFonts w:ascii="Georgia" w:hAnsi="Georgia"/>
+        </w:rPr>
+        <w:t>I found out later that the social worker assigned to my case had a father who worked for the NSA. She didn’t believe me either.</w:t>
+      </w:r>
+    </w:p>
+    <w:p>
+      <w:pPr>
+        <w:pStyle w:val="BodyText"/>
+        <w:spacing w:line="276" w:lineRule="auto"/>
+        <w:rPr>
+          <w:rFonts w:ascii="Georgia" w:hAnsi="Georgia"/>
+        </w:rPr>
+      </w:pPr>
+      <w:r>
+        <w:rPr>
+          <w:rFonts w:ascii="Georgia" w:hAnsi="Georgia"/>
+        </w:rPr>
+        <w:t>Outside, things were happening that I didn’t know about yet.</w:t>
+      </w:r>
+    </w:p>
+    <w:p>
+      <w:pPr>
+        <w:pStyle w:val="BodyText"/>
+        <w:spacing w:line="276" w:lineRule="auto"/>
+        <w:rPr>
+          <w:rFonts w:ascii="Georgia" w:hAnsi="Georgia"/>
+        </w:rPr>
+      </w:pPr>
+      <w:r>
+        <w:rPr>
+          <w:rFonts w:ascii="Georgia" w:hAnsi="Georgia"/>
+        </w:rPr>
+        <w:t>My abstract had been accepted. ESRI had notified Matthew Thompson on March 15th — eight days after Brooke Glen, while I was still inside. Thompson forwarded it to Jim Estes and called it really cool work. A confirmation was sitting somewhere in an inbox, waiting for me to accept the presentation slot. July. Thousands of people. The work I had built alone in my apartment in Navy Yard.</w:t>
+      </w:r>
+    </w:p>
+    <w:p>
+      <w:pPr>
+        <w:pStyle w:val="BodyText"/>
+        <w:spacing w:line="276" w:lineRule="auto"/>
+        <w:rPr>
+          <w:rFonts w:ascii="Georgia" w:hAnsi="Georgia"/>
+        </w:rPr>
+      </w:pPr>
       <w:r>
         <w:rPr>
           <w:rFonts w:ascii="Georgia" w:hAnsi="Georgia"/>
         </w:rPr>
         <w:lastRenderedPageBreak/>
-        <w:t>them on notice — that I intended to pursue arbitration, that I was not going to let this go quietly.</w:t>
-      </w:r>
-    </w:p>
-    <w:p>
-      <w:pPr>
-        <w:pStyle w:val="BodyText"/>
-        <w:spacing w:line="276" w:lineRule="auto"/>
-        <w:rPr>
-          <w:rFonts w:ascii="Georgia" w:hAnsi="Georgia"/>
-        </w:rPr>
-      </w:pPr>
-      <w:r>
-        <w:rPr>
-          <w:rFonts w:ascii="Georgia" w:hAnsi="Georgia"/>
-        </w:rPr>
-        <w:t>At some point during those communications she said it.</w:t>
-      </w:r>
-    </w:p>
-    <w:p>
-      <w:pPr>
-        <w:pStyle w:val="BodyText"/>
-        <w:spacing w:line="276" w:lineRule="auto"/>
-        <w:rPr>
-          <w:rFonts w:ascii="Georgia" w:hAnsi="Georgia"/>
-        </w:rPr>
-      </w:pPr>
-      <w:r>
-        <w:rPr>
-          <w:rFonts w:ascii="Georgia" w:hAnsi="Georgia"/>
-        </w:rPr>
-        <w:t>“We don’t want things to get messy.”</w:t>
-      </w:r>
-    </w:p>
-    <w:p>
-      <w:pPr>
-        <w:pStyle w:val="BodyText"/>
-        <w:spacing w:line="276" w:lineRule="auto"/>
-        <w:rPr>
-          <w:rFonts w:ascii="Georgia" w:hAnsi="Georgia"/>
-        </w:rPr>
-      </w:pPr>
-      <w:r>
-        <w:rPr>
-          <w:rFonts w:ascii="Georgia" w:hAnsi="Georgia"/>
-        </w:rPr>
-        <w:t>I know what that meant. An institution that had just watched one of its contractors get hospitalized, lose his access and lose his evidence was telling him that pursuing accountability would be inconvenient for them. Dressed up as HR language. Delivered to a person who had just gotten out of a psychiatric facility.</w:t>
-      </w:r>
-    </w:p>
-    <w:p>
-      <w:pPr>
-        <w:pStyle w:val="BodyText"/>
-        <w:spacing w:line="276" w:lineRule="auto"/>
-        <w:rPr>
-          <w:rFonts w:ascii="Georgia" w:hAnsi="Georgia"/>
-        </w:rPr>
-      </w:pPr>
-      <w:r>
-        <w:rPr>
-          <w:rFonts w:ascii="Georgia" w:hAnsi="Georgia"/>
-        </w:rPr>
-        <w:t>The calls from that period are mostly gone. I got a new phone number afterward. The text from Zoey is what remains.</w:t>
-      </w:r>
-    </w:p>
-    <w:p>
-      <w:pPr>
-        <w:pStyle w:val="BodyText"/>
-        <w:spacing w:line="276" w:lineRule="auto"/>
-        <w:rPr>
-          <w:rFonts w:ascii="Georgia" w:hAnsi="Georgia"/>
-        </w:rPr>
-      </w:pPr>
-      <w:r>
-        <w:rPr>
-          <w:rFonts w:ascii="Georgia" w:hAnsi="Georgia"/>
-        </w:rPr>
-        <w:t>The following day the accident happened.</w:t>
-      </w:r>
-    </w:p>
-    <w:p>
-      <w:pPr>
-        <w:pStyle w:val="BodyText"/>
-        <w:spacing w:line="276" w:lineRule="auto"/>
-        <w:rPr>
-          <w:rFonts w:ascii="Georgia" w:hAnsi="Georgia"/>
-        </w:rPr>
-      </w:pPr>
-      <w:r>
-        <w:rPr>
-          <w:rFonts w:ascii="Georgia" w:hAnsi="Georgia"/>
-        </w:rPr>
-        <w:t>I will not put the details on this page. What I’ll tell you is that by that point I had not slept properly in nearly two weeks — five days from March 2nd through admission, seven more days at Brooke Glen where the medication was supposed to help and didn’t, not really, not in any way that felt like actual rest. They had taken me off the medications I knew and put me on ones I didn’t. The ground under every thought had been shifting for two weeks straight. I was not the same person who had driven to Dunkin’ Donuts on the morning of March 2nd and ordered a medium coffee, half-decaf, half-regular, and thought the day was going to be ordinary.</w:t>
-      </w:r>
-    </w:p>
-    <w:p>
-      <w:pPr>
-        <w:pStyle w:val="BodyText"/>
-        <w:spacing w:line="276" w:lineRule="auto"/>
-        <w:rPr>
-          <w:rFonts w:ascii="Georgia" w:hAnsi="Georgia"/>
-        </w:rPr>
-      </w:pPr>
-      <w:r>
-        <w:rPr>
-          <w:rFonts w:ascii="Georgia" w:hAnsi="Georgia"/>
-        </w:rPr>
-        <w:t>What I’ll tell you is that my family initiated the 302 that followed.</w:t>
-      </w:r>
-    </w:p>
-    <w:p>
-      <w:pPr>
-        <w:pStyle w:val="BodyText"/>
-        <w:spacing w:line="276" w:lineRule="auto"/>
-        <w:rPr>
-          <w:rFonts w:ascii="Georgia" w:hAnsi="Georgia"/>
-        </w:rPr>
-      </w:pPr>
-      <w:r>
-        <w:rPr>
-          <w:rFonts w:ascii="Georgia" w:hAnsi="Georgia"/>
-        </w:rPr>
-        <w:t>A 302 is an involuntary psychiatric commitment under Pennsylvania law. Someone signs their name to a document stating that you cannot make certain determinations for yourself and that keeping you safe requires removing your ability to choose. It means the next facility doesn’t ask if you want to come in.</w:t>
-      </w:r>
-    </w:p>
-    <w:p>
-      <w:pPr>
-        <w:pStyle w:val="BodyText"/>
-        <w:spacing w:line="276" w:lineRule="auto"/>
-        <w:rPr>
-          <w:rFonts w:ascii="Georgia" w:hAnsi="Georgia"/>
-        </w:rPr>
-      </w:pPr>
-      <w:r>
-        <w:rPr>
-          <w:rFonts w:ascii="Georgia" w:hAnsi="Georgia"/>
-        </w:rPr>
-        <w:t>I didn’t get to say no.</w:t>
-      </w:r>
-    </w:p>
-    <w:p>
-      <w:pPr>
-        <w:spacing w:line="276" w:lineRule="auto"/>
-        <w:jc w:val="center"/>
-        <w:rPr>
-          <w:rFonts w:ascii="Georgia" w:hAnsi="Georgia"/>
-        </w:rPr>
-      </w:pPr>
-      <w:r>
-        <w:rPr>
-          <w:rFonts w:ascii="Georgia" w:hAnsi="Georgia"/>
-        </w:rPr>
-        <w:t>***</w:t>
-      </w:r>
-    </w:p>
-    <w:p>
-      <w:pPr>
-        <w:pStyle w:val="FirstParagraph"/>
-        <w:spacing w:line="276" w:lineRule="auto"/>
-        <w:rPr>
-          <w:rFonts w:ascii="Georgia" w:hAnsi="Georgia"/>
-        </w:rPr>
-      </w:pPr>
-      <w:r>
-        <w:rPr>
-          <w:rFonts w:ascii="Georgia" w:hAnsi="Georgia"/>
-        </w:rPr>
-        <w:t>Horsham was cleaner than Brooke Glen. That’s the most I’ll say in its favor.</w:t>
-      </w:r>
-    </w:p>
-    <w:p>
-      <w:pPr>
-        <w:pStyle w:val="BodyText"/>
-        <w:spacing w:line="276" w:lineRule="auto"/>
-        <w:rPr>
-          <w:rFonts w:ascii="Georgia" w:hAnsi="Georgia"/>
-        </w:rPr>
-      </w:pPr>
-      <w:r>
-        <w:rPr>
-          <w:rFonts w:ascii="Georgia" w:hAnsi="Georgia"/>
-        </w:rPr>
-        <w:t>By the time I arrived I had been awake in any meaningful sense for close to two and a half weeks. The medications they gave me were heavy. Not restoring — just weighted. There is a difference between being sedated and being restored and I learned it there.</w:t>
-      </w:r>
-    </w:p>
-    <w:p>
-      <w:pPr>
-        <w:pStyle w:val="BodyText"/>
-        <w:spacing w:line="276" w:lineRule="auto"/>
-        <w:rPr>
-          <w:rFonts w:ascii="Georgia" w:hAnsi="Georgia"/>
-        </w:rPr>
-      </w:pPr>
-      <w:r>
-        <w:rPr>
-          <w:rFonts w:ascii="Georgia" w:hAnsi="Georgia"/>
-        </w:rPr>
-        <w:t>The question I had been running at Brooke Glen was gone by Horsham. Not answered. Gone. There was nothing left to run it on.</w:t>
+        <w:t>I couldn’t accept it. I didn’t know it existed. My FAA account had been removed while I was incapacitated. My Leidos access was gone. There was no inbox I could reach, no system I could log into, no way to respond to a confirmation that was sitting somewhere waiting for me. The window closed while I was in no position to open it.</w:t>
+      </w:r>
+    </w:p>
+    <w:p>
+      <w:pPr>
+        <w:pStyle w:val="BodyText"/>
+        <w:spacing w:line="276" w:lineRule="auto"/>
+        <w:rPr>
+          <w:rFonts w:ascii="Georgia" w:hAnsi="Georgia"/>
+        </w:rPr>
+      </w:pPr>
+      <w:r>
+        <w:rPr>
+          <w:rFonts w:ascii="Georgia" w:hAnsi="Georgia"/>
+        </w:rPr>
+        <w:t>That was not an accident. I was hospitalized on March 7th. The abstract was accepted on March 15th. The notification went to Matthew Thompson and Jim Estes — not to me. By the time I was out, the path to that stage had been closed from the other end.</w:t>
+      </w:r>
+    </w:p>
+    <w:p>
+      <w:pPr>
+        <w:pStyle w:val="BodyText"/>
+        <w:spacing w:line="276" w:lineRule="auto"/>
+        <w:rPr>
+          <w:rFonts w:ascii="Georgia" w:hAnsi="Georgia"/>
+        </w:rPr>
+      </w:pPr>
+      <w:r>
+        <w:rPr>
+          <w:rFonts w:ascii="Georgia" w:hAnsi="Georgia"/>
+        </w:rPr>
+        <w:t>In a different version of this story, I would have been on that stage in San Diego with my two colleagues, in front of thousands of people, showing work that had taken months to build and that no one had built before. That was the version I had been working toward.</w:t>
+      </w:r>
+    </w:p>
+    <w:p>
+      <w:pPr>
+        <w:pStyle w:val="BodyText"/>
+        <w:spacing w:line="276" w:lineRule="auto"/>
+        <w:rPr>
+          <w:rFonts w:ascii="Georgia" w:hAnsi="Georgia"/>
+        </w:rPr>
+      </w:pPr>
+      <w:r>
+        <w:rPr>
+          <w:rFonts w:ascii="Georgia" w:hAnsi="Georgia"/>
+        </w:rPr>
+        <w:t>The presentation slot expired. The work existed. They made sure I never got to show it.</w:t>
+      </w:r>
+    </w:p>
+    <w:p>
+      <w:pPr>
+        <w:pStyle w:val="BodyText"/>
+        <w:spacing w:line="276" w:lineRule="auto"/>
+        <w:rPr>
+          <w:rFonts w:ascii="Georgia" w:hAnsi="Georgia"/>
+        </w:rPr>
+      </w:pPr>
+      <w:r>
+        <w:rPr>
+          <w:rFonts w:ascii="Georgia" w:hAnsi="Georgia"/>
+        </w:rPr>
+        <w:t>Jim Estes emailed my personal Gmail. Asked how I was doing. Said he was proud of the UAP visualization work. Mentioned HR would need a doctor’s note through Sedgwick, Leidos’s third-party disability and leave management provider.</w:t>
+      </w:r>
+    </w:p>
+    <w:p>
+      <w:pPr>
+        <w:pStyle w:val="BodyText"/>
+        <w:spacing w:line="276" w:lineRule="auto"/>
+        <w:rPr>
+          <w:rFonts w:ascii="Georgia" w:hAnsi="Georgia"/>
+        </w:rPr>
+      </w:pPr>
+      <w:r>
+        <w:rPr>
+          <w:rFonts w:ascii="Georgia" w:hAnsi="Georgia"/>
+        </w:rPr>
+        <w:t>Proud of the work. Doctor’s note through Sedgwick.</w:t>
+      </w:r>
+    </w:p>
+    <w:p>
+      <w:pPr>
+        <w:pStyle w:val="BodyText"/>
+        <w:spacing w:line="276" w:lineRule="auto"/>
+        <w:rPr>
+          <w:rFonts w:ascii="Georgia" w:hAnsi="Georgia"/>
+        </w:rPr>
+      </w:pPr>
+      <w:r>
+        <w:rPr>
+          <w:rFonts w:ascii="Georgia" w:hAnsi="Georgia"/>
+        </w:rPr>
+        <w:t>On March 29th, Sedgwick completed a Provider Statement. The form checked “delusional ideations evident: Yes.” It noted paranoid delusions under reasoning and judgment.</w:t>
+      </w:r>
+    </w:p>
+    <w:p>
+      <w:pPr>
+        <w:pStyle w:val="BodyText"/>
+        <w:spacing w:line="276" w:lineRule="auto"/>
+        <w:rPr>
+          <w:rFonts w:ascii="Georgia" w:hAnsi="Georgia"/>
+        </w:rPr>
+      </w:pPr>
+      <w:r>
+        <w:rPr>
+          <w:rFonts w:ascii="Georgia" w:hAnsi="Georgia"/>
+        </w:rPr>
+        <w:t>The abstract was accepted on March 15th. I was delusional on March 29th. Both documents exist. Both were produced by people operating within the same institutional apparatus.</w:t>
+      </w:r>
+    </w:p>
+    <w:p>
+      <w:pPr>
+        <w:pStyle w:val="BodyText"/>
+        <w:spacing w:line="276" w:lineRule="auto"/>
+        <w:rPr>
+          <w:rFonts w:ascii="Georgia" w:hAnsi="Georgia"/>
+        </w:rPr>
+      </w:pPr>
+      <w:r>
+        <w:rPr>
+          <w:rFonts w:ascii="Georgia" w:hAnsi="Georgia"/>
+        </w:rPr>
+        <w:t>By that point I had not slept properly in close to three weeks. Five days from March 2nd through admission. Seven more days at Brooke Glen where the medication was supposed to help and didn’t. Then the accident. Then the 302. Then Horsham. Three weeks without real sleep, on medications I didn’t know, after the most destabilizing sequence of events of my life.</w:t>
+      </w:r>
+    </w:p>
+    <w:p>
+      <w:pPr>
+        <w:pStyle w:val="BodyText"/>
+        <w:spacing w:line="276" w:lineRule="auto"/>
+        <w:rPr>
+          <w:rFonts w:ascii="Georgia" w:hAnsi="Georgia"/>
+        </w:rPr>
+      </w:pPr>
+      <w:r>
+        <w:rPr>
+          <w:rFonts w:ascii="Georgia" w:hAnsi="Georgia"/>
+        </w:rPr>
+        <w:t>Three weeks without sleep will affect any person’s state of mind. That is not a diagnosis. That is biology.</w:t>
+      </w:r>
+    </w:p>
+    <w:p>
+      <w:pPr>
+        <w:pStyle w:val="BodyText"/>
+        <w:spacing w:line="276" w:lineRule="auto"/>
+        <w:rPr>
+          <w:rFonts w:ascii="Georgia" w:hAnsi="Georgia"/>
+        </w:rPr>
+      </w:pPr>
+      <w:r>
+        <w:rPr>
+          <w:rFonts w:ascii="Georgia" w:hAnsi="Georgia"/>
+        </w:rPr>
+        <w:t>Whatever state I was in when they evaluated me, the work existed before they got to me. The UAP data was real. The ODNI email was real. The abstract was accepted. All of it documented, all of it timestamped, all of it created by a person functioning at the highest level of his career.</w:t>
+      </w:r>
+    </w:p>
+    <w:p>
+      <w:pPr>
+        <w:pStyle w:val="BodyText"/>
+        <w:spacing w:line="276" w:lineRule="auto"/>
+        <w:rPr>
+          <w:rFonts w:ascii="Georgia" w:hAnsi="Georgia"/>
+        </w:rPr>
+      </w:pPr>
+      <w:r>
+        <w:rPr>
+          <w:rFonts w:ascii="Georgia" w:hAnsi="Georgia"/>
+        </w:rPr>
+        <w:t>They broke me down. Then they used the breakdown as the explanation.</w:t>
       </w:r>
     </w:p>
     <w:p>
@@ -5184,307 +5564,6 @@
           <w:rFonts w:ascii="Georgia" w:hAnsi="Georgia"/>
         </w:rPr>
         <w:lastRenderedPageBreak/>
-        <w:t>I met a woman who told me she worked for the federal government. She told me there were angels standing behind me. I did not tell her what I knew about the federal government. I did not tell her what had put me in that room.</w:t>
-      </w:r>
-    </w:p>
-    <w:p>
-      <w:pPr>
-        <w:pStyle w:val="BodyText"/>
-        <w:spacing w:line="276" w:lineRule="auto"/>
-        <w:rPr>
-          <w:rFonts w:ascii="Georgia" w:hAnsi="Georgia"/>
-        </w:rPr>
-      </w:pPr>
-      <w:r>
-        <w:rPr>
-          <w:rFonts w:ascii="Georgia" w:hAnsi="Georgia"/>
-        </w:rPr>
-        <w:t>I met a man who said he worked for the federal government and had seen real live aliens. He told me his family members were in the government and held high ranking positions. He told me he had a clearance. He wore something over his face and hair — covering himself, hiding his identity from whoever he believed was watching. He believed it completely.</w:t>
-      </w:r>
-    </w:p>
-    <w:p>
-      <w:pPr>
-        <w:pStyle w:val="BodyText"/>
-        <w:spacing w:line="276" w:lineRule="auto"/>
-        <w:rPr>
-          <w:rFonts w:ascii="Georgia" w:hAnsi="Georgia"/>
-        </w:rPr>
-      </w:pPr>
-      <w:r>
-        <w:rPr>
-          <w:rFonts w:ascii="Georgia" w:hAnsi="Georgia"/>
-        </w:rPr>
-        <w:t>I didn’t talk to him much.</w:t>
-      </w:r>
-    </w:p>
-    <w:p>
-      <w:pPr>
-        <w:pStyle w:val="BodyText"/>
-        <w:spacing w:line="276" w:lineRule="auto"/>
-        <w:rPr>
-          <w:rFonts w:ascii="Georgia" w:hAnsi="Georgia"/>
-        </w:rPr>
-      </w:pPr>
-      <w:r>
-        <w:rPr>
-          <w:rFonts w:ascii="Georgia" w:hAnsi="Georgia"/>
-        </w:rPr>
-        <w:t>I want to be careful about why. It wasn’t that I thought he was wrong about everything. It was that I had stopped. I had been mutilated and exhausted into silence by that point. I was not going to sit in a psychiatric facility and tell a man with his face covered that I understood something about what it meant to know a thing you couldn’t prove to anyone’s satisfaction. I was not going to give anyone in that building one more data point.</w:t>
-      </w:r>
-    </w:p>
-    <w:p>
-      <w:pPr>
-        <w:pStyle w:val="BodyText"/>
-        <w:spacing w:line="276" w:lineRule="auto"/>
-        <w:rPr>
-          <w:rFonts w:ascii="Georgia" w:hAnsi="Georgia"/>
-        </w:rPr>
-      </w:pPr>
-      <w:r>
-        <w:rPr>
-          <w:rFonts w:ascii="Georgia" w:hAnsi="Georgia"/>
-        </w:rPr>
-        <w:t>So I watched the ceiling instead.</w:t>
-      </w:r>
-    </w:p>
-    <w:p>
-      <w:pPr>
-        <w:pStyle w:val="BodyText"/>
-        <w:spacing w:line="276" w:lineRule="auto"/>
-        <w:rPr>
-          <w:rFonts w:ascii="Georgia" w:hAnsi="Georgia"/>
-        </w:rPr>
-      </w:pPr>
-      <w:r>
-        <w:rPr>
-          <w:rFonts w:ascii="Georgia" w:hAnsi="Georgia"/>
-        </w:rPr>
-        <w:t>I found out later that the social worker assigned to my case had a father who worked for the NSA. She didn’t believe me either.</w:t>
-      </w:r>
-    </w:p>
-    <w:p>
-      <w:pPr>
-        <w:pStyle w:val="BodyText"/>
-        <w:spacing w:line="276" w:lineRule="auto"/>
-        <w:rPr>
-          <w:rFonts w:ascii="Georgia" w:hAnsi="Georgia"/>
-        </w:rPr>
-      </w:pPr>
-      <w:r>
-        <w:rPr>
-          <w:rFonts w:ascii="Georgia" w:hAnsi="Georgia"/>
-        </w:rPr>
-        <w:t>Outside, things were happening that I didn’t know about yet.</w:t>
-      </w:r>
-    </w:p>
-    <w:p>
-      <w:pPr>
-        <w:pStyle w:val="BodyText"/>
-        <w:spacing w:line="276" w:lineRule="auto"/>
-        <w:rPr>
-          <w:rFonts w:ascii="Georgia" w:hAnsi="Georgia"/>
-        </w:rPr>
-      </w:pPr>
-      <w:r>
-        <w:rPr>
-          <w:rFonts w:ascii="Georgia" w:hAnsi="Georgia"/>
-        </w:rPr>
-        <w:t>My abstract had been accepted. ESRI had notified Matthew Thompson on March 15th — eight days after Brooke Glen, while I was still inside. Thompson forwarded it to Jim Estes and called it really cool work. A confirmation was sitting somewhere in an inbox, waiting for me to accept the presentation slot. July. Thousands of people. The work I had built alone in my apartment in Navy Yard.</w:t>
-      </w:r>
-    </w:p>
-    <w:p>
-      <w:pPr>
-        <w:pStyle w:val="BodyText"/>
-        <w:spacing w:line="276" w:lineRule="auto"/>
-        <w:rPr>
-          <w:rFonts w:ascii="Georgia" w:hAnsi="Georgia"/>
-        </w:rPr>
-      </w:pPr>
-      <w:r>
-        <w:rPr>
-          <w:rFonts w:ascii="Georgia" w:hAnsi="Georgia"/>
-        </w:rPr>
-        <w:t>I couldn’t accept it. I didn’t know it existed. My FAA account had been removed while I was incapacitated. My Leidos access was gone. There was no inbox I could reach, no system I could log into, no way to respond to a confirmation that was sitting somewhere waiting for me. The window closed while I was in no position to open it.</w:t>
-      </w:r>
-    </w:p>
-    <w:p>
-      <w:pPr>
-        <w:pStyle w:val="BodyText"/>
-        <w:spacing w:line="276" w:lineRule="auto"/>
-        <w:rPr>
-          <w:rFonts w:ascii="Georgia" w:hAnsi="Georgia"/>
-        </w:rPr>
-      </w:pPr>
-      <w:r>
-        <w:rPr>
-          <w:rFonts w:ascii="Georgia" w:hAnsi="Georgia"/>
-        </w:rPr>
-        <w:t>That was not an accident. I was hospitalized on March 7th. The abstract was accepted on March 15th. The notification went to Matthew Thompson and Jim Estes — not to me. By the time I was out, the path to that stage had been closed from the other end.</w:t>
-      </w:r>
-    </w:p>
-    <w:p>
-      <w:pPr>
-        <w:pStyle w:val="BodyText"/>
-        <w:spacing w:line="276" w:lineRule="auto"/>
-        <w:rPr>
-          <w:rFonts w:ascii="Georgia" w:hAnsi="Georgia"/>
-        </w:rPr>
-      </w:pPr>
-      <w:r>
-        <w:rPr>
-          <w:rFonts w:ascii="Georgia" w:hAnsi="Georgia"/>
-        </w:rPr>
-        <w:t>In a different version of this story, I would have been on that stage in San Diego with my two colleagues, in front of thousands of people, showing work that had taken months to build and that no one had built before. That was the version I had been working toward.</w:t>
-      </w:r>
-    </w:p>
-    <w:p>
-      <w:pPr>
-        <w:pStyle w:val="BodyText"/>
-        <w:spacing w:line="276" w:lineRule="auto"/>
-        <w:rPr>
-          <w:rFonts w:ascii="Georgia" w:hAnsi="Georgia"/>
-        </w:rPr>
-      </w:pPr>
-      <w:r>
-        <w:rPr>
-          <w:rFonts w:ascii="Georgia" w:hAnsi="Georgia"/>
-        </w:rPr>
-        <w:t>The presentation slot expired. The work existed. They made sure I never got to show it.</w:t>
-      </w:r>
-    </w:p>
-    <w:p>
-      <w:pPr>
-        <w:pStyle w:val="BodyText"/>
-        <w:spacing w:line="276" w:lineRule="auto"/>
-        <w:rPr>
-          <w:rFonts w:ascii="Georgia" w:hAnsi="Georgia"/>
-        </w:rPr>
-      </w:pPr>
-      <w:r>
-        <w:rPr>
-          <w:rFonts w:ascii="Georgia" w:hAnsi="Georgia"/>
-        </w:rPr>
-        <w:lastRenderedPageBreak/>
-        <w:t>Jim Estes emailed my personal Gmail. Asked how I was doing. Said he was proud of the UAP visualization work. Mentioned HR would need a doctor’s note through Sedgwick, Leidos’s third-party disability and leave management provider.</w:t>
-      </w:r>
-    </w:p>
-    <w:p>
-      <w:pPr>
-        <w:pStyle w:val="BodyText"/>
-        <w:spacing w:line="276" w:lineRule="auto"/>
-        <w:rPr>
-          <w:rFonts w:ascii="Georgia" w:hAnsi="Georgia"/>
-        </w:rPr>
-      </w:pPr>
-      <w:r>
-        <w:rPr>
-          <w:rFonts w:ascii="Georgia" w:hAnsi="Georgia"/>
-        </w:rPr>
-        <w:t>Proud of the work. Doctor’s note through Sedgwick.</w:t>
-      </w:r>
-    </w:p>
-    <w:p>
-      <w:pPr>
-        <w:pStyle w:val="BodyText"/>
-        <w:spacing w:line="276" w:lineRule="auto"/>
-        <w:rPr>
-          <w:rFonts w:ascii="Georgia" w:hAnsi="Georgia"/>
-        </w:rPr>
-      </w:pPr>
-      <w:r>
-        <w:rPr>
-          <w:rFonts w:ascii="Georgia" w:hAnsi="Georgia"/>
-        </w:rPr>
-        <w:t>On March 29th, Sedgwick completed a Provider Statement. The form checked “delusional ideations evident: Yes.” It noted paranoid delusions under reasoning and judgment.</w:t>
-      </w:r>
-    </w:p>
-    <w:p>
-      <w:pPr>
-        <w:pStyle w:val="BodyText"/>
-        <w:spacing w:line="276" w:lineRule="auto"/>
-        <w:rPr>
-          <w:rFonts w:ascii="Georgia" w:hAnsi="Georgia"/>
-        </w:rPr>
-      </w:pPr>
-      <w:r>
-        <w:rPr>
-          <w:rFonts w:ascii="Georgia" w:hAnsi="Georgia"/>
-        </w:rPr>
-        <w:t>The abstract was accepted on March 15th. I was delusional on March 29th. Both documents exist. Both were produced by people operating within the same institutional apparatus.</w:t>
-      </w:r>
-    </w:p>
-    <w:p>
-      <w:pPr>
-        <w:pStyle w:val="BodyText"/>
-        <w:spacing w:line="276" w:lineRule="auto"/>
-        <w:rPr>
-          <w:rFonts w:ascii="Georgia" w:hAnsi="Georgia"/>
-        </w:rPr>
-      </w:pPr>
-      <w:r>
-        <w:rPr>
-          <w:rFonts w:ascii="Georgia" w:hAnsi="Georgia"/>
-        </w:rPr>
-        <w:t>By that point I had not slept properly in close to three weeks. Five days from March 2nd through admission. Seven more days at Brooke Glen where the medication was supposed to help and didn’t. Then the accident. Then the 302. Then Horsham. Three weeks without real sleep, on medications I didn’t know, after the most destabilizing sequence of events of my life.</w:t>
-      </w:r>
-    </w:p>
-    <w:p>
-      <w:pPr>
-        <w:pStyle w:val="BodyText"/>
-        <w:spacing w:line="276" w:lineRule="auto"/>
-        <w:rPr>
-          <w:rFonts w:ascii="Georgia" w:hAnsi="Georgia"/>
-        </w:rPr>
-      </w:pPr>
-      <w:r>
-        <w:rPr>
-          <w:rFonts w:ascii="Georgia" w:hAnsi="Georgia"/>
-        </w:rPr>
-        <w:t>Three weeks without sleep will affect any person’s state of mind. That is not a diagnosis. That is biology.</w:t>
-      </w:r>
-    </w:p>
-    <w:p>
-      <w:pPr>
-        <w:pStyle w:val="BodyText"/>
-        <w:spacing w:line="276" w:lineRule="auto"/>
-        <w:rPr>
-          <w:rFonts w:ascii="Georgia" w:hAnsi="Georgia"/>
-        </w:rPr>
-      </w:pPr>
-      <w:r>
-        <w:rPr>
-          <w:rFonts w:ascii="Georgia" w:hAnsi="Georgia"/>
-        </w:rPr>
-        <w:t>Whatever state I was in when they evaluated me, the work existed before they got to me. The UAP data was real. The ODNI email was real. The abstract was accepted. All of it documented, all of it timestamped, all of it created by a person functioning at the highest level of his career.</w:t>
-      </w:r>
-    </w:p>
-    <w:p>
-      <w:pPr>
-        <w:pStyle w:val="BodyText"/>
-        <w:spacing w:line="276" w:lineRule="auto"/>
-        <w:rPr>
-          <w:rFonts w:ascii="Georgia" w:hAnsi="Georgia"/>
-        </w:rPr>
-      </w:pPr>
-      <w:r>
-        <w:rPr>
-          <w:rFonts w:ascii="Georgia" w:hAnsi="Georgia"/>
-        </w:rPr>
-        <w:t>They broke me down. Then they used the breakdown as the explanation.</w:t>
-      </w:r>
-    </w:p>
-    <w:p>
-      <w:pPr>
-        <w:pStyle w:val="BodyText"/>
-        <w:spacing w:line="276" w:lineRule="auto"/>
-        <w:rPr>
-          <w:rFonts w:ascii="Georgia" w:hAnsi="Georgia"/>
-        </w:rPr>
-      </w:pPr>
-      <w:r>
-        <w:rPr>
-          <w:rFonts w:ascii="Georgia" w:hAnsi="Georgia"/>
-        </w:rPr>
         <w:t>And while I was in there, Leidos contacted my mother and directed her to ship the laptop back to the company. I was hospitalized. I could not refuse. She didn’t know what she was handing over.</w:t>
       </w:r>
     </w:p>
@@ -5530,7 +5609,6 @@
         <w:rPr>
           <w:rFonts w:ascii="Georgia" w:hAnsi="Georgia"/>
         </w:rPr>
-        <w:lastRenderedPageBreak/>
         <w:t>I lay in Horsham and didn’t know any of this yet.</w:t>
       </w:r>
     </w:p>

</xml_diff>

<commit_message>
Small update to Chapter 4
</commit_message>
<xml_diff>
--- a/Manuscript/Plausibly_Deniable_FORMATTED.docx
+++ b/Manuscript/Plausibly_Deniable_FORMATTED.docx
@@ -227,7 +227,19 @@
         <w:rPr>
           <w:rFonts w:ascii="Georgia" w:hAnsi="Georgia" w:cs="Times New Roman"/>
         </w:rPr>
-        <w:t>To my nieces and nephews — you are why I wrote this. Every page of it.</w:t>
+        <w:t>To my nieces and nephews</w:t>
+      </w:r>
+      <w:r>
+        <w:rPr>
+          <w:rFonts w:ascii="Georgia" w:hAnsi="Georgia" w:cs="Times New Roman"/>
+        </w:rPr>
+        <w:t xml:space="preserve">, </w:t>
+      </w:r>
+      <w:r>
+        <w:rPr>
+          <w:rFonts w:ascii="Georgia" w:hAnsi="Georgia" w:cs="Times New Roman"/>
+        </w:rPr>
+        <w:t>you are why I wrote this. Every page of it.</w:t>
       </w:r>
     </w:p>
     <w:p>
@@ -4446,7 +4458,70 @@
         <w:rPr>
           <w:rFonts w:ascii="Georgia" w:hAnsi="Georgia"/>
         </w:rPr>
-        <w:t>On March 5th, two days after I got home and two days before Brooke Glen, I sent a fax to the DHS Office of Inspector General. I described what had happened. I signed my name to it. I was functioning on almost no sleep and the most destabilizing week of my life, and I filed a federal complaint anyway. That document exists. It is dated March 5, 2023.</w:t>
+        <w:t>On March 5th, two days after I got home and two days before Brooke Glen, I sent a fax to the D</w:t>
+      </w:r>
+      <w:r>
+        <w:rPr>
+          <w:rFonts w:ascii="Georgia" w:hAnsi="Georgia"/>
+        </w:rPr>
+        <w:t xml:space="preserve">epartment of </w:t>
+      </w:r>
+      <w:r>
+        <w:rPr>
+          <w:rFonts w:ascii="Georgia" w:hAnsi="Georgia"/>
+        </w:rPr>
+        <w:t>H</w:t>
+      </w:r>
+      <w:r>
+        <w:rPr>
+          <w:rFonts w:ascii="Georgia" w:hAnsi="Georgia"/>
+        </w:rPr>
+        <w:t xml:space="preserve">omeland </w:t>
+      </w:r>
+      <w:r>
+        <w:rPr>
+          <w:rFonts w:ascii="Georgia" w:hAnsi="Georgia"/>
+        </w:rPr>
+        <w:t>S</w:t>
+      </w:r>
+      <w:r>
+        <w:rPr>
+          <w:rFonts w:ascii="Georgia" w:hAnsi="Georgia"/>
+        </w:rPr>
+        <w:t>ecurity (DHS)</w:t>
+      </w:r>
+      <w:r>
+        <w:rPr>
+          <w:rFonts w:ascii="Georgia" w:hAnsi="Georgia"/>
+        </w:rPr>
+        <w:t xml:space="preserve"> Office of Inspector General. I described what had happened. I signed my name to it. </w:t>
+      </w:r>
+      <w:r>
+        <w:rPr>
+          <w:rFonts w:ascii="Georgia" w:hAnsi="Georgia"/>
+        </w:rPr>
+        <w:t>I filed a federal complaint because I knew exactly what had been done to me.</w:t>
+      </w:r>
+      <w:r>
+        <w:rPr>
+          <w:rFonts w:ascii="Georgia" w:hAnsi="Georgia"/>
+        </w:rPr>
+        <w:t xml:space="preserve"> </w:t>
+      </w:r>
+    </w:p>
+    <w:p>
+      <w:pPr>
+        <w:pStyle w:val="FirstParagraph"/>
+        <w:spacing w:line="276" w:lineRule="auto"/>
+        <w:rPr>
+          <w:rFonts w:ascii="Georgia" w:hAnsi="Georgia"/>
+        </w:rPr>
+      </w:pPr>
+      <w:r>
+        <w:rPr>
+          <w:rFonts w:ascii="Georgia" w:hAnsi="Georgia"/>
+        </w:rPr>
+        <w:t>That document exists. It is dated March 5, 2023.</w:t>
       </w:r>
     </w:p>
     <w:p>

</xml_diff>

<commit_message>
Remove 302 clinical language from Chapter 4, reframe as family decision
</commit_message>
<xml_diff>
--- a/Manuscript/Plausibly_Deniable_FORMATTED.docx
+++ b/Manuscript/Plausibly_Deniable_FORMATTED.docx
@@ -5231,28 +5231,28 @@
         <w:rPr>
           <w:rFonts w:ascii="Georgia" w:hAnsi="Georgia"/>
         </w:rPr>
-        <w:t>What I’ll tell you is that my family initiated the 302 that followed.</w:t>
-      </w:r>
-    </w:p>
-    <w:p>
-      <w:pPr>
-        <w:pStyle w:val="BodyText"/>
-        <w:spacing w:line="276" w:lineRule="auto"/>
-        <w:rPr>
-          <w:rFonts w:ascii="Georgia" w:hAnsi="Georgia"/>
-        </w:rPr>
-      </w:pPr>
-      <w:r>
-        <w:rPr>
-          <w:rFonts w:ascii="Georgia" w:hAnsi="Georgia"/>
-        </w:rPr>
-        <w:t>A 302 is an involuntary psychiatric commitment under Pennsylvania law. Someone signs their name to a document stating that you cannot make certain determinations for yourself and that keeping you safe requires removing your ability to choose. It means the next facility doesn’t ask if you want to come in.</w:t>
-      </w:r>
-    </w:p>
-    <w:p>
-      <w:pPr>
-        <w:pStyle w:val="BodyText"/>
-        <w:spacing w:line="276" w:lineRule="auto"/>
+        <w:t>My family made the decision that followed. Under Pennsylvania law a family member can sign a document stating that you cannot make certain determinations for yourself and that keeping you safe requires removing your ability to choose. It means the next facility doesn't ask if you want to come in.</w:t>
+      </w:r>
+    </w:p>
+    <w:p>
+      <w:pPr>
+        <w:pStyle w:val="BodyText"/>
+        <w:spacing w:line="276" w:lineRule="auto"/>
+        <w:rPr>
+          <w:rFonts w:ascii="Georgia" w:hAnsi="Georgia"/>
+        </w:rPr>
+      </w:pPr>
+      <w:r>
+        <w:rPr>
+          <w:rFonts w:ascii="Georgia" w:hAnsi="Georgia"/>
+        </w:rPr>
+        <w:t>I didn’t get to say no.</w:t>
+      </w:r>
+    </w:p>
+    <w:p>
+      <w:pPr>
+        <w:spacing w:line="276" w:lineRule="auto"/>
+        <w:jc w:val="center"/>
         <w:rPr>
           <w:rFonts w:ascii="Georgia" w:hAnsi="Georgia"/>
         </w:rPr>
@@ -5262,21 +5262,6 @@
           <w:rFonts w:ascii="Georgia" w:hAnsi="Georgia"/>
         </w:rPr>
         <w:lastRenderedPageBreak/>
-        <w:t>I didn’t get to say no.</w:t>
-      </w:r>
-    </w:p>
-    <w:p>
-      <w:pPr>
-        <w:spacing w:line="276" w:lineRule="auto"/>
-        <w:jc w:val="center"/>
-        <w:rPr>
-          <w:rFonts w:ascii="Georgia" w:hAnsi="Georgia"/>
-        </w:rPr>
-      </w:pPr>
-      <w:r>
-        <w:rPr>
-          <w:rFonts w:ascii="Georgia" w:hAnsi="Georgia"/>
-        </w:rPr>
         <w:t>***</w:t>
       </w:r>
     </w:p>
@@ -5457,8 +5442,14 @@
         <w:rPr>
           <w:rFonts w:ascii="Georgia" w:hAnsi="Georgia"/>
         </w:rPr>
+        <w:t xml:space="preserve">I couldn’t accept it. I didn’t know it existed. My FAA account had been removed while I was incapacitated. My Leidos access was gone. There was no inbox I could reach, no </w:t>
+      </w:r>
+      <w:r>
+        <w:rPr>
+          <w:rFonts w:ascii="Georgia" w:hAnsi="Georgia"/>
+        </w:rPr>
         <w:lastRenderedPageBreak/>
-        <w:t>I couldn’t accept it. I didn’t know it existed. My FAA account had been removed while I was incapacitated. My Leidos access was gone. There was no inbox I could reach, no system I could log into, no way to respond to a confirmation that was sitting somewhere waiting for me. The window closed while I was in no position to open it.</w:t>
+        <w:t>system I could log into, no way to respond to a confirmation that was sitting somewhere waiting for me. The window closed while I was in no position to open it.</w:t>
       </w:r>
     </w:p>
     <w:p>
@@ -5578,7 +5569,7 @@
         <w:rPr>
           <w:rFonts w:ascii="Georgia" w:hAnsi="Georgia"/>
         </w:rPr>
-        <w:t>By that point I had not slept properly in close to three weeks. Five days from March 2nd through admission. Seven more days at Brooke Glen where the medication was supposed to help and didn’t. Then the accident. Then the 302. Then Horsham. Three weeks without real sleep, on medications I didn’t know, after the most destabilizing sequence of events of my life.</w:t>
+        <w:t>By that point I had not slept properly in close to three weeks. Five days from March 2nd through admission. Seven more days at Brooke Glen where the medication was supposed to help and didn't. Then the accident. Then the commitment. Then Horsham. Three weeks without real sleep, on medications I didn't know, after the most destabilizing sequence of events of my life.</w:t>
       </w:r>
     </w:p>
     <w:p>
@@ -5638,22 +5629,22 @@
         <w:rPr>
           <w:rFonts w:ascii="Georgia" w:hAnsi="Georgia"/>
         </w:rPr>
+        <w:t>And while I was in there, Leidos contacted my mother and directed her to ship the laptop back to the company. I was hospitalized. I could not refuse. She didn’t know what she was handing over.</w:t>
+      </w:r>
+    </w:p>
+    <w:p>
+      <w:pPr>
+        <w:pStyle w:val="BodyText"/>
+        <w:spacing w:line="276" w:lineRule="auto"/>
+        <w:rPr>
+          <w:rFonts w:ascii="Georgia" w:hAnsi="Georgia"/>
+        </w:rPr>
+      </w:pPr>
+      <w:r>
+        <w:rPr>
+          <w:rFonts w:ascii="Georgia" w:hAnsi="Georgia"/>
+        </w:rPr>
         <w:lastRenderedPageBreak/>
-        <w:t>And while I was in there, Leidos contacted my mother and directed her to ship the laptop back to the company. I was hospitalized. I could not refuse. She didn’t know what she was handing over.</w:t>
-      </w:r>
-    </w:p>
-    <w:p>
-      <w:pPr>
-        <w:pStyle w:val="BodyText"/>
-        <w:spacing w:line="276" w:lineRule="auto"/>
-        <w:rPr>
-          <w:rFonts w:ascii="Georgia" w:hAnsi="Georgia"/>
-        </w:rPr>
-      </w:pPr>
-      <w:r>
-        <w:rPr>
-          <w:rFonts w:ascii="Georgia" w:hAnsi="Georgia"/>
-        </w:rPr>
         <w:t>That laptop had everything on it. The alias account created under my name on March 2nd. The Cisco documents I had been directed to sign removing all record of Ryan C. Lingo from the relevant systems. The Webex account pushed remotely to the machine — the one I set up under a name delivered through plausibly deniable directives. The UAP visualization code. The Python scripts. The months of work that Leidos made sure to recover before I could.</w:t>
       </w:r>
     </w:p>

</xml_diff>

<commit_message>
Expand Nancy Mace entry in Chapter 6 with phone call and submission details
</commit_message>
<xml_diff>
--- a/Manuscript/Plausibly_Deniable_FORMATTED.docx
+++ b/Manuscript/Plausibly_Deniable_FORMATTED.docx
@@ -5,41 +5,65 @@
     <w:p>
       <w:pPr>
         <w:pStyle w:val="Title"/>
+        <w:rPr>
+          <w:rFonts w:ascii="Georgia" w:hAnsi="Georgia"/>
+        </w:rPr>
       </w:pPr>
     </w:p>
     <w:p>
       <w:pPr>
         <w:pStyle w:val="Title"/>
+        <w:rPr>
+          <w:rFonts w:ascii="Georgia" w:hAnsi="Georgia"/>
+        </w:rPr>
       </w:pPr>
     </w:p>
     <w:p>
       <w:pPr>
         <w:pStyle w:val="Title"/>
+        <w:rPr>
+          <w:rFonts w:ascii="Georgia" w:hAnsi="Georgia"/>
+        </w:rPr>
       </w:pPr>
     </w:p>
     <w:p>
       <w:pPr>
         <w:pStyle w:val="Title"/>
+        <w:rPr>
+          <w:rFonts w:ascii="Georgia" w:hAnsi="Georgia"/>
+        </w:rPr>
       </w:pPr>
     </w:p>
     <w:p>
       <w:pPr>
         <w:pStyle w:val="Title"/>
+        <w:rPr>
+          <w:rFonts w:ascii="Georgia" w:hAnsi="Georgia"/>
+        </w:rPr>
       </w:pPr>
     </w:p>
     <w:p>
       <w:pPr>
         <w:pStyle w:val="Title"/>
+        <w:rPr>
+          <w:rFonts w:ascii="Georgia" w:hAnsi="Georgia"/>
+        </w:rPr>
       </w:pPr>
     </w:p>
     <w:p>
       <w:pPr>
         <w:pStyle w:val="Title"/>
+        <w:rPr>
+          <w:rFonts w:ascii="Georgia" w:hAnsi="Georgia"/>
+        </w:rPr>
       </w:pPr>
     </w:p>
     <w:p>
       <w:pPr>
         <w:pStyle w:val="Title"/>
+        <w:rPr>
+          <w:rFonts w:ascii="Georgia" w:hAnsi="Georgia"/>
+        </w:rPr>
       </w:pPr>
     </w:p>
     <w:p>
@@ -92,7 +116,7 @@
           <w:szCs w:val="48"/>
         </w:rPr>
       </w:pPr>
-      <w:bookmarkStart w:id="1" w:name="_Toc228199448"/>
+      <w:bookmarkStart w:id="1" w:name="_Toc228542044"/>
       <w:r>
         <w:rPr>
           <w:rFonts w:ascii="Georgia" w:hAnsi="Georgia"/>
@@ -372,7 +396,7 @@
           <w:szCs w:val="48"/>
         </w:rPr>
       </w:pPr>
-      <w:bookmarkStart w:id="3" w:name="_Toc228199449"/>
+      <w:bookmarkStart w:id="3" w:name="_Toc228542045"/>
       <w:r>
         <w:rPr>
           <w:rFonts w:ascii="Georgia" w:hAnsi="Georgia"/>
@@ -988,7 +1012,7 @@
             </w:rPr>
             <w:fldChar w:fldCharType="separate"/>
           </w:r>
-          <w:hyperlink w:anchor="_Toc228199448" w:history="1">
+          <w:hyperlink w:anchor="_Toc228542044" w:history="1">
             <w:r>
               <w:rPr>
                 <w:rStyle w:val="Hyperlink"/>
@@ -1018,7 +1042,7 @@
                 <w:noProof/>
                 <w:webHidden/>
               </w:rPr>
-              <w:instrText xml:space="preserve"> PAGEREF _Toc228199448 \h </w:instrText>
+              <w:instrText xml:space="preserve"> PAGEREF _Toc228542044 \h </w:instrText>
             </w:r>
             <w:r>
               <w:rPr>
@@ -1062,7 +1086,7 @@
               <w14:ligatures w14:val="standardContextual"/>
             </w:rPr>
           </w:pPr>
-          <w:hyperlink w:anchor="_Toc228199449" w:history="1">
+          <w:hyperlink w:anchor="_Toc228542045" w:history="1">
             <w:r>
               <w:rPr>
                 <w:rStyle w:val="Hyperlink"/>
@@ -1092,7 +1116,7 @@
                 <w:noProof/>
                 <w:webHidden/>
               </w:rPr>
-              <w:instrText xml:space="preserve"> PAGEREF _Toc228199449 \h </w:instrText>
+              <w:instrText xml:space="preserve"> PAGEREF _Toc228542045 \h </w:instrText>
             </w:r>
             <w:r>
               <w:rPr>
@@ -1136,7 +1160,7 @@
               <w14:ligatures w14:val="standardContextual"/>
             </w:rPr>
           </w:pPr>
-          <w:hyperlink w:anchor="_Toc228199450" w:history="1">
+          <w:hyperlink w:anchor="_Toc228542046" w:history="1">
             <w:r>
               <w:rPr>
                 <w:rStyle w:val="Hyperlink"/>
@@ -1166,7 +1190,7 @@
                 <w:noProof/>
                 <w:webHidden/>
               </w:rPr>
-              <w:instrText xml:space="preserve"> PAGEREF _Toc228199450 \h </w:instrText>
+              <w:instrText xml:space="preserve"> PAGEREF _Toc228542046 \h </w:instrText>
             </w:r>
             <w:r>
               <w:rPr>
@@ -1210,7 +1234,7 @@
               <w14:ligatures w14:val="standardContextual"/>
             </w:rPr>
           </w:pPr>
-          <w:hyperlink w:anchor="_Toc228199451" w:history="1">
+          <w:hyperlink w:anchor="_Toc228542047" w:history="1">
             <w:r>
               <w:rPr>
                 <w:rStyle w:val="Hyperlink"/>
@@ -1240,7 +1264,7 @@
                 <w:noProof/>
                 <w:webHidden/>
               </w:rPr>
-              <w:instrText xml:space="preserve"> PAGEREF _Toc228199451 \h </w:instrText>
+              <w:instrText xml:space="preserve"> PAGEREF _Toc228542047 \h </w:instrText>
             </w:r>
             <w:r>
               <w:rPr>
@@ -1284,7 +1308,7 @@
               <w14:ligatures w14:val="standardContextual"/>
             </w:rPr>
           </w:pPr>
-          <w:hyperlink w:anchor="_Toc228199452" w:history="1">
+          <w:hyperlink w:anchor="_Toc228542048" w:history="1">
             <w:r>
               <w:rPr>
                 <w:rStyle w:val="Hyperlink"/>
@@ -1314,7 +1338,7 @@
                 <w:noProof/>
                 <w:webHidden/>
               </w:rPr>
-              <w:instrText xml:space="preserve"> PAGEREF _Toc228199452 \h </w:instrText>
+              <w:instrText xml:space="preserve"> PAGEREF _Toc228542048 \h </w:instrText>
             </w:r>
             <w:r>
               <w:rPr>
@@ -1358,7 +1382,7 @@
               <w14:ligatures w14:val="standardContextual"/>
             </w:rPr>
           </w:pPr>
-          <w:hyperlink w:anchor="_Toc228199453" w:history="1">
+          <w:hyperlink w:anchor="_Toc228542049" w:history="1">
             <w:r>
               <w:rPr>
                 <w:rStyle w:val="Hyperlink"/>
@@ -1388,7 +1412,7 @@
                 <w:noProof/>
                 <w:webHidden/>
               </w:rPr>
-              <w:instrText xml:space="preserve"> PAGEREF _Toc228199453 \h </w:instrText>
+              <w:instrText xml:space="preserve"> PAGEREF _Toc228542049 \h </w:instrText>
             </w:r>
             <w:r>
               <w:rPr>
@@ -1432,7 +1456,7 @@
               <w14:ligatures w14:val="standardContextual"/>
             </w:rPr>
           </w:pPr>
-          <w:hyperlink w:anchor="_Toc228199454" w:history="1">
+          <w:hyperlink w:anchor="_Toc228542050" w:history="1">
             <w:r>
               <w:rPr>
                 <w:rStyle w:val="Hyperlink"/>
@@ -1462,7 +1486,7 @@
                 <w:noProof/>
                 <w:webHidden/>
               </w:rPr>
-              <w:instrText xml:space="preserve"> PAGEREF _Toc228199454 \h </w:instrText>
+              <w:instrText xml:space="preserve"> PAGEREF _Toc228542050 \h </w:instrText>
             </w:r>
             <w:r>
               <w:rPr>
@@ -1506,7 +1530,7 @@
               <w14:ligatures w14:val="standardContextual"/>
             </w:rPr>
           </w:pPr>
-          <w:hyperlink w:anchor="_Toc228199455" w:history="1">
+          <w:hyperlink w:anchor="_Toc228542051" w:history="1">
             <w:r>
               <w:rPr>
                 <w:rStyle w:val="Hyperlink"/>
@@ -1536,7 +1560,7 @@
                 <w:noProof/>
                 <w:webHidden/>
               </w:rPr>
-              <w:instrText xml:space="preserve"> PAGEREF _Toc228199455 \h </w:instrText>
+              <w:instrText xml:space="preserve"> PAGEREF _Toc228542051 \h </w:instrText>
             </w:r>
             <w:r>
               <w:rPr>
@@ -1580,7 +1604,7 @@
               <w14:ligatures w14:val="standardContextual"/>
             </w:rPr>
           </w:pPr>
-          <w:hyperlink w:anchor="_Toc228199456" w:history="1">
+          <w:hyperlink w:anchor="_Toc228542052" w:history="1">
             <w:r>
               <w:rPr>
                 <w:rStyle w:val="Hyperlink"/>
@@ -1610,7 +1634,7 @@
                 <w:noProof/>
                 <w:webHidden/>
               </w:rPr>
-              <w:instrText xml:space="preserve"> PAGEREF _Toc228199456 \h </w:instrText>
+              <w:instrText xml:space="preserve"> PAGEREF _Toc228542052 \h </w:instrText>
             </w:r>
             <w:r>
               <w:rPr>
@@ -1654,7 +1678,7 @@
               <w14:ligatures w14:val="standardContextual"/>
             </w:rPr>
           </w:pPr>
-          <w:hyperlink w:anchor="_Toc228199457" w:history="1">
+          <w:hyperlink w:anchor="_Toc228542053" w:history="1">
             <w:r>
               <w:rPr>
                 <w:rStyle w:val="Hyperlink"/>
@@ -1684,7 +1708,7 @@
                 <w:noProof/>
                 <w:webHidden/>
               </w:rPr>
-              <w:instrText xml:space="preserve"> PAGEREF _Toc228199457 \h </w:instrText>
+              <w:instrText xml:space="preserve"> PAGEREF _Toc228542053 \h </w:instrText>
             </w:r>
             <w:r>
               <w:rPr>
@@ -1728,7 +1752,7 @@
               <w14:ligatures w14:val="standardContextual"/>
             </w:rPr>
           </w:pPr>
-          <w:hyperlink w:anchor="_Toc228199458" w:history="1">
+          <w:hyperlink w:anchor="_Toc228542054" w:history="1">
             <w:r>
               <w:rPr>
                 <w:rStyle w:val="Hyperlink"/>
@@ -1758,7 +1782,7 @@
                 <w:noProof/>
                 <w:webHidden/>
               </w:rPr>
-              <w:instrText xml:space="preserve"> PAGEREF _Toc228199458 \h </w:instrText>
+              <w:instrText xml:space="preserve"> PAGEREF _Toc228542054 \h </w:instrText>
             </w:r>
             <w:r>
               <w:rPr>
@@ -1802,7 +1826,7 @@
               <w14:ligatures w14:val="standardContextual"/>
             </w:rPr>
           </w:pPr>
-          <w:hyperlink w:anchor="_Toc228199459" w:history="1">
+          <w:hyperlink w:anchor="_Toc228542055" w:history="1">
             <w:r>
               <w:rPr>
                 <w:rStyle w:val="Hyperlink"/>
@@ -1832,7 +1856,7 @@
                 <w:noProof/>
                 <w:webHidden/>
               </w:rPr>
-              <w:instrText xml:space="preserve"> PAGEREF _Toc228199459 \h </w:instrText>
+              <w:instrText xml:space="preserve"> PAGEREF _Toc228542055 \h </w:instrText>
             </w:r>
             <w:r>
               <w:rPr>
@@ -1905,7 +1929,7 @@
           <w:szCs w:val="48"/>
         </w:rPr>
       </w:pPr>
-      <w:bookmarkStart w:id="5" w:name="_Toc228199450"/>
+      <w:bookmarkStart w:id="5" w:name="_Toc228542046"/>
       <w:r>
         <w:rPr>
           <w:rFonts w:ascii="Georgia" w:hAnsi="Georgia"/>
@@ -3135,7 +3159,7 @@
           <w:szCs w:val="48"/>
         </w:rPr>
       </w:pPr>
-      <w:bookmarkStart w:id="7" w:name="_Toc228199451"/>
+      <w:bookmarkStart w:id="7" w:name="_Toc228542047"/>
       <w:r>
         <w:rPr>
           <w:rFonts w:ascii="Georgia" w:hAnsi="Georgia"/>
@@ -3823,7 +3847,7 @@
           <w:szCs w:val="48"/>
         </w:rPr>
       </w:pPr>
-      <w:bookmarkStart w:id="9" w:name="_Toc228199452"/>
+      <w:bookmarkStart w:id="9" w:name="_Toc228542048"/>
       <w:r>
         <w:rPr>
           <w:rFonts w:ascii="Georgia" w:hAnsi="Georgia"/>
@@ -4416,7 +4440,7 @@
           <w:szCs w:val="48"/>
         </w:rPr>
       </w:pPr>
-      <w:bookmarkStart w:id="11" w:name="_Toc228199453"/>
+      <w:bookmarkStart w:id="11" w:name="_Toc228542049"/>
       <w:r>
         <w:rPr>
           <w:rFonts w:ascii="Georgia" w:hAnsi="Georgia"/>
@@ -5813,7 +5837,7 @@
           <w:szCs w:val="48"/>
         </w:rPr>
       </w:pPr>
-      <w:bookmarkStart w:id="13" w:name="_Toc228199454"/>
+      <w:bookmarkStart w:id="13" w:name="_Toc228542050"/>
       <w:r>
         <w:rPr>
           <w:rFonts w:ascii="Georgia" w:hAnsi="Georgia"/>
@@ -6944,7 +6968,7 @@
           <w:szCs w:val="48"/>
         </w:rPr>
       </w:pPr>
-      <w:bookmarkStart w:id="15" w:name="_Toc228199455"/>
+      <w:bookmarkStart w:id="15" w:name="_Toc228542051"/>
       <w:r>
         <w:rPr>
           <w:rFonts w:ascii="Georgia" w:hAnsi="Georgia"/>
@@ -7107,18 +7131,8 @@
           <w:i/>
           <w:iCs/>
         </w:rPr>
-        <w:t xml:space="preserve">March 5, </w:t>
-      </w:r>
-      <w:proofErr w:type="gramStart"/>
-      <w:r>
-        <w:rPr>
-          <w:rFonts w:ascii="Georgia" w:hAnsi="Georgia"/>
-          <w:i/>
-          <w:iCs/>
-        </w:rPr>
-        <w:t>2023</w:t>
-      </w:r>
-      <w:proofErr w:type="gramEnd"/>
+        <w:t>March 5, 2023</w:t>
+      </w:r>
       <w:r>
         <w:rPr>
           <w:rFonts w:ascii="Georgia" w:hAnsi="Georgia"/>
@@ -9345,7 +9359,7 @@
           <w:szCs w:val="48"/>
         </w:rPr>
       </w:pPr>
-      <w:bookmarkStart w:id="21" w:name="_Toc228199456"/>
+      <w:bookmarkStart w:id="21" w:name="_Toc228542052"/>
       <w:r>
         <w:rPr>
           <w:rFonts w:ascii="Georgia" w:hAnsi="Georgia"/>
@@ -10706,7 +10720,7 @@
           <w:szCs w:val="48"/>
         </w:rPr>
       </w:pPr>
-      <w:bookmarkStart w:id="23" w:name="_Toc228199457"/>
+      <w:bookmarkStart w:id="23" w:name="_Toc228542053"/>
       <w:r>
         <w:rPr>
           <w:rFonts w:ascii="Georgia" w:hAnsi="Georgia"/>
@@ -11861,7 +11875,7 @@
           <w:szCs w:val="48"/>
         </w:rPr>
       </w:pPr>
-      <w:bookmarkStart w:id="25" w:name="_Toc228199458"/>
+      <w:bookmarkStart w:id="25" w:name="_Toc228542054"/>
       <w:r>
         <w:rPr>
           <w:rFonts w:ascii="Georgia" w:hAnsi="Georgia"/>
@@ -12621,7 +12635,7 @@
           <w:szCs w:val="48"/>
         </w:rPr>
       </w:pPr>
-      <w:bookmarkStart w:id="27" w:name="_Toc228199459"/>
+      <w:bookmarkStart w:id="27" w:name="_Toc228542055"/>
       <w:r>
         <w:rPr>
           <w:rFonts w:ascii="Georgia" w:hAnsi="Georgia"/>

</xml_diff>

<commit_message>
Remove duplicate date from Mace entry in Chapter 6
</commit_message>
<xml_diff>
--- a/Manuscript/Plausibly_Deniable_FORMATTED.docx
+++ b/Manuscript/Plausibly_Deniable_FORMATTED.docx
@@ -158,21 +158,49 @@
         <w:rPr>
           <w:rFonts w:ascii="Georgia" w:hAnsi="Georgia" w:cs="Times New Roman"/>
         </w:rPr>
-        <w:t>To the friends who stayed, you know who you are. You were there during the worst of it and you made me feel heard when hearing me was not easy. That is not a small thing and I have not forgotten it.</w:t>
-      </w:r>
-    </w:p>
-    <w:p>
-      <w:pPr>
-        <w:pStyle w:val="BodyText"/>
-        <w:spacing w:line="276" w:lineRule="auto"/>
+        <w:t xml:space="preserve">To the friends who stayed, you know who you are. You were there during the worst of </w:t>
+      </w:r>
+      <w:proofErr w:type="gramStart"/>
+      <w:r>
         <w:rPr>
           <w:rFonts w:ascii="Georgia" w:hAnsi="Georgia" w:cs="Times New Roman"/>
         </w:rPr>
-      </w:pPr>
+        <w:t>it</w:t>
+      </w:r>
+      <w:proofErr w:type="gramEnd"/>
       <w:r>
         <w:rPr>
           <w:rFonts w:ascii="Georgia" w:hAnsi="Georgia" w:cs="Times New Roman"/>
         </w:rPr>
+        <w:t xml:space="preserve"> and you made me feel heard when hearing me was not easy. That is not a small </w:t>
+      </w:r>
+      <w:proofErr w:type="gramStart"/>
+      <w:r>
+        <w:rPr>
+          <w:rFonts w:ascii="Georgia" w:hAnsi="Georgia" w:cs="Times New Roman"/>
+        </w:rPr>
+        <w:t>thing</w:t>
+      </w:r>
+      <w:proofErr w:type="gramEnd"/>
+      <w:r>
+        <w:rPr>
+          <w:rFonts w:ascii="Georgia" w:hAnsi="Georgia" w:cs="Times New Roman"/>
+        </w:rPr>
+        <w:t xml:space="preserve"> and I have not forgotten it.</w:t>
+      </w:r>
+    </w:p>
+    <w:p>
+      <w:pPr>
+        <w:pStyle w:val="BodyText"/>
+        <w:spacing w:line="276" w:lineRule="auto"/>
+        <w:rPr>
+          <w:rFonts w:ascii="Georgia" w:hAnsi="Georgia" w:cs="Times New Roman"/>
+        </w:rPr>
+      </w:pPr>
+      <w:r>
+        <w:rPr>
+          <w:rFonts w:ascii="Georgia" w:hAnsi="Georgia" w:cs="Times New Roman"/>
+        </w:rPr>
         <w:t>To Kyle, you are a scientist and a rational one. You never reached for the easy explanation. You heard everything and you stayed. You made me feel heard without question, without hesitation. You were my anchor through all of it</w:t>
       </w:r>
       <w:r>
@@ -308,7 +336,21 @@
         <w:rPr>
           <w:rFonts w:ascii="Georgia" w:hAnsi="Georgia" w:cs="Times New Roman"/>
         </w:rPr>
-        <w:t>There is a version of every story like this one that is easier to hold than the truth. It arrives quickly, it feels familiar, and it has the particular comfort of making the world make sense in a way that doesn’t require you to change anything about how you understand it. It is the explanation that asks nothing of you.</w:t>
+        <w:t xml:space="preserve">There is a version of every story like this one that is easier to hold than the truth. It arrives quickly, it feels familiar, and it has the </w:t>
+      </w:r>
+      <w:proofErr w:type="gramStart"/>
+      <w:r>
+        <w:rPr>
+          <w:rFonts w:ascii="Georgia" w:hAnsi="Georgia" w:cs="Times New Roman"/>
+        </w:rPr>
+        <w:t>particular comfort</w:t>
+      </w:r>
+      <w:proofErr w:type="gramEnd"/>
+      <w:r>
+        <w:rPr>
+          <w:rFonts w:ascii="Georgia" w:hAnsi="Georgia" w:cs="Times New Roman"/>
+        </w:rPr>
+        <w:t xml:space="preserve"> of making the world make sense in a way that doesn’t require you to change anything about how you understand it. It is the explanation that asks nothing of you.</w:t>
       </w:r>
     </w:p>
     <w:p>
@@ -468,7 +510,21 @@
         <w:rPr>
           <w:rFonts w:ascii="Georgia" w:hAnsi="Georgia"/>
         </w:rPr>
-        <w:t>What this book asks of you is not belief. It asks attention. Read what happened in the order that it happened. Read the names of the people involved and the titles they held and the dates on which they acted or failed to act. Read the list of every federal agency, every congressional office, every whistleblower attorney, and every newsroom I contacted between 2023 and 2026 in an attempt to find someone willing to look at what had been done to me and say: this matters.</w:t>
+        <w:t xml:space="preserve">What this book asks of you is not belief. It asks attention. Read what happened in the order that it happened. Read the names of the people involved and the titles they held and the dates on which they acted or failed to act. Read the list of every federal agency, every congressional office, every whistleblower attorney, and every newsroom I contacted between 2023 and 2026 </w:t>
+      </w:r>
+      <w:proofErr w:type="gramStart"/>
+      <w:r>
+        <w:rPr>
+          <w:rFonts w:ascii="Georgia" w:hAnsi="Georgia"/>
+        </w:rPr>
+        <w:t>in an attempt to</w:t>
+      </w:r>
+      <w:proofErr w:type="gramEnd"/>
+      <w:r>
+        <w:rPr>
+          <w:rFonts w:ascii="Georgia" w:hAnsi="Georgia"/>
+        </w:rPr>
+        <w:t xml:space="preserve"> find someone willing to look at what had been done to me and say: this matters.</w:t>
       </w:r>
     </w:p>
     <w:p>
@@ -587,7 +643,21 @@
         <w:rPr>
           <w:rFonts w:ascii="Georgia" w:hAnsi="Georgia"/>
         </w:rPr>
-        <w:t xml:space="preserve">Think about the employee who raises an uncomfortable concern at work. Files a complaint, pushes back on something they shouldn’t have, becomes inconvenient to the wrong person. They can’t be fired for it. That would be retaliation, and retaliation leaves a paper trail, and a paper trail is liability. So something quieter happens instead. They </w:t>
+        <w:t xml:space="preserve">Think about the employee who raises an uncomfortable concern at work. Files a complaint, pushes back on something they shouldn’t have, becomes inconvenient to the wrong person. They can’t be fired for it. That would be retaliation, and retaliation leaves a paper trail, and a paper trail is liability. </w:t>
+      </w:r>
+      <w:proofErr w:type="gramStart"/>
+      <w:r>
+        <w:rPr>
+          <w:rFonts w:ascii="Georgia" w:hAnsi="Georgia"/>
+        </w:rPr>
+        <w:t>So</w:t>
+      </w:r>
+      <w:proofErr w:type="gramEnd"/>
+      <w:r>
+        <w:rPr>
+          <w:rFonts w:ascii="Georgia" w:hAnsi="Georgia"/>
+        </w:rPr>
+        <w:t xml:space="preserve"> something quieter happens instead. They </w:t>
       </w:r>
       <w:r>
         <w:rPr>
@@ -766,7 +836,21 @@
           <w:rFonts w:ascii="Georgia" w:hAnsi="Georgia"/>
         </w:rPr>
         <w:lastRenderedPageBreak/>
-        <w:t>2nd, 2023 matters, because it establishes the mechanism. What came after matters, because it establishes the institutional response to that mechanism, which is to say, the absence of one.</w:t>
+        <w:t xml:space="preserve">2nd, </w:t>
+      </w:r>
+      <w:proofErr w:type="gramStart"/>
+      <w:r>
+        <w:rPr>
+          <w:rFonts w:ascii="Georgia" w:hAnsi="Georgia"/>
+        </w:rPr>
+        <w:t>2023</w:t>
+      </w:r>
+      <w:proofErr w:type="gramEnd"/>
+      <w:r>
+        <w:rPr>
+          <w:rFonts w:ascii="Georgia" w:hAnsi="Georgia"/>
+        </w:rPr>
+        <w:t xml:space="preserve"> matters, because it establishes the mechanism. What came after matters, because it establishes the institutional response to that mechanism, which is to say, the absence of one.</w:t>
       </w:r>
     </w:p>
     <w:p>
@@ -1971,7 +2055,21 @@
         <w:rPr>
           <w:rFonts w:ascii="Georgia" w:hAnsi="Georgia"/>
         </w:rPr>
-        <w:t>The prescription was for a muscle relaxer, one I had canceled the day before. I hadn’t ordered a refill. I hadn’t asked for one. It had appeared anyway, and I had picked it up earlier that day without fully processing what that meant. By midnight I had processed it.</w:t>
+        <w:t xml:space="preserve">The prescription was for a muscle </w:t>
+      </w:r>
+      <w:proofErr w:type="gramStart"/>
+      <w:r>
+        <w:rPr>
+          <w:rFonts w:ascii="Georgia" w:hAnsi="Georgia"/>
+        </w:rPr>
+        <w:t>relaxer,</w:t>
+      </w:r>
+      <w:proofErr w:type="gramEnd"/>
+      <w:r>
+        <w:rPr>
+          <w:rFonts w:ascii="Georgia" w:hAnsi="Georgia"/>
+        </w:rPr>
+        <w:t xml:space="preserve"> one I had canceled the day before. I hadn’t ordered a refill. I hadn’t asked for one. It had appeared anyway, and I had picked it up earlier that day without fully processing what that meant. By midnight I had processed it.</w:t>
       </w:r>
     </w:p>
     <w:p>
@@ -2707,7 +2805,21 @@
         <w:rPr>
           <w:rFonts w:ascii="Georgia" w:hAnsi="Georgia"/>
         </w:rPr>
-        <w:t>When I arrived I wasn’t sure who I was supposed to be. Ryan Lingo or Riley Gaines. I was alone. There was one woman working. I was nervous in a specific way — not the adrenaline of earlier, nothing like that. This was the fear of being seen through. Of saying the wrong word, making the wrong move, giving her a reason to look at me twice. I handed over my license. My real name. Ryan Lingo. Not Riley Gaines. I wasn’t sure in that moment which one I was supposed to be, and that uncertainty sat in my chest the whole time I stood at that counter. She handed me the document to open a new account. I took it. I didn’t say anything I shouldn’t have. I walked out.</w:t>
+        <w:t xml:space="preserve">When I </w:t>
+      </w:r>
+      <w:proofErr w:type="gramStart"/>
+      <w:r>
+        <w:rPr>
+          <w:rFonts w:ascii="Georgia" w:hAnsi="Georgia"/>
+        </w:rPr>
+        <w:t>arrived</w:t>
+      </w:r>
+      <w:proofErr w:type="gramEnd"/>
+      <w:r>
+        <w:rPr>
+          <w:rFonts w:ascii="Georgia" w:hAnsi="Georgia"/>
+        </w:rPr>
+        <w:t xml:space="preserve"> I wasn’t sure who I was supposed to be. Ryan Lingo or Riley Gaines. I was alone. There was one woman working. I was nervous in a specific way — not the adrenaline of earlier, nothing like that. This was the fear of being seen through. Of saying the wrong word, making the wrong move, giving her a reason to look at me twice. I handed over my license. My real name. Ryan Lingo. Not Riley Gaines. I wasn’t sure in that moment which one I was supposed to be, and that uncertainty sat in my chest the whole time I stood at that counter. She handed me the document to open a new account. I took it. I didn’t say anything I shouldn’t have. I walked out.</w:t>
       </w:r>
     </w:p>
     <w:p>
@@ -2783,7 +2895,21 @@
         <w:rPr>
           <w:rFonts w:ascii="Georgia" w:hAnsi="Georgia"/>
         </w:rPr>
-        <w:t>I am a geographer. That’s not a dramatic thing to say, but it’s the foundation of everything that follows. I see the world spatially — in patterns, in data, in the relationship between where things are and what they mean. I have a Master’s degree. I know how to build systems that visualize information in three dimensions. I know how to look at a dataset and find the thing that doesn’t belong.</w:t>
+        <w:t xml:space="preserve">I am a geographer. That’s not a dramatic thing to say, but it’s the foundation of everything that follows. I see the world spatially — in patterns, in data, in the relationship between where things are and what they mean. I have a </w:t>
+      </w:r>
+      <w:proofErr w:type="gramStart"/>
+      <w:r>
+        <w:rPr>
+          <w:rFonts w:ascii="Georgia" w:hAnsi="Georgia"/>
+        </w:rPr>
+        <w:t>Master’s</w:t>
+      </w:r>
+      <w:proofErr w:type="gramEnd"/>
+      <w:r>
+        <w:rPr>
+          <w:rFonts w:ascii="Georgia" w:hAnsi="Georgia"/>
+        </w:rPr>
+        <w:t xml:space="preserve"> degree. I know how to build systems that visualize information in three dimensions. I know how to look at a dataset and find the thing that doesn’t belong.</w:t>
       </w:r>
     </w:p>
     <w:p>
@@ -2873,7 +2999,21 @@
         <w:rPr>
           <w:rFonts w:ascii="Georgia" w:hAnsi="Georgia"/>
         </w:rPr>
-        <w:t>The offer came through an unusual channel. My ex-partner was a contractor at FBI headquarters in Washington, working for Deloitte on a federal contract. He asked around, put my name and background in front of the right people, and I was told to apply. That’s how it works in this world. Credentials matter, but so does who knows you exist. And in a city built on contracts layered beneath contracts, the people who know you exist are often contractors too.</w:t>
+        <w:t xml:space="preserve">The offer came through an unusual channel. My ex-partner was a contractor at FBI headquarters in Washington, working for Deloitte on a federal contract. He asked around, put my name and background in front of the right people, and I was told to apply. That’s how it works in this world. Credentials matter, but so does who </w:t>
+      </w:r>
+      <w:proofErr w:type="gramStart"/>
+      <w:r>
+        <w:rPr>
+          <w:rFonts w:ascii="Georgia" w:hAnsi="Georgia"/>
+        </w:rPr>
+        <w:t>knows</w:t>
+      </w:r>
+      <w:proofErr w:type="gramEnd"/>
+      <w:r>
+        <w:rPr>
+          <w:rFonts w:ascii="Georgia" w:hAnsi="Georgia"/>
+        </w:rPr>
+        <w:t xml:space="preserve"> you exist. And in a city built on contracts layered beneath contracts, the people who know you exist are often contractors too.</w:t>
       </w:r>
     </w:p>
     <w:p>
@@ -3096,7 +3236,21 @@
         <w:rPr>
           <w:rFonts w:ascii="Georgia" w:hAnsi="Georgia"/>
         </w:rPr>
-        <w:t>That belief is important to understand, because everything that comes after — every complaint filed, every door closed, every night I spent wondering if I was losing my mind — has to be measured against how completely I trusted the system before it turned on me.</w:t>
+        <w:t xml:space="preserve">That belief is important to understand, because everything that comes after — every complaint filed, every door closed, every night I spent wondering if I was losing my mind — </w:t>
+      </w:r>
+      <w:proofErr w:type="gramStart"/>
+      <w:r>
+        <w:rPr>
+          <w:rFonts w:ascii="Georgia" w:hAnsi="Georgia"/>
+        </w:rPr>
+        <w:t>has to</w:t>
+      </w:r>
+      <w:proofErr w:type="gramEnd"/>
+      <w:r>
+        <w:rPr>
+          <w:rFonts w:ascii="Georgia" w:hAnsi="Georgia"/>
+        </w:rPr>
+        <w:t xml:space="preserve"> be measured against how completely I trusted the system before it turned on me.</w:t>
       </w:r>
     </w:p>
     <w:p>
@@ -3268,22 +3422,50 @@
           <w:rFonts w:ascii="Georgia" w:hAnsi="Georgia"/>
         </w:rPr>
         <w:lastRenderedPageBreak/>
-        <w:t>engage with the architecture of what I was building rather than just the surface of it. At one point there was a specific method in Skyfield — an open-source Python library for tracking objects in space — that we worked through together, a detail in the implementation that mattered for the geometry to be right. He understood it. That kind of collaboration, small as it was, meant something.</w:t>
-      </w:r>
-    </w:p>
-    <w:p>
-      <w:pPr>
-        <w:pStyle w:val="BodyText"/>
-        <w:spacing w:line="276" w:lineRule="auto"/>
-        <w:rPr>
-          <w:rFonts w:ascii="Georgia" w:hAnsi="Georgia"/>
-        </w:rPr>
-      </w:pPr>
-      <w:r>
-        <w:rPr>
-          <w:rFonts w:ascii="Georgia" w:hAnsi="Georgia"/>
-        </w:rPr>
-        <w:t>What we were building, eventually, was this: a three dimensional render of the airspace. You could input an aircraft’s callsign and altitude — a real flight, a real moment — and the tool would place it in space. Then it would map the orbital paths of satellites against that position. Starlink satellites specifically — a commercial constellation of low-Earth orbit satellites launched by SpaceX — the ones whose geometry, at the right sun angle, would produce exactly the kind of anomalous brightness a pilot might report as something unknown.</w:t>
+        <w:t xml:space="preserve">engage with the architecture of what I was building rather than just the surface of it. At one point there was a specific method in </w:t>
+      </w:r>
+      <w:proofErr w:type="spellStart"/>
+      <w:r>
+        <w:rPr>
+          <w:rFonts w:ascii="Georgia" w:hAnsi="Georgia"/>
+        </w:rPr>
+        <w:t>Skyfield</w:t>
+      </w:r>
+      <w:proofErr w:type="spellEnd"/>
+      <w:r>
+        <w:rPr>
+          <w:rFonts w:ascii="Georgia" w:hAnsi="Georgia"/>
+        </w:rPr>
+        <w:t xml:space="preserve"> — an open-source Python library for tracking objects in space — that we worked through together, a detail in the implementation that mattered for the geometry to be right. He understood it. That kind of collaboration, small as it was, meant something.</w:t>
+      </w:r>
+    </w:p>
+    <w:p>
+      <w:pPr>
+        <w:pStyle w:val="BodyText"/>
+        <w:spacing w:line="276" w:lineRule="auto"/>
+        <w:rPr>
+          <w:rFonts w:ascii="Georgia" w:hAnsi="Georgia"/>
+        </w:rPr>
+      </w:pPr>
+      <w:r>
+        <w:rPr>
+          <w:rFonts w:ascii="Georgia" w:hAnsi="Georgia"/>
+        </w:rPr>
+        <w:t xml:space="preserve">What we were building, eventually, was this: a </w:t>
+      </w:r>
+      <w:proofErr w:type="gramStart"/>
+      <w:r>
+        <w:rPr>
+          <w:rFonts w:ascii="Georgia" w:hAnsi="Georgia"/>
+        </w:rPr>
+        <w:t>three dimensional</w:t>
+      </w:r>
+      <w:proofErr w:type="gramEnd"/>
+      <w:r>
+        <w:rPr>
+          <w:rFonts w:ascii="Georgia" w:hAnsi="Georgia"/>
+        </w:rPr>
+        <w:t xml:space="preserve"> render of the airspace. You could input an aircraft’s callsign and altitude — a real flight, a real moment — and the tool would place it in space. Then it would map the orbital paths of satellites against that position. Starlink satellites specifically — a commercial constellation of low-Earth orbit satellites launched by SpaceX — the ones whose geometry, at the right sun angle, would produce exactly the kind of anomalous brightness a pilot might report as something unknown.</w:t>
       </w:r>
     </w:p>
     <w:p>
@@ -3373,7 +3555,21 @@
         <w:rPr>
           <w:rFonts w:ascii="Georgia" w:hAnsi="Georgia"/>
         </w:rPr>
-        <w:t>That’s the honest description of where I was during that period — not stuck, not frustrated, but absorbed in the way you get absorbed when you’re building something that keeps revealing itself to you. The work followed me off the clock. Into evenings. Into weekends. I’d step away from the standing desk and the problem would come with me, turning over quietly in the background the way good problems do when you’re close to something.</w:t>
+        <w:t xml:space="preserve">That’s the honest description of where I was during that period — not stuck, not frustrated, but absorbed in the way you get absorbed when you’re building something that keeps revealing itself to you. The work followed me off the clock. Into evenings. Into weekends. I’d step away from the standing </w:t>
+      </w:r>
+      <w:proofErr w:type="gramStart"/>
+      <w:r>
+        <w:rPr>
+          <w:rFonts w:ascii="Georgia" w:hAnsi="Georgia"/>
+        </w:rPr>
+        <w:t>desk</w:t>
+      </w:r>
+      <w:proofErr w:type="gramEnd"/>
+      <w:r>
+        <w:rPr>
+          <w:rFonts w:ascii="Georgia" w:hAnsi="Georgia"/>
+        </w:rPr>
+        <w:t xml:space="preserve"> and the problem would come with me, turning over quietly in the background the way good problems do when you’re close to something.</w:t>
       </w:r>
     </w:p>
     <w:p>
@@ -3455,7 +3651,21 @@
         <w:rPr>
           <w:rFonts w:ascii="Georgia" w:hAnsi="Georgia"/>
         </w:rPr>
-        <w:t>Most of the reports resolved. Starlink satellites, sunlit at the right moment, visible from the right altitude and position. Pilots and operators seeing something real — just not something unknown. The tool visualized the orbit segments individually — short discrete lines, each one representing just a few seconds of movement in time, rendered in three dimensional space above the aircraft position. Imagine standing beneath the open sky and seeing those brief segments suspended overhead, each one a snapshot of something moving fast. The geometry explained it. You could see the line between the aircraft and the orbit segment, the sun angle, the moment of intersection. You could see exactly what they had seen and why they had seen it.</w:t>
+        <w:t xml:space="preserve">Most of the reports resolved. Starlink satellites, sunlit at the right moment, visible from the right altitude and position. Pilots and operators seeing something real — just not something unknown. The tool visualized the orbit segments individually — short discrete lines, each one representing just a few seconds of movement in time, rendered in </w:t>
+      </w:r>
+      <w:proofErr w:type="gramStart"/>
+      <w:r>
+        <w:rPr>
+          <w:rFonts w:ascii="Georgia" w:hAnsi="Georgia"/>
+        </w:rPr>
+        <w:t>three dimensional</w:t>
+      </w:r>
+      <w:proofErr w:type="gramEnd"/>
+      <w:r>
+        <w:rPr>
+          <w:rFonts w:ascii="Georgia" w:hAnsi="Georgia"/>
+        </w:rPr>
+        <w:t xml:space="preserve"> space above the aircraft position. Imagine standing beneath the open sky and seeing those brief segments suspended overhead, each one a snapshot of something moving fast. The geometry explained it. You could see the line between the aircraft and the orbit segment, the sun angle, the moment of intersection. You could see exactly what they had seen and why they had seen it.</w:t>
       </w:r>
     </w:p>
     <w:p>
@@ -3717,7 +3927,21 @@
         <w:rPr>
           <w:rFonts w:ascii="Georgia" w:hAnsi="Georgia"/>
         </w:rPr>
-        <w:t xml:space="preserve">Built into the visualization was a line of sight function — not something I had added as an afterthought, but a deliberate analytical feature. A user could draw their own line. Aircraft to orbit segment. You could take a specific report, place the aircraft in three dimensional space at its logged altitude and callsign, and then manually trace the geometry yourself — pulling a line from the cockpit position out toward the orbit segments suspended above it, testing whether the angle worked, whether the light </w:t>
+        <w:t xml:space="preserve">Built into the visualization was a </w:t>
+      </w:r>
+      <w:proofErr w:type="gramStart"/>
+      <w:r>
+        <w:rPr>
+          <w:rFonts w:ascii="Georgia" w:hAnsi="Georgia"/>
+        </w:rPr>
+        <w:t>line of sight</w:t>
+      </w:r>
+      <w:proofErr w:type="gramEnd"/>
+      <w:r>
+        <w:rPr>
+          <w:rFonts w:ascii="Georgia" w:hAnsi="Georgia"/>
+        </w:rPr>
+        <w:t xml:space="preserve"> function — not something I had added as an afterthought, but a deliberate analytical feature. A user could draw their own line. Aircraft to orbit segment. You could take a specific report, place the aircraft in three dimensional space at its logged altitude and callsign, and then manually trace the geometry yourself — pulling a line from the cockpit position out toward the orbit segments suspended above it, testing whether the angle worked, whether the light </w:t>
       </w:r>
       <w:r>
         <w:rPr>
@@ -3964,7 +4188,21 @@
         <w:rPr>
           <w:rFonts w:ascii="Georgia" w:hAnsi="Georgia"/>
         </w:rPr>
-        <w:t>He was tall. The meeting was short. He laid out the project the way you lay out something that doesn’t require much explaining: four financial dashboards, employee data, here’s what we need. The kind of task description that’s over before you’ve finished writing it down. I nodded. I was ready to work. If the project felt thin in that room I told myself that was fine. Thin projects had a way of expanding once you got into them.</w:t>
+        <w:t xml:space="preserve">He was tall. The meeting was short. He laid out the project the way you lay out something that doesn’t require much explaining: four financial dashboards, employee data, here’s what we need. The kind of task description that’s over before you’ve finished writing it down. I nodded. I was ready to work. If the project felt thin in that </w:t>
+      </w:r>
+      <w:proofErr w:type="gramStart"/>
+      <w:r>
+        <w:rPr>
+          <w:rFonts w:ascii="Georgia" w:hAnsi="Georgia"/>
+        </w:rPr>
+        <w:t>room</w:t>
+      </w:r>
+      <w:proofErr w:type="gramEnd"/>
+      <w:r>
+        <w:rPr>
+          <w:rFonts w:ascii="Georgia" w:hAnsi="Georgia"/>
+        </w:rPr>
+        <w:t xml:space="preserve"> I told myself that was fine. Thin projects had a way of expanding once you got into them.</w:t>
       </w:r>
     </w:p>
     <w:p>
@@ -4332,52 +4570,136 @@
         <w:rPr>
           <w:rFonts w:ascii="Georgia" w:hAnsi="Georgia"/>
         </w:rPr>
-        <w:t>On the morning of March 7th I texted Jim Estes.</w:t>
-      </w:r>
-    </w:p>
-    <w:p>
-      <w:pPr>
-        <w:pStyle w:val="BodyText"/>
-        <w:spacing w:line="276" w:lineRule="auto"/>
-        <w:rPr>
-          <w:rFonts w:ascii="Georgia" w:hAnsi="Georgia"/>
-        </w:rPr>
-      </w:pPr>
-      <w:r>
-        <w:rPr>
-          <w:rFonts w:ascii="Georgia" w:hAnsi="Georgia"/>
-        </w:rPr>
-        <w:t>I am resigning. Due to an ethics related issue. And unfortunately I do not want to speak with you at this time.</w:t>
-      </w:r>
-    </w:p>
-    <w:p>
-      <w:pPr>
-        <w:pStyle w:val="BodyText"/>
-        <w:spacing w:line="276" w:lineRule="auto"/>
-        <w:rPr>
-          <w:rFonts w:ascii="Georgia" w:hAnsi="Georgia"/>
-        </w:rPr>
-      </w:pPr>
-      <w:r>
-        <w:rPr>
-          <w:rFonts w:ascii="Georgia" w:hAnsi="Georgia"/>
-        </w:rPr>
-        <w:t>That was my documented statement, in writing, at the moment I still had enough clarity to make it. I knew what had happened. I knew what I was walking away from. I named it — an ethics issue — because that’s what it was.</w:t>
-      </w:r>
-    </w:p>
-    <w:p>
-      <w:pPr>
-        <w:pStyle w:val="BodyText"/>
-        <w:spacing w:line="276" w:lineRule="auto"/>
-        <w:rPr>
-          <w:rFonts w:ascii="Georgia" w:hAnsi="Georgia"/>
-        </w:rPr>
-      </w:pPr>
-      <w:r>
-        <w:rPr>
-          <w:rFonts w:ascii="Georgia" w:hAnsi="Georgia"/>
-        </w:rPr>
-        <w:t>By the end of that day I was no longer in a position to act on my own resignation. My family, not understanding what I was resigning from or why, made sure I kept the job. They thought they were helping.</w:t>
+        <w:t xml:space="preserve">On the morning of </w:t>
+      </w:r>
+      <w:proofErr w:type="gramStart"/>
+      <w:r>
+        <w:rPr>
+          <w:rFonts w:ascii="Georgia" w:hAnsi="Georgia"/>
+        </w:rPr>
+        <w:t>March 7th</w:t>
+      </w:r>
+      <w:proofErr w:type="gramEnd"/>
+      <w:r>
+        <w:rPr>
+          <w:rFonts w:ascii="Georgia" w:hAnsi="Georgia"/>
+        </w:rPr>
+        <w:t xml:space="preserve"> I texted Jim Estes.</w:t>
+      </w:r>
+    </w:p>
+    <w:p>
+      <w:pPr>
+        <w:pStyle w:val="BodyText"/>
+        <w:spacing w:line="276" w:lineRule="auto"/>
+        <w:rPr>
+          <w:rFonts w:ascii="Georgia" w:hAnsi="Georgia"/>
+        </w:rPr>
+      </w:pPr>
+      <w:r>
+        <w:rPr>
+          <w:rFonts w:ascii="Georgia" w:hAnsi="Georgia"/>
+        </w:rPr>
+        <w:t xml:space="preserve">I am resigning. Due to an ethics related issue. And </w:t>
+      </w:r>
+      <w:proofErr w:type="gramStart"/>
+      <w:r>
+        <w:rPr>
+          <w:rFonts w:ascii="Georgia" w:hAnsi="Georgia"/>
+        </w:rPr>
+        <w:t>unfortunately</w:t>
+      </w:r>
+      <w:proofErr w:type="gramEnd"/>
+      <w:r>
+        <w:rPr>
+          <w:rFonts w:ascii="Georgia" w:hAnsi="Georgia"/>
+        </w:rPr>
+        <w:t xml:space="preserve"> I do not want to speak with you </w:t>
+      </w:r>
+      <w:proofErr w:type="gramStart"/>
+      <w:r>
+        <w:rPr>
+          <w:rFonts w:ascii="Georgia" w:hAnsi="Georgia"/>
+        </w:rPr>
+        <w:t>at this time</w:t>
+      </w:r>
+      <w:proofErr w:type="gramEnd"/>
+      <w:r>
+        <w:rPr>
+          <w:rFonts w:ascii="Georgia" w:hAnsi="Georgia"/>
+        </w:rPr>
+        <w:t>.</w:t>
+      </w:r>
+    </w:p>
+    <w:p>
+      <w:pPr>
+        <w:pStyle w:val="BodyText"/>
+        <w:spacing w:line="276" w:lineRule="auto"/>
+        <w:rPr>
+          <w:rFonts w:ascii="Georgia" w:hAnsi="Georgia"/>
+        </w:rPr>
+      </w:pPr>
+      <w:r>
+        <w:rPr>
+          <w:rFonts w:ascii="Georgia" w:hAnsi="Georgia"/>
+        </w:rPr>
+        <w:t xml:space="preserve">That was my documented statement, in writing, </w:t>
+      </w:r>
+      <w:proofErr w:type="gramStart"/>
+      <w:r>
+        <w:rPr>
+          <w:rFonts w:ascii="Georgia" w:hAnsi="Georgia"/>
+        </w:rPr>
+        <w:t>at the moment</w:t>
+      </w:r>
+      <w:proofErr w:type="gramEnd"/>
+      <w:r>
+        <w:rPr>
+          <w:rFonts w:ascii="Georgia" w:hAnsi="Georgia"/>
+        </w:rPr>
+        <w:t xml:space="preserve"> I still had enough clarity to make it. I knew what had happened. I knew what I was walking away from. I named it — an ethics issue — because that’s what it was.</w:t>
+      </w:r>
+    </w:p>
+    <w:p>
+      <w:pPr>
+        <w:pStyle w:val="BodyText"/>
+        <w:spacing w:line="276" w:lineRule="auto"/>
+        <w:rPr>
+          <w:rFonts w:ascii="Georgia" w:hAnsi="Georgia"/>
+        </w:rPr>
+      </w:pPr>
+      <w:r>
+        <w:rPr>
+          <w:rFonts w:ascii="Georgia" w:hAnsi="Georgia"/>
+        </w:rPr>
+        <w:t xml:space="preserve">By the end of that </w:t>
+      </w:r>
+      <w:proofErr w:type="gramStart"/>
+      <w:r>
+        <w:rPr>
+          <w:rFonts w:ascii="Georgia" w:hAnsi="Georgia"/>
+        </w:rPr>
+        <w:t>day</w:t>
+      </w:r>
+      <w:proofErr w:type="gramEnd"/>
+      <w:r>
+        <w:rPr>
+          <w:rFonts w:ascii="Georgia" w:hAnsi="Georgia"/>
+        </w:rPr>
+        <w:t xml:space="preserve"> I </w:t>
+      </w:r>
+      <w:proofErr w:type="gramStart"/>
+      <w:r>
+        <w:rPr>
+          <w:rFonts w:ascii="Georgia" w:hAnsi="Georgia"/>
+        </w:rPr>
+        <w:t>was no longer in a position to</w:t>
+      </w:r>
+      <w:proofErr w:type="gramEnd"/>
+      <w:r>
+        <w:rPr>
+          <w:rFonts w:ascii="Georgia" w:hAnsi="Georgia"/>
+        </w:rPr>
+        <w:t xml:space="preserve"> act on my own resignation. My family, not understanding what I was resigning from or why, made sure I kept the job. They thought they were helping.</w:t>
       </w:r>
     </w:p>
     <w:p>
@@ -4663,7 +4985,21 @@
         <w:rPr>
           <w:rFonts w:ascii="Georgia" w:hAnsi="Georgia"/>
         </w:rPr>
-        <w:t>The building was dilapidated. Small. Unclean in the way that buildings get when the people running them have stopped seeing the people inside them. The staff moved through the unit with the particular efficiency of people who had learned not to look too directly at what they were administering. You were processed. You were assigned. You were placed.</w:t>
+        <w:t xml:space="preserve">The building was dilapidated. Small. Unclean in the way that buildings get when the people running them have stopped seeing the people inside them. The staff moved through the unit with the </w:t>
+      </w:r>
+      <w:proofErr w:type="gramStart"/>
+      <w:r>
+        <w:rPr>
+          <w:rFonts w:ascii="Georgia" w:hAnsi="Georgia"/>
+        </w:rPr>
+        <w:t>particular efficiency</w:t>
+      </w:r>
+      <w:proofErr w:type="gramEnd"/>
+      <w:r>
+        <w:rPr>
+          <w:rFonts w:ascii="Georgia" w:hAnsi="Georgia"/>
+        </w:rPr>
+        <w:t xml:space="preserve"> of people who had learned not to look too directly at what they were administering. You were processed. You were assigned. You were placed.</w:t>
       </w:r>
     </w:p>
     <w:p>
@@ -4724,7 +5060,21 @@
         <w:rPr>
           <w:rFonts w:ascii="Georgia" w:hAnsi="Georgia"/>
         </w:rPr>
-        <w:t xml:space="preserve">He said it the way you’d mention a preference for a particular kind of weather. Conversationally. Like he was offering something about himself so I’d know who I was dealing with. I nodded. I had nothing to offer in return that would have made sense in that context. </w:t>
+        <w:t xml:space="preserve">He said it the way you’d mention a preference for a particular kind of weather. Conversationally. Like he was offering something about </w:t>
+      </w:r>
+      <w:proofErr w:type="gramStart"/>
+      <w:r>
+        <w:rPr>
+          <w:rFonts w:ascii="Georgia" w:hAnsi="Georgia"/>
+        </w:rPr>
+        <w:t>himself</w:t>
+      </w:r>
+      <w:proofErr w:type="gramEnd"/>
+      <w:r>
+        <w:rPr>
+          <w:rFonts w:ascii="Georgia" w:hAnsi="Georgia"/>
+        </w:rPr>
+        <w:t xml:space="preserve"> so I’d know who I was dealing with. I nodded. I had nothing to offer in return that would have made sense in that context. </w:t>
       </w:r>
       <w:r>
         <w:rPr>
@@ -4749,11 +5099,19 @@
           <w:rFonts w:ascii="Georgia" w:hAnsi="Georgia"/>
         </w:rPr>
       </w:pPr>
-      <w:r>
-        <w:rPr>
-          <w:rFonts w:ascii="Georgia" w:hAnsi="Georgia"/>
-        </w:rPr>
-        <w:t>So I kept the logic to myself.</w:t>
+      <w:proofErr w:type="gramStart"/>
+      <w:r>
+        <w:rPr>
+          <w:rFonts w:ascii="Georgia" w:hAnsi="Georgia"/>
+        </w:rPr>
+        <w:t>So</w:t>
+      </w:r>
+      <w:proofErr w:type="gramEnd"/>
+      <w:r>
+        <w:rPr>
+          <w:rFonts w:ascii="Georgia" w:hAnsi="Georgia"/>
+        </w:rPr>
+        <w:t xml:space="preserve"> I kept the logic to myself.</w:t>
       </w:r>
     </w:p>
     <w:p>
@@ -4783,7 +5141,21 @@
         <w:rPr>
           <w:rFonts w:ascii="Georgia" w:hAnsi="Georgia"/>
         </w:rPr>
-        <w:t xml:space="preserve">The medication was supposed to help me sleep. It didn’t, or not enough, or not in any way that felt like actual rest. I would lie in the dark and the question would come back the same way it had been coming back since March 2nd. </w:t>
+        <w:t xml:space="preserve">The medication was supposed to help me sleep. It didn’t, or not enough, or not in any way that felt like actual rest. I would lie in the </w:t>
+      </w:r>
+      <w:proofErr w:type="gramStart"/>
+      <w:r>
+        <w:rPr>
+          <w:rFonts w:ascii="Georgia" w:hAnsi="Georgia"/>
+        </w:rPr>
+        <w:t>dark</w:t>
+      </w:r>
+      <w:proofErr w:type="gramEnd"/>
+      <w:r>
+        <w:rPr>
+          <w:rFonts w:ascii="Georgia" w:hAnsi="Georgia"/>
+        </w:rPr>
+        <w:t xml:space="preserve"> and the question would come back the same way it had been coming back since March 2nd. </w:t>
       </w:r>
       <w:r>
         <w:rPr>
@@ -4842,7 +5214,21 @@
         <w:rPr>
           <w:rFonts w:ascii="Georgia" w:hAnsi="Georgia"/>
         </w:rPr>
-        <w:t>We took breaks outside. That was the rhythm of the unit — structured time outdoors, back inside, structured time indoors, repeat. It gave the day a shape that didn’t require you to think about what the day actually was.</w:t>
+        <w:t xml:space="preserve">We took breaks outside. That was the rhythm of the unit — structured time outdoors, back inside, structured time indoors, repeat. It gave the day a shape that didn’t require you to think about what the day </w:t>
+      </w:r>
+      <w:proofErr w:type="gramStart"/>
+      <w:r>
+        <w:rPr>
+          <w:rFonts w:ascii="Georgia" w:hAnsi="Georgia"/>
+        </w:rPr>
+        <w:t>actually was</w:t>
+      </w:r>
+      <w:proofErr w:type="gramEnd"/>
+      <w:r>
+        <w:rPr>
+          <w:rFonts w:ascii="Georgia" w:hAnsi="Georgia"/>
+        </w:rPr>
+        <w:t>.</w:t>
       </w:r>
     </w:p>
     <w:p>
@@ -4872,7 +5258,21 @@
         <w:rPr>
           <w:rFonts w:ascii="Georgia" w:hAnsi="Georgia"/>
         </w:rPr>
-        <w:t>I don’t remember exactly what we were doing. Probably nothing. Standing. The particular quality of time that exists in those places where there is nowhere to be and nothing to accomplish and the minutes pass the way minutes pass when you are waiting for something you cannot name.</w:t>
+        <w:t xml:space="preserve">I don’t remember exactly what we were doing. Probably nothing. Standing. The </w:t>
+      </w:r>
+      <w:proofErr w:type="gramStart"/>
+      <w:r>
+        <w:rPr>
+          <w:rFonts w:ascii="Georgia" w:hAnsi="Georgia"/>
+        </w:rPr>
+        <w:t>particular quality</w:t>
+      </w:r>
+      <w:proofErr w:type="gramEnd"/>
+      <w:r>
+        <w:rPr>
+          <w:rFonts w:ascii="Georgia" w:hAnsi="Georgia"/>
+        </w:rPr>
+        <w:t xml:space="preserve"> of time that exists in those places where there is nowhere to be and nothing to accomplish and the minutes pass the way minutes pass when you are waiting for something you cannot name.</w:t>
       </w:r>
     </w:p>
     <w:p>
@@ -4909,22 +5309,50 @@
           <w:rFonts w:ascii="Georgia" w:hAnsi="Georgia"/>
         </w:rPr>
         <w:lastRenderedPageBreak/>
-        <w:t>is the stretcher. The body on it. The particular stillness of someone who has gone somewhere else and may not come back.</w:t>
-      </w:r>
-    </w:p>
-    <w:p>
-      <w:pPr>
-        <w:pStyle w:val="BodyText"/>
-        <w:spacing w:line="276" w:lineRule="auto"/>
-        <w:rPr>
-          <w:rFonts w:ascii="Georgia" w:hAnsi="Georgia"/>
-        </w:rPr>
-      </w:pPr>
-      <w:r>
-        <w:rPr>
-          <w:rFonts w:ascii="Georgia" w:hAnsi="Georgia"/>
-        </w:rPr>
-        <w:t>He had collected the pills. That was how it worked, apparently — you learned this, the way you learn the architecture of any place you’re confined to. He had been collecting them and he had taken them all at once while we were outside. By the time we came back in the paramedics were working over him on the floor and then he was on the stretcher and then he was gone, transferred out to a hospital from the hospital, and the unit absorbed the absence the way units absorb things, which is to say not at all and completely simultaneously.</w:t>
+        <w:t xml:space="preserve">is the stretcher. The body on it. The </w:t>
+      </w:r>
+      <w:proofErr w:type="gramStart"/>
+      <w:r>
+        <w:rPr>
+          <w:rFonts w:ascii="Georgia" w:hAnsi="Georgia"/>
+        </w:rPr>
+        <w:t>particular stillness</w:t>
+      </w:r>
+      <w:proofErr w:type="gramEnd"/>
+      <w:r>
+        <w:rPr>
+          <w:rFonts w:ascii="Georgia" w:hAnsi="Georgia"/>
+        </w:rPr>
+        <w:t xml:space="preserve"> of someone who has gone somewhere else and may not come back.</w:t>
+      </w:r>
+    </w:p>
+    <w:p>
+      <w:pPr>
+        <w:pStyle w:val="BodyText"/>
+        <w:spacing w:line="276" w:lineRule="auto"/>
+        <w:rPr>
+          <w:rFonts w:ascii="Georgia" w:hAnsi="Georgia"/>
+        </w:rPr>
+      </w:pPr>
+      <w:r>
+        <w:rPr>
+          <w:rFonts w:ascii="Georgia" w:hAnsi="Georgia"/>
+        </w:rPr>
+        <w:t xml:space="preserve">He had collected the pills. That was how it worked, apparently — you learned this, the way you learn the architecture of any place you’re confined to. He had been collecting </w:t>
+      </w:r>
+      <w:proofErr w:type="gramStart"/>
+      <w:r>
+        <w:rPr>
+          <w:rFonts w:ascii="Georgia" w:hAnsi="Georgia"/>
+        </w:rPr>
+        <w:t>them</w:t>
+      </w:r>
+      <w:proofErr w:type="gramEnd"/>
+      <w:r>
+        <w:rPr>
+          <w:rFonts w:ascii="Georgia" w:hAnsi="Georgia"/>
+        </w:rPr>
+        <w:t xml:space="preserve"> and he had taken them all at once while we were outside. By the time we came back in the paramedics were working over him on the floor and then he was on the stretcher and then he was gone, transferred out to a hospital from the hospital, and the unit absorbed the absence the way units absorb things, which is to say not at all and completely simultaneously.</w:t>
       </w:r>
     </w:p>
     <w:p>
@@ -5150,22 +5578,50 @@
         <w:rPr>
           <w:rFonts w:ascii="Georgia" w:hAnsi="Georgia"/>
         </w:rPr>
-        <w:t>During that period I called Leidos. More than once. I have a text from Zoey confirming she received one of my voicemails. I was not calling to ask for help. I was calling to put them on notice — that I intended to pursue arbitration, that I was not going to let this go quietly.</w:t>
-      </w:r>
-    </w:p>
-    <w:p>
-      <w:pPr>
-        <w:pStyle w:val="BodyText"/>
-        <w:spacing w:line="276" w:lineRule="auto"/>
-        <w:rPr>
-          <w:rFonts w:ascii="Georgia" w:hAnsi="Georgia"/>
-        </w:rPr>
-      </w:pPr>
-      <w:r>
-        <w:rPr>
-          <w:rFonts w:ascii="Georgia" w:hAnsi="Georgia"/>
-        </w:rPr>
-        <w:t>At some point during those communications she said it.</w:t>
+        <w:t xml:space="preserve">During that </w:t>
+      </w:r>
+      <w:proofErr w:type="gramStart"/>
+      <w:r>
+        <w:rPr>
+          <w:rFonts w:ascii="Georgia" w:hAnsi="Georgia"/>
+        </w:rPr>
+        <w:t>period</w:t>
+      </w:r>
+      <w:proofErr w:type="gramEnd"/>
+      <w:r>
+        <w:rPr>
+          <w:rFonts w:ascii="Georgia" w:hAnsi="Georgia"/>
+        </w:rPr>
+        <w:t xml:space="preserve"> I called Leidos. More than once. I have a text from Zoey confirming she received one of my voicemails. I was not calling to ask for help. I was calling to put them on notice — that I intended to pursue arbitration, that I was not going to let this go quietly.</w:t>
+      </w:r>
+    </w:p>
+    <w:p>
+      <w:pPr>
+        <w:pStyle w:val="BodyText"/>
+        <w:spacing w:line="276" w:lineRule="auto"/>
+        <w:rPr>
+          <w:rFonts w:ascii="Georgia" w:hAnsi="Georgia"/>
+        </w:rPr>
+      </w:pPr>
+      <w:r>
+        <w:rPr>
+          <w:rFonts w:ascii="Georgia" w:hAnsi="Georgia"/>
+        </w:rPr>
+        <w:t xml:space="preserve">At some point during those </w:t>
+      </w:r>
+      <w:proofErr w:type="gramStart"/>
+      <w:r>
+        <w:rPr>
+          <w:rFonts w:ascii="Georgia" w:hAnsi="Georgia"/>
+        </w:rPr>
+        <w:t>communications</w:t>
+      </w:r>
+      <w:proofErr w:type="gramEnd"/>
+      <w:r>
+        <w:rPr>
+          <w:rFonts w:ascii="Georgia" w:hAnsi="Georgia"/>
+        </w:rPr>
+        <w:t xml:space="preserve"> she said it.</w:t>
       </w:r>
     </w:p>
     <w:p>
@@ -5391,22 +5847,44 @@
         <w:rPr>
           <w:rFonts w:ascii="Georgia" w:hAnsi="Georgia"/>
         </w:rPr>
-        <w:t>I want to be careful about why. It wasn’t that I thought he was wrong about everything. It was that I had stopped. I had been mutilated and exhausted into silence by that point. I was not going to sit in a psychiatric facility and tell a man with his face covered that I understood something about what it meant to know a thing you couldn’t prove to anyone’s satisfaction. I was not going to give anyone in that building one more data point.</w:t>
-      </w:r>
-    </w:p>
-    <w:p>
-      <w:pPr>
-        <w:pStyle w:val="BodyText"/>
-        <w:spacing w:line="276" w:lineRule="auto"/>
-        <w:rPr>
-          <w:rFonts w:ascii="Georgia" w:hAnsi="Georgia"/>
-        </w:rPr>
-      </w:pPr>
-      <w:r>
-        <w:rPr>
-          <w:rFonts w:ascii="Georgia" w:hAnsi="Georgia"/>
-        </w:rPr>
-        <w:t>So I watched the ceiling instead.</w:t>
+        <w:t xml:space="preserve">I want to be careful about why. It wasn’t that I thought he was wrong about everything. It was that I had stopped. I had been mutilated and exhausted into silence by that point. I was not going to sit in a psychiatric facility and tell a man with his face covered that I understood something about what it meant to know a thing you couldn’t prove to anyone’s satisfaction. I was not going to give anyone in that building one more </w:t>
+      </w:r>
+      <w:proofErr w:type="gramStart"/>
+      <w:r>
+        <w:rPr>
+          <w:rFonts w:ascii="Georgia" w:hAnsi="Georgia"/>
+        </w:rPr>
+        <w:t>data</w:t>
+      </w:r>
+      <w:proofErr w:type="gramEnd"/>
+      <w:r>
+        <w:rPr>
+          <w:rFonts w:ascii="Georgia" w:hAnsi="Georgia"/>
+        </w:rPr>
+        <w:t xml:space="preserve"> point.</w:t>
+      </w:r>
+    </w:p>
+    <w:p>
+      <w:pPr>
+        <w:pStyle w:val="BodyText"/>
+        <w:spacing w:line="276" w:lineRule="auto"/>
+        <w:rPr>
+          <w:rFonts w:ascii="Georgia" w:hAnsi="Georgia"/>
+        </w:rPr>
+      </w:pPr>
+      <w:proofErr w:type="gramStart"/>
+      <w:r>
+        <w:rPr>
+          <w:rFonts w:ascii="Georgia" w:hAnsi="Georgia"/>
+        </w:rPr>
+        <w:t>So</w:t>
+      </w:r>
+      <w:proofErr w:type="gramEnd"/>
+      <w:r>
+        <w:rPr>
+          <w:rFonts w:ascii="Georgia" w:hAnsi="Georgia"/>
+        </w:rPr>
+        <w:t xml:space="preserve"> I watched the ceiling instead.</w:t>
       </w:r>
     </w:p>
     <w:p>
@@ -5999,7 +6477,21 @@
         <w:rPr>
           <w:rFonts w:ascii="Georgia" w:hAnsi="Georgia"/>
         </w:rPr>
-        <w:t>My FAA account had been removed while I was incapacitated. My PIV card — the physical hardware token required to access federal systems — was no longer valid. I coordinated with an Aviation Safety Assistant at the Allentown FSDO, and physically traveled to the FAA office with my government laptop to have it restored. The emails documenting that process exist. June 2023. A month and a half after I had walked out of Horsham.</w:t>
+        <w:t xml:space="preserve">My FAA account had been removed while I was incapacitated. My PIV card — the physical hardware token required to access federal systems — was no longer valid. I coordinated with an Aviation Safety Assistant at the </w:t>
+      </w:r>
+      <w:proofErr w:type="gramStart"/>
+      <w:r>
+        <w:rPr>
+          <w:rFonts w:ascii="Georgia" w:hAnsi="Georgia"/>
+        </w:rPr>
+        <w:t>Allentown FSDO, and</w:t>
+      </w:r>
+      <w:proofErr w:type="gramEnd"/>
+      <w:r>
+        <w:rPr>
+          <w:rFonts w:ascii="Georgia" w:hAnsi="Georgia"/>
+        </w:rPr>
+        <w:t xml:space="preserve"> physically traveled to the FAA office with my government laptop to have it restored. The emails documenting that process exist. June 2023. A month and a half after I had walked out of Horsham.</w:t>
       </w:r>
     </w:p>
     <w:p>
@@ -6060,7 +6552,21 @@
           <w:rFonts w:ascii="Georgia" w:hAnsi="Georgia"/>
         </w:rPr>
         <w:lastRenderedPageBreak/>
-        <w:t>I don’t remember exactly when I first noticed it — but at some point I was scrolling and something stopped me. A song title. Then another. Then the algorithm serving me an album I hadn’t searched for, an artist I hadn’t played, a title that sat in my chest like a word spoken directly to me. This was the same period I was filing complaints with federal agencies, reaching congressional offices, and looking for attorneys. The content arrived alongside all of it.</w:t>
+        <w:t xml:space="preserve">I don’t remember exactly when I first noticed it — but at some </w:t>
+      </w:r>
+      <w:proofErr w:type="gramStart"/>
+      <w:r>
+        <w:rPr>
+          <w:rFonts w:ascii="Georgia" w:hAnsi="Georgia"/>
+        </w:rPr>
+        <w:t>point</w:t>
+      </w:r>
+      <w:proofErr w:type="gramEnd"/>
+      <w:r>
+        <w:rPr>
+          <w:rFonts w:ascii="Georgia" w:hAnsi="Georgia"/>
+        </w:rPr>
+        <w:t xml:space="preserve"> I was scrolling and something stopped me. A song title. Then another. Then the algorithm serving me an album I hadn’t searched for, an artist I hadn’t played, a title that sat in my chest like a word spoken directly to me. This was the same period I was filing complaints with federal agencies, reaching congressional offices, and looking for attorneys. The content arrived alongside all of it.</w:t>
       </w:r>
     </w:p>
     <w:p>
@@ -6146,11 +6652,19 @@
           <w:rFonts w:ascii="Georgia" w:hAnsi="Georgia"/>
         </w:rPr>
       </w:pPr>
-      <w:r>
-        <w:rPr>
-          <w:rFonts w:ascii="Georgia" w:hAnsi="Georgia"/>
-        </w:rPr>
-        <w:t>So I didn’t tell anyone. I had already learned what happened when I told people things they weren’t prepared to believe. My family had heard me say things before the hospitalization that they had filed neatly away as symptoms. The institutional record had done the same. I had been given a diagnosis and a prescription and a discharge date, and the world had moved on with the comfortable certainty that the problem had been located and treated.</w:t>
+      <w:proofErr w:type="gramStart"/>
+      <w:r>
+        <w:rPr>
+          <w:rFonts w:ascii="Georgia" w:hAnsi="Georgia"/>
+        </w:rPr>
+        <w:t>So</w:t>
+      </w:r>
+      <w:proofErr w:type="gramEnd"/>
+      <w:r>
+        <w:rPr>
+          <w:rFonts w:ascii="Georgia" w:hAnsi="Georgia"/>
+        </w:rPr>
+        <w:t xml:space="preserve"> I didn’t tell anyone. I had already learned what happened when I told people things they weren’t prepared to believe. My family had heard me say things before the hospitalization that they had filed neatly away as symptoms. The institutional record had done the same. I had been given a diagnosis and a prescription and a discharge date, and the world had moved on with the comfortable certainty that the problem had been located and treated.</w:t>
       </w:r>
     </w:p>
     <w:p>
@@ -6286,7 +6800,21 @@
         <w:rPr>
           <w:rFonts w:ascii="Georgia" w:hAnsi="Georgia"/>
         </w:rPr>
-        <w:t>There is a term for what I was experiencing. Several, actually. I want to name them here precisely because the naming matters. Because one of the ways this kind of operation sustains itself is by existing in a space that feels too strange to describe, too personal to be taken seriously, too diffuse to be actionable. Giving it a name collapses that space.</w:t>
+        <w:t xml:space="preserve">There is a term for what I was experiencing. </w:t>
+      </w:r>
+      <w:proofErr w:type="gramStart"/>
+      <w:r>
+        <w:rPr>
+          <w:rFonts w:ascii="Georgia" w:hAnsi="Georgia"/>
+        </w:rPr>
+        <w:t>Several, actually</w:t>
+      </w:r>
+      <w:proofErr w:type="gramEnd"/>
+      <w:r>
+        <w:rPr>
+          <w:rFonts w:ascii="Georgia" w:hAnsi="Georgia"/>
+        </w:rPr>
+        <w:t>. I want to name them here precisely because the naming matters. Because one of the ways this kind of operation sustains itself is by existing in a space that feels too strange to describe, too personal to be taken seriously, too diffuse to be actionable. Giving it a name collapses that space.</w:t>
       </w:r>
     </w:p>
     <w:p>
@@ -6448,22 +6976,50 @@
         <w:rPr>
           <w:rFonts w:ascii="Georgia" w:hAnsi="Georgia"/>
         </w:rPr>
-        <w:t>I was applying for federal and federal contracting roles simultaneously. On LinkedIn and Indeed I was being served bat biologist and boat captain as top picks. For months the platforms pushed recommendations that had nothing to do with my background and everything to do with keeping me away from the work I was qualified for. I had a Master’s degree. I had been a Geographer for the United States Census Bureau. I had held a SECRET clearance. The algorithm had filed me somewhere else entirely.</w:t>
-      </w:r>
-    </w:p>
-    <w:p>
-      <w:pPr>
-        <w:pStyle w:val="BodyText"/>
-        <w:spacing w:line="276" w:lineRule="auto"/>
-        <w:rPr>
-          <w:rFonts w:ascii="Georgia" w:hAnsi="Georgia"/>
-        </w:rPr>
-      </w:pPr>
-      <w:r>
-        <w:rPr>
-          <w:rFonts w:ascii="Georgia" w:hAnsi="Georgia"/>
-        </w:rPr>
-        <w:t>Then there was the video. “They’re gonna execute the mother.” Rendered in block letters over footage of a burning landscape. Delivered through the same feed that showed me home décor and travel content and the ordinary noise of other people’s lives. Just sitting there. Waiting.</w:t>
+        <w:t xml:space="preserve">I was applying for federal and federal contracting roles simultaneously. On LinkedIn and Indeed I was being served bat biologist and boat captain as top picks. For months the platforms pushed recommendations that had nothing to do with my background and everything to do with keeping me away from the work I was qualified for. I had a </w:t>
+      </w:r>
+      <w:proofErr w:type="gramStart"/>
+      <w:r>
+        <w:rPr>
+          <w:rFonts w:ascii="Georgia" w:hAnsi="Georgia"/>
+        </w:rPr>
+        <w:t>Master’s</w:t>
+      </w:r>
+      <w:proofErr w:type="gramEnd"/>
+      <w:r>
+        <w:rPr>
+          <w:rFonts w:ascii="Georgia" w:hAnsi="Georgia"/>
+        </w:rPr>
+        <w:t xml:space="preserve"> degree. I had been a Geographer for the United States Census Bureau. I had held a SECRET clearance. The algorithm had filed me somewhere else entirely.</w:t>
+      </w:r>
+    </w:p>
+    <w:p>
+      <w:pPr>
+        <w:pStyle w:val="BodyText"/>
+        <w:spacing w:line="276" w:lineRule="auto"/>
+        <w:rPr>
+          <w:rFonts w:ascii="Georgia" w:hAnsi="Georgia"/>
+        </w:rPr>
+      </w:pPr>
+      <w:r>
+        <w:rPr>
+          <w:rFonts w:ascii="Georgia" w:hAnsi="Georgia"/>
+        </w:rPr>
+        <w:t xml:space="preserve">Then there was the video. “They’re </w:t>
+      </w:r>
+      <w:proofErr w:type="spellStart"/>
+      <w:r>
+        <w:rPr>
+          <w:rFonts w:ascii="Georgia" w:hAnsi="Georgia"/>
+        </w:rPr>
+        <w:t>gonna</w:t>
+      </w:r>
+      <w:proofErr w:type="spellEnd"/>
+      <w:r>
+        <w:rPr>
+          <w:rFonts w:ascii="Georgia" w:hAnsi="Georgia"/>
+        </w:rPr>
+        <w:t xml:space="preserve"> execute the mother.” Rendered in block letters over footage of a burning landscape. Delivered through the same feed that showed me home décor and travel content and the ordinary noise of other people’s lives. Just sitting there. Waiting.</w:t>
       </w:r>
     </w:p>
     <w:p>
@@ -6685,11 +7241,19 @@
           <w:rFonts w:ascii="Georgia" w:hAnsi="Georgia"/>
         </w:rPr>
       </w:pPr>
-      <w:r>
-        <w:rPr>
-          <w:rFonts w:ascii="Georgia" w:hAnsi="Georgia"/>
-        </w:rPr>
-        <w:t xml:space="preserve">So I tried to show them what was happening in the only way I had left. They had been sending me content for months — that’s what I need you to understand before I tell you what I did next. This wasn’t my language. It was theirs. Kesha’s </w:t>
+      <w:proofErr w:type="gramStart"/>
+      <w:r>
+        <w:rPr>
+          <w:rFonts w:ascii="Georgia" w:hAnsi="Georgia"/>
+        </w:rPr>
+        <w:t>So</w:t>
+      </w:r>
+      <w:proofErr w:type="gramEnd"/>
+      <w:r>
+        <w:rPr>
+          <w:rFonts w:ascii="Georgia" w:hAnsi="Georgia"/>
+        </w:rPr>
+        <w:t xml:space="preserve"> I tried to show them what was happening in the only way I had left. They had been sending me content for months — that’s what I need you to understand before I tell you what I did next. This wasn’t my language. It was theirs. Kesha’s </w:t>
       </w:r>
       <w:r>
         <w:rPr>
@@ -6764,7 +7328,21 @@
           <w:rFonts w:ascii="Georgia" w:hAnsi="Georgia"/>
         </w:rPr>
         <w:lastRenderedPageBreak/>
-        <w:t>What I got back was the particular silence that offices are very good at, the kind that isn’t refusal exactly, just the absence of acknowledgment. The kind that leaves you holding the thing you tried to hand someone, alone again with it.</w:t>
+        <w:t xml:space="preserve">What I got back was the </w:t>
+      </w:r>
+      <w:proofErr w:type="gramStart"/>
+      <w:r>
+        <w:rPr>
+          <w:rFonts w:ascii="Georgia" w:hAnsi="Georgia"/>
+        </w:rPr>
+        <w:t>particular silence</w:t>
+      </w:r>
+      <w:proofErr w:type="gramEnd"/>
+      <w:r>
+        <w:rPr>
+          <w:rFonts w:ascii="Georgia" w:hAnsi="Georgia"/>
+        </w:rPr>
+        <w:t xml:space="preserve"> that offices are very good at, the kind that isn’t refusal exactly, just the absence of acknowledgment. The kind that leaves you holding the thing you tried to hand someone, alone again with it.</w:t>
       </w:r>
     </w:p>
     <w:p>
@@ -7025,7 +7603,21 @@
         <w:rPr>
           <w:rFonts w:ascii="Georgia" w:hAnsi="Georgia"/>
         </w:rPr>
-        <w:t xml:space="preserve">What follows is a list. Not a metaphor. Not a characterization. A documented record of every institution, every official, every congressional office, every attorney, and every newsroom I contacted between March 2023 and 2026 in an attempt to find someone — anyone — willing to look at what had been done to me and say: </w:t>
+        <w:t xml:space="preserve">What follows is a list. Not a metaphor. Not a characterization. A documented record of every institution, every official, every congressional office, every attorney, and every newsroom I contacted between March 2023 and 2026 </w:t>
+      </w:r>
+      <w:proofErr w:type="gramStart"/>
+      <w:r>
+        <w:rPr>
+          <w:rFonts w:ascii="Georgia" w:hAnsi="Georgia"/>
+        </w:rPr>
+        <w:t>in an attempt to</w:t>
+      </w:r>
+      <w:proofErr w:type="gramEnd"/>
+      <w:r>
+        <w:rPr>
+          <w:rFonts w:ascii="Georgia" w:hAnsi="Georgia"/>
+        </w:rPr>
+        <w:t xml:space="preserve"> find someone — anyone — willing to look at what had been done to me and say: </w:t>
       </w:r>
       <w:r>
         <w:rPr>
@@ -7131,8 +7723,18 @@
           <w:i/>
           <w:iCs/>
         </w:rPr>
-        <w:t>March 5, 2023</w:t>
-      </w:r>
+        <w:t xml:space="preserve">March 5, </w:t>
+      </w:r>
+      <w:proofErr w:type="gramStart"/>
+      <w:r>
+        <w:rPr>
+          <w:rFonts w:ascii="Georgia" w:hAnsi="Georgia"/>
+          <w:i/>
+          <w:iCs/>
+        </w:rPr>
+        <w:t>2023</w:t>
+      </w:r>
+      <w:proofErr w:type="gramEnd"/>
       <w:r>
         <w:rPr>
           <w:rFonts w:ascii="Georgia" w:hAnsi="Georgia"/>
@@ -7265,8 +7867,18 @@
           <w:i/>
           <w:iCs/>
         </w:rPr>
-        <w:t>June 22, 2023</w:t>
-      </w:r>
+        <w:t xml:space="preserve">June 22, </w:t>
+      </w:r>
+      <w:proofErr w:type="gramStart"/>
+      <w:r>
+        <w:rPr>
+          <w:rFonts w:ascii="Georgia" w:hAnsi="Georgia"/>
+          <w:i/>
+          <w:iCs/>
+        </w:rPr>
+        <w:t>2023</w:t>
+      </w:r>
+      <w:proofErr w:type="gramEnd"/>
       <w:r>
         <w:rPr>
           <w:rFonts w:ascii="Georgia" w:hAnsi="Georgia"/>
@@ -7302,21 +7914,67 @@
           <w:i/>
           <w:iCs/>
         </w:rPr>
-        <w:t>January 11, 2024</w:t>
-      </w:r>
-      <w:r>
-        <w:rPr>
-          <w:rFonts w:ascii="Georgia" w:hAnsi="Georgia"/>
-        </w:rPr>
-        <w:t xml:space="preserve"> Frederick contacted me by phone and then email asking me to clarify my allegations. I responded the same day with a detailed account of the March 2nd events. She responded hours later: </w:t>
-      </w:r>
+        <w:t xml:space="preserve">January 11, </w:t>
+      </w:r>
+      <w:proofErr w:type="gramStart"/>
       <w:r>
         <w:rPr>
           <w:rFonts w:ascii="Georgia" w:hAnsi="Georgia"/>
           <w:i/>
           <w:iCs/>
         </w:rPr>
-        <w:t>“Based on a review of the information provided in your recent emails, we believe that DOT-OIG lacks oversight regarding your concerns. Additionally, we are not in a position to provide advice and anticipate no further action from our office concerning these matters.”</w:t>
+        <w:t>2024</w:t>
+      </w:r>
+      <w:proofErr w:type="gramEnd"/>
+      <w:r>
+        <w:rPr>
+          <w:rFonts w:ascii="Georgia" w:hAnsi="Georgia"/>
+        </w:rPr>
+        <w:t xml:space="preserve"> Frederick contacted me by phone and then email asking me to clarify my allegations. I responded the same day with a detailed account of the March 2nd events. She responded hours later: </w:t>
+      </w:r>
+      <w:r>
+        <w:rPr>
+          <w:rFonts w:ascii="Georgia" w:hAnsi="Georgia"/>
+          <w:i/>
+          <w:iCs/>
+        </w:rPr>
+        <w:t xml:space="preserve">“Based on a review of the information provided in your recent emails, we believe that DOT-OIG </w:t>
+      </w:r>
+      <w:proofErr w:type="spellStart"/>
+      <w:r>
+        <w:rPr>
+          <w:rFonts w:ascii="Georgia" w:hAnsi="Georgia"/>
+          <w:i/>
+          <w:iCs/>
+        </w:rPr>
+        <w:t>lacks</w:t>
+      </w:r>
+      <w:proofErr w:type="spellEnd"/>
+      <w:r>
+        <w:rPr>
+          <w:rFonts w:ascii="Georgia" w:hAnsi="Georgia"/>
+          <w:i/>
+          <w:iCs/>
+        </w:rPr>
+        <w:t xml:space="preserve"> oversight regarding your concerns. Additionally, we </w:t>
+      </w:r>
+      <w:proofErr w:type="gramStart"/>
+      <w:r>
+        <w:rPr>
+          <w:rFonts w:ascii="Georgia" w:hAnsi="Georgia"/>
+          <w:i/>
+          <w:iCs/>
+        </w:rPr>
+        <w:t>are not in a position to</w:t>
+      </w:r>
+      <w:proofErr w:type="gramEnd"/>
+      <w:r>
+        <w:rPr>
+          <w:rFonts w:ascii="Georgia" w:hAnsi="Georgia"/>
+          <w:i/>
+          <w:iCs/>
+        </w:rPr>
+        <w:t xml:space="preserve"> provide advice and anticipate no further action from our office concerning these matters.”</w:t>
       </w:r>
     </w:p>
     <w:p>
@@ -7399,8 +8057,18 @@
           <w:i/>
           <w:iCs/>
         </w:rPr>
-        <w:t>August 7, 2024</w:t>
-      </w:r>
+        <w:t xml:space="preserve">August 7, </w:t>
+      </w:r>
+      <w:proofErr w:type="gramStart"/>
+      <w:r>
+        <w:rPr>
+          <w:rFonts w:ascii="Georgia" w:hAnsi="Georgia"/>
+          <w:i/>
+          <w:iCs/>
+        </w:rPr>
+        <w:t>2024</w:t>
+      </w:r>
+      <w:proofErr w:type="gramEnd"/>
       <w:r>
         <w:rPr>
           <w:rFonts w:ascii="Georgia" w:hAnsi="Georgia"/>
@@ -7487,13 +8155,37 @@
           <w:i/>
           <w:iCs/>
         </w:rPr>
-        <w:t>July 18, 2024</w:t>
-      </w:r>
-      <w:r>
-        <w:rPr>
-          <w:rFonts w:ascii="Georgia" w:hAnsi="Georgia"/>
-        </w:rPr>
-        <w:t xml:space="preserve"> I contacted SAF’s Negotiation and Dispute Resolution office separately. Mlinaz explained that NDR is an internal program — engagement requires a request from the IG. Mills would need to ask. Mills never asked. The ADR door I had been trying to open since March 2023 was closed procedurally by a person who never made a phone call.</w:t>
+        <w:t xml:space="preserve">July 18, </w:t>
+      </w:r>
+      <w:proofErr w:type="gramStart"/>
+      <w:r>
+        <w:rPr>
+          <w:rFonts w:ascii="Georgia" w:hAnsi="Georgia"/>
+          <w:i/>
+          <w:iCs/>
+        </w:rPr>
+        <w:t>2024</w:t>
+      </w:r>
+      <w:proofErr w:type="gramEnd"/>
+      <w:r>
+        <w:rPr>
+          <w:rFonts w:ascii="Georgia" w:hAnsi="Georgia"/>
+        </w:rPr>
+        <w:t xml:space="preserve"> I contacted SAF’s Negotiation and Dispute Resolution office separately. </w:t>
+      </w:r>
+      <w:proofErr w:type="spellStart"/>
+      <w:r>
+        <w:rPr>
+          <w:rFonts w:ascii="Georgia" w:hAnsi="Georgia"/>
+        </w:rPr>
+        <w:t>Mlinaz</w:t>
+      </w:r>
+      <w:proofErr w:type="spellEnd"/>
+      <w:r>
+        <w:rPr>
+          <w:rFonts w:ascii="Georgia" w:hAnsi="Georgia"/>
+        </w:rPr>
+        <w:t xml:space="preserve"> explained that NDR is an internal program — engagement requires a request from the IG. Mills would need to ask. Mills never asked. The ADR door I had been trying to open since March 2023 was closed procedurally by a person who never made a phone call.</w:t>
       </w:r>
     </w:p>
     <w:p>
@@ -7524,13 +8216,37 @@
           <w:i/>
           <w:iCs/>
         </w:rPr>
-        <w:t>December 6, 2024</w:t>
-      </w:r>
-      <w:r>
-        <w:rPr>
-          <w:rFonts w:ascii="Georgia" w:hAnsi="Georgia"/>
-        </w:rPr>
-        <w:t xml:space="preserve"> I sent a formal letter to Secretary Buttigieg at the Department of Transportation. I described the coercive directives, the alias account, the unauthorized medical access, the ongoing intimidation, and the failure of both the DHS and DOT OIGs to take action. I wrote: </w:t>
+        <w:t xml:space="preserve">December 6, </w:t>
+      </w:r>
+      <w:proofErr w:type="gramStart"/>
+      <w:r>
+        <w:rPr>
+          <w:rFonts w:ascii="Georgia" w:hAnsi="Georgia"/>
+          <w:i/>
+          <w:iCs/>
+        </w:rPr>
+        <w:t>2024</w:t>
+      </w:r>
+      <w:proofErr w:type="gramEnd"/>
+      <w:r>
+        <w:rPr>
+          <w:rFonts w:ascii="Georgia" w:hAnsi="Georgia"/>
+        </w:rPr>
+        <w:t xml:space="preserve"> I sent a formal letter to Secretary Buttigieg at the Department of Transportation. I described the coercive directives, the alias account, the unauthorized medical access, the ongoing intimidation, and the failure of both the DHS and DOT OIGs to </w:t>
+      </w:r>
+      <w:proofErr w:type="gramStart"/>
+      <w:r>
+        <w:rPr>
+          <w:rFonts w:ascii="Georgia" w:hAnsi="Georgia"/>
+        </w:rPr>
+        <w:t>take action</w:t>
+      </w:r>
+      <w:proofErr w:type="gramEnd"/>
+      <w:r>
+        <w:rPr>
+          <w:rFonts w:ascii="Georgia" w:hAnsi="Georgia"/>
+        </w:rPr>
+        <w:t xml:space="preserve">. I wrote: </w:t>
       </w:r>
       <w:r>
         <w:rPr>
@@ -7846,7 +8562,21 @@
         <w:rPr>
           <w:rFonts w:ascii="Georgia" w:hAnsi="Georgia"/>
         </w:rPr>
-        <w:t>Towards the end of the conversation he said he hoped they didn’t get a tail on him. He laughed when he said it.</w:t>
+        <w:t xml:space="preserve">Towards the end of the </w:t>
+      </w:r>
+      <w:proofErr w:type="gramStart"/>
+      <w:r>
+        <w:rPr>
+          <w:rFonts w:ascii="Georgia" w:hAnsi="Georgia"/>
+        </w:rPr>
+        <w:t>conversation</w:t>
+      </w:r>
+      <w:proofErr w:type="gramEnd"/>
+      <w:r>
+        <w:rPr>
+          <w:rFonts w:ascii="Georgia" w:hAnsi="Georgia"/>
+        </w:rPr>
+        <w:t xml:space="preserve"> he said he hoped they didn’t get a tail on him. He laughed when he said it.</w:t>
       </w:r>
     </w:p>
     <w:p>
@@ -7923,8 +8653,18 @@
           <w:i/>
           <w:iCs/>
         </w:rPr>
-        <w:t>March 7, 2024</w:t>
-      </w:r>
+        <w:t xml:space="preserve">March 7, </w:t>
+      </w:r>
+      <w:proofErr w:type="gramStart"/>
+      <w:r>
+        <w:rPr>
+          <w:rFonts w:ascii="Georgia" w:hAnsi="Georgia"/>
+          <w:i/>
+          <w:iCs/>
+        </w:rPr>
+        <w:t>2024</w:t>
+      </w:r>
+      <w:proofErr w:type="gramEnd"/>
       <w:r>
         <w:rPr>
           <w:rFonts w:ascii="Georgia" w:hAnsi="Georgia"/>
@@ -8012,13 +8752,37 @@
           <w:i/>
           <w:iCs/>
         </w:rPr>
-        <w:t>November 2024</w:t>
-      </w:r>
-      <w:r>
-        <w:rPr>
-          <w:rFonts w:ascii="Georgia" w:hAnsi="Georgia"/>
-        </w:rPr>
-        <w:t xml:space="preserve"> I submitted a case to Rep. Mace’s office, expanding my congressional outreach beyond my home district. No substantive outcome was documented.</w:t>
+        <w:t>November</w:t>
+      </w:r>
+      <w:r>
+        <w:rPr>
+          <w:rFonts w:ascii="Georgia" w:hAnsi="Georgia"/>
+          <w:i/>
+          <w:iCs/>
+        </w:rPr>
+        <w:t xml:space="preserve"> 18</w:t>
+      </w:r>
+      <w:proofErr w:type="gramStart"/>
+      <w:r>
+        <w:rPr>
+          <w:rFonts w:ascii="Georgia" w:hAnsi="Georgia"/>
+          <w:i/>
+          <w:iCs/>
+        </w:rPr>
+        <w:t xml:space="preserve"> 2024</w:t>
+      </w:r>
+      <w:proofErr w:type="gramEnd"/>
+      <w:r>
+        <w:rPr>
+          <w:rFonts w:ascii="Georgia" w:hAnsi="Georgia"/>
+        </w:rPr>
+        <w:t xml:space="preserve"> </w:t>
+      </w:r>
+      <w:r>
+        <w:rPr>
+          <w:rFonts w:ascii="Georgia" w:hAnsi="Georgia"/>
+        </w:rPr>
+        <w:t>I contacted Representative Nancy Mace's office and spoke with a staffer by phone. I submitted a signed privacy release form listing the Department of Defense and Air Force as the agencies involved. I also submitted the HPSCI letter through her office. No substantive response was received.</w:t>
       </w:r>
     </w:p>
     <w:p>
@@ -8049,20 +8813,30 @@
           <w:i/>
           <w:iCs/>
         </w:rPr>
-        <w:t>February 5, 2026</w:t>
-      </w:r>
-      <w:r>
-        <w:rPr>
-          <w:rFonts w:ascii="Georgia" w:hAnsi="Georgia"/>
-        </w:rPr>
-        <w:t xml:space="preserve"> I sent the HPSCI letter and a message to the Oversight Democrats Signal line. I wrote: </w:t>
-      </w:r>
+        <w:t xml:space="preserve">February 5, </w:t>
+      </w:r>
+      <w:proofErr w:type="gramStart"/>
       <w:r>
         <w:rPr>
           <w:rFonts w:ascii="Georgia" w:hAnsi="Georgia"/>
           <w:i/>
           <w:iCs/>
         </w:rPr>
+        <w:t>2026</w:t>
+      </w:r>
+      <w:proofErr w:type="gramEnd"/>
+      <w:r>
+        <w:rPr>
+          <w:rFonts w:ascii="Georgia" w:hAnsi="Georgia"/>
+        </w:rPr>
+        <w:t xml:space="preserve"> I sent the HPSCI letter and a message to the Oversight Democrats Signal line. I wrote: </w:t>
+      </w:r>
+      <w:r>
+        <w:rPr>
+          <w:rFonts w:ascii="Georgia" w:hAnsi="Georgia"/>
+          <w:i/>
+          <w:iCs/>
+        </w:rPr>
         <w:t>“I believe this was never delivered…sharing to ensure my story does not go unanswered. I worked with Senator Casey’s office and Brian Fitzpatrick.”</w:t>
       </w:r>
     </w:p>
@@ -8109,8 +8883,18 @@
           <w:i/>
           <w:iCs/>
         </w:rPr>
-        <w:t>March 21, 2026</w:t>
-      </w:r>
+        <w:t xml:space="preserve">March 21, </w:t>
+      </w:r>
+      <w:proofErr w:type="gramStart"/>
+      <w:r>
+        <w:rPr>
+          <w:rFonts w:ascii="Georgia" w:hAnsi="Georgia"/>
+          <w:i/>
+          <w:iCs/>
+        </w:rPr>
+        <w:t>2026</w:t>
+      </w:r>
+      <w:proofErr w:type="gramEnd"/>
       <w:r>
         <w:rPr>
           <w:rFonts w:ascii="Georgia" w:hAnsi="Georgia"/>
@@ -8147,6 +8931,7 @@
           <w:b/>
           <w:bCs/>
         </w:rPr>
+        <w:lastRenderedPageBreak/>
         <w:t>Brennen Gelinas — Rep. Anna Paulina Luna’s Office / UAP Task Force</w:t>
       </w:r>
       <w:r>
@@ -8161,20 +8946,23 @@
           <w:i/>
           <w:iCs/>
         </w:rPr>
-        <w:t>March 23, 2026</w:t>
-      </w:r>
-      <w:r>
-        <w:rPr>
-          <w:rFonts w:ascii="Georgia" w:hAnsi="Georgia"/>
-        </w:rPr>
-        <w:t xml:space="preserve"> After calling Rep. Luna’s DC office I emailed Brennen Gelinas, staff member on the Task Force on the Declassification of Federal Secrets. I attached the </w:t>
-      </w:r>
-      <w:r>
-        <w:rPr>
-          <w:rFonts w:ascii="Georgia" w:hAnsi="Georgia"/>
-        </w:rPr>
-        <w:lastRenderedPageBreak/>
-        <w:t>congressional brief, the Benson email chain, and the Bartlett denial letter. I offered to brief the Task Force in any format at any time. Rep. Luna chairs the Task Force, which held hearings on UAP transparency and whistleblower protection in September 2025. No substantive response was documented at time of writing.</w:t>
+        <w:t xml:space="preserve">March 23, </w:t>
+      </w:r>
+      <w:proofErr w:type="gramStart"/>
+      <w:r>
+        <w:rPr>
+          <w:rFonts w:ascii="Georgia" w:hAnsi="Georgia"/>
+          <w:i/>
+          <w:iCs/>
+        </w:rPr>
+        <w:t>2026</w:t>
+      </w:r>
+      <w:proofErr w:type="gramEnd"/>
+      <w:r>
+        <w:rPr>
+          <w:rFonts w:ascii="Georgia" w:hAnsi="Georgia"/>
+        </w:rPr>
+        <w:t xml:space="preserve"> After calling Rep. Luna’s DC office I emailed Brennen Gelinas, staff member on the Task Force on the Declassification of Federal Secrets. I attached the congressional brief, the Benson email chain, and the Bartlett denial letter. I offered to brief the Task Force in any format at any time. Rep. Luna chairs the Task Force, which held hearings on UAP transparency and whistleblower protection in September 2025. No substantive response was documented at time of writing.</w:t>
       </w:r>
     </w:p>
     <w:p>
@@ -8205,8 +8993,18 @@
           <w:i/>
           <w:iCs/>
         </w:rPr>
-        <w:t>March 23, 2026</w:t>
-      </w:r>
+        <w:t xml:space="preserve">March 23, </w:t>
+      </w:r>
+      <w:proofErr w:type="gramStart"/>
+      <w:r>
+        <w:rPr>
+          <w:rFonts w:ascii="Georgia" w:hAnsi="Georgia"/>
+          <w:i/>
+          <w:iCs/>
+        </w:rPr>
+        <w:t>2026</w:t>
+      </w:r>
+      <w:proofErr w:type="gramEnd"/>
       <w:r>
         <w:rPr>
           <w:rFonts w:ascii="Georgia" w:hAnsi="Georgia"/>
@@ -8343,13 +9141,23 @@
           <w:rFonts w:ascii="Georgia" w:hAnsi="Georgia"/>
         </w:rPr>
       </w:pPr>
+      <w:proofErr w:type="spellStart"/>
       <w:r>
         <w:rPr>
           <w:rFonts w:ascii="Georgia" w:hAnsi="Georgia"/>
           <w:b/>
           <w:bCs/>
         </w:rPr>
-        <w:t>Bochetto &amp; Lentz, P.C. — Philadelphia, PA</w:t>
+        <w:t>Bochetto</w:t>
+      </w:r>
+      <w:proofErr w:type="spellEnd"/>
+      <w:r>
+        <w:rPr>
+          <w:rFonts w:ascii="Georgia" w:hAnsi="Georgia"/>
+          <w:b/>
+          <w:bCs/>
+        </w:rPr>
+        <w:t xml:space="preserve"> &amp; Lentz, P.C. — Philadelphia, PA</w:t>
       </w:r>
       <w:r>
         <w:rPr>
@@ -8363,8 +9171,18 @@
           <w:i/>
           <w:iCs/>
         </w:rPr>
-        <w:t>August 6, 2023</w:t>
-      </w:r>
+        <w:t xml:space="preserve">August 6, </w:t>
+      </w:r>
+      <w:proofErr w:type="gramStart"/>
+      <w:r>
+        <w:rPr>
+          <w:rFonts w:ascii="Georgia" w:hAnsi="Georgia"/>
+          <w:i/>
+          <w:iCs/>
+        </w:rPr>
+        <w:t>2023</w:t>
+      </w:r>
+      <w:proofErr w:type="gramEnd"/>
       <w:r>
         <w:rPr>
           <w:rFonts w:ascii="Georgia" w:hAnsi="Georgia"/>
@@ -8386,6 +9204,7 @@
           <w:b/>
           <w:bCs/>
         </w:rPr>
+        <w:lastRenderedPageBreak/>
         <w:t>Phillips &amp; Cohen LLP — Washington, D.C.</w:t>
       </w:r>
       <w:r>
@@ -8400,20 +9219,30 @@
           <w:i/>
           <w:iCs/>
         </w:rPr>
-        <w:t>March 7, 2024</w:t>
-      </w:r>
-      <w:r>
-        <w:rPr>
-          <w:rFonts w:ascii="Georgia" w:hAnsi="Georgia"/>
-        </w:rPr>
-        <w:t xml:space="preserve"> Matthew Smith reviewed and declined. He wrote: </w:t>
-      </w:r>
+        <w:t xml:space="preserve">March 7, </w:t>
+      </w:r>
+      <w:proofErr w:type="gramStart"/>
       <w:r>
         <w:rPr>
           <w:rFonts w:ascii="Georgia" w:hAnsi="Georgia"/>
           <w:i/>
           <w:iCs/>
         </w:rPr>
+        <w:t>2024</w:t>
+      </w:r>
+      <w:proofErr w:type="gramEnd"/>
+      <w:r>
+        <w:rPr>
+          <w:rFonts w:ascii="Georgia" w:hAnsi="Georgia"/>
+        </w:rPr>
+        <w:t xml:space="preserve"> Matthew Smith reviewed and declined. He wrote: </w:t>
+      </w:r>
+      <w:r>
+        <w:rPr>
+          <w:rFonts w:ascii="Georgia" w:hAnsi="Georgia"/>
+          <w:i/>
+          <w:iCs/>
+        </w:rPr>
         <w:t>“Our decision is not intended to suggest that a successful action cannot be maintained.”</w:t>
       </w:r>
       <w:r>
@@ -8437,7 +9266,6 @@
           <w:b/>
           <w:bCs/>
         </w:rPr>
-        <w:lastRenderedPageBreak/>
         <w:t>Katz Banks Kumin — Washington, D.C.</w:t>
       </w:r>
       <w:r>
@@ -8489,13 +9317,37 @@
           <w:i/>
           <w:iCs/>
         </w:rPr>
-        <w:t>July 25, 2024</w:t>
-      </w:r>
-      <w:r>
-        <w:rPr>
-          <w:rFonts w:ascii="Georgia" w:hAnsi="Georgia"/>
-        </w:rPr>
-        <w:t xml:space="preserve"> LeShante Henry contacted me via referral from the National Whistleblower Legal Defense and Education Fund. I provided a fact timeline and key documents. The firm reviewed and did not offer representation.</w:t>
+        <w:t xml:space="preserve">July 25, </w:t>
+      </w:r>
+      <w:proofErr w:type="gramStart"/>
+      <w:r>
+        <w:rPr>
+          <w:rFonts w:ascii="Georgia" w:hAnsi="Georgia"/>
+          <w:i/>
+          <w:iCs/>
+        </w:rPr>
+        <w:t>2024</w:t>
+      </w:r>
+      <w:proofErr w:type="gramEnd"/>
+      <w:r>
+        <w:rPr>
+          <w:rFonts w:ascii="Georgia" w:hAnsi="Georgia"/>
+        </w:rPr>
+        <w:t xml:space="preserve"> </w:t>
+      </w:r>
+      <w:proofErr w:type="spellStart"/>
+      <w:r>
+        <w:rPr>
+          <w:rFonts w:ascii="Georgia" w:hAnsi="Georgia"/>
+        </w:rPr>
+        <w:t>LeShante</w:t>
+      </w:r>
+      <w:proofErr w:type="spellEnd"/>
+      <w:r>
+        <w:rPr>
+          <w:rFonts w:ascii="Georgia" w:hAnsi="Georgia"/>
+        </w:rPr>
+        <w:t xml:space="preserve"> Henry contacted me via referral from the National Whistleblower Legal Defense and Education Fund. I provided a fact timeline and key documents. The firm reviewed and did not offer representation.</w:t>
       </w:r>
     </w:p>
     <w:p>
@@ -8571,20 +9423,30 @@
           <w:i/>
           <w:iCs/>
         </w:rPr>
-        <w:t>January 30, 2025</w:t>
-      </w:r>
-      <w:r>
-        <w:rPr>
-          <w:rFonts w:ascii="Georgia" w:hAnsi="Georgia"/>
-        </w:rPr>
-        <w:t xml:space="preserve"> L. Leonard Lundy declined. The letter noted declining to represent </w:t>
-      </w:r>
+        <w:t xml:space="preserve">January 30, </w:t>
+      </w:r>
+      <w:proofErr w:type="gramStart"/>
       <w:r>
         <w:rPr>
           <w:rFonts w:ascii="Georgia" w:hAnsi="Georgia"/>
           <w:i/>
           <w:iCs/>
         </w:rPr>
+        <w:t>2025</w:t>
+      </w:r>
+      <w:proofErr w:type="gramEnd"/>
+      <w:r>
+        <w:rPr>
+          <w:rFonts w:ascii="Georgia" w:hAnsi="Georgia"/>
+        </w:rPr>
+        <w:t xml:space="preserve"> L. Leonard Lundy declined. The letter noted declining to represent </w:t>
+      </w:r>
+      <w:r>
+        <w:rPr>
+          <w:rFonts w:ascii="Georgia" w:hAnsi="Georgia"/>
+          <w:i/>
+          <w:iCs/>
+        </w:rPr>
         <w:t>“makes no representation as to the veracity or strength of this potential legal matter.”</w:t>
       </w:r>
     </w:p>
@@ -8698,20 +9560,30 @@
           <w:i/>
           <w:iCs/>
         </w:rPr>
-        <w:t>July 9, 2025</w:t>
-      </w:r>
-      <w:r>
-        <w:rPr>
-          <w:rFonts w:ascii="Georgia" w:hAnsi="Georgia"/>
-        </w:rPr>
-        <w:t xml:space="preserve"> Caroline Sullivan declined on behalf of the firm. She wrote: </w:t>
-      </w:r>
+        <w:t xml:space="preserve">July 9, </w:t>
+      </w:r>
+      <w:proofErr w:type="gramStart"/>
       <w:r>
         <w:rPr>
           <w:rFonts w:ascii="Georgia" w:hAnsi="Georgia"/>
           <w:i/>
           <w:iCs/>
         </w:rPr>
+        <w:t>2025</w:t>
+      </w:r>
+      <w:proofErr w:type="gramEnd"/>
+      <w:r>
+        <w:rPr>
+          <w:rFonts w:ascii="Georgia" w:hAnsi="Georgia"/>
+        </w:rPr>
+        <w:t xml:space="preserve"> Caroline Sullivan declined on behalf of the firm. She wrote: </w:t>
+      </w:r>
+      <w:r>
+        <w:rPr>
+          <w:rFonts w:ascii="Georgia" w:hAnsi="Georgia"/>
+          <w:i/>
+          <w:iCs/>
+        </w:rPr>
         <w:t>“We regret that we cannot represent all of the worthy and deserving individuals who come to us for help.”</w:t>
       </w:r>
     </w:p>
@@ -8823,6 +9695,7 @@
         <w:rPr>
           <w:rFonts w:ascii="Georgia" w:hAnsi="Georgia"/>
         </w:rPr>
+        <w:lastRenderedPageBreak/>
         <w:t>Three contacts. Three years. The same firm. The same result.</w:t>
       </w:r>
     </w:p>
@@ -8861,7 +9734,6 @@
           <w:bCs/>
           <w:color w:val="000000" w:themeColor="text1"/>
         </w:rPr>
-        <w:lastRenderedPageBreak/>
         <w:t>Part Four — The Press</w:t>
       </w:r>
     </w:p>
@@ -8923,8 +9795,18 @@
           <w:i/>
           <w:iCs/>
         </w:rPr>
-        <w:t>March 5, 2024</w:t>
-      </w:r>
+        <w:t xml:space="preserve">March 5, </w:t>
+      </w:r>
+      <w:proofErr w:type="gramStart"/>
+      <w:r>
+        <w:rPr>
+          <w:rFonts w:ascii="Georgia" w:hAnsi="Georgia"/>
+          <w:i/>
+          <w:iCs/>
+        </w:rPr>
+        <w:t>2024</w:t>
+      </w:r>
+      <w:proofErr w:type="gramEnd"/>
       <w:r>
         <w:rPr>
           <w:rFonts w:ascii="Georgia" w:hAnsi="Georgia"/>
@@ -8960,8 +9842,18 @@
           <w:i/>
           <w:iCs/>
         </w:rPr>
-        <w:t>February 29, 2024</w:t>
-      </w:r>
+        <w:t xml:space="preserve">February 29, </w:t>
+      </w:r>
+      <w:proofErr w:type="gramStart"/>
+      <w:r>
+        <w:rPr>
+          <w:rFonts w:ascii="Georgia" w:hAnsi="Georgia"/>
+          <w:i/>
+          <w:iCs/>
+        </w:rPr>
+        <w:t>2024</w:t>
+      </w:r>
+      <w:proofErr w:type="gramEnd"/>
       <w:r>
         <w:rPr>
           <w:rFonts w:ascii="Georgia" w:hAnsi="Georgia"/>
@@ -8997,8 +9889,18 @@
           <w:i/>
           <w:iCs/>
         </w:rPr>
-        <w:t>March 6, 2024</w:t>
-      </w:r>
+        <w:t xml:space="preserve">March 6, </w:t>
+      </w:r>
+      <w:proofErr w:type="gramStart"/>
+      <w:r>
+        <w:rPr>
+          <w:rFonts w:ascii="Georgia" w:hAnsi="Georgia"/>
+          <w:i/>
+          <w:iCs/>
+        </w:rPr>
+        <w:t>2024</w:t>
+      </w:r>
+      <w:proofErr w:type="gramEnd"/>
       <w:r>
         <w:rPr>
           <w:rFonts w:ascii="Georgia" w:hAnsi="Georgia"/>
@@ -9034,13 +9936,37 @@
           <w:i/>
           <w:iCs/>
         </w:rPr>
-        <w:t>March 6 and March 23, 2024</w:t>
-      </w:r>
-      <w:r>
-        <w:rPr>
-          <w:rFonts w:ascii="Georgia" w:hAnsi="Georgia"/>
-        </w:rPr>
-        <w:t xml:space="preserve"> I emailed the WJLA newsdesk twice. The first email bounced with a DNS error. I tried again on March 23rd. No substantive response was received.</w:t>
+        <w:t xml:space="preserve">March 6 and March 23, </w:t>
+      </w:r>
+      <w:proofErr w:type="gramStart"/>
+      <w:r>
+        <w:rPr>
+          <w:rFonts w:ascii="Georgia" w:hAnsi="Georgia"/>
+          <w:i/>
+          <w:iCs/>
+        </w:rPr>
+        <w:t>2024</w:t>
+      </w:r>
+      <w:proofErr w:type="gramEnd"/>
+      <w:r>
+        <w:rPr>
+          <w:rFonts w:ascii="Georgia" w:hAnsi="Georgia"/>
+        </w:rPr>
+        <w:t xml:space="preserve"> I emailed the WJLA </w:t>
+      </w:r>
+      <w:proofErr w:type="spellStart"/>
+      <w:r>
+        <w:rPr>
+          <w:rFonts w:ascii="Georgia" w:hAnsi="Georgia"/>
+        </w:rPr>
+        <w:t>newsdesk</w:t>
+      </w:r>
+      <w:proofErr w:type="spellEnd"/>
+      <w:r>
+        <w:rPr>
+          <w:rFonts w:ascii="Georgia" w:hAnsi="Georgia"/>
+        </w:rPr>
+        <w:t xml:space="preserve"> twice. The first email bounced with a DNS error. I tried again on March 23rd. No substantive response was received.</w:t>
       </w:r>
     </w:p>
     <w:p>
@@ -9108,20 +10034,30 @@
           <w:i/>
           <w:iCs/>
         </w:rPr>
-        <w:t>June 6, 2024</w:t>
-      </w:r>
-      <w:r>
-        <w:rPr>
-          <w:rFonts w:ascii="Georgia" w:hAnsi="Georgia"/>
-        </w:rPr>
-        <w:t xml:space="preserve"> I sent a tip via Proton Mail. I described the March 2023 coercive events, the alias account, the ESRI abstract, the retaliation. I wrote: </w:t>
-      </w:r>
+        <w:t xml:space="preserve">June 6, </w:t>
+      </w:r>
+      <w:proofErr w:type="gramStart"/>
       <w:r>
         <w:rPr>
           <w:rFonts w:ascii="Georgia" w:hAnsi="Georgia"/>
           <w:i/>
           <w:iCs/>
         </w:rPr>
+        <w:t>2024</w:t>
+      </w:r>
+      <w:proofErr w:type="gramEnd"/>
+      <w:r>
+        <w:rPr>
+          <w:rFonts w:ascii="Georgia" w:hAnsi="Georgia"/>
+        </w:rPr>
+        <w:t xml:space="preserve"> I sent a tip via Proton Mail. I described the March 2023 coercive events, the alias account, the ESRI abstract, the retaliation. I wrote: </w:t>
+      </w:r>
+      <w:r>
+        <w:rPr>
+          <w:rFonts w:ascii="Georgia" w:hAnsi="Georgia"/>
+          <w:i/>
+          <w:iCs/>
+        </w:rPr>
         <w:t>“If there is somebody at CNN who does care, maybe forward this to that person.”</w:t>
       </w:r>
       <w:r>
@@ -9159,8 +10095,18 @@
           <w:i/>
           <w:iCs/>
         </w:rPr>
-        <w:t>July 2, 2025</w:t>
-      </w:r>
+        <w:t xml:space="preserve">July 2, </w:t>
+      </w:r>
+      <w:proofErr w:type="gramStart"/>
+      <w:r>
+        <w:rPr>
+          <w:rFonts w:ascii="Georgia" w:hAnsi="Georgia"/>
+          <w:i/>
+          <w:iCs/>
+        </w:rPr>
+        <w:t>2025</w:t>
+      </w:r>
+      <w:proofErr w:type="gramEnd"/>
       <w:r>
         <w:rPr>
           <w:rFonts w:ascii="Georgia" w:hAnsi="Georgia"/>
@@ -9182,6 +10128,7 @@
           <w:b/>
           <w:bCs/>
         </w:rPr>
+        <w:lastRenderedPageBreak/>
         <w:t>The Intercept, ProPublica, The Washington Post, The Guardian, CBC</w:t>
       </w:r>
       <w:r>
@@ -9202,22 +10149,35 @@
         <w:rPr>
           <w:rFonts w:ascii="Georgia" w:hAnsi="Georgia"/>
         </w:rPr>
-        <w:t xml:space="preserve"> I BCC’d five investigative outlets on my urgent appeal to the UN Office of the High Commissioner for Human Rights. The same story. The same documents. Five newsrooms. No response was documented from any of them.</w:t>
-      </w:r>
-    </w:p>
-    <w:p>
-      <w:pPr>
-        <w:pStyle w:val="BodyText"/>
-        <w:spacing w:line="276" w:lineRule="auto"/>
-        <w:rPr>
-          <w:rFonts w:ascii="Georgia" w:hAnsi="Georgia"/>
-        </w:rPr>
-      </w:pPr>
-      <w:r>
-        <w:rPr>
-          <w:rFonts w:ascii="Georgia" w:hAnsi="Georgia"/>
-        </w:rPr>
-        <w:lastRenderedPageBreak/>
+        <w:t xml:space="preserve"> I </w:t>
+      </w:r>
+      <w:proofErr w:type="spellStart"/>
+      <w:r>
+        <w:rPr>
+          <w:rFonts w:ascii="Georgia" w:hAnsi="Georgia"/>
+        </w:rPr>
+        <w:t>BCC’d</w:t>
+      </w:r>
+      <w:proofErr w:type="spellEnd"/>
+      <w:r>
+        <w:rPr>
+          <w:rFonts w:ascii="Georgia" w:hAnsi="Georgia"/>
+        </w:rPr>
+        <w:t xml:space="preserve"> five investigative outlets on my urgent appeal to the UN Office of the High Commissioner for Human Rights. The same story. The same documents. Five newsrooms. No response was documented from any of them.</w:t>
+      </w:r>
+    </w:p>
+    <w:p>
+      <w:pPr>
+        <w:pStyle w:val="BodyText"/>
+        <w:spacing w:line="276" w:lineRule="auto"/>
+        <w:rPr>
+          <w:rFonts w:ascii="Georgia" w:hAnsi="Georgia"/>
+        </w:rPr>
+      </w:pPr>
+      <w:r>
+        <w:rPr>
+          <w:rFonts w:ascii="Georgia" w:hAnsi="Georgia"/>
+        </w:rPr>
         <w:t>The press, like the institutions, like the attorneys, received the information and returned the silence.</w:t>
       </w:r>
     </w:p>
@@ -9629,22 +10589,54 @@
           <w:i/>
           <w:iCs/>
         </w:rPr>
-        <w:t>We were impressed with your background and think that your experience and skills will be a valuable asset to 2d Weather Squadron.</w:t>
-      </w:r>
-    </w:p>
-    <w:p>
-      <w:pPr>
-        <w:pStyle w:val="BodyText"/>
-        <w:spacing w:line="276" w:lineRule="auto"/>
-        <w:rPr>
-          <w:rFonts w:ascii="Georgia" w:hAnsi="Georgia"/>
-        </w:rPr>
-      </w:pPr>
-      <w:r>
-        <w:rPr>
-          <w:rFonts w:ascii="Georgia" w:hAnsi="Georgia"/>
-        </w:rPr>
-        <w:t>I read that sentence more than once. I want to be honest about what it did to me. After everything — the hospitalization, the outpatient programs, the months of sleeping until the afternoon, the reduced work, the small office, the website — someone at the Air Force had looked at my background and said: valuable asset. Someone had looked at what I had built and recognized it.</w:t>
+        <w:t xml:space="preserve">We were impressed with your background and think that your experience and skills will be </w:t>
+      </w:r>
+      <w:proofErr w:type="gramStart"/>
+      <w:r>
+        <w:rPr>
+          <w:rFonts w:ascii="Georgia" w:hAnsi="Georgia"/>
+          <w:i/>
+          <w:iCs/>
+        </w:rPr>
+        <w:t>a valuable asset</w:t>
+      </w:r>
+      <w:proofErr w:type="gramEnd"/>
+      <w:r>
+        <w:rPr>
+          <w:rFonts w:ascii="Georgia" w:hAnsi="Georgia"/>
+          <w:i/>
+          <w:iCs/>
+        </w:rPr>
+        <w:t xml:space="preserve"> to 2d Weather Squadron.</w:t>
+      </w:r>
+    </w:p>
+    <w:p>
+      <w:pPr>
+        <w:pStyle w:val="BodyText"/>
+        <w:spacing w:line="276" w:lineRule="auto"/>
+        <w:rPr>
+          <w:rFonts w:ascii="Georgia" w:hAnsi="Georgia"/>
+        </w:rPr>
+      </w:pPr>
+      <w:r>
+        <w:rPr>
+          <w:rFonts w:ascii="Georgia" w:hAnsi="Georgia"/>
+        </w:rPr>
+        <w:t xml:space="preserve">I read that sentence more than once. I want to be honest about what it did to me. After everything — the hospitalization, the outpatient programs, the months of sleeping until the afternoon, the reduced work, the small office, the website — someone at the Air Force had looked at my background and said: </w:t>
+      </w:r>
+      <w:proofErr w:type="gramStart"/>
+      <w:r>
+        <w:rPr>
+          <w:rFonts w:ascii="Georgia" w:hAnsi="Georgia"/>
+        </w:rPr>
+        <w:t>valuable asset</w:t>
+      </w:r>
+      <w:proofErr w:type="gramEnd"/>
+      <w:r>
+        <w:rPr>
+          <w:rFonts w:ascii="Georgia" w:hAnsi="Georgia"/>
+        </w:rPr>
+        <w:t>. Someone had looked at what I had built and recognized it.</w:t>
       </w:r>
     </w:p>
     <w:p>
@@ -9711,7 +10703,21 @@
         <w:rPr>
           <w:rFonts w:ascii="Georgia" w:hAnsi="Georgia"/>
         </w:rPr>
-        <w:t>I am aware of how this reads. I am telling you anyway because it is what happened.</w:t>
+        <w:t xml:space="preserve">I am aware of how </w:t>
+      </w:r>
+      <w:proofErr w:type="gramStart"/>
+      <w:r>
+        <w:rPr>
+          <w:rFonts w:ascii="Georgia" w:hAnsi="Georgia"/>
+        </w:rPr>
+        <w:t>this reads</w:t>
+      </w:r>
+      <w:proofErr w:type="gramEnd"/>
+      <w:r>
+        <w:rPr>
+          <w:rFonts w:ascii="Georgia" w:hAnsi="Georgia"/>
+        </w:rPr>
+        <w:t>. I am telling you anyway because it is what happened.</w:t>
       </w:r>
     </w:p>
     <w:p>
@@ -9875,7 +10881,21 @@
         <w:rPr>
           <w:rFonts w:ascii="Georgia" w:hAnsi="Georgia"/>
         </w:rPr>
-        <w:t>It was the accumulation. That’s the honest answer to why that morning and not another. There was no single thing — no specific piece of content, no particular moment that broke through where others hadn’t. It was the weight of all of it together. The ads. The content. The same deniable architecture that had been running since before the hospitalization, still running, still calibrated, still pointing and suggesting and threatening in the way that left no fingerprints and no recourse. I had been trying to interview for a position at Offutt Air Force Base while the same apparatus that surrounded everything was still operating around me. I couldn’t keep doing both.</w:t>
+        <w:t xml:space="preserve">It was the accumulation. That’s the honest answer to why that morning and not another. There was no single thing — no specific piece of content, no </w:t>
+      </w:r>
+      <w:proofErr w:type="gramStart"/>
+      <w:r>
+        <w:rPr>
+          <w:rFonts w:ascii="Georgia" w:hAnsi="Georgia"/>
+        </w:rPr>
+        <w:t>particular moment</w:t>
+      </w:r>
+      <w:proofErr w:type="gramEnd"/>
+      <w:r>
+        <w:rPr>
+          <w:rFonts w:ascii="Georgia" w:hAnsi="Georgia"/>
+        </w:rPr>
+        <w:t xml:space="preserve"> that broke through where others hadn’t. It was the weight of all of it together. The ads. The content. The same deniable architecture that had been running since before the hospitalization, still running, still calibrated, still pointing and suggesting and threatening in the way that left no fingerprints and no recourse. I had been trying to interview for a position at Offutt Air Force Base while the same apparatus that surrounded everything was still operating around me. I couldn’t keep doing both.</w:t>
       </w:r>
     </w:p>
     <w:p>
@@ -9923,7 +10943,25 @@
           <w:i/>
           <w:iCs/>
         </w:rPr>
-        <w:t>I completely understand your health and safety are paramount. If you would like to have a private phone conversation concerning this you can reach out to me. I can also provide you with contact information for the Air Force Office of Special Investigations — our military version of the FBI — who may be able to assist you if these threats are due to you applying for the position.</w:t>
+        <w:t xml:space="preserve">I completely understand your health and safety are paramount. If you would like to have a private phone conversation concerning </w:t>
+      </w:r>
+      <w:proofErr w:type="gramStart"/>
+      <w:r>
+        <w:rPr>
+          <w:rFonts w:ascii="Georgia" w:hAnsi="Georgia"/>
+          <w:i/>
+          <w:iCs/>
+        </w:rPr>
+        <w:t>this</w:t>
+      </w:r>
+      <w:proofErr w:type="gramEnd"/>
+      <w:r>
+        <w:rPr>
+          <w:rFonts w:ascii="Georgia" w:hAnsi="Georgia"/>
+          <w:i/>
+          <w:iCs/>
+        </w:rPr>
+        <w:t xml:space="preserve"> you can reach out to me. I can also provide you with contact information for the Air Force Office of Special Investigations — our military version of the FBI — who may be able to assist you if these threats are due to you applying for the position.</w:t>
       </w:r>
     </w:p>
     <w:p>
@@ -10013,7 +11051,21 @@
         <w:rPr>
           <w:rFonts w:ascii="Georgia" w:hAnsi="Georgia"/>
         </w:rPr>
-        <w:t>I know how that reads. I have already told you I know how that reads. What I can tell you is that the work was still real and the mission was still real and I was a person who had been trying to find a safe place inside this apparatus for the better part of a year and I wasn’t ready to stop trying. Not yet.</w:t>
+        <w:t xml:space="preserve">I know how that reads. I have already told you I know how that reads. What I can tell you is that the work was still real and the mission was still real and I was a person who had been trying to find a safe place inside this apparatus for the better part of a </w:t>
+      </w:r>
+      <w:proofErr w:type="gramStart"/>
+      <w:r>
+        <w:rPr>
+          <w:rFonts w:ascii="Georgia" w:hAnsi="Georgia"/>
+        </w:rPr>
+        <w:t>year</w:t>
+      </w:r>
+      <w:proofErr w:type="gramEnd"/>
+      <w:r>
+        <w:rPr>
+          <w:rFonts w:ascii="Georgia" w:hAnsi="Georgia"/>
+        </w:rPr>
+        <w:t xml:space="preserve"> and I wasn’t ready to stop trying. Not yet.</w:t>
       </w:r>
     </w:p>
     <w:p>
@@ -10073,7 +11125,21 @@
         <w:rPr>
           <w:rFonts w:ascii="Georgia" w:hAnsi="Georgia"/>
         </w:rPr>
-        <w:t>It was comprehensive. Named subjects: Leidos, the FAA, the US Air Force, the US Space Force. Cited violations of the Whistleblower Protection Act, the ADA, the Privacy Act, OSHA. Documented the incident period from March 2, 2023 through June 4, 2024. Fifteen months of documented events organized into a formal complaint submitted to the Secretary of the Air Force Inspector General Hotline.</w:t>
+        <w:t xml:space="preserve">It was comprehensive. Named subjects: Leidos, the FAA, the US Air Force, the US Space Force. Cited violations of the Whistleblower Protection Act, the ADA, the Privacy Act, OSHA. Documented the incident period from March 2, </w:t>
+      </w:r>
+      <w:proofErr w:type="gramStart"/>
+      <w:r>
+        <w:rPr>
+          <w:rFonts w:ascii="Georgia" w:hAnsi="Georgia"/>
+        </w:rPr>
+        <w:t>2023</w:t>
+      </w:r>
+      <w:proofErr w:type="gramEnd"/>
+      <w:r>
+        <w:rPr>
+          <w:rFonts w:ascii="Georgia" w:hAnsi="Georgia"/>
+        </w:rPr>
+        <w:t xml:space="preserve"> through June 4, 2024. Fifteen months of documented events organized into a formal complaint submitted to the Secretary of the Air Force Inspector General Hotline.</w:t>
       </w:r>
     </w:p>
     <w:p>
@@ -10155,7 +11221,21 @@
         <w:rPr>
           <w:rFonts w:ascii="Georgia" w:hAnsi="Georgia"/>
         </w:rPr>
-        <w:t xml:space="preserve">What followed was a particular kind of frustration I don’t have a precise word for. Mills wasn’t hostile. He was procedural. He asked careful questions and I gave careful answers — responses I had thought through, organized, documented. Each time I provided a precise account of the Air Force connection he came back with a version of the same question. </w:t>
+        <w:t xml:space="preserve">What followed was a particular kind of frustration I don’t have a precise word for. Mills </w:t>
+      </w:r>
+      <w:proofErr w:type="gramStart"/>
+      <w:r>
+        <w:rPr>
+          <w:rFonts w:ascii="Georgia" w:hAnsi="Georgia"/>
+        </w:rPr>
+        <w:t>wasn’t</w:t>
+      </w:r>
+      <w:proofErr w:type="gramEnd"/>
+      <w:r>
+        <w:rPr>
+          <w:rFonts w:ascii="Georgia" w:hAnsi="Georgia"/>
+        </w:rPr>
+        <w:t xml:space="preserve"> hostile. He was procedural. He asked careful questions and I gave careful answers — responses I had thought through, organized, documented. Each time I provided a precise account of the Air Force connection he came back with a version of the same question. </w:t>
       </w:r>
       <w:r>
         <w:rPr>
@@ -10184,7 +11264,21 @@
         <w:rPr>
           <w:rFonts w:ascii="Georgia" w:hAnsi="Georgia"/>
         </w:rPr>
-        <w:t>On July 18th SAF’s Negotiation and Dispute Resolution office responded to a separate inquiry. Kimberly Mlinaz explained that NDR is an internal program — engagement requires a request from the IG. Mills would need to ask. Mills never asked.</w:t>
+        <w:t xml:space="preserve">On July 18th SAF’s Negotiation and Dispute Resolution office responded to a separate inquiry. Kimberly </w:t>
+      </w:r>
+      <w:proofErr w:type="spellStart"/>
+      <w:r>
+        <w:rPr>
+          <w:rFonts w:ascii="Georgia" w:hAnsi="Georgia"/>
+        </w:rPr>
+        <w:t>Mlinaz</w:t>
+      </w:r>
+      <w:proofErr w:type="spellEnd"/>
+      <w:r>
+        <w:rPr>
+          <w:rFonts w:ascii="Georgia" w:hAnsi="Georgia"/>
+        </w:rPr>
+        <w:t xml:space="preserve"> explained that NDR is an internal program — engagement requires a request from the IG. Mills would need to ask. Mills never asked.</w:t>
       </w:r>
     </w:p>
     <w:p>
@@ -10311,7 +11405,21 @@
           <w:rFonts w:ascii="Georgia" w:hAnsi="Georgia"/>
         </w:rPr>
         <w:lastRenderedPageBreak/>
-        <w:t xml:space="preserve">status of my SAF/IG complaint and advocate for alternative dispute resolution. I wrote: </w:t>
+        <w:t xml:space="preserve">status of my SAF/IG complaint and advocate for alternative dispute resolution. I </w:t>
+      </w:r>
+      <w:proofErr w:type="gramStart"/>
+      <w:r>
+        <w:rPr>
+          <w:rFonts w:ascii="Georgia" w:hAnsi="Georgia"/>
+        </w:rPr>
+        <w:t>wrote:</w:t>
+      </w:r>
+      <w:proofErr w:type="gramEnd"/>
+      <w:r>
+        <w:rPr>
+          <w:rFonts w:ascii="Georgia" w:hAnsi="Georgia"/>
+        </w:rPr>
+        <w:t xml:space="preserve"> </w:t>
       </w:r>
       <w:r>
         <w:rPr>
@@ -10500,7 +11608,25 @@
           <w:i/>
           <w:iCs/>
         </w:rPr>
-        <w:t>We were impressed with your background and think that your experience and skills will be a valuable asset to 2d Weather Squadron.</w:t>
+        <w:t xml:space="preserve">We were impressed with your background and think that your experience and skills will be </w:t>
+      </w:r>
+      <w:proofErr w:type="gramStart"/>
+      <w:r>
+        <w:rPr>
+          <w:rFonts w:ascii="Georgia" w:hAnsi="Georgia"/>
+          <w:i/>
+          <w:iCs/>
+        </w:rPr>
+        <w:t>a valuable asset</w:t>
+      </w:r>
+      <w:proofErr w:type="gramEnd"/>
+      <w:r>
+        <w:rPr>
+          <w:rFonts w:ascii="Georgia" w:hAnsi="Georgia"/>
+          <w:i/>
+          <w:iCs/>
+        </w:rPr>
+        <w:t xml:space="preserve"> to 2d Weather Squadron.</w:t>
       </w:r>
       <w:r>
         <w:rPr>
@@ -10777,7 +11903,21 @@
         <w:rPr>
           <w:rFonts w:ascii="Georgia" w:hAnsi="Georgia"/>
         </w:rPr>
-        <w:t>That sounds abstract until you understand what that person looked like. He was twenty-nine years old, living alone in Navy Yard, twenty minutes from the White House, in an apartment he had chosen specifically because of where it put him in relation to everything he was building toward. He had a Master’s degree and a SECRET clearance and an accepted presentation slot at the largest GIS conference in the world. He had colleagues who relied on him and a supervisor who praised his work and screenshots that had reached the Office of the Director of National Intelligence. He was embedded and trusted and moving toward something significant.</w:t>
+        <w:t xml:space="preserve">That sounds abstract until you understand what that person looked like. He was twenty-nine years old, living alone in Navy Yard, twenty minutes from the White House, in an apartment he had chosen specifically because of where it put him in relation to everything he was building toward. He had a </w:t>
+      </w:r>
+      <w:proofErr w:type="gramStart"/>
+      <w:r>
+        <w:rPr>
+          <w:rFonts w:ascii="Georgia" w:hAnsi="Georgia"/>
+        </w:rPr>
+        <w:t>Master’s</w:t>
+      </w:r>
+      <w:proofErr w:type="gramEnd"/>
+      <w:r>
+        <w:rPr>
+          <w:rFonts w:ascii="Georgia" w:hAnsi="Georgia"/>
+        </w:rPr>
+        <w:t xml:space="preserve"> degree and a SECRET clearance and an accepted presentation slot at the largest GIS conference in the world. He had colleagues who relied on him and a supervisor who praised his work and screenshots that had reached the Office of the Director of National Intelligence. He was embedded and trusted and moving toward something significant.</w:t>
       </w:r>
     </w:p>
     <w:p>
@@ -10807,7 +11947,21 @@
         <w:rPr>
           <w:rFonts w:ascii="Georgia" w:hAnsi="Georgia"/>
         </w:rPr>
-        <w:t>After March 2023 he was someone people had a story about.</w:t>
+        <w:t xml:space="preserve">After March 2023 he was </w:t>
+      </w:r>
+      <w:proofErr w:type="gramStart"/>
+      <w:r>
+        <w:rPr>
+          <w:rFonts w:ascii="Georgia" w:hAnsi="Georgia"/>
+        </w:rPr>
+        <w:t>someone</w:t>
+      </w:r>
+      <w:proofErr w:type="gramEnd"/>
+      <w:r>
+        <w:rPr>
+          <w:rFonts w:ascii="Georgia" w:hAnsi="Georgia"/>
+        </w:rPr>
+        <w:t xml:space="preserve"> people had a story about.</w:t>
       </w:r>
     </w:p>
     <w:p>
@@ -10837,7 +11991,21 @@
         <w:rPr>
           <w:rFonts w:ascii="Georgia" w:hAnsi="Georgia"/>
         </w:rPr>
-        <w:t>My family loves me. I want to say that clearly. What happened to them is the same thing that happened to my mother when she shipped the laptop. They were given a narrative by people with authority and they operated inside it in good faith. They were taken advantage of by the same system that took advantage of me. Even if they don’t fully realize it yet.</w:t>
+        <w:t xml:space="preserve">My family loves me. I want to say that clearly. What happened to them is the same thing that happened to my mother when she shipped the laptop. They were given a narrative by people with </w:t>
+      </w:r>
+      <w:proofErr w:type="gramStart"/>
+      <w:r>
+        <w:rPr>
+          <w:rFonts w:ascii="Georgia" w:hAnsi="Georgia"/>
+        </w:rPr>
+        <w:t>authority</w:t>
+      </w:r>
+      <w:proofErr w:type="gramEnd"/>
+      <w:r>
+        <w:rPr>
+          <w:rFonts w:ascii="Georgia" w:hAnsi="Georgia"/>
+        </w:rPr>
+        <w:t xml:space="preserve"> and they operated inside it in good faith. They were taken advantage of by the same system that took advantage of me. Even if they don’t fully realize it yet.</w:t>
       </w:r>
     </w:p>
     <w:p>
@@ -11003,7 +12171,21 @@
         <w:rPr>
           <w:rFonts w:ascii="Georgia" w:hAnsi="Georgia"/>
         </w:rPr>
-        <w:t>I don’t remember what he said. I remember the phone in my hand and the ceiling above me and the particular quality of that hour. Not morning anymore, not afternoon yet, just a blank space in the middle of the day that I had no reason to fill. The medication made everything slow and heavy. The days had no shape. I would surface around noon and lie there for another hour before anything required me to move.</w:t>
+        <w:t xml:space="preserve">I don’t remember what he said. I remember the phone in my hand and the ceiling above me and the </w:t>
+      </w:r>
+      <w:proofErr w:type="gramStart"/>
+      <w:r>
+        <w:rPr>
+          <w:rFonts w:ascii="Georgia" w:hAnsi="Georgia"/>
+        </w:rPr>
+        <w:t>particular quality</w:t>
+      </w:r>
+      <w:proofErr w:type="gramEnd"/>
+      <w:r>
+        <w:rPr>
+          <w:rFonts w:ascii="Georgia" w:hAnsi="Georgia"/>
+        </w:rPr>
+        <w:t xml:space="preserve"> of that hour. Not morning anymore, not afternoon yet, just a blank space in the middle of the day that I had no reason to fill. The medication made everything slow and heavy. The days had no shape. I would surface around noon and lie there for another hour before anything required me to move.</w:t>
       </w:r>
     </w:p>
     <w:p>
@@ -11048,7 +12230,21 @@
         <w:rPr>
           <w:rFonts w:ascii="Georgia" w:hAnsi="Georgia"/>
         </w:rPr>
-        <w:t xml:space="preserve">I was working for my parents during that period. Getting to the office around nine or nine-thirty when I could manage it. Learning new systems. Helping build a website. My parents gave me a place to land when there was nowhere else. I am grateful for that. But I had spent my entire adult life trying not to need that particular landing place, and </w:t>
+        <w:t xml:space="preserve">I was working for my parents during that period. Getting to the office around nine or nine-thirty when I could manage it. Learning new systems. Helping build a website. My parents gave me a place to land when there was nowhere else. I am grateful for that. But I had spent my entire adult life trying not to need that </w:t>
+      </w:r>
+      <w:proofErr w:type="gramStart"/>
+      <w:r>
+        <w:rPr>
+          <w:rFonts w:ascii="Georgia" w:hAnsi="Georgia"/>
+        </w:rPr>
+        <w:t>particular landing</w:t>
+      </w:r>
+      <w:proofErr w:type="gramEnd"/>
+      <w:r>
+        <w:rPr>
+          <w:rFonts w:ascii="Georgia" w:hAnsi="Georgia"/>
+        </w:rPr>
+        <w:t xml:space="preserve"> place, and </w:t>
       </w:r>
       <w:r>
         <w:rPr>
@@ -11145,7 +12341,21 @@
         <w:rPr>
           <w:rFonts w:ascii="Georgia" w:hAnsi="Georgia"/>
         </w:rPr>
-        <w:t>The NGA sent me a HireVue invitation in June 2024.</w:t>
+        <w:t xml:space="preserve">The NGA sent me a </w:t>
+      </w:r>
+      <w:proofErr w:type="spellStart"/>
+      <w:r>
+        <w:rPr>
+          <w:rFonts w:ascii="Georgia" w:hAnsi="Georgia"/>
+        </w:rPr>
+        <w:t>HireVue</w:t>
+      </w:r>
+      <w:proofErr w:type="spellEnd"/>
+      <w:r>
+        <w:rPr>
+          <w:rFonts w:ascii="Georgia" w:hAnsi="Georgia"/>
+        </w:rPr>
+        <w:t xml:space="preserve"> invitation in June 2024.</w:t>
       </w:r>
     </w:p>
     <w:p>
@@ -11257,7 +12467,21 @@
         <w:rPr>
           <w:rFonts w:ascii="Georgia" w:hAnsi="Georgia"/>
         </w:rPr>
-        <w:t xml:space="preserve">I want to be honest about what that period felt like from the inside. I wasn’t being considered by multiple agencies because the IC was generous. I was being moved between them, NGA, NSA, CIA, like something being sorted. Assessed for where I could be placed in a way that kept me contained and employed and quiet. The message underneath all of it, never stated, was: </w:t>
+        <w:t xml:space="preserve">I want to be honest about what that period felt like from the inside. I wasn’t being considered by multiple agencies because the IC was generous. I was being moved between them, NGA, NSA, CIA, like something being sorted. Assessed for where I could be placed in a way that kept me contained and employed and quiet. The message underneath all of it, never stated, </w:t>
+      </w:r>
+      <w:proofErr w:type="gramStart"/>
+      <w:r>
+        <w:rPr>
+          <w:rFonts w:ascii="Georgia" w:hAnsi="Georgia"/>
+        </w:rPr>
+        <w:t>was:</w:t>
+      </w:r>
+      <w:proofErr w:type="gramEnd"/>
+      <w:r>
+        <w:rPr>
+          <w:rFonts w:ascii="Georgia" w:hAnsi="Georgia"/>
+        </w:rPr>
+        <w:t xml:space="preserve"> </w:t>
       </w:r>
       <w:r>
         <w:rPr>
@@ -11340,7 +12564,21 @@
         <w:rPr>
           <w:rFonts w:ascii="Georgia" w:hAnsi="Georgia"/>
         </w:rPr>
-        <w:t xml:space="preserve">There was one other thing I held onto during that period. In March 2024, a LinkedIn notification arrived in the alias inbox, the account I had been directed to create, the one that still existed, the one I hadn’t deleted because I couldn’t bring myself to. The profile was under the name Riley Gaines. Seventy-five views. I didn’t create that profile. But I kept the notification. Because some part of me was still afraid of them and still wanted back in at the same time. That’s the thing about an institution that destroys you. It doesn’t stop feeling like home. The machine had taken everything from me and I still wanted to be inside it, still believed the work that had started under that name wasn’t finished, still thought maybe I was the one who was supposed to finish it. That’s what they don’t account for when they dismantle a person. The part that keeps waiting for things to go back to normal. The part that sees an email from a name that isn’t yours and thinks: </w:t>
+        <w:t xml:space="preserve">There was one other thing I held onto during that period. In March 2024, a LinkedIn notification arrived in the alias inbox, the account I had been directed to create, the one that still existed, the one I hadn’t deleted because I couldn’t bring myself to. The profile was under the name Riley Gaines. Seventy-five views. I didn’t create that profile. But I kept the notification. Because some part of me was still afraid of them and still wanted back in at the same time. That’s the thing about an institution that destroys you. It doesn’t stop feeling like home. The machine had taken everything from </w:t>
+      </w:r>
+      <w:proofErr w:type="gramStart"/>
+      <w:r>
+        <w:rPr>
+          <w:rFonts w:ascii="Georgia" w:hAnsi="Georgia"/>
+        </w:rPr>
+        <w:t>me</w:t>
+      </w:r>
+      <w:proofErr w:type="gramEnd"/>
+      <w:r>
+        <w:rPr>
+          <w:rFonts w:ascii="Georgia" w:hAnsi="Georgia"/>
+        </w:rPr>
+        <w:t xml:space="preserve"> and I still wanted to be inside it, still believed the work that had started under that name wasn’t finished, still thought maybe I was the one who was supposed to finish it. That’s what they don’t account for when they dismantle a person. The part that keeps waiting for things to go back to normal. The part that sees an email from a name that isn’t yours and thinks: </w:t>
       </w:r>
       <w:r>
         <w:rPr>
@@ -11409,7 +12647,21 @@
         <w:rPr>
           <w:rFonts w:ascii="Georgia" w:hAnsi="Georgia"/>
         </w:rPr>
-        <w:t>I want to say that plainly because the plainness of it is the point. I had a Master’s degree. A SECRET clearance. An accepted presentation slot at the largest GIS conference in the world. Screenshots of my work that had reached the Office of the Director of National Intelligence.</w:t>
+        <w:t xml:space="preserve">I want to say that plainly because the plainness of it is the point. I had a </w:t>
+      </w:r>
+      <w:proofErr w:type="gramStart"/>
+      <w:r>
+        <w:rPr>
+          <w:rFonts w:ascii="Georgia" w:hAnsi="Georgia"/>
+        </w:rPr>
+        <w:t>Master’s</w:t>
+      </w:r>
+      <w:proofErr w:type="gramEnd"/>
+      <w:r>
+        <w:rPr>
+          <w:rFonts w:ascii="Georgia" w:hAnsi="Georgia"/>
+        </w:rPr>
+        <w:t xml:space="preserve"> degree. A SECRET clearance. An accepted presentation slot at the largest GIS conference in the world. Screenshots of my work that had reached the Office of the Director of National Intelligence.</w:t>
       </w:r>
     </w:p>
     <w:p>
@@ -11439,22 +12691,64 @@
         <w:rPr>
           <w:rFonts w:ascii="Georgia" w:hAnsi="Georgia"/>
         </w:rPr>
-        <w:t>They were good to me. They found things that weren’t nothing — social media, a website rebuild, tasks that required a brain. They gave me a place to land. I am grateful for that and I mean it. But I had spent my entire adult life building distance from needing that particular landing place. Getting out of Pennsylvania on my own terms was the thing. The clearance, the apartment in Navy Yard, the federal contract — all of it was proof that I had done it. Finding myself back inside my family’s orbit, working for their company, was a specific kind of grief that sat underneath everything else and didn’t announce itself.</w:t>
-      </w:r>
-    </w:p>
-    <w:p>
-      <w:pPr>
-        <w:pStyle w:val="BodyText"/>
-        <w:spacing w:line="276" w:lineRule="auto"/>
-        <w:rPr>
-          <w:rFonts w:ascii="Georgia" w:hAnsi="Georgia"/>
-        </w:rPr>
-      </w:pPr>
-      <w:r>
-        <w:rPr>
-          <w:rFonts w:ascii="Georgia" w:hAnsi="Georgia"/>
-        </w:rPr>
-        <w:t>I applied for jobs the entire time. Deloitte. Booz Allen Hamilton, where Edward Snowden had worked before anyone knew his name. Companies in DC and Virginia that I was qualified for on paper and never heard back from. Not rejections exactly — silence, and then a form letter, and then silence again. The same boilerplate arriving over and over until the pattern became its own answer. I don’t have proof of what that pattern meant. I know what it felt like. It felt like a wall that had no door and no sign and no one standing in front of it to tell you that you weren’t getting through.</w:t>
+        <w:t xml:space="preserve">They were good to me. They found things that weren’t nothing — social media, a website </w:t>
+      </w:r>
+      <w:proofErr w:type="gramStart"/>
+      <w:r>
+        <w:rPr>
+          <w:rFonts w:ascii="Georgia" w:hAnsi="Georgia"/>
+        </w:rPr>
+        <w:t>rebuild</w:t>
+      </w:r>
+      <w:proofErr w:type="gramEnd"/>
+      <w:r>
+        <w:rPr>
+          <w:rFonts w:ascii="Georgia" w:hAnsi="Georgia"/>
+        </w:rPr>
+        <w:t xml:space="preserve">, tasks that required a brain. They gave me a place to land. I am grateful for that and I mean it. But I had spent my entire adult life building distance from needing that </w:t>
+      </w:r>
+      <w:proofErr w:type="gramStart"/>
+      <w:r>
+        <w:rPr>
+          <w:rFonts w:ascii="Georgia" w:hAnsi="Georgia"/>
+        </w:rPr>
+        <w:t>particular landing</w:t>
+      </w:r>
+      <w:proofErr w:type="gramEnd"/>
+      <w:r>
+        <w:rPr>
+          <w:rFonts w:ascii="Georgia" w:hAnsi="Georgia"/>
+        </w:rPr>
+        <w:t xml:space="preserve"> place. Getting out of Pennsylvania on my own terms was the thing. The clearance, the apartment in Navy Yard, the federal contract — all of it was proof that I had done it. Finding myself back inside my family’s orbit, working for their company, was a specific kind of grief that sat underneath everything else and didn’t announce itself.</w:t>
+      </w:r>
+    </w:p>
+    <w:p>
+      <w:pPr>
+        <w:pStyle w:val="BodyText"/>
+        <w:spacing w:line="276" w:lineRule="auto"/>
+        <w:rPr>
+          <w:rFonts w:ascii="Georgia" w:hAnsi="Georgia"/>
+        </w:rPr>
+      </w:pPr>
+      <w:r>
+        <w:rPr>
+          <w:rFonts w:ascii="Georgia" w:hAnsi="Georgia"/>
+        </w:rPr>
+        <w:t xml:space="preserve">I applied for jobs the entire time. Deloitte. Booz Allen Hamilton, where Edward Snowden had worked before anyone knew his name. Companies in DC and Virginia that I was qualified for on paper and never heard back from. Not rejections exactly — silence, and then a form letter, and then silence again. The same boilerplate arriving </w:t>
+      </w:r>
+      <w:proofErr w:type="gramStart"/>
+      <w:r>
+        <w:rPr>
+          <w:rFonts w:ascii="Georgia" w:hAnsi="Georgia"/>
+        </w:rPr>
+        <w:t>over and over</w:t>
+      </w:r>
+      <w:proofErr w:type="gramEnd"/>
+      <w:r>
+        <w:rPr>
+          <w:rFonts w:ascii="Georgia" w:hAnsi="Georgia"/>
+        </w:rPr>
+        <w:t xml:space="preserve"> until the pattern became its own answer. I don’t have proof of what that pattern meant. I know what it felt like. It felt like a wall that had no door and no sign and no one standing in front of it to tell you that you weren’t getting through.</w:t>
       </w:r>
     </w:p>
     <w:p>
@@ -11500,7 +12794,21 @@
           <w:rFonts w:ascii="Georgia" w:hAnsi="Georgia"/>
         </w:rPr>
         <w:lastRenderedPageBreak/>
-        <w:t>What kept me going in that office, honestly, was the creative work. Adobe, photo editing, the website rebuild. I found something real in it. The creativity was a relief — the one part of each day that asked something of me I could actually give without it costing me something I didn’t have.</w:t>
+        <w:t xml:space="preserve">What kept me going in that office, honestly, was the creative work. Adobe, photo editing, the website rebuild. I found something real in it. The creativity was a relief — the one part of each day that asked something of me I could </w:t>
+      </w:r>
+      <w:proofErr w:type="gramStart"/>
+      <w:r>
+        <w:rPr>
+          <w:rFonts w:ascii="Georgia" w:hAnsi="Georgia"/>
+        </w:rPr>
+        <w:t>actually give</w:t>
+      </w:r>
+      <w:proofErr w:type="gramEnd"/>
+      <w:r>
+        <w:rPr>
+          <w:rFonts w:ascii="Georgia" w:hAnsi="Georgia"/>
+        </w:rPr>
+        <w:t xml:space="preserve"> without it costing me something I didn’t have.</w:t>
       </w:r>
     </w:p>
     <w:p>
@@ -11575,7 +12883,21 @@
         <w:rPr>
           <w:rFonts w:ascii="Georgia" w:hAnsi="Georgia"/>
         </w:rPr>
-        <w:t>There was a senior leader at XTS who appeared on our monthly video calls. I don’t remember his name. What I remember is the CIA emblem on the wall behind him. I would sit in those calls and look at it and think: they moved me here. They know where I belong and they put me here anyway.</w:t>
+        <w:t xml:space="preserve">There was a senior leader at XTS who appeared on our monthly video calls. I don’t remember his name. What I remember is the CIA emblem on the wall behind him. I would sit in those calls and look at it and </w:t>
+      </w:r>
+      <w:proofErr w:type="gramStart"/>
+      <w:r>
+        <w:rPr>
+          <w:rFonts w:ascii="Georgia" w:hAnsi="Georgia"/>
+        </w:rPr>
+        <w:t>think:</w:t>
+      </w:r>
+      <w:proofErr w:type="gramEnd"/>
+      <w:r>
+        <w:rPr>
+          <w:rFonts w:ascii="Georgia" w:hAnsi="Georgia"/>
+        </w:rPr>
+        <w:t xml:space="preserve"> they moved me here. They know where I belong and they put me here anyway.</w:t>
       </w:r>
     </w:p>
     <w:p>
@@ -11806,22 +13128,50 @@
         <w:rPr>
           <w:rFonts w:ascii="Georgia" w:hAnsi="Georgia"/>
         </w:rPr>
-        <w:t>They told me asylum was impossible. That if I stayed I would be held in an immigration detention center for months while my case was processed. The officer did not allow me to sign the withdrawal form himself. He sent me back.</w:t>
-      </w:r>
-    </w:p>
-    <w:p>
-      <w:pPr>
-        <w:pStyle w:val="BodyText"/>
-        <w:spacing w:line="276" w:lineRule="auto"/>
-        <w:rPr>
-          <w:rFonts w:ascii="Georgia" w:hAnsi="Georgia"/>
-        </w:rPr>
-      </w:pPr>
-      <w:r>
-        <w:rPr>
-          <w:rFonts w:ascii="Georgia" w:hAnsi="Georgia"/>
-        </w:rPr>
-        <w:t>I drove home alone. Back across the border with the binder in the backseat and the form somewhere in the car and the particular silence of a person who has just run out of road.</w:t>
+        <w:t xml:space="preserve">They told me asylum was impossible. That if I </w:t>
+      </w:r>
+      <w:proofErr w:type="gramStart"/>
+      <w:r>
+        <w:rPr>
+          <w:rFonts w:ascii="Georgia" w:hAnsi="Georgia"/>
+        </w:rPr>
+        <w:t>stayed</w:t>
+      </w:r>
+      <w:proofErr w:type="gramEnd"/>
+      <w:r>
+        <w:rPr>
+          <w:rFonts w:ascii="Georgia" w:hAnsi="Georgia"/>
+        </w:rPr>
+        <w:t xml:space="preserve"> I would be held in an immigration detention center for months while my case was processed. The officer did not allow me to sign the withdrawal form himself. He sent me back.</w:t>
+      </w:r>
+    </w:p>
+    <w:p>
+      <w:pPr>
+        <w:pStyle w:val="BodyText"/>
+        <w:spacing w:line="276" w:lineRule="auto"/>
+        <w:rPr>
+          <w:rFonts w:ascii="Georgia" w:hAnsi="Georgia"/>
+        </w:rPr>
+      </w:pPr>
+      <w:r>
+        <w:rPr>
+          <w:rFonts w:ascii="Georgia" w:hAnsi="Georgia"/>
+        </w:rPr>
+        <w:t xml:space="preserve">I drove home alone. Back across the border with the binder in the backseat and the form somewhere in the car and the </w:t>
+      </w:r>
+      <w:proofErr w:type="gramStart"/>
+      <w:r>
+        <w:rPr>
+          <w:rFonts w:ascii="Georgia" w:hAnsi="Georgia"/>
+        </w:rPr>
+        <w:t>particular silence</w:t>
+      </w:r>
+      <w:proofErr w:type="gramEnd"/>
+      <w:r>
+        <w:rPr>
+          <w:rFonts w:ascii="Georgia" w:hAnsi="Georgia"/>
+        </w:rPr>
+        <w:t xml:space="preserve"> of a person who has just run out of road.</w:t>
       </w:r>
     </w:p>
     <w:p>
@@ -11947,37 +13297,107 @@
         <w:rPr>
           <w:rFonts w:ascii="Georgia" w:hAnsi="Georgia"/>
         </w:rPr>
-        <w:t>The drive back took a long time, or felt that way. Just highway and the particular silence of a person replaying everything that had happened in a room they couldn’t go back to. The male officer’s voice. The White House letter he held up and called boilerplate. The female officer who could see it, who looked at my outline and knew I was telling the truth, and still couldn’t do anything about it. I had told them I would rather sit in a detention center for months than return to the United States. I had meant it. They walked me out to my car anyway.</w:t>
-      </w:r>
-    </w:p>
-    <w:p>
-      <w:pPr>
-        <w:pStyle w:val="BodyText"/>
-        <w:spacing w:line="276" w:lineRule="auto"/>
-        <w:rPr>
-          <w:rFonts w:ascii="Georgia" w:hAnsi="Georgia"/>
-        </w:rPr>
-      </w:pPr>
-      <w:r>
-        <w:rPr>
-          <w:rFonts w:ascii="Georgia" w:hAnsi="Georgia"/>
-        </w:rPr>
-        <w:t>I thought about what I was driving back to. No job. I had resigned from XTS six days before the crossing because I was not going to ask a new country for protection while still employed by one connected to the apparatus I was fleeing. My parents had made clear they needed me to find work before I could come back home. So there was no apartment, no income, no institutional footing of any kind. Just the binder in the backseat and the road that kept going south.</w:t>
-      </w:r>
-    </w:p>
-    <w:p>
-      <w:pPr>
-        <w:pStyle w:val="BodyText"/>
-        <w:spacing w:line="276" w:lineRule="auto"/>
-        <w:rPr>
-          <w:rFonts w:ascii="Georgia" w:hAnsi="Georgia"/>
-        </w:rPr>
-      </w:pPr>
-      <w:r>
-        <w:rPr>
-          <w:rFonts w:ascii="Georgia" w:hAnsi="Georgia"/>
-        </w:rPr>
-        <w:t>When I got to his apartment I told him everything. The room. The two officers. Being walked to my car. Driving down the wrong lane when I pulled away, the guards yelling, correcting course. The CBP officer on the American side who said they had no problem with me coming back, sympathetic in the way people are when there is nothing they are required to do.</w:t>
+        <w:t xml:space="preserve">The drive back took a long </w:t>
+      </w:r>
+      <w:proofErr w:type="gramStart"/>
+      <w:r>
+        <w:rPr>
+          <w:rFonts w:ascii="Georgia" w:hAnsi="Georgia"/>
+        </w:rPr>
+        <w:t>time, or</w:t>
+      </w:r>
+      <w:proofErr w:type="gramEnd"/>
+      <w:r>
+        <w:rPr>
+          <w:rFonts w:ascii="Georgia" w:hAnsi="Georgia"/>
+        </w:rPr>
+        <w:t xml:space="preserve"> felt that way. Just highway and the </w:t>
+      </w:r>
+      <w:proofErr w:type="gramStart"/>
+      <w:r>
+        <w:rPr>
+          <w:rFonts w:ascii="Georgia" w:hAnsi="Georgia"/>
+        </w:rPr>
+        <w:t>particular silence</w:t>
+      </w:r>
+      <w:proofErr w:type="gramEnd"/>
+      <w:r>
+        <w:rPr>
+          <w:rFonts w:ascii="Georgia" w:hAnsi="Georgia"/>
+        </w:rPr>
+        <w:t xml:space="preserve"> of a person replaying everything that had happened in a room they couldn’t go back to. The male officer’s voice. The White House letter he held up and called boilerplate. The female officer who could see it, who looked at my outline and knew I was telling the truth, and still couldn’t do anything about it. I had told them I would rather sit in a detention center for months than return to the United States. I had meant it. They walked me out to my car anyway.</w:t>
+      </w:r>
+    </w:p>
+    <w:p>
+      <w:pPr>
+        <w:pStyle w:val="BodyText"/>
+        <w:spacing w:line="276" w:lineRule="auto"/>
+        <w:rPr>
+          <w:rFonts w:ascii="Georgia" w:hAnsi="Georgia"/>
+        </w:rPr>
+      </w:pPr>
+      <w:r>
+        <w:rPr>
+          <w:rFonts w:ascii="Georgia" w:hAnsi="Georgia"/>
+        </w:rPr>
+        <w:t xml:space="preserve">I thought about what I was driving back to. No job. I had resigned from XTS six days before the crossing because I was not going to ask a new country for protection while still employed by one connected to the apparatus I was fleeing. My parents had made clear they needed me to find work before I could come back home. </w:t>
+      </w:r>
+      <w:proofErr w:type="gramStart"/>
+      <w:r>
+        <w:rPr>
+          <w:rFonts w:ascii="Georgia" w:hAnsi="Georgia"/>
+        </w:rPr>
+        <w:t>So</w:t>
+      </w:r>
+      <w:proofErr w:type="gramEnd"/>
+      <w:r>
+        <w:rPr>
+          <w:rFonts w:ascii="Georgia" w:hAnsi="Georgia"/>
+        </w:rPr>
+        <w:t xml:space="preserve"> there was no apartment, no income, no institutional footing of any kind. Just the binder in the backseat and the road that kept going south.</w:t>
+      </w:r>
+    </w:p>
+    <w:p>
+      <w:pPr>
+        <w:pStyle w:val="BodyText"/>
+        <w:spacing w:line="276" w:lineRule="auto"/>
+        <w:rPr>
+          <w:rFonts w:ascii="Georgia" w:hAnsi="Georgia"/>
+        </w:rPr>
+      </w:pPr>
+      <w:r>
+        <w:rPr>
+          <w:rFonts w:ascii="Georgia" w:hAnsi="Georgia"/>
+        </w:rPr>
+        <w:t xml:space="preserve">When I got to his </w:t>
+      </w:r>
+      <w:proofErr w:type="gramStart"/>
+      <w:r>
+        <w:rPr>
+          <w:rFonts w:ascii="Georgia" w:hAnsi="Georgia"/>
+        </w:rPr>
+        <w:t>apartment</w:t>
+      </w:r>
+      <w:proofErr w:type="gramEnd"/>
+      <w:r>
+        <w:rPr>
+          <w:rFonts w:ascii="Georgia" w:hAnsi="Georgia"/>
+        </w:rPr>
+        <w:t xml:space="preserve"> I told him everything. The room. The two officers. Being walked to my car. Driving down the wrong lane when I pulled away, the guards yelling, correcting course. The CBP officer on the American side who said they had no problem with me coming back, sympathetic in the way people are when there is </w:t>
+      </w:r>
+      <w:proofErr w:type="gramStart"/>
+      <w:r>
+        <w:rPr>
+          <w:rFonts w:ascii="Georgia" w:hAnsi="Georgia"/>
+        </w:rPr>
+        <w:t>nothing</w:t>
+      </w:r>
+      <w:proofErr w:type="gramEnd"/>
+      <w:r>
+        <w:rPr>
+          <w:rFonts w:ascii="Georgia" w:hAnsi="Georgia"/>
+        </w:rPr>
+        <w:t xml:space="preserve"> they are required to do.</w:t>
       </w:r>
     </w:p>
     <w:p>
@@ -12044,7 +13464,21 @@
         <w:rPr>
           <w:rFonts w:ascii="Georgia" w:hAnsi="Georgia"/>
         </w:rPr>
-        <w:t>By the time I found stable ground again I had a job and a life that had some shape to it. Not what I had before March 2023, not Navy Yard and a SECRET clearance and a presentation slot at the largest GIS conference in the world. But a real apartment, split with my boyfriend, in a place I actually liked. That mattered more than I expected it to.</w:t>
+        <w:t xml:space="preserve">By the time I found stable ground again I had a job and a life that had some shape to it. Not what I had before March 2023, not Navy Yard and a SECRET clearance and a presentation slot at the largest GIS conference in the world. But a real apartment, split with my boyfriend, in a place I </w:t>
+      </w:r>
+      <w:proofErr w:type="gramStart"/>
+      <w:r>
+        <w:rPr>
+          <w:rFonts w:ascii="Georgia" w:hAnsi="Georgia"/>
+        </w:rPr>
+        <w:t>actually liked</w:t>
+      </w:r>
+      <w:proofErr w:type="gramEnd"/>
+      <w:r>
+        <w:rPr>
+          <w:rFonts w:ascii="Georgia" w:hAnsi="Georgia"/>
+        </w:rPr>
+        <w:t>. That mattered more than I expected it to.</w:t>
       </w:r>
     </w:p>
     <w:p>
@@ -12085,11 +13519,19 @@
           <w:rFonts w:ascii="Georgia" w:hAnsi="Georgia"/>
         </w:rPr>
       </w:pPr>
-      <w:r>
-        <w:rPr>
-          <w:rFonts w:ascii="Georgia" w:hAnsi="Georgia"/>
-        </w:rPr>
-        <w:t>So I rebuilt the timeline from scratch. Every document, every date, every closed door laid out in order. I shared the details the way I had always worked, methodically, one entry at a time, sharing the source documents as I went. The job interview with Dr. Benson. The eleven messages. The offer of consideration for two positions. Captain Pearson’s response about the Air Force Office of Special Investigations.</w:t>
+      <w:proofErr w:type="gramStart"/>
+      <w:r>
+        <w:rPr>
+          <w:rFonts w:ascii="Georgia" w:hAnsi="Georgia"/>
+        </w:rPr>
+        <w:t>So</w:t>
+      </w:r>
+      <w:proofErr w:type="gramEnd"/>
+      <w:r>
+        <w:rPr>
+          <w:rFonts w:ascii="Georgia" w:hAnsi="Georgia"/>
+        </w:rPr>
+        <w:t xml:space="preserve"> I rebuilt the timeline from scratch. Every document, every date, every closed door laid out in order. I shared the details the way I had always worked, methodically, one entry at a time, sharing the source documents as I went. The job interview with Dr. Benson. The eleven messages. The offer of consideration for two positions. Captain Pearson’s response about the Air Force Office of Special Investigations.</w:t>
       </w:r>
     </w:p>
     <w:p>
@@ -12285,7 +13727,21 @@
         <w:rPr>
           <w:rFonts w:ascii="Georgia" w:hAnsi="Georgia"/>
         </w:rPr>
-        <w:t>It was later in the day when I hung up, after work, the sun going down. I had one thing to do and I needed to do it before anything could interrupt it. Three years of watching documents disappear, accounts get deleted, evidence get removed while I was in no position to stop it. I was not going to let this brief sit in a draft folder overnight. I sent it that evening. The 2nd Weather Squadron emails. The SAF/IGQ denial. The contradiction, documented, organized, two columns, readable in thirty seconds.</w:t>
+        <w:t xml:space="preserve">It was later in the day when I hung up, after work, the sun going down. I had one thing to </w:t>
+      </w:r>
+      <w:proofErr w:type="gramStart"/>
+      <w:r>
+        <w:rPr>
+          <w:rFonts w:ascii="Georgia" w:hAnsi="Georgia"/>
+        </w:rPr>
+        <w:t>do</w:t>
+      </w:r>
+      <w:proofErr w:type="gramEnd"/>
+      <w:r>
+        <w:rPr>
+          <w:rFonts w:ascii="Georgia" w:hAnsi="Georgia"/>
+        </w:rPr>
+        <w:t xml:space="preserve"> and I needed to do it before anything could interrupt it. Three years of watching documents disappear, accounts get deleted, evidence get removed while I was in no position to stop it. I was not going to let this brief sit in a draft folder overnight. I sent it that evening. The 2nd Weather Squadron emails. The SAF/IGQ denial. The contradiction, documented, organized, two columns, readable in thirty seconds.</w:t>
       </w:r>
     </w:p>
     <w:p>
@@ -12406,7 +13862,21 @@
           <w:rFonts w:ascii="Georgia" w:hAnsi="Georgia"/>
         </w:rPr>
         <w:lastRenderedPageBreak/>
-        <w:t>The attorneys are their own category. Bochetto and Lentz. Phillips and Cohen. Katz Banks Kumin, twice. Eric Siegel Law. Skeen Law Offices. Lundy Law. Relman Colfax. Several of them said the same thing in different words: our decision is not a reflection on the merits of your case. Phillips and Cohen wrote that a successful action could not be ruled out. GAP wrote that my claims were not unimportant and not without merit. Then they all referred me to NELA and wished me luck.</w:t>
+        <w:t xml:space="preserve">The attorneys are their own category. </w:t>
+      </w:r>
+      <w:proofErr w:type="spellStart"/>
+      <w:r>
+        <w:rPr>
+          <w:rFonts w:ascii="Georgia" w:hAnsi="Georgia"/>
+        </w:rPr>
+        <w:t>Bochetto</w:t>
+      </w:r>
+      <w:proofErr w:type="spellEnd"/>
+      <w:r>
+        <w:rPr>
+          <w:rFonts w:ascii="Georgia" w:hAnsi="Georgia"/>
+        </w:rPr>
+        <w:t xml:space="preserve"> and Lentz. Phillips and Cohen. Katz Banks Kumin, twice. Eric Siegel Law. Skeen Law Offices. Lundy Law. Relman Colfax. Several of them said the same thing in different words: our decision is not a reflection on the merits of your case. Phillips and Cohen wrote that a successful action could not be ruled out. GAP wrote that my claims were not unimportant and not without merit. Then they all referred me to NELA and wished me luck.</w:t>
       </w:r>
     </w:p>
     <w:p>
@@ -12436,7 +13906,21 @@
         <w:rPr>
           <w:rFonts w:ascii="Georgia" w:hAnsi="Georgia"/>
         </w:rPr>
-        <w:t>That is where things stand. Not resolved, not abandoned. The record exists. The documents exist. I have a Master’s degree and a SECRET clearance and a geographer’s understanding of what it means when the data doesn’t lie. I have the Benson emails and the Bartlett denial and the contradiction sitting between them that no one has been able to explain away, because it cannot be explained away. I have journal entries written the night before they hospitalized me. I have a book that cannot be retrieved, cannot be shipped back, cannot be removed while I am incapacitated.</w:t>
+        <w:t xml:space="preserve">That is where things stand. Not resolved, not abandoned. The record exists. The documents exist. I have a </w:t>
+      </w:r>
+      <w:proofErr w:type="gramStart"/>
+      <w:r>
+        <w:rPr>
+          <w:rFonts w:ascii="Georgia" w:hAnsi="Georgia"/>
+        </w:rPr>
+        <w:t>Master’s</w:t>
+      </w:r>
+      <w:proofErr w:type="gramEnd"/>
+      <w:r>
+        <w:rPr>
+          <w:rFonts w:ascii="Georgia" w:hAnsi="Georgia"/>
+        </w:rPr>
+        <w:t xml:space="preserve"> degree and a SECRET clearance and a geographer’s understanding of what it means when the data doesn’t lie. I have the Benson emails and the Bartlett denial and the contradiction sitting between them that no one has been able to explain away, because it cannot be explained away. I have journal entries written the night before they hospitalized me. I have a book that cannot be retrieved, cannot be shipped back, cannot be removed while I am incapacitated.</w:t>
       </w:r>
     </w:p>
     <w:p>
@@ -12496,7 +13980,35 @@
         <w:rPr>
           <w:rFonts w:ascii="Georgia" w:hAnsi="Georgia"/>
         </w:rPr>
-        <w:t>That is not a small thing. Every person who finishes this book and understands what happened is one more person the silence cannot reach. They built the silence carefully. They counted on it. They counted on closed doors and institutional indifference and the particular exhaustion that sets in when a person has tried every channel available to them and been turned away at every one. They counted on me running out of road.</w:t>
+        <w:t xml:space="preserve">That is not a small thing. Every person who finishes this book and understands what happened is one more person the silence cannot reach. They built the silence carefully. They counted on it. They counted on closed doors and institutional indifference and the </w:t>
+      </w:r>
+      <w:proofErr w:type="gramStart"/>
+      <w:r>
+        <w:rPr>
+          <w:rFonts w:ascii="Georgia" w:hAnsi="Georgia"/>
+        </w:rPr>
+        <w:t>particular exhaustion</w:t>
+      </w:r>
+      <w:proofErr w:type="gramEnd"/>
+      <w:r>
+        <w:rPr>
+          <w:rFonts w:ascii="Georgia" w:hAnsi="Georgia"/>
+        </w:rPr>
+        <w:t xml:space="preserve"> that sets in when a person has tried every channel available to them and been turned away at </w:t>
+      </w:r>
+      <w:proofErr w:type="spellStart"/>
+      <w:r>
+        <w:rPr>
+          <w:rFonts w:ascii="Georgia" w:hAnsi="Georgia"/>
+        </w:rPr>
+        <w:t>every one</w:t>
+      </w:r>
+      <w:proofErr w:type="spellEnd"/>
+      <w:r>
+        <w:rPr>
+          <w:rFonts w:ascii="Georgia" w:hAnsi="Georgia"/>
+        </w:rPr>
+        <w:t>. They counted on me running out of road.</w:t>
       </w:r>
     </w:p>
     <w:p>
@@ -12541,7 +14053,35 @@
         <w:rPr>
           <w:rFonts w:ascii="Georgia" w:hAnsi="Georgia"/>
         </w:rPr>
-        <w:t>To the whistleblowers reading this: I see you. Whatever they are doing to you, whatever version of this you are living through right now, I believe you. The pattern is real. The targeting is real. The institutional indifference is real and it is not an accident. You are not imagining it and you are not alone. Build the record. Name the names. Keep going.</w:t>
+        <w:t xml:space="preserve">To the whistleblowers reading this: I see you. Whatever they are doing to you, whatever version of this you are living through right now, I believe you. The pattern is real. The targeting is real. The institutional indifference is </w:t>
+      </w:r>
+      <w:proofErr w:type="gramStart"/>
+      <w:r>
+        <w:rPr>
+          <w:rFonts w:ascii="Georgia" w:hAnsi="Georgia"/>
+        </w:rPr>
+        <w:t>real</w:t>
+      </w:r>
+      <w:proofErr w:type="gramEnd"/>
+      <w:r>
+        <w:rPr>
+          <w:rFonts w:ascii="Georgia" w:hAnsi="Georgia"/>
+        </w:rPr>
+        <w:t xml:space="preserve"> and it is not an accident. You are not imagining </w:t>
+      </w:r>
+      <w:proofErr w:type="gramStart"/>
+      <w:r>
+        <w:rPr>
+          <w:rFonts w:ascii="Georgia" w:hAnsi="Georgia"/>
+        </w:rPr>
+        <w:t>it</w:t>
+      </w:r>
+      <w:proofErr w:type="gramEnd"/>
+      <w:r>
+        <w:rPr>
+          <w:rFonts w:ascii="Georgia" w:hAnsi="Georgia"/>
+        </w:rPr>
+        <w:t xml:space="preserve"> and you are not alone. Build the record. Name the names. Keep going.</w:t>
       </w:r>
     </w:p>
     <w:p>

</xml_diff>

<commit_message>
Fix inaccurate document naming claim in book description
</commit_message>
<xml_diff>
--- a/Manuscript/Plausibly_Deniable_FORMATTED.docx
+++ b/Manuscript/Plausibly_Deniable_FORMATTED.docx
@@ -116,7 +116,7 @@
           <w:szCs w:val="48"/>
         </w:rPr>
       </w:pPr>
-      <w:bookmarkStart w:id="1" w:name="_Toc228542044"/>
+      <w:bookmarkStart w:id="1" w:name="_Toc228693275"/>
       <w:r>
         <w:rPr>
           <w:rFonts w:ascii="Georgia" w:hAnsi="Georgia"/>
@@ -438,7 +438,7 @@
           <w:szCs w:val="48"/>
         </w:rPr>
       </w:pPr>
-      <w:bookmarkStart w:id="3" w:name="_Toc228542045"/>
+      <w:bookmarkStart w:id="3" w:name="_Toc228693276"/>
       <w:r>
         <w:rPr>
           <w:rFonts w:ascii="Georgia" w:hAnsi="Georgia"/>
@@ -1096,7 +1096,7 @@
             </w:rPr>
             <w:fldChar w:fldCharType="separate"/>
           </w:r>
-          <w:hyperlink w:anchor="_Toc228542044" w:history="1">
+          <w:hyperlink w:anchor="_Toc228693275" w:history="1">
             <w:r>
               <w:rPr>
                 <w:rStyle w:val="Hyperlink"/>
@@ -1126,7 +1126,7 @@
                 <w:noProof/>
                 <w:webHidden/>
               </w:rPr>
-              <w:instrText xml:space="preserve"> PAGEREF _Toc228542044 \h </w:instrText>
+              <w:instrText xml:space="preserve"> PAGEREF _Toc228693275 \h </w:instrText>
             </w:r>
             <w:r>
               <w:rPr>
@@ -1170,7 +1170,7 @@
               <w14:ligatures w14:val="standardContextual"/>
             </w:rPr>
           </w:pPr>
-          <w:hyperlink w:anchor="_Toc228542045" w:history="1">
+          <w:hyperlink w:anchor="_Toc228693276" w:history="1">
             <w:r>
               <w:rPr>
                 <w:rStyle w:val="Hyperlink"/>
@@ -1200,7 +1200,7 @@
                 <w:noProof/>
                 <w:webHidden/>
               </w:rPr>
-              <w:instrText xml:space="preserve"> PAGEREF _Toc228542045 \h </w:instrText>
+              <w:instrText xml:space="preserve"> PAGEREF _Toc228693276 \h </w:instrText>
             </w:r>
             <w:r>
               <w:rPr>
@@ -1244,7 +1244,7 @@
               <w14:ligatures w14:val="standardContextual"/>
             </w:rPr>
           </w:pPr>
-          <w:hyperlink w:anchor="_Toc228542046" w:history="1">
+          <w:hyperlink w:anchor="_Toc228693277" w:history="1">
             <w:r>
               <w:rPr>
                 <w:rStyle w:val="Hyperlink"/>
@@ -1274,7 +1274,7 @@
                 <w:noProof/>
                 <w:webHidden/>
               </w:rPr>
-              <w:instrText xml:space="preserve"> PAGEREF _Toc228542046 \h </w:instrText>
+              <w:instrText xml:space="preserve"> PAGEREF _Toc228693277 \h </w:instrText>
             </w:r>
             <w:r>
               <w:rPr>
@@ -1318,7 +1318,7 @@
               <w14:ligatures w14:val="standardContextual"/>
             </w:rPr>
           </w:pPr>
-          <w:hyperlink w:anchor="_Toc228542047" w:history="1">
+          <w:hyperlink w:anchor="_Toc228693278" w:history="1">
             <w:r>
               <w:rPr>
                 <w:rStyle w:val="Hyperlink"/>
@@ -1348,7 +1348,7 @@
                 <w:noProof/>
                 <w:webHidden/>
               </w:rPr>
-              <w:instrText xml:space="preserve"> PAGEREF _Toc228542047 \h </w:instrText>
+              <w:instrText xml:space="preserve"> PAGEREF _Toc228693278 \h </w:instrText>
             </w:r>
             <w:r>
               <w:rPr>
@@ -1392,7 +1392,7 @@
               <w14:ligatures w14:val="standardContextual"/>
             </w:rPr>
           </w:pPr>
-          <w:hyperlink w:anchor="_Toc228542048" w:history="1">
+          <w:hyperlink w:anchor="_Toc228693279" w:history="1">
             <w:r>
               <w:rPr>
                 <w:rStyle w:val="Hyperlink"/>
@@ -1422,7 +1422,7 @@
                 <w:noProof/>
                 <w:webHidden/>
               </w:rPr>
-              <w:instrText xml:space="preserve"> PAGEREF _Toc228542048 \h </w:instrText>
+              <w:instrText xml:space="preserve"> PAGEREF _Toc228693279 \h </w:instrText>
             </w:r>
             <w:r>
               <w:rPr>
@@ -1466,7 +1466,7 @@
               <w14:ligatures w14:val="standardContextual"/>
             </w:rPr>
           </w:pPr>
-          <w:hyperlink w:anchor="_Toc228542049" w:history="1">
+          <w:hyperlink w:anchor="_Toc228693280" w:history="1">
             <w:r>
               <w:rPr>
                 <w:rStyle w:val="Hyperlink"/>
@@ -1496,7 +1496,7 @@
                 <w:noProof/>
                 <w:webHidden/>
               </w:rPr>
-              <w:instrText xml:space="preserve"> PAGEREF _Toc228542049 \h </w:instrText>
+              <w:instrText xml:space="preserve"> PAGEREF _Toc228693280 \h </w:instrText>
             </w:r>
             <w:r>
               <w:rPr>
@@ -1540,7 +1540,7 @@
               <w14:ligatures w14:val="standardContextual"/>
             </w:rPr>
           </w:pPr>
-          <w:hyperlink w:anchor="_Toc228542050" w:history="1">
+          <w:hyperlink w:anchor="_Toc228693281" w:history="1">
             <w:r>
               <w:rPr>
                 <w:rStyle w:val="Hyperlink"/>
@@ -1570,7 +1570,7 @@
                 <w:noProof/>
                 <w:webHidden/>
               </w:rPr>
-              <w:instrText xml:space="preserve"> PAGEREF _Toc228542050 \h </w:instrText>
+              <w:instrText xml:space="preserve"> PAGEREF _Toc228693281 \h </w:instrText>
             </w:r>
             <w:r>
               <w:rPr>
@@ -1614,7 +1614,7 @@
               <w14:ligatures w14:val="standardContextual"/>
             </w:rPr>
           </w:pPr>
-          <w:hyperlink w:anchor="_Toc228542051" w:history="1">
+          <w:hyperlink w:anchor="_Toc228693282" w:history="1">
             <w:r>
               <w:rPr>
                 <w:rStyle w:val="Hyperlink"/>
@@ -1644,7 +1644,7 @@
                 <w:noProof/>
                 <w:webHidden/>
               </w:rPr>
-              <w:instrText xml:space="preserve"> PAGEREF _Toc228542051 \h </w:instrText>
+              <w:instrText xml:space="preserve"> PAGEREF _Toc228693282 \h </w:instrText>
             </w:r>
             <w:r>
               <w:rPr>
@@ -1688,7 +1688,7 @@
               <w14:ligatures w14:val="standardContextual"/>
             </w:rPr>
           </w:pPr>
-          <w:hyperlink w:anchor="_Toc228542052" w:history="1">
+          <w:hyperlink w:anchor="_Toc228693283" w:history="1">
             <w:r>
               <w:rPr>
                 <w:rStyle w:val="Hyperlink"/>
@@ -1718,7 +1718,7 @@
                 <w:noProof/>
                 <w:webHidden/>
               </w:rPr>
-              <w:instrText xml:space="preserve"> PAGEREF _Toc228542052 \h </w:instrText>
+              <w:instrText xml:space="preserve"> PAGEREF _Toc228693283 \h </w:instrText>
             </w:r>
             <w:r>
               <w:rPr>
@@ -1738,7 +1738,7 @@
                 <w:noProof/>
                 <w:webHidden/>
               </w:rPr>
-              <w:t>45</w:t>
+              <w:t>46</w:t>
             </w:r>
             <w:r>
               <w:rPr>
@@ -1762,7 +1762,7 @@
               <w14:ligatures w14:val="standardContextual"/>
             </w:rPr>
           </w:pPr>
-          <w:hyperlink w:anchor="_Toc228542053" w:history="1">
+          <w:hyperlink w:anchor="_Toc228693284" w:history="1">
             <w:r>
               <w:rPr>
                 <w:rStyle w:val="Hyperlink"/>
@@ -1792,7 +1792,7 @@
                 <w:noProof/>
                 <w:webHidden/>
               </w:rPr>
-              <w:instrText xml:space="preserve"> PAGEREF _Toc228542053 \h </w:instrText>
+              <w:instrText xml:space="preserve"> PAGEREF _Toc228693284 \h </w:instrText>
             </w:r>
             <w:r>
               <w:rPr>
@@ -1812,7 +1812,7 @@
                 <w:noProof/>
                 <w:webHidden/>
               </w:rPr>
-              <w:t>52</w:t>
+              <w:t>53</w:t>
             </w:r>
             <w:r>
               <w:rPr>
@@ -1836,7 +1836,7 @@
               <w14:ligatures w14:val="standardContextual"/>
             </w:rPr>
           </w:pPr>
-          <w:hyperlink w:anchor="_Toc228542054" w:history="1">
+          <w:hyperlink w:anchor="_Toc228693285" w:history="1">
             <w:r>
               <w:rPr>
                 <w:rStyle w:val="Hyperlink"/>
@@ -1866,7 +1866,7 @@
                 <w:noProof/>
                 <w:webHidden/>
               </w:rPr>
-              <w:instrText xml:space="preserve"> PAGEREF _Toc228542054 \h </w:instrText>
+              <w:instrText xml:space="preserve"> PAGEREF _Toc228693285 \h </w:instrText>
             </w:r>
             <w:r>
               <w:rPr>
@@ -1886,7 +1886,7 @@
                 <w:noProof/>
                 <w:webHidden/>
               </w:rPr>
-              <w:t>59</w:t>
+              <w:t>60</w:t>
             </w:r>
             <w:r>
               <w:rPr>
@@ -1910,7 +1910,7 @@
               <w14:ligatures w14:val="standardContextual"/>
             </w:rPr>
           </w:pPr>
-          <w:hyperlink w:anchor="_Toc228542055" w:history="1">
+          <w:hyperlink w:anchor="_Toc228693286" w:history="1">
             <w:r>
               <w:rPr>
                 <w:rStyle w:val="Hyperlink"/>
@@ -1940,7 +1940,7 @@
                 <w:noProof/>
                 <w:webHidden/>
               </w:rPr>
-              <w:instrText xml:space="preserve"> PAGEREF _Toc228542055 \h </w:instrText>
+              <w:instrText xml:space="preserve"> PAGEREF _Toc228693286 \h </w:instrText>
             </w:r>
             <w:r>
               <w:rPr>
@@ -1960,7 +1960,7 @@
                 <w:noProof/>
                 <w:webHidden/>
               </w:rPr>
-              <w:t>64</w:t>
+              <w:t>65</w:t>
             </w:r>
             <w:r>
               <w:rPr>
@@ -2013,7 +2013,7 @@
           <w:szCs w:val="48"/>
         </w:rPr>
       </w:pPr>
-      <w:bookmarkStart w:id="5" w:name="_Toc228542046"/>
+      <w:bookmarkStart w:id="5" w:name="_Toc228693277"/>
       <w:r>
         <w:rPr>
           <w:rFonts w:ascii="Georgia" w:hAnsi="Georgia"/>
@@ -3313,7 +3313,7 @@
           <w:szCs w:val="48"/>
         </w:rPr>
       </w:pPr>
-      <w:bookmarkStart w:id="7" w:name="_Toc228542047"/>
+      <w:bookmarkStart w:id="7" w:name="_Toc228693278"/>
       <w:r>
         <w:rPr>
           <w:rFonts w:ascii="Georgia" w:hAnsi="Georgia"/>
@@ -4071,7 +4071,7 @@
           <w:szCs w:val="48"/>
         </w:rPr>
       </w:pPr>
-      <w:bookmarkStart w:id="9" w:name="_Toc228542048"/>
+      <w:bookmarkStart w:id="9" w:name="_Toc228693279"/>
       <w:r>
         <w:rPr>
           <w:rFonts w:ascii="Georgia" w:hAnsi="Georgia"/>
@@ -4762,7 +4762,7 @@
           <w:szCs w:val="48"/>
         </w:rPr>
       </w:pPr>
-      <w:bookmarkStart w:id="11" w:name="_Toc228542049"/>
+      <w:bookmarkStart w:id="11" w:name="_Toc228693280"/>
       <w:r>
         <w:rPr>
           <w:rFonts w:ascii="Georgia" w:hAnsi="Georgia"/>
@@ -6315,7 +6315,7 @@
           <w:szCs w:val="48"/>
         </w:rPr>
       </w:pPr>
-      <w:bookmarkStart w:id="13" w:name="_Toc228542050"/>
+      <w:bookmarkStart w:id="13" w:name="_Toc228693281"/>
       <w:r>
         <w:rPr>
           <w:rFonts w:ascii="Georgia" w:hAnsi="Georgia"/>
@@ -7546,7 +7546,7 @@
           <w:szCs w:val="48"/>
         </w:rPr>
       </w:pPr>
-      <w:bookmarkStart w:id="15" w:name="_Toc228542051"/>
+      <w:bookmarkStart w:id="15" w:name="_Toc228693282"/>
       <w:r>
         <w:rPr>
           <w:rFonts w:ascii="Georgia" w:hAnsi="Georgia"/>
@@ -7701,6 +7701,8 @@
         <w:spacing w:line="276" w:lineRule="auto"/>
         <w:rPr>
           <w:rFonts w:ascii="Georgia" w:hAnsi="Georgia"/>
+          <w:i/>
+          <w:iCs/>
         </w:rPr>
       </w:pPr>
       <w:r>
@@ -7723,23 +7725,74 @@
           <w:i/>
           <w:iCs/>
         </w:rPr>
-        <w:t xml:space="preserve">March 5, </w:t>
-      </w:r>
-      <w:proofErr w:type="gramStart"/>
+        <w:t>March 5, 2023</w:t>
+      </w:r>
+    </w:p>
+    <w:p>
+      <w:pPr>
+        <w:pStyle w:val="FirstParagraph"/>
+        <w:spacing w:line="276" w:lineRule="auto"/>
+        <w:rPr>
+          <w:rFonts w:ascii="Georgia" w:hAnsi="Georgia"/>
+        </w:rPr>
+      </w:pPr>
+      <w:r>
+        <w:rPr>
+          <w:rFonts w:ascii="Georgia" w:hAnsi="Georgia"/>
+        </w:rPr>
+        <w:t>I faxed a confidential complaint to the DHS OIG two days after the coercive events of March 2nd. The transmission confirmation shows successful delivery at 9:57 AM. No substantive response was ever received. Two days later I was hospitalized.</w:t>
+      </w:r>
+    </w:p>
+    <w:p>
+      <w:pPr>
+        <w:pStyle w:val="BodyText"/>
+        <w:spacing w:line="276" w:lineRule="auto"/>
+        <w:rPr>
+          <w:rFonts w:ascii="Georgia" w:hAnsi="Georgia"/>
+        </w:rPr>
+      </w:pPr>
+      <w:r>
+        <w:rPr>
+          <w:rFonts w:ascii="Georgia" w:hAnsi="Georgia"/>
+          <w:b/>
+          <w:bCs/>
+        </w:rPr>
+        <w:t>The White House — Biden-Harris Administration</w:t>
+      </w:r>
+      <w:r>
+        <w:rPr>
+          <w:rFonts w:ascii="Georgia" w:hAnsi="Georgia"/>
+        </w:rPr>
+        <w:t xml:space="preserve"> </w:t>
+      </w:r>
       <w:r>
         <w:rPr>
           <w:rFonts w:ascii="Georgia" w:hAnsi="Georgia"/>
           <w:i/>
           <w:iCs/>
         </w:rPr>
-        <w:t>2023</w:t>
-      </w:r>
-      <w:proofErr w:type="gramEnd"/>
-      <w:r>
-        <w:rPr>
-          <w:rFonts w:ascii="Georgia" w:hAnsi="Georgia"/>
-        </w:rPr>
-        <w:t xml:space="preserve"> I faxed a confidential complaint to the DHS OIG two days after the coercive events of March 2nd. The transmission confirmation shows successful delivery at 9:57 AM. No substantive response was ever received. Two days later I was hospitalized.</w:t>
+        <w:t>March and April 2023</w:t>
+      </w:r>
+      <w:r>
+        <w:rPr>
+          <w:rFonts w:ascii="Georgia" w:hAnsi="Georgia"/>
+        </w:rPr>
+        <w:t xml:space="preserve"> </w:t>
+      </w:r>
+    </w:p>
+    <w:p>
+      <w:pPr>
+        <w:pStyle w:val="BodyText"/>
+        <w:spacing w:line="276" w:lineRule="auto"/>
+        <w:rPr>
+          <w:rFonts w:ascii="Georgia" w:hAnsi="Georgia"/>
+        </w:rPr>
+      </w:pPr>
+      <w:r>
+        <w:rPr>
+          <w:rFonts w:ascii="Georgia" w:hAnsi="Georgia"/>
+        </w:rPr>
+        <w:t>I contacted the White House twice. Both times I received acknowledgments. The April response confirmed my correspondence had been forwarded to the “appropriate Federal agency for further action.” No agency ever followed up with me directly.</w:t>
       </w:r>
     </w:p>
     <w:p>
@@ -7756,7 +7809,7 @@
           <w:b/>
           <w:bCs/>
         </w:rPr>
-        <w:t>The White House — Biden-Harris Administration</w:t>
+        <w:t>Jodi Votel, EEO Counselor/Specialist — FAA Office of Civil Rights (ACT-9)</w:t>
       </w:r>
       <w:r>
         <w:rPr>
@@ -7770,13 +7823,57 @@
           <w:i/>
           <w:iCs/>
         </w:rPr>
-        <w:t>March and April 2023</w:t>
-      </w:r>
-      <w:r>
-        <w:rPr>
-          <w:rFonts w:ascii="Georgia" w:hAnsi="Georgia"/>
-        </w:rPr>
-        <w:t xml:space="preserve"> I contacted the White House twice. Both times I received acknowledgments. The April response confirmed my correspondence had been forwarded to the “appropriate Federal agency for further action.” No agency ever followed up with me directly.</w:t>
+        <w:t>May 2023</w:t>
+      </w:r>
+      <w:r>
+        <w:rPr>
+          <w:rFonts w:ascii="Georgia" w:hAnsi="Georgia"/>
+        </w:rPr>
+        <w:t xml:space="preserve"> </w:t>
+      </w:r>
+    </w:p>
+    <w:p>
+      <w:pPr>
+        <w:pStyle w:val="BodyText"/>
+        <w:spacing w:line="276" w:lineRule="auto"/>
+        <w:rPr>
+          <w:rFonts w:ascii="Georgia" w:hAnsi="Georgia"/>
+        </w:rPr>
+      </w:pPr>
+      <w:r>
+        <w:rPr>
+          <w:rFonts w:ascii="Georgia" w:hAnsi="Georgia"/>
+        </w:rPr>
+        <w:t xml:space="preserve">I filed EEO complaint #2023-29988. Votel processed it and sent the Rights and Responsibilities documentation. On May 11th I withdrew the complaint. I wrote: </w:t>
+      </w:r>
+      <w:r>
+        <w:rPr>
+          <w:rFonts w:ascii="Georgia" w:hAnsi="Georgia"/>
+          <w:i/>
+          <w:iCs/>
+        </w:rPr>
+        <w:t>“I am very fearful for my well-being if I move forward with it.”</w:t>
+      </w:r>
+      <w:r>
+        <w:rPr>
+          <w:rFonts w:ascii="Georgia" w:hAnsi="Georgia"/>
+        </w:rPr>
+        <w:t xml:space="preserve"> Votel sent the withdrawal </w:t>
+      </w:r>
+      <w:r>
+        <w:rPr>
+          <w:rFonts w:ascii="Georgia" w:hAnsi="Georgia"/>
+        </w:rPr>
+        <w:lastRenderedPageBreak/>
+        <w:t xml:space="preserve">paperwork. I signed it. I later wrote to her: </w:t>
+      </w:r>
+      <w:r>
+        <w:rPr>
+          <w:rFonts w:ascii="Georgia" w:hAnsi="Georgia"/>
+          <w:i/>
+          <w:iCs/>
+        </w:rPr>
+        <w:t>“I’d like to add that I signed that memorandum out of fear.”</w:t>
       </w:r>
     </w:p>
     <w:p>
@@ -7793,7 +7890,7 @@
           <w:b/>
           <w:bCs/>
         </w:rPr>
-        <w:t>Jodi Votel, EEO Counselor/Specialist — FAA Office of Civil Rights (ACT-9)</w:t>
+        <w:t>FAA Pre-Complaint — Timothy Wallace, Manager, AJR-22</w:t>
       </w:r>
       <w:r>
         <w:rPr>
@@ -7807,13 +7904,51 @@
           <w:i/>
           <w:iCs/>
         </w:rPr>
-        <w:t>May 2023</w:t>
-      </w:r>
-      <w:r>
-        <w:rPr>
-          <w:rFonts w:ascii="Georgia" w:hAnsi="Georgia"/>
-        </w:rPr>
-        <w:t xml:space="preserve"> I filed EEO complaint #2023-29988. Votel processed it and sent the Rights and Responsibilities documentation. On May 11th I withdrew the complaint. I wrote: </w:t>
+        <w:t>June 22, 2023</w:t>
+      </w:r>
+      <w:r>
+        <w:rPr>
+          <w:rFonts w:ascii="Georgia" w:hAnsi="Georgia"/>
+        </w:rPr>
+        <w:t xml:space="preserve"> </w:t>
+      </w:r>
+    </w:p>
+    <w:p>
+      <w:pPr>
+        <w:pStyle w:val="BodyText"/>
+        <w:spacing w:line="276" w:lineRule="auto"/>
+        <w:rPr>
+          <w:rFonts w:ascii="Georgia" w:hAnsi="Georgia"/>
+        </w:rPr>
+      </w:pPr>
+      <w:r>
+        <w:rPr>
+          <w:rFonts w:ascii="Georgia" w:hAnsi="Georgia"/>
+        </w:rPr>
+        <w:t>I filed a second pre-complaint naming Timothy Wallace, Manager of Operational Security Initiatives, as the responsible management official. I alleged disability discrimination, harassment, and failure to provide reasonable accommodation. I elected ADR. No resolution was ever documented.</w:t>
+      </w:r>
+    </w:p>
+    <w:p>
+      <w:pPr>
+        <w:pStyle w:val="BodyText"/>
+        <w:spacing w:line="276" w:lineRule="auto"/>
+        <w:rPr>
+          <w:rFonts w:ascii="Georgia" w:hAnsi="Georgia"/>
+        </w:rPr>
+      </w:pPr>
+      <w:r>
+        <w:rPr>
+          <w:rFonts w:ascii="Georgia" w:hAnsi="Georgia"/>
+          <w:b/>
+          <w:bCs/>
+        </w:rPr>
+        <w:t>Sabina Frederick, Whistleblower Protection Coordinator — DOT OIG</w:t>
+      </w:r>
+      <w:r>
+        <w:rPr>
+          <w:rFonts w:ascii="Georgia" w:hAnsi="Georgia"/>
+        </w:rPr>
+        <w:t xml:space="preserve"> </w:t>
       </w:r>
       <w:r>
         <w:rPr>
@@ -7821,13 +7956,28 @@
           <w:i/>
           <w:iCs/>
         </w:rPr>
-        <w:t>“I am very fearful for my well-being if I move forward with it.”</w:t>
-      </w:r>
-      <w:r>
-        <w:rPr>
-          <w:rFonts w:ascii="Georgia" w:hAnsi="Georgia"/>
-        </w:rPr>
-        <w:t xml:space="preserve"> Votel sent the withdrawal paperwork. I signed it. I later wrote to her: </w:t>
+        <w:t>January 11, 2024</w:t>
+      </w:r>
+      <w:r>
+        <w:rPr>
+          <w:rFonts w:ascii="Georgia" w:hAnsi="Georgia"/>
+        </w:rPr>
+        <w:t xml:space="preserve"> </w:t>
+      </w:r>
+    </w:p>
+    <w:p>
+      <w:pPr>
+        <w:pStyle w:val="BodyText"/>
+        <w:spacing w:line="276" w:lineRule="auto"/>
+        <w:rPr>
+          <w:rFonts w:ascii="Georgia" w:hAnsi="Georgia"/>
+        </w:rPr>
+      </w:pPr>
+      <w:r>
+        <w:rPr>
+          <w:rFonts w:ascii="Georgia" w:hAnsi="Georgia"/>
+        </w:rPr>
+        <w:t xml:space="preserve">Frederick contacted me by phone and then email asking me to clarify my allegations. I responded the same day with a detailed account of the March 2nd events. She responded hours later: </w:t>
       </w:r>
       <w:r>
         <w:rPr>
@@ -7835,15 +7985,68 @@
           <w:i/>
           <w:iCs/>
         </w:rPr>
-        <w:t>“I’d like to add that I signed that memorandum out of fear.”</w:t>
-      </w:r>
-    </w:p>
-    <w:p>
-      <w:pPr>
-        <w:pStyle w:val="BodyText"/>
-        <w:spacing w:line="276" w:lineRule="auto"/>
-        <w:rPr>
-          <w:rFonts w:ascii="Georgia" w:hAnsi="Georgia"/>
+        <w:t xml:space="preserve">“Based on a review of the information provided in your recent emails, we believe that DOT-OIG </w:t>
+      </w:r>
+      <w:proofErr w:type="spellStart"/>
+      <w:r>
+        <w:rPr>
+          <w:rFonts w:ascii="Georgia" w:hAnsi="Georgia"/>
+          <w:i/>
+          <w:iCs/>
+        </w:rPr>
+        <w:t>lacks</w:t>
+      </w:r>
+      <w:proofErr w:type="spellEnd"/>
+      <w:r>
+        <w:rPr>
+          <w:rFonts w:ascii="Georgia" w:hAnsi="Georgia"/>
+          <w:i/>
+          <w:iCs/>
+        </w:rPr>
+        <w:t xml:space="preserve"> oversight regarding your concerns. Additionally, we </w:t>
+      </w:r>
+      <w:proofErr w:type="gramStart"/>
+      <w:r>
+        <w:rPr>
+          <w:rFonts w:ascii="Georgia" w:hAnsi="Georgia"/>
+          <w:i/>
+          <w:iCs/>
+        </w:rPr>
+        <w:t>are not in a position to</w:t>
+      </w:r>
+      <w:proofErr w:type="gramEnd"/>
+      <w:r>
+        <w:rPr>
+          <w:rFonts w:ascii="Georgia" w:hAnsi="Georgia"/>
+          <w:i/>
+          <w:iCs/>
+        </w:rPr>
+        <w:t xml:space="preserve"> provide advice and anticipate no further action from our office concerning these matters.”</w:t>
+      </w:r>
+    </w:p>
+    <w:p>
+      <w:pPr>
+        <w:pStyle w:val="BodyText"/>
+        <w:spacing w:line="276" w:lineRule="auto"/>
+        <w:rPr>
+          <w:rFonts w:ascii="Georgia" w:hAnsi="Georgia"/>
+        </w:rPr>
+      </w:pPr>
+      <w:r>
+        <w:rPr>
+          <w:rFonts w:ascii="Georgia" w:hAnsi="Georgia"/>
+        </w:rPr>
+        <w:t>Same day. Hours later. No further action.</w:t>
+      </w:r>
+    </w:p>
+    <w:p>
+      <w:pPr>
+        <w:pStyle w:val="BodyText"/>
+        <w:spacing w:line="276" w:lineRule="auto"/>
+        <w:rPr>
+          <w:rFonts w:ascii="Georgia" w:hAnsi="Georgia"/>
+          <w:i/>
+          <w:iCs/>
         </w:rPr>
       </w:pPr>
       <w:r>
@@ -7852,8 +8055,7 @@
           <w:b/>
           <w:bCs/>
         </w:rPr>
-        <w:lastRenderedPageBreak/>
-        <w:t>FAA Pre-Complaint — Timothy Wallace, Manager, AJR-22</w:t>
+        <w:t>FBI / Internet Crime Complaint Center (IC3)</w:t>
       </w:r>
       <w:r>
         <w:rPr>
@@ -7867,23 +8069,74 @@
           <w:i/>
           <w:iCs/>
         </w:rPr>
-        <w:t xml:space="preserve">June 22, </w:t>
-      </w:r>
-      <w:proofErr w:type="gramStart"/>
+        <w:t>January 2024</w:t>
+      </w:r>
+    </w:p>
+    <w:p>
+      <w:pPr>
+        <w:pStyle w:val="BodyText"/>
+        <w:spacing w:line="276" w:lineRule="auto"/>
+        <w:rPr>
+          <w:rFonts w:ascii="Georgia" w:hAnsi="Georgia"/>
+        </w:rPr>
+      </w:pPr>
+      <w:r>
+        <w:rPr>
+          <w:rFonts w:ascii="Georgia" w:hAnsi="Georgia"/>
+        </w:rPr>
+        <w:t>I filed a complaint documenting the March 2nd events as coordinated internet crime — targeted ads on a federal device, alias account creation directives, financial coercion conducted through digital means. No response was ever documented.</w:t>
+      </w:r>
+    </w:p>
+    <w:p>
+      <w:pPr>
+        <w:pStyle w:val="BodyText"/>
+        <w:spacing w:line="276" w:lineRule="auto"/>
+        <w:rPr>
+          <w:rFonts w:ascii="Georgia" w:hAnsi="Georgia"/>
+        </w:rPr>
+      </w:pPr>
+      <w:r>
+        <w:rPr>
+          <w:rFonts w:ascii="Georgia" w:hAnsi="Georgia"/>
+          <w:b/>
+          <w:bCs/>
+        </w:rPr>
+        <w:t>Office of Special Counsel (OSC)</w:t>
+      </w:r>
+      <w:r>
+        <w:rPr>
+          <w:rFonts w:ascii="Georgia" w:hAnsi="Georgia"/>
+        </w:rPr>
+        <w:t xml:space="preserve"> </w:t>
+      </w:r>
       <w:r>
         <w:rPr>
           <w:rFonts w:ascii="Georgia" w:hAnsi="Georgia"/>
           <w:i/>
           <w:iCs/>
         </w:rPr>
-        <w:t>2023</w:t>
-      </w:r>
-      <w:proofErr w:type="gramEnd"/>
-      <w:r>
-        <w:rPr>
-          <w:rFonts w:ascii="Georgia" w:hAnsi="Georgia"/>
-        </w:rPr>
-        <w:t xml:space="preserve"> I filed a second pre-complaint naming Timothy Wallace, Manager of Operational Security Initiatives, as the responsible management official. I alleged disability discrimination, harassment, and failure to provide reasonable accommodation. I elected ADR. No resolution was ever documented.</w:t>
+        <w:t>August 7, 2024</w:t>
+      </w:r>
+      <w:r>
+        <w:rPr>
+          <w:rFonts w:ascii="Georgia" w:hAnsi="Georgia"/>
+        </w:rPr>
+        <w:t xml:space="preserve"> </w:t>
+      </w:r>
+    </w:p>
+    <w:p>
+      <w:pPr>
+        <w:pStyle w:val="BodyText"/>
+        <w:spacing w:line="276" w:lineRule="auto"/>
+        <w:rPr>
+          <w:rFonts w:ascii="Georgia" w:hAnsi="Georgia"/>
+        </w:rPr>
+      </w:pPr>
+      <w:r>
+        <w:rPr>
+          <w:rFonts w:ascii="Georgia" w:hAnsi="Georgia"/>
+        </w:rPr>
+        <w:t>I filed four separate allegations: Abuse of Authority, Censorship Related to Scientific Research, Danger to Public Health, and Violation of Law, Rule or Regulation. The OSC website returned a notification indicating the FAA fell outside its jurisdiction. No active investigation resulted.</w:t>
       </w:r>
     </w:p>
     <w:p>
@@ -7900,7 +8153,7 @@
           <w:b/>
           <w:bCs/>
         </w:rPr>
-        <w:t>Sabina Frederick, Whistleblower Protection Coordinator — DOT OIG</w:t>
+        <w:t>Michael Mills, AFDW/IG — Joint Base Andrews</w:t>
       </w:r>
       <w:r>
         <w:rPr>
@@ -7914,23 +8167,65 @@
           <w:i/>
           <w:iCs/>
         </w:rPr>
-        <w:t xml:space="preserve">January 11, </w:t>
-      </w:r>
-      <w:proofErr w:type="gramStart"/>
+        <w:t>July 2024</w:t>
+      </w:r>
+      <w:r>
+        <w:rPr>
+          <w:rFonts w:ascii="Georgia" w:hAnsi="Georgia"/>
+        </w:rPr>
+        <w:t xml:space="preserve"> </w:t>
+      </w:r>
+    </w:p>
+    <w:p>
+      <w:pPr>
+        <w:pStyle w:val="BodyText"/>
+        <w:spacing w:line="276" w:lineRule="auto"/>
+        <w:rPr>
+          <w:rFonts w:ascii="Georgia" w:hAnsi="Georgia"/>
+        </w:rPr>
+      </w:pPr>
+      <w:r>
+        <w:rPr>
+          <w:rFonts w:ascii="Georgia" w:hAnsi="Georgia"/>
+        </w:rPr>
+        <w:t xml:space="preserve">Mills contacted me after my SAF/IG complaint. He read the case. He asked careful questions and I gave careful answers. He said: </w:t>
+      </w:r>
       <w:r>
         <w:rPr>
           <w:rFonts w:ascii="Georgia" w:hAnsi="Georgia"/>
           <w:i/>
           <w:iCs/>
         </w:rPr>
-        <w:t>2024</w:t>
-      </w:r>
-      <w:proofErr w:type="gramEnd"/>
-      <w:r>
-        <w:rPr>
-          <w:rFonts w:ascii="Georgia" w:hAnsi="Georgia"/>
-        </w:rPr>
-        <w:t xml:space="preserve"> Frederick contacted me by phone and then email asking me to clarify my allegations. I responded the same day with a detailed account of the March 2nd events. She responded hours later: </w:t>
+        <w:t>“Right now, everything I’m seeing is either FAA or DoT… If we can’t identify an Air Force issue, then we won’t have a path forward.”</w:t>
+      </w:r>
+      <w:r>
+        <w:rPr>
+          <w:rFonts w:ascii="Georgia" w:hAnsi="Georgia"/>
+        </w:rPr>
+        <w:t xml:space="preserve"> He could not identify an Air Force issue. He closed the case without referral.</w:t>
+      </w:r>
+    </w:p>
+    <w:p>
+      <w:pPr>
+        <w:pStyle w:val="BodyText"/>
+        <w:spacing w:line="276" w:lineRule="auto"/>
+        <w:rPr>
+          <w:rFonts w:ascii="Georgia" w:hAnsi="Georgia"/>
+        </w:rPr>
+      </w:pPr>
+      <w:r>
+        <w:rPr>
+          <w:rFonts w:ascii="Georgia" w:hAnsi="Georgia"/>
+          <w:b/>
+          <w:bCs/>
+        </w:rPr>
+        <w:t>Kimberly Mlinaz, Director of NDR — SAF/GCA</w:t>
+      </w:r>
+      <w:r>
+        <w:rPr>
+          <w:rFonts w:ascii="Georgia" w:hAnsi="Georgia"/>
+        </w:rPr>
+        <w:t xml:space="preserve"> </w:t>
       </w:r>
       <w:r>
         <w:rPr>
@@ -7938,322 +8233,122 @@
           <w:i/>
           <w:iCs/>
         </w:rPr>
-        <w:t xml:space="preserve">“Based on a review of the information provided in your recent emails, we believe that DOT-OIG </w:t>
+        <w:t>July 18, 2024</w:t>
+      </w:r>
+      <w:r>
+        <w:rPr>
+          <w:rFonts w:ascii="Georgia" w:hAnsi="Georgia"/>
+        </w:rPr>
+        <w:t xml:space="preserve"> </w:t>
+      </w:r>
+    </w:p>
+    <w:p>
+      <w:pPr>
+        <w:pStyle w:val="BodyText"/>
+        <w:spacing w:line="276" w:lineRule="auto"/>
+        <w:rPr>
+          <w:rFonts w:ascii="Georgia" w:hAnsi="Georgia"/>
+        </w:rPr>
+      </w:pPr>
+      <w:r>
+        <w:rPr>
+          <w:rFonts w:ascii="Georgia" w:hAnsi="Georgia"/>
+        </w:rPr>
+        <w:t xml:space="preserve">I contacted SAF’s Negotiation and Dispute Resolution office separately. </w:t>
       </w:r>
       <w:proofErr w:type="spellStart"/>
+      <w:r>
+        <w:rPr>
+          <w:rFonts w:ascii="Georgia" w:hAnsi="Georgia"/>
+        </w:rPr>
+        <w:t>Mlinaz</w:t>
+      </w:r>
+      <w:proofErr w:type="spellEnd"/>
+      <w:r>
+        <w:rPr>
+          <w:rFonts w:ascii="Georgia" w:hAnsi="Georgia"/>
+        </w:rPr>
+        <w:t xml:space="preserve"> explained that NDR is an internal program — engagement requires a request from the </w:t>
+      </w:r>
+      <w:r>
+        <w:rPr>
+          <w:rFonts w:ascii="Georgia" w:hAnsi="Georgia"/>
+        </w:rPr>
+        <w:lastRenderedPageBreak/>
+        <w:t>IG. Mills would need to ask. Mills never asked. The ADR door I had been trying to open since March 2023 was closed procedurally by a person who never made a phone call.</w:t>
+      </w:r>
+    </w:p>
+    <w:p>
+      <w:pPr>
+        <w:pStyle w:val="BodyText"/>
+        <w:spacing w:line="276" w:lineRule="auto"/>
+        <w:rPr>
+          <w:rFonts w:ascii="Georgia" w:hAnsi="Georgia"/>
+        </w:rPr>
+      </w:pPr>
+      <w:r>
+        <w:rPr>
+          <w:rFonts w:ascii="Georgia" w:hAnsi="Georgia"/>
+          <w:b/>
+          <w:bCs/>
+        </w:rPr>
+        <w:t>Secretary of Transportation Pete Buttigieg</w:t>
+      </w:r>
+      <w:r>
+        <w:rPr>
+          <w:rFonts w:ascii="Georgia" w:hAnsi="Georgia"/>
+        </w:rPr>
+        <w:t xml:space="preserve"> </w:t>
+      </w:r>
       <w:r>
         <w:rPr>
           <w:rFonts w:ascii="Georgia" w:hAnsi="Georgia"/>
           <w:i/>
           <w:iCs/>
         </w:rPr>
-        <w:t>lacks</w:t>
-      </w:r>
-      <w:proofErr w:type="spellEnd"/>
+        <w:t>December 6, 2024</w:t>
+      </w:r>
+      <w:r>
+        <w:rPr>
+          <w:rFonts w:ascii="Georgia" w:hAnsi="Georgia"/>
+        </w:rPr>
+        <w:t xml:space="preserve"> </w:t>
+      </w:r>
+    </w:p>
+    <w:p>
+      <w:pPr>
+        <w:pStyle w:val="BodyText"/>
+        <w:spacing w:line="276" w:lineRule="auto"/>
+        <w:rPr>
+          <w:rFonts w:ascii="Georgia" w:hAnsi="Georgia"/>
+        </w:rPr>
+      </w:pPr>
+      <w:r>
+        <w:rPr>
+          <w:rFonts w:ascii="Georgia" w:hAnsi="Georgia"/>
+        </w:rPr>
+        <w:t xml:space="preserve">I sent a formal letter to Secretary Buttigieg at the Department of Transportation. I described the coercive directives, the alias account, the unauthorized medical access, the ongoing intimidation, and the failure of both the DHS and DOT OIGs to </w:t>
+      </w:r>
+      <w:proofErr w:type="gramStart"/>
+      <w:r>
+        <w:rPr>
+          <w:rFonts w:ascii="Georgia" w:hAnsi="Georgia"/>
+        </w:rPr>
+        <w:t>take action</w:t>
+      </w:r>
+      <w:proofErr w:type="gramEnd"/>
+      <w:r>
+        <w:rPr>
+          <w:rFonts w:ascii="Georgia" w:hAnsi="Georgia"/>
+        </w:rPr>
+        <w:t xml:space="preserve">. I wrote: </w:t>
+      </w:r>
       <w:r>
         <w:rPr>
           <w:rFonts w:ascii="Georgia" w:hAnsi="Georgia"/>
           <w:i/>
           <w:iCs/>
         </w:rPr>
-        <w:t xml:space="preserve"> oversight regarding your concerns. Additionally, we </w:t>
-      </w:r>
-      <w:proofErr w:type="gramStart"/>
-      <w:r>
-        <w:rPr>
-          <w:rFonts w:ascii="Georgia" w:hAnsi="Georgia"/>
-          <w:i/>
-          <w:iCs/>
-        </w:rPr>
-        <w:t>are not in a position to</w:t>
-      </w:r>
-      <w:proofErr w:type="gramEnd"/>
-      <w:r>
-        <w:rPr>
-          <w:rFonts w:ascii="Georgia" w:hAnsi="Georgia"/>
-          <w:i/>
-          <w:iCs/>
-        </w:rPr>
-        <w:t xml:space="preserve"> provide advice and anticipate no further action from our office concerning these matters.”</w:t>
-      </w:r>
-    </w:p>
-    <w:p>
-      <w:pPr>
-        <w:pStyle w:val="BodyText"/>
-        <w:spacing w:line="276" w:lineRule="auto"/>
-        <w:rPr>
-          <w:rFonts w:ascii="Georgia" w:hAnsi="Georgia"/>
-        </w:rPr>
-      </w:pPr>
-      <w:r>
-        <w:rPr>
-          <w:rFonts w:ascii="Georgia" w:hAnsi="Georgia"/>
-        </w:rPr>
-        <w:t>Same day. Hours later. No further action.</w:t>
-      </w:r>
-    </w:p>
-    <w:p>
-      <w:pPr>
-        <w:pStyle w:val="BodyText"/>
-        <w:spacing w:line="276" w:lineRule="auto"/>
-        <w:rPr>
-          <w:rFonts w:ascii="Georgia" w:hAnsi="Georgia"/>
-        </w:rPr>
-      </w:pPr>
-      <w:r>
-        <w:rPr>
-          <w:rFonts w:ascii="Georgia" w:hAnsi="Georgia"/>
-          <w:b/>
-          <w:bCs/>
-        </w:rPr>
-        <w:t>FBI / Internet Crime Complaint Center (IC3)</w:t>
-      </w:r>
-      <w:r>
-        <w:rPr>
-          <w:rFonts w:ascii="Georgia" w:hAnsi="Georgia"/>
-        </w:rPr>
-        <w:t xml:space="preserve"> </w:t>
-      </w:r>
-      <w:r>
-        <w:rPr>
-          <w:rFonts w:ascii="Georgia" w:hAnsi="Georgia"/>
-          <w:i/>
-          <w:iCs/>
-        </w:rPr>
-        <w:t>January 2024</w:t>
-      </w:r>
-      <w:r>
-        <w:rPr>
-          <w:rFonts w:ascii="Georgia" w:hAnsi="Georgia"/>
-        </w:rPr>
-        <w:t xml:space="preserve"> I filed a complaint documenting the March 2nd events as coordinated internet crime — targeted ads on a federal device, alias account creation directives, financial coercion conducted through digital means. No response was ever documented.</w:t>
-      </w:r>
-    </w:p>
-    <w:p>
-      <w:pPr>
-        <w:pStyle w:val="BodyText"/>
-        <w:spacing w:line="276" w:lineRule="auto"/>
-        <w:rPr>
-          <w:rFonts w:ascii="Georgia" w:hAnsi="Georgia"/>
-        </w:rPr>
-      </w:pPr>
-      <w:r>
-        <w:rPr>
-          <w:rFonts w:ascii="Georgia" w:hAnsi="Georgia"/>
-          <w:b/>
-          <w:bCs/>
-        </w:rPr>
-        <w:t>Office of Special Counsel (OSC)</w:t>
-      </w:r>
-      <w:r>
-        <w:rPr>
-          <w:rFonts w:ascii="Georgia" w:hAnsi="Georgia"/>
-        </w:rPr>
-        <w:t xml:space="preserve"> </w:t>
-      </w:r>
-      <w:r>
-        <w:rPr>
-          <w:rFonts w:ascii="Georgia" w:hAnsi="Georgia"/>
-          <w:i/>
-          <w:iCs/>
-        </w:rPr>
-        <w:t xml:space="preserve">August 7, </w:t>
-      </w:r>
-      <w:proofErr w:type="gramStart"/>
-      <w:r>
-        <w:rPr>
-          <w:rFonts w:ascii="Georgia" w:hAnsi="Georgia"/>
-          <w:i/>
-          <w:iCs/>
-        </w:rPr>
-        <w:t>2024</w:t>
-      </w:r>
-      <w:proofErr w:type="gramEnd"/>
-      <w:r>
-        <w:rPr>
-          <w:rFonts w:ascii="Georgia" w:hAnsi="Georgia"/>
-        </w:rPr>
-        <w:t xml:space="preserve"> I filed four separate allegations: Abuse of Authority, Censorship Related to Scientific Research, Danger to Public Health, and Violation of Law, Rule or Regulation. The OSC website returned a notification indicating the FAA fell outside its jurisdiction. No active investigation resulted.</w:t>
-      </w:r>
-    </w:p>
-    <w:p>
-      <w:pPr>
-        <w:pStyle w:val="BodyText"/>
-        <w:spacing w:line="276" w:lineRule="auto"/>
-        <w:rPr>
-          <w:rFonts w:ascii="Georgia" w:hAnsi="Georgia"/>
-        </w:rPr>
-      </w:pPr>
-      <w:r>
-        <w:rPr>
-          <w:rFonts w:ascii="Georgia" w:hAnsi="Georgia"/>
-          <w:b/>
-          <w:bCs/>
-        </w:rPr>
-        <w:t>Michael Mills, AFDW/IG — Joint Base Andrews</w:t>
-      </w:r>
-      <w:r>
-        <w:rPr>
-          <w:rFonts w:ascii="Georgia" w:hAnsi="Georgia"/>
-        </w:rPr>
-        <w:t xml:space="preserve"> </w:t>
-      </w:r>
-      <w:r>
-        <w:rPr>
-          <w:rFonts w:ascii="Georgia" w:hAnsi="Georgia"/>
-          <w:i/>
-          <w:iCs/>
-        </w:rPr>
-        <w:t>July 2024</w:t>
-      </w:r>
-      <w:r>
-        <w:rPr>
-          <w:rFonts w:ascii="Georgia" w:hAnsi="Georgia"/>
-        </w:rPr>
-        <w:t xml:space="preserve"> Mills contacted me after my SAF/IG complaint. He read the case. He asked careful questions and I gave careful answers. He said: </w:t>
-      </w:r>
-      <w:r>
-        <w:rPr>
-          <w:rFonts w:ascii="Georgia" w:hAnsi="Georgia"/>
-          <w:i/>
-          <w:iCs/>
-        </w:rPr>
-        <w:t>“Right now, everything I’m seeing is either FAA or DoT… If we can’t identify an Air Force issue, then we won’t have a path forward.”</w:t>
-      </w:r>
-      <w:r>
-        <w:rPr>
-          <w:rFonts w:ascii="Georgia" w:hAnsi="Georgia"/>
-        </w:rPr>
-        <w:t xml:space="preserve"> He could not identify an Air Force issue. He closed the case without referral.</w:t>
-      </w:r>
-    </w:p>
-    <w:p>
-      <w:pPr>
-        <w:pStyle w:val="BodyText"/>
-        <w:spacing w:line="276" w:lineRule="auto"/>
-        <w:rPr>
-          <w:rFonts w:ascii="Georgia" w:hAnsi="Georgia"/>
-        </w:rPr>
-      </w:pPr>
-      <w:r>
-        <w:rPr>
-          <w:rFonts w:ascii="Georgia" w:hAnsi="Georgia"/>
-          <w:b/>
-          <w:bCs/>
-        </w:rPr>
-        <w:t>Kimberly Mlinaz, Director of NDR — SAF/GCA</w:t>
-      </w:r>
-      <w:r>
-        <w:rPr>
-          <w:rFonts w:ascii="Georgia" w:hAnsi="Georgia"/>
-        </w:rPr>
-        <w:t xml:space="preserve"> </w:t>
-      </w:r>
-      <w:r>
-        <w:rPr>
-          <w:rFonts w:ascii="Georgia" w:hAnsi="Georgia"/>
-          <w:i/>
-          <w:iCs/>
-        </w:rPr>
-        <w:t xml:space="preserve">July 18, </w:t>
-      </w:r>
-      <w:proofErr w:type="gramStart"/>
-      <w:r>
-        <w:rPr>
-          <w:rFonts w:ascii="Georgia" w:hAnsi="Georgia"/>
-          <w:i/>
-          <w:iCs/>
-        </w:rPr>
-        <w:t>2024</w:t>
-      </w:r>
-      <w:proofErr w:type="gramEnd"/>
-      <w:r>
-        <w:rPr>
-          <w:rFonts w:ascii="Georgia" w:hAnsi="Georgia"/>
-        </w:rPr>
-        <w:t xml:space="preserve"> I contacted SAF’s Negotiation and Dispute Resolution office separately. </w:t>
-      </w:r>
-      <w:proofErr w:type="spellStart"/>
-      <w:r>
-        <w:rPr>
-          <w:rFonts w:ascii="Georgia" w:hAnsi="Georgia"/>
-        </w:rPr>
-        <w:t>Mlinaz</w:t>
-      </w:r>
-      <w:proofErr w:type="spellEnd"/>
-      <w:r>
-        <w:rPr>
-          <w:rFonts w:ascii="Georgia" w:hAnsi="Georgia"/>
-        </w:rPr>
-        <w:t xml:space="preserve"> explained that NDR is an internal program — engagement requires a request from the IG. Mills would need to ask. Mills never asked. The ADR door I had been trying to open since March 2023 was closed procedurally by a person who never made a phone call.</w:t>
-      </w:r>
-    </w:p>
-    <w:p>
-      <w:pPr>
-        <w:pStyle w:val="BodyText"/>
-        <w:spacing w:line="276" w:lineRule="auto"/>
-        <w:rPr>
-          <w:rFonts w:ascii="Georgia" w:hAnsi="Georgia"/>
-        </w:rPr>
-      </w:pPr>
-      <w:r>
-        <w:rPr>
-          <w:rFonts w:ascii="Georgia" w:hAnsi="Georgia"/>
-          <w:b/>
-          <w:bCs/>
-        </w:rPr>
-        <w:t>Secretary of Transportation Pete Buttigieg</w:t>
-      </w:r>
-      <w:r>
-        <w:rPr>
-          <w:rFonts w:ascii="Georgia" w:hAnsi="Georgia"/>
-        </w:rPr>
-        <w:t xml:space="preserve"> </w:t>
-      </w:r>
-      <w:r>
-        <w:rPr>
-          <w:rFonts w:ascii="Georgia" w:hAnsi="Georgia"/>
-          <w:i/>
-          <w:iCs/>
-        </w:rPr>
-        <w:t xml:space="preserve">December 6, </w:t>
-      </w:r>
-      <w:proofErr w:type="gramStart"/>
-      <w:r>
-        <w:rPr>
-          <w:rFonts w:ascii="Georgia" w:hAnsi="Georgia"/>
-          <w:i/>
-          <w:iCs/>
-        </w:rPr>
-        <w:t>2024</w:t>
-      </w:r>
-      <w:proofErr w:type="gramEnd"/>
-      <w:r>
-        <w:rPr>
-          <w:rFonts w:ascii="Georgia" w:hAnsi="Georgia"/>
-        </w:rPr>
-        <w:t xml:space="preserve"> I sent a formal letter to Secretary Buttigieg at the Department of Transportation. I described the coercive directives, the alias account, the unauthorized medical access, the ongoing intimidation, and the failure of both the DHS and DOT OIGs to </w:t>
-      </w:r>
-      <w:proofErr w:type="gramStart"/>
-      <w:r>
-        <w:rPr>
-          <w:rFonts w:ascii="Georgia" w:hAnsi="Georgia"/>
-        </w:rPr>
-        <w:t>take action</w:t>
-      </w:r>
-      <w:proofErr w:type="gramEnd"/>
-      <w:r>
-        <w:rPr>
-          <w:rFonts w:ascii="Georgia" w:hAnsi="Georgia"/>
-        </w:rPr>
-        <w:t xml:space="preserve">. I wrote: </w:t>
-      </w:r>
-      <w:r>
-        <w:rPr>
-          <w:rFonts w:ascii="Georgia" w:hAnsi="Georgia"/>
-          <w:i/>
-          <w:iCs/>
-        </w:rPr>
         <w:t>“The lack of response from your office has left me feeling unprotected and has seemingly emboldened those responsible.”</w:t>
       </w:r>
     </w:p>
@@ -8269,7 +8364,6 @@
         <w:rPr>
           <w:rFonts w:ascii="Georgia" w:hAnsi="Georgia"/>
         </w:rPr>
-        <w:lastRenderedPageBreak/>
         <w:t>No response was ever received.</w:t>
       </w:r>
     </w:p>
@@ -8345,7 +8439,22 @@
         <w:rPr>
           <w:rFonts w:ascii="Georgia" w:hAnsi="Georgia"/>
         </w:rPr>
-        <w:t xml:space="preserve"> I contacted Senator Booker’s office. No substantive response was received.</w:t>
+        <w:t xml:space="preserve"> </w:t>
+      </w:r>
+    </w:p>
+    <w:p>
+      <w:pPr>
+        <w:pStyle w:val="FirstParagraph"/>
+        <w:spacing w:line="276" w:lineRule="auto"/>
+        <w:rPr>
+          <w:rFonts w:ascii="Georgia" w:hAnsi="Georgia"/>
+        </w:rPr>
+      </w:pPr>
+      <w:r>
+        <w:rPr>
+          <w:rFonts w:ascii="Georgia" w:hAnsi="Georgia"/>
+        </w:rPr>
+        <w:t>I contacted Senator Booker’s office. No substantive response was received.</w:t>
       </w:r>
     </w:p>
     <w:p>
@@ -8382,7 +8491,22 @@
         <w:rPr>
           <w:rFonts w:ascii="Georgia" w:hAnsi="Georgia"/>
         </w:rPr>
-        <w:t xml:space="preserve"> I contacted Senator Burchett’s office. No substantive response was received.</w:t>
+        <w:t xml:space="preserve"> </w:t>
+      </w:r>
+    </w:p>
+    <w:p>
+      <w:pPr>
+        <w:pStyle w:val="BodyText"/>
+        <w:spacing w:line="276" w:lineRule="auto"/>
+        <w:rPr>
+          <w:rFonts w:ascii="Georgia" w:hAnsi="Georgia"/>
+        </w:rPr>
+      </w:pPr>
+      <w:r>
+        <w:rPr>
+          <w:rFonts w:ascii="Georgia" w:hAnsi="Georgia"/>
+        </w:rPr>
+        <w:t>I contacted Senator Burchett’s office. No substantive response was received.</w:t>
       </w:r>
     </w:p>
     <w:p>
@@ -8419,7 +8543,22 @@
         <w:rPr>
           <w:rFonts w:ascii="Georgia" w:hAnsi="Georgia"/>
         </w:rPr>
-        <w:t xml:space="preserve"> I contacted the committee directly. No substantive response was received.</w:t>
+        <w:t xml:space="preserve"> </w:t>
+      </w:r>
+    </w:p>
+    <w:p>
+      <w:pPr>
+        <w:pStyle w:val="BodyText"/>
+        <w:spacing w:line="276" w:lineRule="auto"/>
+        <w:rPr>
+          <w:rFonts w:ascii="Georgia" w:hAnsi="Georgia"/>
+        </w:rPr>
+      </w:pPr>
+      <w:r>
+        <w:rPr>
+          <w:rFonts w:ascii="Georgia" w:hAnsi="Georgia"/>
+        </w:rPr>
+        <w:t>I contacted the committee directly. No substantive response was received.</w:t>
       </w:r>
     </w:p>
     <w:p>
@@ -8456,7 +8595,22 @@
         <w:rPr>
           <w:rFonts w:ascii="Georgia" w:hAnsi="Georgia"/>
         </w:rPr>
-        <w:t xml:space="preserve"> I contacted the committee directly. No substantive response was received.</w:t>
+        <w:t xml:space="preserve"> </w:t>
+      </w:r>
+    </w:p>
+    <w:p>
+      <w:pPr>
+        <w:pStyle w:val="BodyText"/>
+        <w:spacing w:line="276" w:lineRule="auto"/>
+        <w:rPr>
+          <w:rFonts w:ascii="Georgia" w:hAnsi="Georgia"/>
+        </w:rPr>
+      </w:pPr>
+      <w:r>
+        <w:rPr>
+          <w:rFonts w:ascii="Georgia" w:hAnsi="Georgia"/>
+        </w:rPr>
+        <w:t>I contacted the committee directly. No substantive response was received.</w:t>
       </w:r>
     </w:p>
     <w:p>
@@ -8532,7 +8686,14 @@
         <w:rPr>
           <w:rFonts w:ascii="Georgia" w:hAnsi="Georgia"/>
         </w:rPr>
-        <w:t>I sat across from him and tried to explain what had been done to me and I couldn’t get it out in any order that made sense. The problem wasn’t the time. I told him it felt like an ethical assassination attempt. I said it twice. I showed him my challenge coin. I told him I was afraid of going to jail for saying the wrong thing. I told him I couldn’t share details about the technology. I told him they had used my disability against me. I told him about the music, the medications, the bank, the GitHub repository. I told him there were people at my workplace who had died and that it was made to look like overdoses.</w:t>
+        <w:t xml:space="preserve">I sat across from him and tried to explain what had been done to me and I couldn’t get it out in any order that made sense. The problem wasn’t the time. I told him it felt like an ethical assassination attempt. I said it twice. I showed him my challenge coin. I told him I was afraid of going to jail for saying the wrong thing. I told him I couldn’t share details about the technology. I told him they had used my disability against me. I told him </w:t>
+      </w:r>
+      <w:r>
+        <w:rPr>
+          <w:rFonts w:ascii="Georgia" w:hAnsi="Georgia"/>
+        </w:rPr>
+        <w:lastRenderedPageBreak/>
+        <w:t>about the music, the medications, the bank, the GitHub repository. I told him there were people at my workplace who had died and that it was made to look like overdoses.</w:t>
       </w:r>
     </w:p>
     <w:p>
@@ -8564,14 +8725,12 @@
         </w:rPr>
         <w:t xml:space="preserve">Towards the end of the </w:t>
       </w:r>
-      <w:proofErr w:type="gramStart"/>
-      <w:r>
-        <w:rPr>
-          <w:rFonts w:ascii="Georgia" w:hAnsi="Georgia"/>
-        </w:rPr>
-        <w:t>conversation</w:t>
-      </w:r>
-      <w:proofErr w:type="gramEnd"/>
+      <w:r>
+        <w:rPr>
+          <w:rFonts w:ascii="Georgia" w:hAnsi="Georgia"/>
+        </w:rPr>
+        <w:t>conversation,</w:t>
+      </w:r>
       <w:r>
         <w:rPr>
           <w:rFonts w:ascii="Georgia" w:hAnsi="Georgia"/>
@@ -8606,7 +8765,6 @@
         <w:rPr>
           <w:rFonts w:ascii="Georgia" w:hAnsi="Georgia"/>
         </w:rPr>
-        <w:lastRenderedPageBreak/>
         <w:t>I sent the written description anyway. He followed up. He forwarded the DOT OIG’s declination letter. He offered to follow up with the Air Force OIG on June 25th.</w:t>
       </w:r>
     </w:p>
@@ -8653,23 +8811,95 @@
           <w:i/>
           <w:iCs/>
         </w:rPr>
-        <w:t xml:space="preserve">March 7, </w:t>
-      </w:r>
-      <w:proofErr w:type="gramStart"/>
+        <w:t>March 7, 2024</w:t>
+      </w:r>
+      <w:r>
+        <w:rPr>
+          <w:rFonts w:ascii="Georgia" w:hAnsi="Georgia"/>
+        </w:rPr>
+        <w:t xml:space="preserve"> </w:t>
+      </w:r>
+    </w:p>
+    <w:p>
+      <w:pPr>
+        <w:pStyle w:val="BodyText"/>
+        <w:spacing w:line="276" w:lineRule="auto"/>
+        <w:rPr>
+          <w:rFonts w:ascii="Georgia" w:hAnsi="Georgia"/>
+        </w:rPr>
+      </w:pPr>
+      <w:r>
+        <w:rPr>
+          <w:rFonts w:ascii="Georgia" w:hAnsi="Georgia"/>
+        </w:rPr>
+        <w:t>I sent a signed letter to HPSCI Members at the Capitol Visitor Center, submitted on my behalf through Representative Brian Fitzpatrick’s office. I identified myself as a former Leidos/FAA contractor whose UAP work had been shared with ODNI. I reported threats to my life and safety, requested whistleblower protections, and described being prevented from presenting my work at the 2023 ESRI conference. No response was ever documented.</w:t>
+      </w:r>
+    </w:p>
+    <w:p>
+      <w:pPr>
+        <w:pStyle w:val="BodyText"/>
+        <w:spacing w:line="276" w:lineRule="auto"/>
+        <w:rPr>
+          <w:rFonts w:ascii="Georgia" w:hAnsi="Georgia"/>
+        </w:rPr>
+      </w:pPr>
+      <w:r>
+        <w:rPr>
+          <w:rFonts w:ascii="Georgia" w:hAnsi="Georgia"/>
+          <w:b/>
+          <w:bCs/>
+        </w:rPr>
+        <w:t>Molly Peters / McKenzie Cliatt — Senator Bob Casey’s Office</w:t>
+      </w:r>
+      <w:r>
+        <w:rPr>
+          <w:rFonts w:ascii="Georgia" w:hAnsi="Georgia"/>
+        </w:rPr>
+        <w:t xml:space="preserve"> </w:t>
+      </w:r>
       <w:r>
         <w:rPr>
           <w:rFonts w:ascii="Georgia" w:hAnsi="Georgia"/>
           <w:i/>
           <w:iCs/>
         </w:rPr>
-        <w:t>2024</w:t>
-      </w:r>
-      <w:proofErr w:type="gramEnd"/>
-      <w:r>
-        <w:rPr>
-          <w:rFonts w:ascii="Georgia" w:hAnsi="Georgia"/>
-        </w:rPr>
-        <w:t xml:space="preserve"> I sent a signed letter to HPSCI Members at the Capitol Visitor Center, submitted on my behalf through Representative Brian Fitzpatrick’s office. I identified myself as a former Leidos/FAA contractor whose UAP work had been shared with ODNI. I reported threats to my life and safety, requested whistleblower protections, and described being prevented from presenting my work at the 2023 ESRI conference. No response was ever documented.</w:t>
+        <w:t>February – July 2024</w:t>
+      </w:r>
+      <w:r>
+        <w:rPr>
+          <w:rFonts w:ascii="Georgia" w:hAnsi="Georgia"/>
+        </w:rPr>
+        <w:t xml:space="preserve"> </w:t>
+      </w:r>
+    </w:p>
+    <w:p>
+      <w:pPr>
+        <w:pStyle w:val="BodyText"/>
+        <w:spacing w:line="276" w:lineRule="auto"/>
+        <w:rPr>
+          <w:rFonts w:ascii="Georgia" w:hAnsi="Georgia"/>
+        </w:rPr>
+      </w:pPr>
+      <w:r>
+        <w:rPr>
+          <w:rFonts w:ascii="Georgia" w:hAnsi="Georgia"/>
+        </w:rPr>
+        <w:t>Senator Casey’s office engaged more substantively than most. Peters assigned my case to a constituent advocate. Cliatt requested and received a signed Privacy Act Release Form. The office submitted my complaint to USAF contacts with a 30-business-day response window.</w:t>
+      </w:r>
+    </w:p>
+    <w:p>
+      <w:pPr>
+        <w:pStyle w:val="BodyText"/>
+        <w:spacing w:line="276" w:lineRule="auto"/>
+        <w:rPr>
+          <w:rFonts w:ascii="Georgia" w:hAnsi="Georgia"/>
+        </w:rPr>
+      </w:pPr>
+      <w:r>
+        <w:rPr>
+          <w:rFonts w:ascii="Georgia" w:hAnsi="Georgia"/>
+        </w:rPr>
+        <w:t>The Air Force responded thirty days later. That response is the subject of the next chapter.</w:t>
       </w:r>
     </w:p>
     <w:p>
@@ -8686,7 +8916,7 @@
           <w:b/>
           <w:bCs/>
         </w:rPr>
-        <w:t>Molly Peters / McKenzie Cliatt — Senator Bob Casey’s Office</w:t>
+        <w:t>Representative Nancy Mace’s Office</w:t>
       </w:r>
       <w:r>
         <w:rPr>
@@ -8700,28 +8930,44 @@
           <w:i/>
           <w:iCs/>
         </w:rPr>
-        <w:t>February – July 2024</w:t>
-      </w:r>
-      <w:r>
-        <w:rPr>
-          <w:rFonts w:ascii="Georgia" w:hAnsi="Georgia"/>
-        </w:rPr>
-        <w:t xml:space="preserve"> Senator Casey’s office engaged more substantively than most. Peters assigned my case to a constituent advocate. Cliatt requested and received a signed Privacy Act Release Form. The office submitted my complaint to USAF contacts with a 30-business-day response window.</w:t>
-      </w:r>
-    </w:p>
-    <w:p>
-      <w:pPr>
-        <w:pStyle w:val="BodyText"/>
-        <w:spacing w:line="276" w:lineRule="auto"/>
-        <w:rPr>
-          <w:rFonts w:ascii="Georgia" w:hAnsi="Georgia"/>
-        </w:rPr>
-      </w:pPr>
-      <w:r>
-        <w:rPr>
-          <w:rFonts w:ascii="Georgia" w:hAnsi="Georgia"/>
-        </w:rPr>
-        <w:t>The Air Force responded thirty days later. That response is the subject of the next chapter.</w:t>
+        <w:t>November</w:t>
+      </w:r>
+      <w:r>
+        <w:rPr>
+          <w:rFonts w:ascii="Georgia" w:hAnsi="Georgia"/>
+          <w:i/>
+          <w:iCs/>
+        </w:rPr>
+        <w:t xml:space="preserve"> 18</w:t>
+      </w:r>
+      <w:r>
+        <w:rPr>
+          <w:rFonts w:ascii="Georgia" w:hAnsi="Georgia"/>
+          <w:i/>
+          <w:iCs/>
+        </w:rPr>
+        <w:t>, 2024</w:t>
+      </w:r>
+      <w:r>
+        <w:rPr>
+          <w:rFonts w:ascii="Georgia" w:hAnsi="Georgia"/>
+        </w:rPr>
+        <w:t xml:space="preserve"> </w:t>
+      </w:r>
+    </w:p>
+    <w:p>
+      <w:pPr>
+        <w:pStyle w:val="BodyText"/>
+        <w:spacing w:line="276" w:lineRule="auto"/>
+        <w:rPr>
+          <w:rFonts w:ascii="Georgia" w:hAnsi="Georgia"/>
+        </w:rPr>
+      </w:pPr>
+      <w:r>
+        <w:rPr>
+          <w:rFonts w:ascii="Georgia" w:hAnsi="Georgia"/>
+        </w:rPr>
+        <w:t>I contacted Representative Nancy Mace's office and spoke with a staffer by phone. I submitted a signed privacy release form listing the Department of Defense and Air Force as the agencies involved. I also submitted the HPSCI letter through her office. No substantive response was received.</w:t>
       </w:r>
     </w:p>
     <w:p>
@@ -8738,7 +8984,8 @@
           <w:b/>
           <w:bCs/>
         </w:rPr>
-        <w:t>Representative Nancy Mace’s Office</w:t>
+        <w:lastRenderedPageBreak/>
+        <w:t>House Oversight Committee Democrats — Signal</w:t>
       </w:r>
       <w:r>
         <w:rPr>
@@ -8752,7 +8999,28 @@
           <w:i/>
           <w:iCs/>
         </w:rPr>
-        <w:t>November</w:t>
+        <w:t>February 5, 2026</w:t>
+      </w:r>
+      <w:r>
+        <w:rPr>
+          <w:rFonts w:ascii="Georgia" w:hAnsi="Georgia"/>
+        </w:rPr>
+        <w:t xml:space="preserve"> </w:t>
+      </w:r>
+    </w:p>
+    <w:p>
+      <w:pPr>
+        <w:pStyle w:val="BodyText"/>
+        <w:spacing w:line="276" w:lineRule="auto"/>
+        <w:rPr>
+          <w:rFonts w:ascii="Georgia" w:hAnsi="Georgia"/>
+        </w:rPr>
+      </w:pPr>
+      <w:r>
+        <w:rPr>
+          <w:rFonts w:ascii="Georgia" w:hAnsi="Georgia"/>
+        </w:rPr>
+        <w:t xml:space="preserve">I sent the HPSCI letter and a message to the Oversight Democrats Signal line. I wrote: </w:t>
       </w:r>
       <w:r>
         <w:rPr>
@@ -8760,29 +9028,89 @@
           <w:i/>
           <w:iCs/>
         </w:rPr>
-        <w:t xml:space="preserve"> 18</w:t>
-      </w:r>
-      <w:proofErr w:type="gramStart"/>
+        <w:t>“I believe this was never delivered…sharing to ensure my story does not go unanswered. I worked with Senator Casey’s office and Brian Fitzpatrick.”</w:t>
+      </w:r>
+    </w:p>
+    <w:p>
+      <w:pPr>
+        <w:pStyle w:val="BodyText"/>
+        <w:spacing w:line="276" w:lineRule="auto"/>
+        <w:rPr>
+          <w:rFonts w:ascii="Georgia" w:hAnsi="Georgia"/>
+        </w:rPr>
+      </w:pPr>
+      <w:r>
+        <w:rPr>
+          <w:rFonts w:ascii="Georgia" w:hAnsi="Georgia"/>
+        </w:rPr>
+        <w:t>That second message received a thumbs up reaction.</w:t>
+      </w:r>
+    </w:p>
+    <w:p>
+      <w:pPr>
+        <w:pStyle w:val="BodyText"/>
+        <w:spacing w:line="276" w:lineRule="auto"/>
+        <w:rPr>
+          <w:rFonts w:ascii="Georgia" w:hAnsi="Georgia"/>
+        </w:rPr>
+      </w:pPr>
+      <w:r>
+        <w:rPr>
+          <w:rFonts w:ascii="Georgia" w:hAnsi="Georgia"/>
+          <w:b/>
+          <w:bCs/>
+        </w:rPr>
+        <w:t>Representative Summer Lee’s Office — Task Force on the Declassification of Federal Secrets</w:t>
+      </w:r>
+      <w:r>
+        <w:rPr>
+          <w:rFonts w:ascii="Georgia" w:hAnsi="Georgia"/>
+        </w:rPr>
+        <w:t xml:space="preserve"> </w:t>
+      </w:r>
       <w:r>
         <w:rPr>
           <w:rFonts w:ascii="Georgia" w:hAnsi="Georgia"/>
           <w:i/>
           <w:iCs/>
         </w:rPr>
-        <w:t xml:space="preserve"> 2024</w:t>
-      </w:r>
-      <w:proofErr w:type="gramEnd"/>
+        <w:t>March 21, 2026</w:t>
+      </w:r>
       <w:r>
         <w:rPr>
           <w:rFonts w:ascii="Georgia" w:hAnsi="Georgia"/>
         </w:rPr>
         <w:t xml:space="preserve"> </w:t>
       </w:r>
-      <w:r>
-        <w:rPr>
-          <w:rFonts w:ascii="Georgia" w:hAnsi="Georgia"/>
-        </w:rPr>
-        <w:t>I contacted Representative Nancy Mace's office and spoke with a staffer by phone. I submitted a signed privacy release form listing the Department of Defense and Air Force as the agencies involved. I also submitted the HPSCI letter through her office. No substantive response was received.</w:t>
+    </w:p>
+    <w:p>
+      <w:pPr>
+        <w:pStyle w:val="BodyText"/>
+        <w:spacing w:line="276" w:lineRule="auto"/>
+        <w:rPr>
+          <w:rFonts w:ascii="Georgia" w:hAnsi="Georgia"/>
+        </w:rPr>
+      </w:pPr>
+      <w:r>
+        <w:rPr>
+          <w:rFonts w:ascii="Georgia" w:hAnsi="Georgia"/>
+        </w:rPr>
+        <w:t>I emailed Representative Lee’s press office directly, identifying her as a member of the Task Force on the Declassification of Federal Secrets. I sent the same congressional brief and the same evidence. I wrote that I respectfully asked her to review the attached brief and consider referring the matter to the Task Force for further examination.</w:t>
+      </w:r>
+    </w:p>
+    <w:p>
+      <w:pPr>
+        <w:pStyle w:val="BodyText"/>
+        <w:spacing w:line="276" w:lineRule="auto"/>
+        <w:rPr>
+          <w:rFonts w:ascii="Georgia" w:hAnsi="Georgia"/>
+        </w:rPr>
+      </w:pPr>
+      <w:r>
+        <w:rPr>
+          <w:rFonts w:ascii="Georgia" w:hAnsi="Georgia"/>
+        </w:rPr>
+        <w:t>No response was documented.</w:t>
       </w:r>
     </w:p>
     <w:p>
@@ -8799,7 +9127,7 @@
           <w:b/>
           <w:bCs/>
         </w:rPr>
-        <w:t>House Oversight Committee Democrats — Signal</w:t>
+        <w:t>Brennen Gelinas — Rep. Anna Paulina Luna’s Office / UAP Task Force</w:t>
       </w:r>
       <w:r>
         <w:rPr>
@@ -8813,63 +9141,59 @@
           <w:i/>
           <w:iCs/>
         </w:rPr>
-        <w:t xml:space="preserve">February 5, </w:t>
-      </w:r>
-      <w:proofErr w:type="gramStart"/>
+        <w:t>March 23, 2026</w:t>
+      </w:r>
+      <w:r>
+        <w:rPr>
+          <w:rFonts w:ascii="Georgia" w:hAnsi="Georgia"/>
+        </w:rPr>
+        <w:t xml:space="preserve"> </w:t>
+      </w:r>
+    </w:p>
+    <w:p>
+      <w:pPr>
+        <w:pStyle w:val="BodyText"/>
+        <w:spacing w:line="276" w:lineRule="auto"/>
+        <w:rPr>
+          <w:rFonts w:ascii="Georgia" w:hAnsi="Georgia"/>
+        </w:rPr>
+      </w:pPr>
+      <w:r>
+        <w:rPr>
+          <w:rFonts w:ascii="Georgia" w:hAnsi="Georgia"/>
+        </w:rPr>
+        <w:t>After calling Rep. Luna’s DC office I emailed Brennen Gelinas, staff member on the Task Force on the Declassification of Federal Secrets. I attached the congressional brief, the Benson email chain, and the Bartlett denial letter. I offered to brief the Task Force in any format at any time. Rep. Luna chairs the Task Force, which held hearings on UAP transparency and whistleblower protection in September 2025. No substantive response was documented at time of writing.</w:t>
+      </w:r>
+    </w:p>
+    <w:p>
+      <w:pPr>
+        <w:pStyle w:val="BodyText"/>
+        <w:spacing w:line="276" w:lineRule="auto"/>
+        <w:rPr>
+          <w:rFonts w:ascii="Georgia" w:hAnsi="Georgia"/>
+        </w:rPr>
+      </w:pPr>
+      <w:r>
+        <w:rPr>
+          <w:rFonts w:ascii="Georgia" w:hAnsi="Georgia"/>
+          <w:b/>
+          <w:bCs/>
+        </w:rPr>
+        <w:t>Rep. Jasmine Crockett’s Office — Ranking Member, Task Force on the Declassification of Federal Secrets</w:t>
+      </w:r>
+      <w:r>
+        <w:rPr>
+          <w:rFonts w:ascii="Georgia" w:hAnsi="Georgia"/>
+        </w:rPr>
+        <w:t xml:space="preserve"> </w:t>
+      </w:r>
       <w:r>
         <w:rPr>
           <w:rFonts w:ascii="Georgia" w:hAnsi="Georgia"/>
           <w:i/>
           <w:iCs/>
         </w:rPr>
-        <w:t>2026</w:t>
-      </w:r>
-      <w:proofErr w:type="gramEnd"/>
-      <w:r>
-        <w:rPr>
-          <w:rFonts w:ascii="Georgia" w:hAnsi="Georgia"/>
-        </w:rPr>
-        <w:t xml:space="preserve"> I sent the HPSCI letter and a message to the Oversight Democrats Signal line. I wrote: </w:t>
-      </w:r>
-      <w:r>
-        <w:rPr>
-          <w:rFonts w:ascii="Georgia" w:hAnsi="Georgia"/>
-          <w:i/>
-          <w:iCs/>
-        </w:rPr>
-        <w:t>“I believe this was never delivered…sharing to ensure my story does not go unanswered. I worked with Senator Casey’s office and Brian Fitzpatrick.”</w:t>
-      </w:r>
-    </w:p>
-    <w:p>
-      <w:pPr>
-        <w:pStyle w:val="BodyText"/>
-        <w:spacing w:line="276" w:lineRule="auto"/>
-        <w:rPr>
-          <w:rFonts w:ascii="Georgia" w:hAnsi="Georgia"/>
-        </w:rPr>
-      </w:pPr>
-      <w:r>
-        <w:rPr>
-          <w:rFonts w:ascii="Georgia" w:hAnsi="Georgia"/>
-        </w:rPr>
-        <w:t>That second message received a thumbs up reaction.</w:t>
-      </w:r>
-    </w:p>
-    <w:p>
-      <w:pPr>
-        <w:pStyle w:val="BodyText"/>
-        <w:spacing w:line="276" w:lineRule="auto"/>
-        <w:rPr>
-          <w:rFonts w:ascii="Georgia" w:hAnsi="Georgia"/>
-        </w:rPr>
-      </w:pPr>
-      <w:r>
-        <w:rPr>
-          <w:rFonts w:ascii="Georgia" w:hAnsi="Georgia"/>
-          <w:b/>
-          <w:bCs/>
-        </w:rPr>
-        <w:t>Representative Summer Lee’s Office — Task Force on the Declassification of Federal Secrets</w:t>
+        <w:t>March 23, 2026</w:t>
       </w:r>
       <w:r>
         <w:rPr>
@@ -8877,139 +9201,20 @@
         </w:rPr>
         <w:t xml:space="preserve"> </w:t>
       </w:r>
-      <w:r>
-        <w:rPr>
-          <w:rFonts w:ascii="Georgia" w:hAnsi="Georgia"/>
-          <w:i/>
-          <w:iCs/>
-        </w:rPr>
-        <w:t xml:space="preserve">March 21, </w:t>
-      </w:r>
-      <w:proofErr w:type="gramStart"/>
-      <w:r>
-        <w:rPr>
-          <w:rFonts w:ascii="Georgia" w:hAnsi="Georgia"/>
-          <w:i/>
-          <w:iCs/>
-        </w:rPr>
-        <w:t>2026</w:t>
-      </w:r>
-      <w:proofErr w:type="gramEnd"/>
-      <w:r>
-        <w:rPr>
-          <w:rFonts w:ascii="Georgia" w:hAnsi="Georgia"/>
-        </w:rPr>
-        <w:t xml:space="preserve"> I emailed Representative Lee’s press office directly, identifying her as a member of the Task Force on the Declassification of Federal Secrets. I sent the same congressional brief and the same evidence. I wrote that I respectfully asked her to review the attached brief and consider referring the matter to the Task Force for further examination.</w:t>
-      </w:r>
-    </w:p>
-    <w:p>
-      <w:pPr>
-        <w:pStyle w:val="BodyText"/>
-        <w:spacing w:line="276" w:lineRule="auto"/>
-        <w:rPr>
-          <w:rFonts w:ascii="Georgia" w:hAnsi="Georgia"/>
-        </w:rPr>
-      </w:pPr>
-      <w:r>
-        <w:rPr>
-          <w:rFonts w:ascii="Georgia" w:hAnsi="Georgia"/>
-        </w:rPr>
-        <w:t>No response was documented.</w:t>
-      </w:r>
-    </w:p>
-    <w:p>
-      <w:pPr>
-        <w:pStyle w:val="BodyText"/>
-        <w:spacing w:line="276" w:lineRule="auto"/>
-        <w:rPr>
-          <w:rFonts w:ascii="Georgia" w:hAnsi="Georgia"/>
-        </w:rPr>
-      </w:pPr>
-      <w:r>
-        <w:rPr>
-          <w:rFonts w:ascii="Georgia" w:hAnsi="Georgia"/>
-          <w:b/>
-          <w:bCs/>
-        </w:rPr>
-        <w:lastRenderedPageBreak/>
-        <w:t>Brennen Gelinas — Rep. Anna Paulina Luna’s Office / UAP Task Force</w:t>
-      </w:r>
-      <w:r>
-        <w:rPr>
-          <w:rFonts w:ascii="Georgia" w:hAnsi="Georgia"/>
-        </w:rPr>
-        <w:t xml:space="preserve"> </w:t>
-      </w:r>
-      <w:r>
-        <w:rPr>
-          <w:rFonts w:ascii="Georgia" w:hAnsi="Georgia"/>
-          <w:i/>
-          <w:iCs/>
-        </w:rPr>
-        <w:t xml:space="preserve">March 23, </w:t>
-      </w:r>
-      <w:proofErr w:type="gramStart"/>
-      <w:r>
-        <w:rPr>
-          <w:rFonts w:ascii="Georgia" w:hAnsi="Georgia"/>
-          <w:i/>
-          <w:iCs/>
-        </w:rPr>
-        <w:t>2026</w:t>
-      </w:r>
-      <w:proofErr w:type="gramEnd"/>
-      <w:r>
-        <w:rPr>
-          <w:rFonts w:ascii="Georgia" w:hAnsi="Georgia"/>
-        </w:rPr>
-        <w:t xml:space="preserve"> After calling Rep. Luna’s DC office I emailed Brennen Gelinas, staff member on the Task Force on the Declassification of Federal Secrets. I attached the congressional brief, the Benson email chain, and the Bartlett denial letter. I offered to brief the Task Force in any format at any time. Rep. Luna chairs the Task Force, which held hearings on UAP transparency and whistleblower protection in September 2025. No substantive response was documented at time of writing.</w:t>
-      </w:r>
-    </w:p>
-    <w:p>
-      <w:pPr>
-        <w:pStyle w:val="BodyText"/>
-        <w:spacing w:line="276" w:lineRule="auto"/>
-        <w:rPr>
-          <w:rFonts w:ascii="Georgia" w:hAnsi="Georgia"/>
-        </w:rPr>
-      </w:pPr>
-      <w:r>
-        <w:rPr>
-          <w:rFonts w:ascii="Georgia" w:hAnsi="Georgia"/>
-          <w:b/>
-          <w:bCs/>
-        </w:rPr>
-        <w:t>Rep. Jasmine Crockett’s Office — Ranking Member, Task Force on the Declassification of Federal Secrets</w:t>
-      </w:r>
-      <w:r>
-        <w:rPr>
-          <w:rFonts w:ascii="Georgia" w:hAnsi="Georgia"/>
-        </w:rPr>
-        <w:t xml:space="preserve"> </w:t>
-      </w:r>
-      <w:r>
-        <w:rPr>
-          <w:rFonts w:ascii="Georgia" w:hAnsi="Georgia"/>
-          <w:i/>
-          <w:iCs/>
-        </w:rPr>
-        <w:t xml:space="preserve">March 23, </w:t>
-      </w:r>
-      <w:proofErr w:type="gramStart"/>
-      <w:r>
-        <w:rPr>
-          <w:rFonts w:ascii="Georgia" w:hAnsi="Georgia"/>
-          <w:i/>
-          <w:iCs/>
-        </w:rPr>
-        <w:t>2026</w:t>
-      </w:r>
-      <w:proofErr w:type="gramEnd"/>
-      <w:r>
-        <w:rPr>
-          <w:rFonts w:ascii="Georgia" w:hAnsi="Georgia"/>
-        </w:rPr>
-        <w:t xml:space="preserve"> On the same day I contacted Brennen Gelinas in Rep. Luna’s office, I emailed Rep. Crockett’s press office directly. She serves as Ranking Member of the same Task Force — the Democratic counterpart to Luna’s Republican chair. I sent the same congressional brief and the same evidence. I wrote: </w:t>
+    </w:p>
+    <w:p>
+      <w:pPr>
+        <w:pStyle w:val="BodyText"/>
+        <w:spacing w:line="276" w:lineRule="auto"/>
+        <w:rPr>
+          <w:rFonts w:ascii="Georgia" w:hAnsi="Georgia"/>
+        </w:rPr>
+      </w:pPr>
+      <w:r>
+        <w:rPr>
+          <w:rFonts w:ascii="Georgia" w:hAnsi="Georgia"/>
+        </w:rPr>
+        <w:t xml:space="preserve">On the same day I contacted Brennen Gelinas in Rep. Luna’s office, I emailed Rep. Crockett’s press office directly. She serves as Ranking Member of the same Task Force — the Democratic counterpart to Luna’s Republican chair. I sent the same congressional brief and the same evidence. I wrote: </w:t>
       </w:r>
       <w:r>
         <w:rPr>
@@ -9085,6 +9290,7 @@
           <w:bCs/>
           <w:color w:val="000000" w:themeColor="text1"/>
         </w:rPr>
+        <w:lastRenderedPageBreak/>
         <w:t>Part Three — Legal Contacts</w:t>
       </w:r>
     </w:p>
@@ -9171,31 +9377,104 @@
           <w:i/>
           <w:iCs/>
         </w:rPr>
-        <w:t xml:space="preserve">August 6, </w:t>
-      </w:r>
-      <w:proofErr w:type="gramStart"/>
+        <w:t>August 6, 2023</w:t>
+      </w:r>
+      <w:r>
+        <w:rPr>
+          <w:rFonts w:ascii="Georgia" w:hAnsi="Georgia"/>
+        </w:rPr>
+        <w:t xml:space="preserve"> </w:t>
+      </w:r>
+    </w:p>
+    <w:p>
+      <w:pPr>
+        <w:pStyle w:val="BodyText"/>
+        <w:spacing w:line="276" w:lineRule="auto"/>
+        <w:rPr>
+          <w:rFonts w:ascii="Georgia" w:hAnsi="Georgia"/>
+        </w:rPr>
+      </w:pPr>
+      <w:r>
+        <w:rPr>
+          <w:rFonts w:ascii="Georgia" w:hAnsi="Georgia"/>
+        </w:rPr>
+        <w:t>Contact form submitted. No representation offered.</w:t>
+      </w:r>
+    </w:p>
+    <w:p>
+      <w:pPr>
+        <w:pStyle w:val="BodyText"/>
+        <w:spacing w:line="276" w:lineRule="auto"/>
+        <w:rPr>
+          <w:rFonts w:ascii="Georgia" w:hAnsi="Georgia"/>
+        </w:rPr>
+      </w:pPr>
+      <w:r>
+        <w:rPr>
+          <w:rFonts w:ascii="Georgia" w:hAnsi="Georgia"/>
+          <w:b/>
+          <w:bCs/>
+        </w:rPr>
+        <w:t>Phillips &amp; Cohen LLP — Washington, D.C.</w:t>
+      </w:r>
+      <w:r>
+        <w:rPr>
+          <w:rFonts w:ascii="Georgia" w:hAnsi="Georgia"/>
+        </w:rPr>
+        <w:t xml:space="preserve"> </w:t>
+      </w:r>
       <w:r>
         <w:rPr>
           <w:rFonts w:ascii="Georgia" w:hAnsi="Georgia"/>
           <w:i/>
           <w:iCs/>
         </w:rPr>
-        <w:t>2023</w:t>
-      </w:r>
-      <w:proofErr w:type="gramEnd"/>
-      <w:r>
-        <w:rPr>
-          <w:rFonts w:ascii="Georgia" w:hAnsi="Georgia"/>
-        </w:rPr>
-        <w:t xml:space="preserve"> Contact form submitted. No representation offered.</w:t>
-      </w:r>
-    </w:p>
-    <w:p>
-      <w:pPr>
-        <w:pStyle w:val="BodyText"/>
-        <w:spacing w:line="276" w:lineRule="auto"/>
-        <w:rPr>
-          <w:rFonts w:ascii="Georgia" w:hAnsi="Georgia"/>
+        <w:t>March 7, 2024</w:t>
+      </w:r>
+      <w:r>
+        <w:rPr>
+          <w:rFonts w:ascii="Georgia" w:hAnsi="Georgia"/>
+        </w:rPr>
+        <w:t xml:space="preserve"> </w:t>
+      </w:r>
+    </w:p>
+    <w:p>
+      <w:pPr>
+        <w:pStyle w:val="BodyText"/>
+        <w:spacing w:line="276" w:lineRule="auto"/>
+        <w:rPr>
+          <w:rFonts w:ascii="Georgia" w:hAnsi="Georgia"/>
+        </w:rPr>
+      </w:pPr>
+      <w:r>
+        <w:rPr>
+          <w:rFonts w:ascii="Georgia" w:hAnsi="Georgia"/>
+        </w:rPr>
+        <w:t xml:space="preserve">Matthew Smith reviewed and declined. He wrote: </w:t>
+      </w:r>
+      <w:r>
+        <w:rPr>
+          <w:rFonts w:ascii="Georgia" w:hAnsi="Georgia"/>
+          <w:i/>
+          <w:iCs/>
+        </w:rPr>
+        <w:t>“Our decision is not intended to suggest that a successful action cannot be maintained.”</w:t>
+      </w:r>
+      <w:r>
+        <w:rPr>
+          <w:rFonts w:ascii="Georgia" w:hAnsi="Georgia"/>
+        </w:rPr>
+        <w:t xml:space="preserve"> He noted the urgency of statute of limitations.</w:t>
+      </w:r>
+    </w:p>
+    <w:p>
+      <w:pPr>
+        <w:pStyle w:val="BodyText"/>
+        <w:spacing w:line="276" w:lineRule="auto"/>
+        <w:rPr>
+          <w:rFonts w:ascii="Georgia" w:hAnsi="Georgia"/>
+          <w:i/>
+          <w:iCs/>
         </w:rPr>
       </w:pPr>
       <w:r>
@@ -9204,8 +9483,7 @@
           <w:b/>
           <w:bCs/>
         </w:rPr>
-        <w:lastRenderedPageBreak/>
-        <w:t>Phillips &amp; Cohen LLP — Washington, D.C.</w:t>
+        <w:t>Katz Banks Kumin — Washington, D.C.</w:t>
       </w:r>
       <w:r>
         <w:rPr>
@@ -9219,23 +9497,65 @@
           <w:i/>
           <w:iCs/>
         </w:rPr>
-        <w:t xml:space="preserve">March 7, </w:t>
-      </w:r>
-      <w:proofErr w:type="gramStart"/>
+        <w:t>July 12, 2024</w:t>
+      </w:r>
+    </w:p>
+    <w:p>
+      <w:pPr>
+        <w:pStyle w:val="BodyText"/>
+        <w:spacing w:line="276" w:lineRule="auto"/>
+        <w:rPr>
+          <w:rFonts w:ascii="Georgia" w:hAnsi="Georgia"/>
+        </w:rPr>
+      </w:pPr>
       <w:r>
         <w:rPr>
           <w:rFonts w:ascii="Georgia" w:hAnsi="Georgia"/>
           <w:i/>
           <w:iCs/>
         </w:rPr>
-        <w:t>2024</w:t>
-      </w:r>
-      <w:proofErr w:type="gramEnd"/>
-      <w:r>
-        <w:rPr>
-          <w:rFonts w:ascii="Georgia" w:hAnsi="Georgia"/>
-        </w:rPr>
-        <w:t xml:space="preserve"> Matthew Smith reviewed and declined. He wrote: </w:t>
+        <w:t>First Contact</w:t>
+      </w:r>
+      <w:r>
+        <w:rPr>
+          <w:rFonts w:ascii="Georgia" w:hAnsi="Georgia"/>
+        </w:rPr>
+        <w:t xml:space="preserve"> </w:t>
+      </w:r>
+      <w:r>
+        <w:rPr>
+          <w:rFonts w:ascii="Georgia" w:hAnsi="Georgia"/>
+        </w:rPr>
+        <w:t xml:space="preserve">- </w:t>
+      </w:r>
+      <w:r>
+        <w:rPr>
+          <w:rFonts w:ascii="Georgia" w:hAnsi="Georgia"/>
+        </w:rPr>
+        <w:t>Destiny Barber declined on behalf of the firm. Katz Banks Kumin is one of the most prominent whistleblower protection law firms in Washington, D.C. — a firm that specializes in exactly the kind of case I was bringing. They declined.</w:t>
+      </w:r>
+    </w:p>
+    <w:p>
+      <w:pPr>
+        <w:pStyle w:val="BodyText"/>
+        <w:spacing w:line="276" w:lineRule="auto"/>
+        <w:rPr>
+          <w:rFonts w:ascii="Georgia" w:hAnsi="Georgia"/>
+        </w:rPr>
+      </w:pPr>
+      <w:r>
+        <w:rPr>
+          <w:rFonts w:ascii="Georgia" w:hAnsi="Georgia"/>
+          <w:b/>
+          <w:bCs/>
+        </w:rPr>
+        <w:t>Eric Siegel Law, PLLC — Washington, D.C.</w:t>
+      </w:r>
+      <w:r>
+        <w:rPr>
+          <w:rFonts w:ascii="Georgia" w:hAnsi="Georgia"/>
+        </w:rPr>
+        <w:t xml:space="preserve"> </w:t>
       </w:r>
       <w:r>
         <w:rPr>
@@ -9243,13 +9563,36 @@
           <w:i/>
           <w:iCs/>
         </w:rPr>
-        <w:t>“Our decision is not intended to suggest that a successful action cannot be maintained.”</w:t>
-      </w:r>
-      <w:r>
-        <w:rPr>
-          <w:rFonts w:ascii="Georgia" w:hAnsi="Georgia"/>
-        </w:rPr>
-        <w:t xml:space="preserve"> He noted the urgency of statute of limitations.</w:t>
+        <w:t>July 25, 2024</w:t>
+      </w:r>
+      <w:r>
+        <w:rPr>
+          <w:rFonts w:ascii="Georgia" w:hAnsi="Georgia"/>
+        </w:rPr>
+        <w:t xml:space="preserve"> </w:t>
+      </w:r>
+    </w:p>
+    <w:p>
+      <w:pPr>
+        <w:pStyle w:val="BodyText"/>
+        <w:spacing w:line="276" w:lineRule="auto"/>
+        <w:rPr>
+          <w:rFonts w:ascii="Georgia" w:hAnsi="Georgia"/>
+        </w:rPr>
+      </w:pPr>
+      <w:proofErr w:type="spellStart"/>
+      <w:r>
+        <w:rPr>
+          <w:rFonts w:ascii="Georgia" w:hAnsi="Georgia"/>
+        </w:rPr>
+        <w:t>LeShante</w:t>
+      </w:r>
+      <w:proofErr w:type="spellEnd"/>
+      <w:r>
+        <w:rPr>
+          <w:rFonts w:ascii="Georgia" w:hAnsi="Georgia"/>
+        </w:rPr>
+        <w:t xml:space="preserve"> Henry contacted me via referral from the National Whistleblower Legal Defense and Education Fund. I provided a fact timeline and key documents. The firm reviewed and did not offer representation.</w:t>
       </w:r>
     </w:p>
     <w:p>
@@ -9266,7 +9609,7 @@
           <w:b/>
           <w:bCs/>
         </w:rPr>
-        <w:t>Katz Banks Kumin — Washington, D.C.</w:t>
+        <w:t>Skeen Law Offices — Charlottesville, VA</w:t>
       </w:r>
       <w:r>
         <w:rPr>
@@ -9280,13 +9623,36 @@
           <w:i/>
           <w:iCs/>
         </w:rPr>
-        <w:t>July 12, 2024 — First Contact</w:t>
-      </w:r>
-      <w:r>
-        <w:rPr>
-          <w:rFonts w:ascii="Georgia" w:hAnsi="Georgia"/>
-        </w:rPr>
-        <w:t xml:space="preserve"> Destiny Barber declined on behalf of the firm. Katz Banks Kumin is one of the most prominent whistleblower protection law firms in Washington, D.C. — a firm that specializes in exactly the kind of case I was bringing. They declined.</w:t>
+        <w:t>November 11–14, 2024</w:t>
+      </w:r>
+      <w:r>
+        <w:rPr>
+          <w:rFonts w:ascii="Georgia" w:hAnsi="Georgia"/>
+        </w:rPr>
+        <w:t xml:space="preserve"> </w:t>
+      </w:r>
+    </w:p>
+    <w:p>
+      <w:pPr>
+        <w:pStyle w:val="BodyText"/>
+        <w:spacing w:line="276" w:lineRule="auto"/>
+        <w:rPr>
+          <w:rFonts w:ascii="Georgia" w:hAnsi="Georgia"/>
+        </w:rPr>
+      </w:pPr>
+      <w:r>
+        <w:rPr>
+          <w:rFonts w:ascii="Georgia" w:hAnsi="Georgia"/>
+        </w:rPr>
+        <w:t xml:space="preserve">Michael Turiello reached out via Morgan and Morgan referral. We spoke by phone. I provided my case narrative and supporting documents. He wrote: </w:t>
+      </w:r>
+      <w:r>
+        <w:rPr>
+          <w:rFonts w:ascii="Georgia" w:hAnsi="Georgia"/>
+          <w:i/>
+          <w:iCs/>
+        </w:rPr>
+        <w:t>“Despite my deepest sympathies for what you’ve experienced, we are unable to take your case.”</w:t>
       </w:r>
     </w:p>
     <w:p>
@@ -9303,7 +9669,7 @@
           <w:b/>
           <w:bCs/>
         </w:rPr>
-        <w:t>Eric Siegel Law, PLLC — Washington, D.C.</w:t>
+        <w:t>Lundy Law — Philadelphia, PA</w:t>
       </w:r>
       <w:r>
         <w:rPr>
@@ -9317,45 +9683,47 @@
           <w:i/>
           <w:iCs/>
         </w:rPr>
-        <w:t xml:space="preserve">July 25, </w:t>
-      </w:r>
-      <w:proofErr w:type="gramStart"/>
+        <w:t>January 30, 2025</w:t>
+      </w:r>
+      <w:r>
+        <w:rPr>
+          <w:rFonts w:ascii="Georgia" w:hAnsi="Georgia"/>
+        </w:rPr>
+        <w:t xml:space="preserve"> </w:t>
+      </w:r>
+    </w:p>
+    <w:p>
+      <w:pPr>
+        <w:pStyle w:val="BodyText"/>
+        <w:spacing w:line="276" w:lineRule="auto"/>
+        <w:rPr>
+          <w:rFonts w:ascii="Georgia" w:hAnsi="Georgia"/>
+        </w:rPr>
+      </w:pPr>
+      <w:r>
+        <w:rPr>
+          <w:rFonts w:ascii="Georgia" w:hAnsi="Georgia"/>
+        </w:rPr>
+        <w:lastRenderedPageBreak/>
+        <w:t xml:space="preserve">L. Leonard Lundy declined. The letter noted declining to represent </w:t>
+      </w:r>
       <w:r>
         <w:rPr>
           <w:rFonts w:ascii="Georgia" w:hAnsi="Georgia"/>
           <w:i/>
           <w:iCs/>
         </w:rPr>
-        <w:t>2024</w:t>
-      </w:r>
-      <w:proofErr w:type="gramEnd"/>
-      <w:r>
-        <w:rPr>
-          <w:rFonts w:ascii="Georgia" w:hAnsi="Georgia"/>
-        </w:rPr>
-        <w:t xml:space="preserve"> </w:t>
-      </w:r>
-      <w:proofErr w:type="spellStart"/>
-      <w:r>
-        <w:rPr>
-          <w:rFonts w:ascii="Georgia" w:hAnsi="Georgia"/>
-        </w:rPr>
-        <w:t>LeShante</w:t>
-      </w:r>
-      <w:proofErr w:type="spellEnd"/>
-      <w:r>
-        <w:rPr>
-          <w:rFonts w:ascii="Georgia" w:hAnsi="Georgia"/>
-        </w:rPr>
-        <w:t xml:space="preserve"> Henry contacted me via referral from the National Whistleblower Legal Defense and Education Fund. I provided a fact timeline and key documents. The firm reviewed and did not offer representation.</w:t>
-      </w:r>
-    </w:p>
-    <w:p>
-      <w:pPr>
-        <w:pStyle w:val="BodyText"/>
-        <w:spacing w:line="276" w:lineRule="auto"/>
-        <w:rPr>
-          <w:rFonts w:ascii="Georgia" w:hAnsi="Georgia"/>
+        <w:t>“makes no representation as to the veracity or strength of this potential legal matter.”</w:t>
+      </w:r>
+    </w:p>
+    <w:p>
+      <w:pPr>
+        <w:pStyle w:val="BodyText"/>
+        <w:spacing w:line="276" w:lineRule="auto"/>
+        <w:rPr>
+          <w:rFonts w:ascii="Georgia" w:hAnsi="Georgia"/>
+          <w:i/>
+          <w:iCs/>
         </w:rPr>
       </w:pPr>
       <w:r>
@@ -9364,7 +9732,7 @@
           <w:b/>
           <w:bCs/>
         </w:rPr>
-        <w:t>Skeen Law Offices — Charlottesville, VA</w:t>
+        <w:t>Government Accountability Project (GAP) — Washington, D.C.</w:t>
       </w:r>
       <w:r>
         <w:rPr>
@@ -9378,29 +9746,60 @@
           <w:i/>
           <w:iCs/>
         </w:rPr>
-        <w:t>November 11–14, 2024</w:t>
-      </w:r>
-      <w:r>
-        <w:rPr>
-          <w:rFonts w:ascii="Georgia" w:hAnsi="Georgia"/>
-        </w:rPr>
-        <w:t xml:space="preserve"> Michael Turiello reached out via Morgan and Morgan referral. We spoke by phone. I provided my case narrative and supporting documents. He wrote: </w:t>
-      </w:r>
+        <w:t>January 29, 2025</w:t>
+      </w:r>
+    </w:p>
+    <w:p>
+      <w:pPr>
+        <w:pStyle w:val="BodyText"/>
+        <w:spacing w:line="276" w:lineRule="auto"/>
+        <w:rPr>
+          <w:rFonts w:ascii="Georgia" w:hAnsi="Georgia"/>
+        </w:rPr>
+      </w:pPr>
       <w:r>
         <w:rPr>
           <w:rFonts w:ascii="Georgia" w:hAnsi="Georgia"/>
           <w:i/>
           <w:iCs/>
         </w:rPr>
-        <w:t>“Despite my deepest sympathies for what you’ve experienced, we are unable to take your case.”</w:t>
-      </w:r>
-    </w:p>
-    <w:p>
-      <w:pPr>
-        <w:pStyle w:val="BodyText"/>
-        <w:spacing w:line="276" w:lineRule="auto"/>
-        <w:rPr>
-          <w:rFonts w:ascii="Georgia" w:hAnsi="Georgia"/>
+        <w:t>First Contact</w:t>
+      </w:r>
+      <w:r>
+        <w:rPr>
+          <w:rFonts w:ascii="Georgia" w:hAnsi="Georgia"/>
+        </w:rPr>
+        <w:t xml:space="preserve"> </w:t>
+      </w:r>
+      <w:r>
+        <w:rPr>
+          <w:rFonts w:ascii="Georgia" w:hAnsi="Georgia"/>
+        </w:rPr>
+        <w:t xml:space="preserve">- </w:t>
+      </w:r>
+      <w:r>
+        <w:rPr>
+          <w:rFonts w:ascii="Georgia" w:hAnsi="Georgia"/>
+        </w:rPr>
+        <w:t xml:space="preserve">Joanne Royce reviewed my Case Narrative and Legal Claims memo and declined representation. She wrote: </w:t>
+      </w:r>
+      <w:r>
+        <w:rPr>
+          <w:rFonts w:ascii="Georgia" w:hAnsi="Georgia"/>
+          <w:i/>
+          <w:iCs/>
+        </w:rPr>
+        <w:t>“Our declining of services to you does not indicate that our staff thinks your claims to be unimportant or without merit.”</w:t>
+      </w:r>
+    </w:p>
+    <w:p>
+      <w:pPr>
+        <w:pStyle w:val="BodyText"/>
+        <w:spacing w:line="276" w:lineRule="auto"/>
+        <w:rPr>
+          <w:rFonts w:ascii="Georgia" w:hAnsi="Georgia"/>
+          <w:i/>
+          <w:iCs/>
         </w:rPr>
       </w:pPr>
       <w:r>
@@ -9409,7 +9808,7 @@
           <w:b/>
           <w:bCs/>
         </w:rPr>
-        <w:t>Lundy Law — Philadelphia, PA</w:t>
+        <w:t>Katz Banks Kumin — Washington, D.C.</w:t>
       </w:r>
       <w:r>
         <w:rPr>
@@ -9423,40 +9822,53 @@
           <w:i/>
           <w:iCs/>
         </w:rPr>
-        <w:t xml:space="preserve">January 30, </w:t>
-      </w:r>
-      <w:proofErr w:type="gramStart"/>
+        <w:t>July 3, 2025</w:t>
+      </w:r>
+    </w:p>
+    <w:p>
+      <w:pPr>
+        <w:pStyle w:val="BodyText"/>
+        <w:spacing w:line="276" w:lineRule="auto"/>
+        <w:rPr>
+          <w:rFonts w:ascii="Georgia" w:hAnsi="Georgia"/>
+        </w:rPr>
+      </w:pPr>
       <w:r>
         <w:rPr>
           <w:rFonts w:ascii="Georgia" w:hAnsi="Georgia"/>
           <w:i/>
           <w:iCs/>
         </w:rPr>
-        <w:t>2025</w:t>
-      </w:r>
-      <w:proofErr w:type="gramEnd"/>
-      <w:r>
-        <w:rPr>
-          <w:rFonts w:ascii="Georgia" w:hAnsi="Georgia"/>
-        </w:rPr>
-        <w:t xml:space="preserve"> L. Leonard Lundy declined. The letter noted declining to represent </w:t>
-      </w:r>
-      <w:r>
+        <w:t>Second Contact</w:t>
+      </w:r>
+      <w:r>
+        <w:rPr>
+          <w:rFonts w:ascii="Georgia" w:hAnsi="Georgia"/>
+        </w:rPr>
+        <w:t xml:space="preserve"> </w:t>
+      </w:r>
+      <w:r>
+        <w:rPr>
+          <w:rFonts w:ascii="Georgia" w:hAnsi="Georgia"/>
+        </w:rPr>
+        <w:t xml:space="preserve">- </w:t>
+      </w:r>
+      <w:r>
+        <w:rPr>
+          <w:rFonts w:ascii="Georgia" w:hAnsi="Georgia"/>
+        </w:rPr>
+        <w:t>I contacted them again. Destiny Barber declined again. Same firm. Same result. One year later.</w:t>
+      </w:r>
+    </w:p>
+    <w:p>
+      <w:pPr>
+        <w:pStyle w:val="BodyText"/>
+        <w:spacing w:line="276" w:lineRule="auto"/>
         <w:rPr>
           <w:rFonts w:ascii="Georgia" w:hAnsi="Georgia"/>
           <w:i/>
           <w:iCs/>
         </w:rPr>
-        <w:t>“makes no representation as to the veracity or strength of this potential legal matter.”</w:t>
-      </w:r>
-    </w:p>
-    <w:p>
-      <w:pPr>
-        <w:pStyle w:val="BodyText"/>
-        <w:spacing w:line="276" w:lineRule="auto"/>
-        <w:rPr>
-          <w:rFonts w:ascii="Georgia" w:hAnsi="Georgia"/>
-        </w:rPr>
       </w:pPr>
       <w:r>
         <w:rPr>
@@ -9464,7 +9876,7 @@
           <w:b/>
           <w:bCs/>
         </w:rPr>
-        <w:t>Government Accountability Project (GAP) — Washington, D.C.</w:t>
+        <w:t>Relman Colfax PLLC — Washington, D.C.</w:t>
       </w:r>
       <w:r>
         <w:rPr>
@@ -9478,13 +9890,22 @@
           <w:i/>
           <w:iCs/>
         </w:rPr>
-        <w:t>January 29, 2025 — First Contact</w:t>
-      </w:r>
-      <w:r>
-        <w:rPr>
-          <w:rFonts w:ascii="Georgia" w:hAnsi="Georgia"/>
-        </w:rPr>
-        <w:t xml:space="preserve"> Joanne Royce reviewed my Case Narrative and Legal Claims memo and declined representation. She wrote: </w:t>
+        <w:t>July 9, 2025</w:t>
+      </w:r>
+    </w:p>
+    <w:p>
+      <w:pPr>
+        <w:pStyle w:val="BodyText"/>
+        <w:spacing w:line="276" w:lineRule="auto"/>
+        <w:rPr>
+          <w:rFonts w:ascii="Georgia" w:hAnsi="Georgia"/>
+        </w:rPr>
+      </w:pPr>
+      <w:r>
+        <w:rPr>
+          <w:rFonts w:ascii="Georgia" w:hAnsi="Georgia"/>
+        </w:rPr>
+        <w:t xml:space="preserve"> Caroline Sullivan declined on behalf of the firm. She wrote: </w:t>
       </w:r>
       <w:r>
         <w:rPr>
@@ -9492,15 +9913,17 @@
           <w:i/>
           <w:iCs/>
         </w:rPr>
-        <w:t>“Our declining of services to you does not indicate that our staff thinks your claims to be unimportant or without merit.”</w:t>
-      </w:r>
-    </w:p>
-    <w:p>
-      <w:pPr>
-        <w:pStyle w:val="BodyText"/>
-        <w:spacing w:line="276" w:lineRule="auto"/>
-        <w:rPr>
-          <w:rFonts w:ascii="Georgia" w:hAnsi="Georgia"/>
+        <w:t>“We regret that we cannot represent all of the worthy and deserving individuals who come to us for help.”</w:t>
+      </w:r>
+    </w:p>
+    <w:p>
+      <w:pPr>
+        <w:pStyle w:val="BodyText"/>
+        <w:spacing w:line="276" w:lineRule="auto"/>
+        <w:rPr>
+          <w:rFonts w:ascii="Georgia" w:hAnsi="Georgia"/>
+          <w:i/>
+          <w:iCs/>
         </w:rPr>
       </w:pPr>
       <w:r>
@@ -9509,7 +9932,7 @@
           <w:b/>
           <w:bCs/>
         </w:rPr>
-        <w:t>Katz Banks Kumin — Washington, D.C.</w:t>
+        <w:t>Government Accountability Project (GAP) — Washington, D.C.</w:t>
       </w:r>
       <w:r>
         <w:rPr>
@@ -9523,21 +9946,60 @@
           <w:i/>
           <w:iCs/>
         </w:rPr>
-        <w:t>July 3, 2025 — Second Contact</w:t>
-      </w:r>
-      <w:r>
-        <w:rPr>
-          <w:rFonts w:ascii="Georgia" w:hAnsi="Georgia"/>
-        </w:rPr>
-        <w:t xml:space="preserve"> I contacted them again. Destiny Barber declined again. Same firm. Same result. One year later.</w:t>
-      </w:r>
-    </w:p>
-    <w:p>
-      <w:pPr>
-        <w:pStyle w:val="BodyText"/>
-        <w:spacing w:line="276" w:lineRule="auto"/>
-        <w:rPr>
-          <w:rFonts w:ascii="Georgia" w:hAnsi="Georgia"/>
+        <w:t>April 15, 2026</w:t>
+      </w:r>
+    </w:p>
+    <w:p>
+      <w:pPr>
+        <w:pStyle w:val="BodyText"/>
+        <w:spacing w:line="276" w:lineRule="auto"/>
+        <w:rPr>
+          <w:rFonts w:ascii="Georgia" w:hAnsi="Georgia"/>
+        </w:rPr>
+      </w:pPr>
+      <w:r>
+        <w:rPr>
+          <w:rFonts w:ascii="Georgia" w:hAnsi="Georgia"/>
+          <w:i/>
+          <w:iCs/>
+        </w:rPr>
+        <w:t xml:space="preserve"> Second Contact</w:t>
+      </w:r>
+      <w:r>
+        <w:rPr>
+          <w:rFonts w:ascii="Georgia" w:hAnsi="Georgia"/>
+        </w:rPr>
+        <w:t xml:space="preserve"> </w:t>
+      </w:r>
+      <w:r>
+        <w:rPr>
+          <w:rFonts w:ascii="Georgia" w:hAnsi="Georgia"/>
+        </w:rPr>
+        <w:t xml:space="preserve">- </w:t>
+      </w:r>
+      <w:r>
+        <w:rPr>
+          <w:rFonts w:ascii="Georgia" w:hAnsi="Georgia"/>
+        </w:rPr>
+        <w:t xml:space="preserve">I applied again. They declined again. The intake team wrote: </w:t>
+      </w:r>
+      <w:r>
+        <w:rPr>
+          <w:rFonts w:ascii="Georgia" w:hAnsi="Georgia"/>
+          <w:i/>
+          <w:iCs/>
+        </w:rPr>
+        <w:t>“our declining of services to you does not indicate that our staff thinks your concerns are unimportant or without merit.”</w:t>
+      </w:r>
+    </w:p>
+    <w:p>
+      <w:pPr>
+        <w:pStyle w:val="BodyText"/>
+        <w:spacing w:line="276" w:lineRule="auto"/>
+        <w:rPr>
+          <w:rFonts w:ascii="Georgia" w:hAnsi="Georgia"/>
+          <w:i/>
+          <w:iCs/>
         </w:rPr>
       </w:pPr>
       <w:r>
@@ -9546,7 +10008,7 @@
           <w:b/>
           <w:bCs/>
         </w:rPr>
-        <w:t>Relman Colfax PLLC — Washington, D.C.</w:t>
+        <w:t>Katz Banks Kumin — Washington, D.C.</w:t>
       </w:r>
       <w:r>
         <w:rPr>
@@ -9560,23 +10022,42 @@
           <w:i/>
           <w:iCs/>
         </w:rPr>
-        <w:t xml:space="preserve">July 9, </w:t>
-      </w:r>
-      <w:proofErr w:type="gramStart"/>
+        <w:t>April 1, 2026</w:t>
+      </w:r>
+    </w:p>
+    <w:p>
+      <w:pPr>
+        <w:pStyle w:val="BodyText"/>
+        <w:spacing w:line="276" w:lineRule="auto"/>
+        <w:rPr>
+          <w:rFonts w:ascii="Georgia" w:hAnsi="Georgia"/>
+        </w:rPr>
+      </w:pPr>
       <w:r>
         <w:rPr>
           <w:rFonts w:ascii="Georgia" w:hAnsi="Georgia"/>
           <w:i/>
           <w:iCs/>
         </w:rPr>
-        <w:t>2025</w:t>
-      </w:r>
-      <w:proofErr w:type="gramEnd"/>
-      <w:r>
-        <w:rPr>
-          <w:rFonts w:ascii="Georgia" w:hAnsi="Georgia"/>
-        </w:rPr>
-        <w:t xml:space="preserve"> Caroline Sullivan declined on behalf of the firm. She wrote: </w:t>
+        <w:t>Third Contact</w:t>
+      </w:r>
+      <w:r>
+        <w:rPr>
+          <w:rFonts w:ascii="Georgia" w:hAnsi="Georgia"/>
+        </w:rPr>
+        <w:t xml:space="preserve"> </w:t>
+      </w:r>
+      <w:r>
+        <w:rPr>
+          <w:rFonts w:ascii="Georgia" w:hAnsi="Georgia"/>
+        </w:rPr>
+        <w:t xml:space="preserve">- </w:t>
+      </w:r>
+      <w:r>
+        <w:rPr>
+          <w:rFonts w:ascii="Georgia" w:hAnsi="Georgia"/>
+        </w:rPr>
+        <w:t xml:space="preserve">I contacted Lisa Banks, Partner, directly — subject line: </w:t>
       </w:r>
       <w:r>
         <w:rPr>
@@ -9584,96 +10065,6 @@
           <w:i/>
           <w:iCs/>
         </w:rPr>
-        <w:t>“We regret that we cannot represent all of the worthy and deserving individuals who come to us for help.”</w:t>
-      </w:r>
-    </w:p>
-    <w:p>
-      <w:pPr>
-        <w:pStyle w:val="BodyText"/>
-        <w:spacing w:line="276" w:lineRule="auto"/>
-        <w:rPr>
-          <w:rFonts w:ascii="Georgia" w:hAnsi="Georgia"/>
-        </w:rPr>
-      </w:pPr>
-      <w:r>
-        <w:rPr>
-          <w:rFonts w:ascii="Georgia" w:hAnsi="Georgia"/>
-          <w:b/>
-          <w:bCs/>
-        </w:rPr>
-        <w:t>Government Accountability Project (GAP) — Washington, D.C.</w:t>
-      </w:r>
-      <w:r>
-        <w:rPr>
-          <w:rFonts w:ascii="Georgia" w:hAnsi="Georgia"/>
-        </w:rPr>
-        <w:t xml:space="preserve"> </w:t>
-      </w:r>
-      <w:r>
-        <w:rPr>
-          <w:rFonts w:ascii="Georgia" w:hAnsi="Georgia"/>
-          <w:i/>
-          <w:iCs/>
-        </w:rPr>
-        <w:t>April 15, 2026 — Second Contact</w:t>
-      </w:r>
-      <w:r>
-        <w:rPr>
-          <w:rFonts w:ascii="Georgia" w:hAnsi="Georgia"/>
-        </w:rPr>
-        <w:t xml:space="preserve"> I applied again. They declined again. The intake team wrote: </w:t>
-      </w:r>
-      <w:r>
-        <w:rPr>
-          <w:rFonts w:ascii="Georgia" w:hAnsi="Georgia"/>
-          <w:i/>
-          <w:iCs/>
-        </w:rPr>
-        <w:t>“our declining of services to you does not indicate that our staff thinks your concerns are unimportant or without merit.”</w:t>
-      </w:r>
-    </w:p>
-    <w:p>
-      <w:pPr>
-        <w:pStyle w:val="BodyText"/>
-        <w:spacing w:line="276" w:lineRule="auto"/>
-        <w:rPr>
-          <w:rFonts w:ascii="Georgia" w:hAnsi="Georgia"/>
-        </w:rPr>
-      </w:pPr>
-      <w:r>
-        <w:rPr>
-          <w:rFonts w:ascii="Georgia" w:hAnsi="Georgia"/>
-          <w:b/>
-          <w:bCs/>
-        </w:rPr>
-        <w:t>Katz Banks Kumin — Washington, D.C.</w:t>
-      </w:r>
-      <w:r>
-        <w:rPr>
-          <w:rFonts w:ascii="Georgia" w:hAnsi="Georgia"/>
-        </w:rPr>
-        <w:t xml:space="preserve"> </w:t>
-      </w:r>
-      <w:r>
-        <w:rPr>
-          <w:rFonts w:ascii="Georgia" w:hAnsi="Georgia"/>
-          <w:i/>
-          <w:iCs/>
-        </w:rPr>
-        <w:t>April 1, 2026 — Third Contact</w:t>
-      </w:r>
-      <w:r>
-        <w:rPr>
-          <w:rFonts w:ascii="Georgia" w:hAnsi="Georgia"/>
-        </w:rPr>
-        <w:t xml:space="preserve"> I contacted Lisa Banks, Partner, directly — subject line: </w:t>
-      </w:r>
-      <w:r>
-        <w:rPr>
-          <w:rFonts w:ascii="Georgia" w:hAnsi="Georgia"/>
-          <w:i/>
-          <w:iCs/>
-        </w:rPr>
         <w:t>“Potential Civil Claims — Federal Contractor Retaliation and Documented False Statement to U.S. Senator.”</w:t>
       </w:r>
       <w:r>
@@ -9695,7 +10086,6 @@
         <w:rPr>
           <w:rFonts w:ascii="Georgia" w:hAnsi="Georgia"/>
         </w:rPr>
-        <w:lastRenderedPageBreak/>
         <w:t>Three contacts. Three years. The same firm. The same result.</w:t>
       </w:r>
     </w:p>
@@ -9795,23 +10185,81 @@
           <w:i/>
           <w:iCs/>
         </w:rPr>
-        <w:t xml:space="preserve">March 5, </w:t>
-      </w:r>
-      <w:proofErr w:type="gramStart"/>
+        <w:t>March 5, 2024</w:t>
+      </w:r>
+      <w:r>
+        <w:rPr>
+          <w:rFonts w:ascii="Georgia" w:hAnsi="Georgia"/>
+        </w:rPr>
+        <w:t xml:space="preserve"> </w:t>
+      </w:r>
+    </w:p>
+    <w:p>
+      <w:pPr>
+        <w:pStyle w:val="BodyText"/>
+        <w:spacing w:line="276" w:lineRule="auto"/>
+        <w:rPr>
+          <w:rFonts w:ascii="Georgia" w:hAnsi="Georgia"/>
+        </w:rPr>
+      </w:pPr>
+      <w:r>
+        <w:rPr>
+          <w:rFonts w:ascii="Georgia" w:hAnsi="Georgia"/>
+        </w:rPr>
+        <w:t>I contacted NewsNation and described what had happened in so many words. I shared the HPSCI letter and the details of the retaliation. No substantive response was received.</w:t>
+      </w:r>
+    </w:p>
+    <w:p>
+      <w:pPr>
+        <w:pStyle w:val="BodyText"/>
+        <w:spacing w:line="276" w:lineRule="auto"/>
+        <w:rPr>
+          <w:rFonts w:ascii="Georgia" w:hAnsi="Georgia"/>
+        </w:rPr>
+      </w:pPr>
+      <w:r>
+        <w:rPr>
+          <w:rFonts w:ascii="Georgia" w:hAnsi="Georgia"/>
+          <w:b/>
+          <w:bCs/>
+        </w:rPr>
+        <w:lastRenderedPageBreak/>
+        <w:t>Washington Post — Matea Gold</w:t>
+      </w:r>
+      <w:r>
+        <w:rPr>
+          <w:rFonts w:ascii="Georgia" w:hAnsi="Georgia"/>
+        </w:rPr>
+        <w:t xml:space="preserve"> </w:t>
+      </w:r>
       <w:r>
         <w:rPr>
           <w:rFonts w:ascii="Georgia" w:hAnsi="Georgia"/>
           <w:i/>
           <w:iCs/>
         </w:rPr>
-        <w:t>2024</w:t>
-      </w:r>
-      <w:proofErr w:type="gramEnd"/>
-      <w:r>
-        <w:rPr>
-          <w:rFonts w:ascii="Georgia" w:hAnsi="Georgia"/>
-        </w:rPr>
-        <w:t xml:space="preserve"> I contacted NewsNation and described what had happened in so many words. I shared the HPSCI letter and the details of the retaliation. No substantive response was received.</w:t>
+        <w:t>February 29, 2024</w:t>
+      </w:r>
+      <w:r>
+        <w:rPr>
+          <w:rFonts w:ascii="Georgia" w:hAnsi="Georgia"/>
+        </w:rPr>
+        <w:t xml:space="preserve"> </w:t>
+      </w:r>
+    </w:p>
+    <w:p>
+      <w:pPr>
+        <w:pStyle w:val="BodyText"/>
+        <w:spacing w:line="276" w:lineRule="auto"/>
+        <w:rPr>
+          <w:rFonts w:ascii="Georgia" w:hAnsi="Georgia"/>
+        </w:rPr>
+      </w:pPr>
+      <w:r>
+        <w:rPr>
+          <w:rFonts w:ascii="Georgia" w:hAnsi="Georgia"/>
+        </w:rPr>
+        <w:t>I emailed Matea Gold directly. I identified myself by name, explained that anonymity was impossible given the UAP connection, and listed the congressional offices I had already contacted. No response was documented.</w:t>
       </w:r>
     </w:p>
     <w:p>
@@ -9828,7 +10276,7 @@
           <w:b/>
           <w:bCs/>
         </w:rPr>
-        <w:t>Washington Post — Matea Gold</w:t>
+        <w:t>6ABC Philadelphia</w:t>
       </w:r>
       <w:r>
         <w:rPr>
@@ -9842,23 +10290,92 @@
           <w:i/>
           <w:iCs/>
         </w:rPr>
-        <w:t xml:space="preserve">February 29, </w:t>
-      </w:r>
-      <w:proofErr w:type="gramStart"/>
+        <w:t>March 6, 2024</w:t>
+      </w:r>
+      <w:r>
+        <w:rPr>
+          <w:rFonts w:ascii="Georgia" w:hAnsi="Georgia"/>
+        </w:rPr>
+        <w:t xml:space="preserve"> </w:t>
+      </w:r>
+    </w:p>
+    <w:p>
+      <w:pPr>
+        <w:pStyle w:val="BodyText"/>
+        <w:spacing w:line="276" w:lineRule="auto"/>
+        <w:rPr>
+          <w:rFonts w:ascii="Georgia" w:hAnsi="Georgia"/>
+        </w:rPr>
+      </w:pPr>
+      <w:r>
+        <w:rPr>
+          <w:rFonts w:ascii="Georgia" w:hAnsi="Georgia"/>
+        </w:rPr>
+        <w:t>I contacted 6ABC by email and spoke with someone by phone. They gave me a contact number. Nothing came of it.</w:t>
+      </w:r>
+    </w:p>
+    <w:p>
+      <w:pPr>
+        <w:pStyle w:val="BodyText"/>
+        <w:spacing w:line="276" w:lineRule="auto"/>
+        <w:rPr>
+          <w:rFonts w:ascii="Georgia" w:hAnsi="Georgia"/>
+        </w:rPr>
+      </w:pPr>
+      <w:r>
+        <w:rPr>
+          <w:rFonts w:ascii="Georgia" w:hAnsi="Georgia"/>
+          <w:b/>
+          <w:bCs/>
+        </w:rPr>
+        <w:t>WJLA Washington</w:t>
+      </w:r>
+      <w:r>
+        <w:rPr>
+          <w:rFonts w:ascii="Georgia" w:hAnsi="Georgia"/>
+        </w:rPr>
+        <w:t xml:space="preserve"> </w:t>
+      </w:r>
       <w:r>
         <w:rPr>
           <w:rFonts w:ascii="Georgia" w:hAnsi="Georgia"/>
           <w:i/>
           <w:iCs/>
         </w:rPr>
-        <w:t>2024</w:t>
-      </w:r>
-      <w:proofErr w:type="gramEnd"/>
-      <w:r>
-        <w:rPr>
-          <w:rFonts w:ascii="Georgia" w:hAnsi="Georgia"/>
-        </w:rPr>
-        <w:t xml:space="preserve"> I emailed Matea Gold directly. I identified myself by name, explained that anonymity was impossible given the UAP connection, and listed the congressional offices I had already contacted. No response was documented.</w:t>
+        <w:t>March 6 and March 23, 2024</w:t>
+      </w:r>
+      <w:r>
+        <w:rPr>
+          <w:rFonts w:ascii="Georgia" w:hAnsi="Georgia"/>
+        </w:rPr>
+        <w:t xml:space="preserve"> </w:t>
+      </w:r>
+    </w:p>
+    <w:p>
+      <w:pPr>
+        <w:pStyle w:val="BodyText"/>
+        <w:spacing w:line="276" w:lineRule="auto"/>
+        <w:rPr>
+          <w:rFonts w:ascii="Georgia" w:hAnsi="Georgia"/>
+        </w:rPr>
+      </w:pPr>
+      <w:r>
+        <w:rPr>
+          <w:rFonts w:ascii="Georgia" w:hAnsi="Georgia"/>
+        </w:rPr>
+        <w:t xml:space="preserve">I emailed the WJLA </w:t>
+      </w:r>
+      <w:r>
+        <w:rPr>
+          <w:rFonts w:ascii="Georgia" w:hAnsi="Georgia"/>
+        </w:rPr>
+        <w:t>news desk</w:t>
+      </w:r>
+      <w:r>
+        <w:rPr>
+          <w:rFonts w:ascii="Georgia" w:hAnsi="Georgia"/>
+        </w:rPr>
+        <w:t xml:space="preserve"> twice. The first email bounced with a DNS error. I tried again on March 23rd. No substantive response was received.</w:t>
       </w:r>
     </w:p>
     <w:p>
@@ -9875,7 +10392,7 @@
           <w:b/>
           <w:bCs/>
         </w:rPr>
-        <w:t>6ABC Philadelphia</w:t>
+        <w:t>BBC</w:t>
       </w:r>
       <w:r>
         <w:rPr>
@@ -9889,23 +10406,94 @@
           <w:i/>
           <w:iCs/>
         </w:rPr>
-        <w:t xml:space="preserve">March 6, </w:t>
-      </w:r>
-      <w:proofErr w:type="gramStart"/>
+        <w:t>March 2024 (approximate)</w:t>
+      </w:r>
+      <w:r>
+        <w:rPr>
+          <w:rFonts w:ascii="Georgia" w:hAnsi="Georgia"/>
+        </w:rPr>
+        <w:t xml:space="preserve"> </w:t>
+      </w:r>
+    </w:p>
+    <w:p>
+      <w:pPr>
+        <w:pStyle w:val="BodyText"/>
+        <w:spacing w:line="276" w:lineRule="auto"/>
+        <w:rPr>
+          <w:rFonts w:ascii="Georgia" w:hAnsi="Georgia"/>
+        </w:rPr>
+      </w:pPr>
+      <w:r>
+        <w:rPr>
+          <w:rFonts w:ascii="Georgia" w:hAnsi="Georgia"/>
+        </w:rPr>
+        <w:t>I contacted the BBC around the time of my congressional outreach. I identified myself, shared the HPSCI letter and my Air Force complaint, and noted I was working with senators on the case. No substantive response was received.</w:t>
+      </w:r>
+    </w:p>
+    <w:p>
+      <w:pPr>
+        <w:pStyle w:val="BodyText"/>
+        <w:spacing w:line="276" w:lineRule="auto"/>
+        <w:rPr>
+          <w:rFonts w:ascii="Georgia" w:hAnsi="Georgia"/>
+        </w:rPr>
+      </w:pPr>
+      <w:r>
+        <w:rPr>
+          <w:rFonts w:ascii="Georgia" w:hAnsi="Georgia"/>
+          <w:b/>
+          <w:bCs/>
+        </w:rPr>
+        <w:t>CNN</w:t>
+      </w:r>
+      <w:r>
+        <w:rPr>
+          <w:rFonts w:ascii="Georgia" w:hAnsi="Georgia"/>
+        </w:rPr>
+        <w:t xml:space="preserve"> </w:t>
+      </w:r>
       <w:r>
         <w:rPr>
           <w:rFonts w:ascii="Georgia" w:hAnsi="Georgia"/>
           <w:i/>
           <w:iCs/>
         </w:rPr>
-        <w:t>2024</w:t>
-      </w:r>
-      <w:proofErr w:type="gramEnd"/>
-      <w:r>
-        <w:rPr>
-          <w:rFonts w:ascii="Georgia" w:hAnsi="Georgia"/>
-        </w:rPr>
-        <w:t xml:space="preserve"> I contacted 6ABC by email and spoke with someone by phone. They gave me a contact number. Nothing came of it.</w:t>
+        <w:t>June 6, 2024</w:t>
+      </w:r>
+      <w:r>
+        <w:rPr>
+          <w:rFonts w:ascii="Georgia" w:hAnsi="Georgia"/>
+        </w:rPr>
+        <w:t xml:space="preserve"> </w:t>
+      </w:r>
+    </w:p>
+    <w:p>
+      <w:pPr>
+        <w:pStyle w:val="BodyText"/>
+        <w:spacing w:line="276" w:lineRule="auto"/>
+        <w:rPr>
+          <w:rFonts w:ascii="Georgia" w:hAnsi="Georgia"/>
+        </w:rPr>
+      </w:pPr>
+      <w:r>
+        <w:rPr>
+          <w:rFonts w:ascii="Georgia" w:hAnsi="Georgia"/>
+        </w:rPr>
+        <w:t xml:space="preserve">I sent a tip via Proton Mail. I described the March 2023 coercive events, the alias account, the ESRI abstract, the retaliation. I wrote: </w:t>
+      </w:r>
+      <w:r>
+        <w:rPr>
+          <w:rFonts w:ascii="Georgia" w:hAnsi="Georgia"/>
+          <w:i/>
+          <w:iCs/>
+        </w:rPr>
+        <w:t>“If there is somebody at CNN who does care, maybe forward this to that person.”</w:t>
+      </w:r>
+      <w:r>
+        <w:rPr>
+          <w:rFonts w:ascii="Georgia" w:hAnsi="Georgia"/>
+        </w:rPr>
+        <w:t xml:space="preserve"> I noted that the Washington Post and the New York Times had not responded to prior outreach. No response was documented from CNN.</w:t>
       </w:r>
     </w:p>
     <w:p>
@@ -9922,7 +10510,7 @@
           <w:b/>
           <w:bCs/>
         </w:rPr>
-        <w:t>WJLA Washington</w:t>
+        <w:t>NBC News</w:t>
       </w:r>
       <w:r>
         <w:rPr>
@@ -9936,263 +10524,124 @@
           <w:i/>
           <w:iCs/>
         </w:rPr>
-        <w:t xml:space="preserve">March 6 and March 23, </w:t>
-      </w:r>
-      <w:proofErr w:type="gramStart"/>
+        <w:t>July 2, 2025</w:t>
+      </w:r>
+      <w:r>
+        <w:rPr>
+          <w:rFonts w:ascii="Georgia" w:hAnsi="Georgia"/>
+        </w:rPr>
+        <w:t xml:space="preserve"> </w:t>
+      </w:r>
+    </w:p>
+    <w:p>
+      <w:pPr>
+        <w:pStyle w:val="BodyText"/>
+        <w:spacing w:line="276" w:lineRule="auto"/>
+        <w:rPr>
+          <w:rFonts w:ascii="Georgia" w:hAnsi="Georgia"/>
+        </w:rPr>
+      </w:pPr>
+      <w:r>
+        <w:rPr>
+          <w:rFonts w:ascii="Georgia" w:hAnsi="Georgia"/>
+        </w:rPr>
+        <w:t>I submitted a formal tip to NBC News investigative teams identifying myself as a former Leidos contractor whose UAP visualization work had been shared with ODNI. I described the coercive directives, the alias accounts, the psychiatric targeting, and the retaliation. NBC News Customer Care confirmed receipt and said they would forward it for review. No journalist followed up.</w:t>
+      </w:r>
+    </w:p>
+    <w:p>
+      <w:pPr>
+        <w:pStyle w:val="BodyText"/>
+        <w:spacing w:line="276" w:lineRule="auto"/>
+        <w:rPr>
+          <w:rFonts w:ascii="Georgia" w:hAnsi="Georgia"/>
+        </w:rPr>
+      </w:pPr>
+      <w:r>
+        <w:rPr>
+          <w:rFonts w:ascii="Georgia" w:hAnsi="Georgia"/>
+          <w:b/>
+          <w:bCs/>
+        </w:rPr>
+        <w:t>The Intercept, ProPublica, The Washington Post, The Guardian, CBC</w:t>
+      </w:r>
+      <w:r>
+        <w:rPr>
+          <w:rFonts w:ascii="Georgia" w:hAnsi="Georgia"/>
+        </w:rPr>
+        <w:t xml:space="preserve"> </w:t>
+      </w:r>
       <w:r>
         <w:rPr>
           <w:rFonts w:ascii="Georgia" w:hAnsi="Georgia"/>
           <w:i/>
           <w:iCs/>
         </w:rPr>
-        <w:t>2024</w:t>
-      </w:r>
-      <w:proofErr w:type="gramEnd"/>
-      <w:r>
-        <w:rPr>
-          <w:rFonts w:ascii="Georgia" w:hAnsi="Georgia"/>
-        </w:rPr>
-        <w:t xml:space="preserve"> I emailed the WJLA </w:t>
+        <w:t>July 2025</w:t>
+      </w:r>
+      <w:r>
+        <w:rPr>
+          <w:rFonts w:ascii="Georgia" w:hAnsi="Georgia"/>
+        </w:rPr>
+        <w:t xml:space="preserve"> </w:t>
+      </w:r>
+    </w:p>
+    <w:p>
+      <w:pPr>
+        <w:pStyle w:val="BodyText"/>
+        <w:spacing w:line="276" w:lineRule="auto"/>
+        <w:rPr>
+          <w:rFonts w:ascii="Georgia" w:hAnsi="Georgia"/>
+        </w:rPr>
+      </w:pPr>
+      <w:r>
+        <w:rPr>
+          <w:rFonts w:ascii="Georgia" w:hAnsi="Georgia"/>
+        </w:rPr>
+        <w:t xml:space="preserve">I </w:t>
       </w:r>
       <w:proofErr w:type="spellStart"/>
       <w:r>
         <w:rPr>
           <w:rFonts w:ascii="Georgia" w:hAnsi="Georgia"/>
         </w:rPr>
-        <w:t>newsdesk</w:t>
+        <w:t>BCC’d</w:t>
       </w:r>
       <w:proofErr w:type="spellEnd"/>
       <w:r>
         <w:rPr>
           <w:rFonts w:ascii="Georgia" w:hAnsi="Georgia"/>
         </w:rPr>
-        <w:t xml:space="preserve"> twice. The first email bounced with a DNS error. I tried again on March 23rd. No substantive response was received.</w:t>
-      </w:r>
-    </w:p>
-    <w:p>
-      <w:pPr>
-        <w:pStyle w:val="BodyText"/>
-        <w:spacing w:line="276" w:lineRule="auto"/>
-        <w:rPr>
-          <w:rFonts w:ascii="Georgia" w:hAnsi="Georgia"/>
-        </w:rPr>
-      </w:pPr>
-      <w:r>
-        <w:rPr>
-          <w:rFonts w:ascii="Georgia" w:hAnsi="Georgia"/>
-          <w:b/>
-          <w:bCs/>
-        </w:rPr>
-        <w:t>BBC</w:t>
-      </w:r>
-      <w:r>
-        <w:rPr>
-          <w:rFonts w:ascii="Georgia" w:hAnsi="Georgia"/>
-        </w:rPr>
-        <w:t xml:space="preserve"> </w:t>
-      </w:r>
-      <w:r>
-        <w:rPr>
-          <w:rFonts w:ascii="Georgia" w:hAnsi="Georgia"/>
-          <w:i/>
-          <w:iCs/>
-        </w:rPr>
-        <w:t>March 2024 (approximate)</w:t>
-      </w:r>
-      <w:r>
-        <w:rPr>
-          <w:rFonts w:ascii="Georgia" w:hAnsi="Georgia"/>
-        </w:rPr>
-        <w:t xml:space="preserve"> I contacted the BBC around the time of my congressional outreach. I identified myself, shared the HPSCI letter and my Air Force complaint, and noted I was working with senators on the case. No substantive response was received.</w:t>
-      </w:r>
-    </w:p>
-    <w:p>
-      <w:pPr>
-        <w:pStyle w:val="BodyText"/>
-        <w:spacing w:line="276" w:lineRule="auto"/>
-        <w:rPr>
-          <w:rFonts w:ascii="Georgia" w:hAnsi="Georgia"/>
-        </w:rPr>
-      </w:pPr>
-      <w:r>
-        <w:rPr>
-          <w:rFonts w:ascii="Georgia" w:hAnsi="Georgia"/>
-          <w:b/>
-          <w:bCs/>
-        </w:rPr>
-        <w:t>CNN</w:t>
-      </w:r>
-      <w:r>
-        <w:rPr>
-          <w:rFonts w:ascii="Georgia" w:hAnsi="Georgia"/>
-        </w:rPr>
-        <w:t xml:space="preserve"> </w:t>
-      </w:r>
-      <w:r>
-        <w:rPr>
-          <w:rFonts w:ascii="Georgia" w:hAnsi="Georgia"/>
-          <w:i/>
-          <w:iCs/>
-        </w:rPr>
-        <w:t xml:space="preserve">June 6, </w:t>
-      </w:r>
-      <w:proofErr w:type="gramStart"/>
-      <w:r>
-        <w:rPr>
-          <w:rFonts w:ascii="Georgia" w:hAnsi="Georgia"/>
-          <w:i/>
-          <w:iCs/>
-        </w:rPr>
-        <w:t>2024</w:t>
-      </w:r>
-      <w:proofErr w:type="gramEnd"/>
-      <w:r>
-        <w:rPr>
-          <w:rFonts w:ascii="Georgia" w:hAnsi="Georgia"/>
-        </w:rPr>
-        <w:t xml:space="preserve"> I sent a tip via Proton Mail. I described the March 2023 coercive events, the alias account, the ESRI abstract, the retaliation. I wrote: </w:t>
-      </w:r>
-      <w:r>
-        <w:rPr>
-          <w:rFonts w:ascii="Georgia" w:hAnsi="Georgia"/>
-          <w:i/>
-          <w:iCs/>
-        </w:rPr>
-        <w:t>“If there is somebody at CNN who does care, maybe forward this to that person.”</w:t>
-      </w:r>
-      <w:r>
-        <w:rPr>
-          <w:rFonts w:ascii="Georgia" w:hAnsi="Georgia"/>
-        </w:rPr>
-        <w:t xml:space="preserve"> I noted that the Washington Post and the New York Times had not responded to prior outreach. No response was documented from CNN.</w:t>
-      </w:r>
-    </w:p>
-    <w:p>
-      <w:pPr>
-        <w:pStyle w:val="BodyText"/>
-        <w:spacing w:line="276" w:lineRule="auto"/>
-        <w:rPr>
-          <w:rFonts w:ascii="Georgia" w:hAnsi="Georgia"/>
-        </w:rPr>
-      </w:pPr>
-      <w:r>
-        <w:rPr>
-          <w:rFonts w:ascii="Georgia" w:hAnsi="Georgia"/>
-          <w:b/>
-          <w:bCs/>
-        </w:rPr>
-        <w:t>NBC News</w:t>
-      </w:r>
-      <w:r>
-        <w:rPr>
-          <w:rFonts w:ascii="Georgia" w:hAnsi="Georgia"/>
-        </w:rPr>
-        <w:t xml:space="preserve"> </w:t>
-      </w:r>
-      <w:r>
-        <w:rPr>
-          <w:rFonts w:ascii="Georgia" w:hAnsi="Georgia"/>
-          <w:i/>
-          <w:iCs/>
-        </w:rPr>
-        <w:t xml:space="preserve">July 2, </w:t>
-      </w:r>
-      <w:proofErr w:type="gramStart"/>
-      <w:r>
-        <w:rPr>
-          <w:rFonts w:ascii="Georgia" w:hAnsi="Georgia"/>
-          <w:i/>
-          <w:iCs/>
-        </w:rPr>
-        <w:t>2025</w:t>
-      </w:r>
-      <w:proofErr w:type="gramEnd"/>
-      <w:r>
-        <w:rPr>
-          <w:rFonts w:ascii="Georgia" w:hAnsi="Georgia"/>
-        </w:rPr>
-        <w:t xml:space="preserve"> I submitted a formal tip to NBC News investigative teams identifying myself as a former Leidos contractor whose UAP visualization work had been shared with ODNI. I described the coercive directives, the alias accounts, the psychiatric targeting, and the retaliation. NBC News Customer Care confirmed receipt and said they would forward it for review. No journalist followed up.</w:t>
-      </w:r>
-    </w:p>
-    <w:p>
-      <w:pPr>
-        <w:pStyle w:val="BodyText"/>
-        <w:spacing w:line="276" w:lineRule="auto"/>
-        <w:rPr>
-          <w:rFonts w:ascii="Georgia" w:hAnsi="Georgia"/>
-        </w:rPr>
-      </w:pPr>
-      <w:r>
-        <w:rPr>
-          <w:rFonts w:ascii="Georgia" w:hAnsi="Georgia"/>
-          <w:b/>
-          <w:bCs/>
+        <w:t xml:space="preserve"> five investigative outlets on my urgent appeal to the UN Office of the High Commissioner for Human Rights. The same story. The same documents. Five newsrooms. No response was documented from any of them.</w:t>
+      </w:r>
+    </w:p>
+    <w:p>
+      <w:pPr>
+        <w:pStyle w:val="BodyText"/>
+        <w:spacing w:line="276" w:lineRule="auto"/>
+        <w:rPr>
+          <w:rFonts w:ascii="Georgia" w:hAnsi="Georgia"/>
+        </w:rPr>
+      </w:pPr>
+      <w:r>
+        <w:rPr>
+          <w:rFonts w:ascii="Georgia" w:hAnsi="Georgia"/>
+        </w:rPr>
+        <w:t>The press, like the institutions, like the attorneys, received the information and returned the silence.</w:t>
+      </w:r>
+    </w:p>
+    <w:p>
+      <w:pPr>
+        <w:spacing w:line="276" w:lineRule="auto"/>
+        <w:jc w:val="center"/>
+        <w:rPr>
+          <w:rFonts w:ascii="Georgia" w:hAnsi="Georgia"/>
+        </w:rPr>
+      </w:pPr>
+      <w:r>
+        <w:rPr>
+          <w:rFonts w:ascii="Georgia" w:hAnsi="Georgia"/>
         </w:rPr>
         <w:lastRenderedPageBreak/>
-        <w:t>The Intercept, ProPublica, The Washington Post, The Guardian, CBC</w:t>
-      </w:r>
-      <w:r>
-        <w:rPr>
-          <w:rFonts w:ascii="Georgia" w:hAnsi="Georgia"/>
-        </w:rPr>
-        <w:t xml:space="preserve"> </w:t>
-      </w:r>
-      <w:r>
-        <w:rPr>
-          <w:rFonts w:ascii="Georgia" w:hAnsi="Georgia"/>
-          <w:i/>
-          <w:iCs/>
-        </w:rPr>
-        <w:t>July 2025</w:t>
-      </w:r>
-      <w:r>
-        <w:rPr>
-          <w:rFonts w:ascii="Georgia" w:hAnsi="Georgia"/>
-        </w:rPr>
-        <w:t xml:space="preserve"> I </w:t>
-      </w:r>
-      <w:proofErr w:type="spellStart"/>
-      <w:r>
-        <w:rPr>
-          <w:rFonts w:ascii="Georgia" w:hAnsi="Georgia"/>
-        </w:rPr>
-        <w:t>BCC’d</w:t>
-      </w:r>
-      <w:proofErr w:type="spellEnd"/>
-      <w:r>
-        <w:rPr>
-          <w:rFonts w:ascii="Georgia" w:hAnsi="Georgia"/>
-        </w:rPr>
-        <w:t xml:space="preserve"> five investigative outlets on my urgent appeal to the UN Office of the High Commissioner for Human Rights. The same story. The same documents. Five newsrooms. No response was documented from any of them.</w:t>
-      </w:r>
-    </w:p>
-    <w:p>
-      <w:pPr>
-        <w:pStyle w:val="BodyText"/>
-        <w:spacing w:line="276" w:lineRule="auto"/>
-        <w:rPr>
-          <w:rFonts w:ascii="Georgia" w:hAnsi="Georgia"/>
-        </w:rPr>
-      </w:pPr>
-      <w:r>
-        <w:rPr>
-          <w:rFonts w:ascii="Georgia" w:hAnsi="Georgia"/>
-        </w:rPr>
-        <w:t>The press, like the institutions, like the attorneys, received the information and returned the silence.</w:t>
-      </w:r>
-    </w:p>
-    <w:p>
-      <w:pPr>
-        <w:spacing w:line="276" w:lineRule="auto"/>
-        <w:jc w:val="center"/>
-        <w:rPr>
-          <w:rFonts w:ascii="Georgia" w:hAnsi="Georgia"/>
-        </w:rPr>
-      </w:pPr>
-      <w:r>
-        <w:rPr>
-          <w:rFonts w:ascii="Georgia" w:hAnsi="Georgia"/>
-        </w:rPr>
         <w:t>***</w:t>
       </w:r>
     </w:p>
@@ -10319,7 +10768,7 @@
           <w:szCs w:val="48"/>
         </w:rPr>
       </w:pPr>
-      <w:bookmarkStart w:id="21" w:name="_Toc228542052"/>
+      <w:bookmarkStart w:id="21" w:name="_Toc228693283"/>
       <w:r>
         <w:rPr>
           <w:rFonts w:ascii="Georgia" w:hAnsi="Georgia"/>
@@ -11846,7 +12295,7 @@
           <w:szCs w:val="48"/>
         </w:rPr>
       </w:pPr>
-      <w:bookmarkStart w:id="23" w:name="_Toc228542053"/>
+      <w:bookmarkStart w:id="23" w:name="_Toc228693284"/>
       <w:r>
         <w:rPr>
           <w:rFonts w:ascii="Georgia" w:hAnsi="Georgia"/>
@@ -13225,7 +13674,7 @@
           <w:szCs w:val="48"/>
         </w:rPr>
       </w:pPr>
-      <w:bookmarkStart w:id="25" w:name="_Toc228542054"/>
+      <w:bookmarkStart w:id="25" w:name="_Toc228693285"/>
       <w:r>
         <w:rPr>
           <w:rFonts w:ascii="Georgia" w:hAnsi="Georgia"/>
@@ -14175,7 +14624,7 @@
           <w:szCs w:val="48"/>
         </w:rPr>
       </w:pPr>
-      <w:bookmarkStart w:id="27" w:name="_Toc228542055"/>
+      <w:bookmarkStart w:id="27" w:name="_Toc228693286"/>
       <w:r>
         <w:rPr>
           <w:rFonts w:ascii="Georgia" w:hAnsi="Georgia"/>

</xml_diff>